<commit_message>
Align seminar with course guidelines: research claim, case study, consent form
Co-Authored-By: Claude Opus 5.5 <noreply@anthropic.com>
Claude-Session: https://claude.ai/code/session_01PCrLuLuf13bgHFN1Akf9GB
</commit_message>
<xml_diff>
--- a/seminar/עבודת סמינר - חיתאם אבו ריאש.docx
+++ b/seminar/עבודת סמינר - חיתאם אבו ריאש.docx
@@ -15,6 +15,22 @@
           <w:szCs w:val="24"/>
           <w:rtl/>
         </w:rPr>
+        <w:t xml:space="preserve">[לוגו המכללה למינהל]</w:t>
+      </w:r>
+    </w:p>
+    <w:p>
+      <w:pPr>
+        <w:bidi/>
+        <w:spacing w:after="120" w:before="0" w:line="480" w:lineRule="auto"/>
+        <w:jc w:val="center"/>
+      </w:pPr>
+      <w:r>
+        <w:rPr>
+          <w:rFonts w:ascii="Times New Roman" w:cs="David" w:hAnsi="Times New Roman"/>
+          <w:sz w:val="24"/>
+          <w:szCs w:val="24"/>
+          <w:rtl/>
+        </w:rPr>
         <w:t xml:space="preserve">המכללה למנהל, המסלול האקדמי</w:t>
       </w:r>
     </w:p>
@@ -227,7 +243,7 @@
           <w:szCs w:val="24"/>
           <w:rtl/>
         </w:rPr>
-        <w:t xml:space="preserve">תאריך הגשה: ____________</w:t>
+        <w:t xml:space="preserve">תאריך הגשה (חודש ושנה): ____________</w:t>
       </w:r>
     </w:p>
     <w:p>
@@ -819,6 +835,23 @@
     </w:p>
     <w:p>
       <w:pPr>
+        <w:bidi/>
+        <w:spacing w:after="120" w:before="0" w:line="480" w:lineRule="auto"/>
+        <w:ind w:firstLine="567"/>
+        <w:jc w:val="both"/>
+      </w:pPr>
+      <w:r>
+        <w:rPr>
+          <w:rFonts w:ascii="Times New Roman" w:cs="David" w:hAnsi="Times New Roman"/>
+          <w:sz w:val="24"/>
+          <w:szCs w:val="24"/>
+          <w:rtl/>
+        </w:rPr>
+        <w:t xml:space="preserve">במחקר איכותני אין השערת מחקר אלא טענת מחקר (צוות הקורס, 2025א). טענת המחקר, הנגזרת מן הרקע התיאורטי, היא שבבתי ספר ערביים בעיר מעורבת, הקשר בין המורות להורים נבנה פחות דרך הערוצים הרשמיים של המערכת ויותר דרך מבנה הקהילה, וששותפות של ממש תלויה במנהיגות שמאפשרת למורות ולהורים לפעול יחד.</w:t>
+      </w:r>
+    </w:p>
+    <w:p>
+      <w:pPr>
         <w:pStyle w:val="Heading1"/>
         <w:pageBreakBefore/>
         <w:bidi/>
@@ -871,6 +904,23 @@
           <w:rtl/>
         </w:rPr>
         <w:t xml:space="preserve">המחקר נערך בגישה האיכותנית-פרשנית, המבקשת להבין את הפרשנות שהמשתתפים עצמם נותנים לחוויותיהם, ולא לבחון השערות או קשר בין משתנים (צוות הקורס, 2025א). גישה זו נבחרה משום ששאלת המחקר עוסקת באופן שבו מורות חוות את עבודתן מול ההורים ונותנות לה משמעות. מחקר איכותני אינו נשען על מדגם גדול ומייצג, והכללה ממנו נעשית באמצעות דיאלוג בין המשתתפים לבין הקהילה האקדמית (צוות הקורס, 2025א).</w:t>
+      </w:r>
+    </w:p>
+    <w:p>
+      <w:pPr>
+        <w:bidi/>
+        <w:spacing w:after="120" w:before="0" w:line="480" w:lineRule="auto"/>
+        <w:ind w:firstLine="567"/>
+        <w:jc w:val="both"/>
+      </w:pPr>
+      <w:r>
+        <w:rPr>
+          <w:rFonts w:ascii="Times New Roman" w:cs="David" w:hAnsi="Times New Roman"/>
+          <w:sz w:val="24"/>
+          <w:szCs w:val="24"/>
+          <w:rtl/>
+        </w:rPr>
+        <w:t xml:space="preserve">מסורת המחקר שנבחרה היא חקר מקרה, כלומר מחקר של יחידה מוגדרת בסביבתה הטבעית, מתוך כוונה ללמוד ממנה על מקרים דומים (צוות הקורס, 2025א). המקרה הנחקר הוא הקשר בין מורות להורים בבתי ספר במגזר הערבי בלוד. הבחירה בו נובעת מכך שלוד מרכזת מאפיינים של ערים מעורבות אחרות בישראל, כמו פערים חברתיים-כלכליים בין יהודים לערבים, תקשורת מוסדית בעברית ומתחים שהתפרצו במאי 2021 (אבגר ואחרים, 2021), ולכן הממצאים עשויים ללמד גם על בתי ספר ערביים בערים כמו רמלה, עכו ויפו. כדי לקבל מבט רחב על המקרה נכללו בו חמישה בתי ספר, ולא בית ספר אחד.</w:t>
       </w:r>
     </w:p>
     <w:p>
@@ -2950,7 +3000,7 @@
           <w:szCs w:val="24"/>
           <w:rtl/>
         </w:rPr>
-        <w:t xml:space="preserve">מניתוח הראיונות עלו שש תמות. הן מוצגות להלן לפי סדר חשיבותן בדברי המרואיינות, ולצד כל אחת מובאים ציטוטים מדברי המשתתפות.</w:t>
+        <w:t xml:space="preserve">מניתוח הראיונות עלו שש תמות. הן מוצגות להלן לפי סדר חשיבותן בדברי המרואיינות, ולצד כל אחת מובאים ציטוטים מדברי המשתתפות. כאשר המרואיינות הביעו עמדות סותרות, הסתירה מוצגת כפי שהן עצמן ראו אותה, וכאשר עמדה עלתה אצל מרואיינת אחת בלבד, הדבר מצוין.</w:t>
       </w:r>
     </w:p>
     <w:p>
@@ -3056,7 +3106,7 @@
           <w:szCs w:val="24"/>
           <w:rtl/>
         </w:rPr>
-        <w:t xml:space="preserve">הוואטסאפ הוא הערוץ העיקרי בכל בתי הספר, ומערכת משו"ב כמעט אינה בשימוש בקרב ההורים. מהא העריכה ש"אולי עשרים אחוז מההורים" פותחים אותה, וסמר סיפרה שכאשר היא שואלת הורים אם ראו משהו במשו"ב, הם עונים "מה זה". כל המורות הבחינו בין העברת מידע ובין בניית יחסים. ריהאם אמרה: "ההבדל בין פנים אל פנים לבין הודעות הוא ההבדל בין קשר לבין מידע." פאטמה ניסחה זאת כך: "פנים אל פנים זה שיחה, טלפון זה חצי שיחה, הודעה זה פתק." מכאן גזרו כמה מורות כלל עבודה. מהא אמרה: "כל דבר שיש בו רגש, לא בווטסאפ."</w:t>
+        <w:t xml:space="preserve">הוואטסאפ הוא הערוץ העיקרי בכל בתי הספר, ומערכת משו"ב כמעט אינה בשימוש בקרב ההורים. מהא העריכה ש"אולי עשרים אחוז מההורים" פותחים אותה, וסמר סיפרה שכאשר היא שואלת הורים אם ראו משהו במשו"ב, הם עונים "מה זה". היחס של המורות לכלים הדיגיטליים היה כפול. ריהאם אמרה שהם "שינו את הקשר לגמרי, לטובה ולרעה", ונסרין תיארה כיצד עמוד הפייסבוק של בית הספר "בנה תחושה של קהילה שלא הייתה קודם", ובאותה נשימה אמרה שהכלים "עזרו לנו להגיע לכולם ופגעו ביכולת שלנו להגיע למישהו". את הסתירה הזאת יישבו המורות בהבחנה בין העברת מידע ובין בניית יחסים. ריהאם אמרה: "ההבדל בין פנים אל פנים לבין הודעות הוא ההבדל בין קשר לבין מידע." פאטמה ניסחה זאת כך: "פנים אל פנים זה שיחה, טלפון זה חצי שיחה, הודעה זה פתק." מכאן גזרו כמה מורות כלל עבודה. מהא אמרה: "כל דבר שיש בו רגש, לא בווטסאפ."</w:t>
       </w:r>
     </w:p>
     <w:p>
@@ -3196,7 +3246,7 @@
           <w:szCs w:val="24"/>
           <w:rtl/>
         </w:rPr>
-        <w:t xml:space="preserve">שתי מורות הקימו גופים של הורים שמשתתפים בפתרון בעיות. מהא הקימה "צוות הורים" של השכבה והביאה אליו את בעיית ההיעדרויות. אחת האמהות הציעה ש"אמהות שנשארות בבית בבוקר יעשו 'שרשרת'" ויתקשרו לשכנים בשבע, ולדברי מהא "בתוך חודשיים ההיעדרויות ירדו בחצי". אמאני הקימה "מועצת הורים כיתתית", ובערב הורים ניסחו ההורים עצמם הסכם על שימוש בטלפונים, שהביא לירידה בשימוש בהם בכיתה. נסרין הקימה "ועדת קהילה", וסוהא הקימה "מועצת קהילה" של נציגי המשפחות הגדולות בעיר. המורות זיהו תנאים דומים להצלחה: ההורים הוזמנו כמי שיש להם מה לתת, הפתרון בא מהם, והמקום היה שלהם. נסרין אמרה כי "השותפות הכי טובה היא כשבית הספר מפנה מקום ויוצא מהדרך".</w:t>
+        <w:t xml:space="preserve">שתי מורות הקימו גופים של הורים שמשתתפים בפתרון בעיות. מהא הקימה "צוות הורים" של השכבה והביאה אליו את בעיית ההיעדרויות. אחת האמהות הציעה ש"אמהות שנשארות בבית בבוקר יעשו 'שרשרת'" ויתקשרו לשכנים בשבע, ולדברי מהא "בתוך חודשיים ההיעדרויות ירדו בחצי". אמאני הקימה "מועצת הורים כיתתית", ובערב הורים ניסחו ההורים עצמם הסכם על שימוש בטלפונים, שהביא לירידה בשימוש בהם בכיתה. נסרין הקימה "ועדת קהילה", וסוהא הקימה "מועצת קהילה" של נציגי המשפחות הגדולות בעיר. המורות זיהו תנאים דומים להצלחה: ההורים הוזמנו כמי שיש להם מה לתת, הפתרון בא מהם, והמקום היה שלהם. נסרין אמרה כי "השותפות הכי טובה היא כשבית הספר מפנה מקום ויוצא מהדרך". קול אחר עלה אצל פאטמה, הוותיקה שבמרואיינות. לדבריה, "הורים אצלנו לא תמיד רוצים להחליט, הם רוצים שמישהו שהם סומכים עליו יחליט", אם כי היא ציינה שהדור הצעיר של ההורים מבקש להיות שותף "ולפעמים הוא נתקל בקיר".</w:t>
       </w:r>
     </w:p>
     <w:p>
@@ -3463,6 +3513,23 @@
     </w:p>
     <w:p>
       <w:pPr>
+        <w:bidi/>
+        <w:spacing w:after="120" w:before="0" w:line="480" w:lineRule="auto"/>
+        <w:ind w:firstLine="567"/>
+        <w:jc w:val="both"/>
+      </w:pPr>
+      <w:r>
+        <w:rPr>
+          <w:rFonts w:ascii="Times New Roman" w:cs="David" w:hAnsi="Times New Roman"/>
+          <w:sz w:val="24"/>
+          <w:szCs w:val="24"/>
+          <w:rtl/>
+        </w:rPr>
+        <w:t xml:space="preserve">מן הממצאים אפשר להעלות השערה לגבי משמעותם. ייתכן שהמעורבות שנראית "נמוכה" בבתי ספר ערביים אינה ביטוי לחוסר עניין של ההורים, אלא לפער בין הערוצים שהמערכת מציעה ובין הערוצים שבהם הקהילה פועלת. לפי השערה זו, כשבית הספר עובר לערוצים של הקהילה, כמו השער, הבית והסבתא, המעורבות עולה. השערה נוספת היא שהיעדר מבנה מערכתי מעביר את מחיר השותפות אל המורות, ובמיוחד אל מורות בנות הקהילה, וכי מחיר זה עלול להוביל לשחיקה. כדי לבחון את ההשערות מוצע לערוך מחקרי המשך שישמעו את ההורים עצמם, ובכללם הסבתות והאבות, ישוו לבתי ספר בחינוך העברי בעיר ובערים מעורבות אחרות, ויבחנו לאורך זמן את השפעתן של יוזמות כמו צוות הורים או רכזת קהילה על היעדרויות ועל נשירה.</w:t>
+      </w:r>
+    </w:p>
+    <w:p>
+      <w:pPr>
         <w:pStyle w:val="Heading1"/>
         <w:pageBreakBefore/>
         <w:bidi/>
@@ -3514,7 +3581,7 @@
           <w:szCs w:val="24"/>
           <w:rtl/>
         </w:rPr>
-        <w:t xml:space="preserve">שאלת המחקר עסקה באופן שבו מורות עובדות מול הורים בבתי ספר במגזר הערבי בלוד. התשובה שעלתה היא שהמורות עובדות מול ההורים כגשר. הן מעבירות מידע בערוצים דיגיטליים ובונות יחסים בפגישות פנים אל פנים ובערוצים בלתי פורמליים כמו השער, הגדר והבית. הן פונות להורים קודם כול בחיובי, מזמינות אותם כנותנים, ופועלות בתוך מבנה המשפחה המורחבת והכבוד. השותפות בהחלטות מצומצמת ברמת בית הספר, ומתקיימת בעיקר ביוזמות של מורות יחידות. המסקנה המרכזית היא שהמנהיגות השיתופית בבתי ספר אלה מתקיימת "מלמטה", ושהיא תלויה באנשים יותר מאשר במבנה. מטרת המחקר הושגה במובן שהוא מתאר את דרכי העבודה ואת התנאים להצלחתן, אך הוא מתאר אותן מנקודת מבטן של המורות בלבד.</w:t>
+        <w:t xml:space="preserve">שאלת המחקר עסקה באופן שבו מורות עובדות מול הורים בבתי ספר במגזר הערבי בלוד. התשובה שעלתה היא שהמורות עובדות מול ההורים כגשר. הן מעבירות מידע בערוצים דיגיטליים ובונות יחסים בפגישות פנים אל פנים ובערוצים בלתי פורמליים כמו השער, הגדר והבית. הן פונות להורים קודם כול בחיובי, מזמינות אותם כנותנים, ופועלות בתוך מבנה המשפחה המורחבת והכבוד. השותפות בהחלטות מצומצמת ברמת בית הספר, ומתקיימת בעיקר ביוזמות של מורות יחידות. המסקנה המרכזית היא שהמנהיגות השיתופית בבתי ספר אלה מתקיימת "מלמטה", ושהיא תלויה באנשים יותר מאשר במבנה. טענת המחקר קיבלה חיזוק: הקשר נבנה בעיקר דרך מבנה הקהילה ולא דרך הערוצים הרשמיים, והשותפות הייתה עמוקה יותר במקומות שבהם ההנהלה הקצתה זמן ותפקיד. מטרת המחקר הושגה במובן שהוא מתאר את דרכי העבודה ואת התנאים להצלחתן, אך הוא מתאר אותן מנקודת מבטן של המורות בלבד. תרומת המחקר לידע הקיים היא בתיאור של מנהיגות שיתופית כפי שהיא מתקיימת בבתי ספר ערביים בעיר מעורבת, הקשר שכמעט לא נחקר.</w:t>
       </w:r>
     </w:p>
     <w:p>
@@ -3550,7 +3617,7 @@
           <w:szCs w:val="24"/>
           <w:rtl/>
         </w:rPr>
-        <w:t xml:space="preserve">המחקר התבסס על שמונה ראיונות בלבד, ולכן אי אפשר להכליל ממנו לכלל בתי הספר בלוד. כל המשתתפות היו נשים שמלמדות בבתי ספר ערביים, והמחקר לא כלל מורים גברים, מורים מבתי ספר עבריים בעיר, הורים או מנהלים. הנתונים מבוססים על דיווח עצמי, ולא נבדקו מול מקורות נוספים כמו תצפיות או מסמכים, שהיו יכולים לחזק את תוקף המחקר (הרבון, ל.ת.). חלק מהראיונות נערכו בערבית ותורגמו, והתרגום עלול לשנות דקויות. הראיונות נערכו בידי שתי מראיינות, והיכרותן עם הקהילה עשויה הייתה להשפיע על התשובות.</w:t>
+        <w:t xml:space="preserve">המחקר התבסס על שמונה ראיונות בלבד, ולכן אי אפשר להכליל ממנו לכלל בתי הספר בלוד. כל המשתתפות היו נשים שמלמדות בבתי ספר ערביים, והמחקר לא כלל מורים גברים, מורים מבתי ספר עבריים בעיר, הורים או מנהלים. הנתונים מבוססים על דיווח עצמי, ולא נבדקו מול מקורות נוספים כמו תצפיות או מסמכים, שהיו יכולים לחזק את תוקף המחקר (הרבון, ל.ת.). חלק מהראיונות נערכו בערבית ותורגמו, והתרגום עלול לשנות דקויות. הראיונות נערכו בידי שתי מראיינות, והיכרותן עם הקהילה עשויה הייתה להשפיע על התשובות. גורמים נוספים שעלולים היו להשפיע על התוצאות הם רצייה חברתית, כלומר נטייה להציג את העבודה מול ההורים באור חיובי, והעובדה שרבות מהמשתתפות ממלאות תפקידי ריכוז, ולכן ייתכן שהן מעורבות בקשר עם ההורים יותר ממורה ממוצעת.</w:t>
       </w:r>
     </w:p>
     <w:p>
@@ -5202,16 +5269,180 @@
       <w:pPr>
         <w:bidi/>
         <w:spacing w:after="120" w:before="0" w:line="480" w:lineRule="auto"/>
-        <w:jc w:val="both"/>
-      </w:pPr>
-      <w:r>
-        <w:rPr>
-          <w:rFonts w:ascii="Times New Roman" w:cs="David" w:hAnsi="Times New Roman"/>
-          <w:sz w:val="24"/>
-          <w:szCs w:val="24"/>
-          <w:rtl/>
-        </w:rPr>
-        <w:t xml:space="preserve">[יש לצרף כאן את טופס ההסכמה מדעת שעליו חתמו המרואיינות, ללא פרטים מזהים.]</w:t>
+        <w:jc w:val="center"/>
+      </w:pPr>
+      <w:r>
+        <w:rPr>
+          <w:rFonts w:ascii="Times New Roman" w:cs="David" w:hAnsi="Times New Roman"/>
+          <w:b/>
+          <w:bCs/>
+          <w:sz w:val="24"/>
+          <w:szCs w:val="24"/>
+          <w:rtl/>
+        </w:rPr>
+        <w:t xml:space="preserve">טופס הסכמה להשתתף בראיון</w:t>
+      </w:r>
+    </w:p>
+    <w:p>
+      <w:pPr>
+        <w:bidi/>
+        <w:spacing w:after="120" w:before="0" w:line="480" w:lineRule="auto"/>
+        <w:jc w:val="center"/>
+      </w:pPr>
+      <w:r>
+        <w:rPr>
+          <w:rFonts w:ascii="Times New Roman" w:cs="David" w:hAnsi="Times New Roman"/>
+          <w:b/>
+          <w:bCs/>
+          <w:sz w:val="24"/>
+          <w:szCs w:val="24"/>
+          <w:rtl/>
+        </w:rPr>
+        <w:t xml:space="preserve">עבודת מורים מול הורים בבתי ספר בלוד</w:t>
+      </w:r>
+    </w:p>
+    <w:p>
+      <w:pPr>
+        <w:bidi/>
+        <w:spacing w:after="120" w:before="0" w:line="480" w:lineRule="auto"/>
+        <w:jc w:val="both"/>
+      </w:pPr>
+      <w:r>
+        <w:rPr>
+          <w:rFonts w:ascii="Times New Roman" w:cs="David" w:hAnsi="Times New Roman"/>
+          <w:sz w:val="24"/>
+          <w:szCs w:val="24"/>
+          <w:rtl/>
+        </w:rPr>
+        <w:t xml:space="preserve">שלום למשתתפת במחקר,</w:t>
+      </w:r>
+    </w:p>
+    <w:p>
+      <w:pPr>
+        <w:bidi/>
+        <w:spacing w:after="120" w:before="0" w:line="480" w:lineRule="auto"/>
+        <w:jc w:val="both"/>
+      </w:pPr>
+      <w:r>
+        <w:rPr>
+          <w:rFonts w:ascii="Times New Roman" w:cs="David" w:hAnsi="Times New Roman"/>
+          <w:sz w:val="24"/>
+          <w:szCs w:val="24"/>
+          <w:rtl/>
+        </w:rPr>
+        <w:t xml:space="preserve">במסגרת עבודה סמינריונית בקורס "מנהיגות ופיתוח קהילה בעידן הדיגיטלי" במכללה למנהל, אני פונה אלייך כדי לשמוע על עבודתך מול ההורים בבית הספר: באילו דרכים את מתקשרת עם ההורים, איך נראה שיתוף הפעולה ביניכם, ומה מקשה עליו או עוזר לו. אין תשובות נכונות או שגויות, וחשוב לי לשמוע את הניסיון והתפיסות שלך.</w:t>
+      </w:r>
+    </w:p>
+    <w:p>
+      <w:pPr>
+        <w:bidi/>
+        <w:spacing w:after="120" w:before="0" w:line="480" w:lineRule="auto"/>
+        <w:jc w:val="both"/>
+      </w:pPr>
+      <w:r>
+        <w:rPr>
+          <w:rFonts w:ascii="Times New Roman" w:cs="David" w:hAnsi="Times New Roman"/>
+          <w:sz w:val="24"/>
+          <w:szCs w:val="24"/>
+          <w:rtl/>
+        </w:rPr>
+        <w:t xml:space="preserve">כדי לאפשר לשיחה להתנהל ללא הפרעות, הראיון יוקלט. ההקלטות ישמשו לניתוח הנתונים בלבד ויישמרו במקום מאובטח עד להשמדתן. שמך, שם בית הספר ופרטים מזהים אחרים לא יופיעו בעבודה, והציטוטים יובאו בשם בדוי.</w:t>
+      </w:r>
+    </w:p>
+    <w:p>
+      <w:pPr>
+        <w:bidi/>
+        <w:spacing w:after="120" w:before="0" w:line="480" w:lineRule="auto"/>
+        <w:jc w:val="both"/>
+      </w:pPr>
+      <w:r>
+        <w:rPr>
+          <w:rFonts w:ascii="Times New Roman" w:cs="David" w:hAnsi="Times New Roman"/>
+          <w:sz w:val="24"/>
+          <w:szCs w:val="24"/>
+          <w:rtl/>
+        </w:rPr>
+        <w:t xml:space="preserve">ההשתתפות במחקר היא התנדבותית, ולא יהיו לך השלכות אם תבחרי שלא להשתתף. אינך חייבת לענות על שאלה שלא נוח לך לענות עליה, ואת רשאית להפסיק את הראיון בכל שלב.</w:t>
+      </w:r>
+    </w:p>
+    <w:p>
+      <w:pPr>
+        <w:bidi/>
+        <w:spacing w:after="120" w:before="0" w:line="480" w:lineRule="auto"/>
+        <w:jc w:val="both"/>
+      </w:pPr>
+      <w:r>
+        <w:rPr>
+          <w:rFonts w:ascii="Times New Roman" w:cs="David" w:hAnsi="Times New Roman"/>
+          <w:sz w:val="24"/>
+          <w:szCs w:val="24"/>
+          <w:rtl/>
+        </w:rPr>
+        <w:t xml:space="preserve">השתתפותך תסייע להבנת הקשר בין מורים להורים בלוד, ועשויה לתרום לאנשי חינוך המבקשים לחזק את השותפות בין בית הספר לבית.</w:t>
+      </w:r>
+    </w:p>
+    <w:p>
+      <w:pPr>
+        <w:bidi/>
+        <w:spacing w:after="120" w:before="0" w:line="480" w:lineRule="auto"/>
+        <w:jc w:val="both"/>
+      </w:pPr>
+      <w:r>
+        <w:rPr>
+          <w:rFonts w:ascii="Times New Roman" w:cs="David" w:hAnsi="Times New Roman"/>
+          <w:sz w:val="24"/>
+          <w:szCs w:val="24"/>
+          <w:rtl/>
+        </w:rPr>
+        <w:t xml:space="preserve">תודה על השתתפותך,</w:t>
+      </w:r>
+    </w:p>
+    <w:p>
+      <w:pPr>
+        <w:bidi/>
+        <w:spacing w:after="120" w:before="0" w:line="480" w:lineRule="auto"/>
+        <w:jc w:val="both"/>
+      </w:pPr>
+      <w:r>
+        <w:rPr>
+          <w:rFonts w:ascii="Times New Roman" w:cs="David" w:hAnsi="Times New Roman"/>
+          <w:sz w:val="24"/>
+          <w:szCs w:val="24"/>
+          <w:rtl/>
+        </w:rPr>
+        <w:t xml:space="preserve">חיתאם אבו ריאש</w:t>
+      </w:r>
+    </w:p>
+    <w:p>
+      <w:pPr>
+        <w:bidi/>
+        <w:spacing w:after="120" w:before="0" w:line="480" w:lineRule="auto"/>
+        <w:jc w:val="both"/>
+      </w:pPr>
+      <w:r>
+        <w:rPr>
+          <w:rFonts w:ascii="Times New Roman" w:cs="David" w:hAnsi="Times New Roman"/>
+          <w:sz w:val="24"/>
+          <w:szCs w:val="24"/>
+          <w:rtl/>
+        </w:rPr>
+        <w:t xml:space="preserve">אני החתומה מטה מצהירה כי קראתי את טופס ההסכמה במלואו, אני מבינה את מטרות המחקר ובחתימתי אני מביעה את הסכמתי להשתתף בו.</w:t>
+      </w:r>
+    </w:p>
+    <w:p>
+      <w:pPr>
+        <w:bidi/>
+        <w:spacing w:after="120" w:before="0" w:line="480" w:lineRule="auto"/>
+        <w:jc w:val="both"/>
+      </w:pPr>
+      <w:r>
+        <w:rPr>
+          <w:rFonts w:ascii="Times New Roman" w:cs="David" w:hAnsi="Times New Roman"/>
+          <w:sz w:val="24"/>
+          <w:szCs w:val="24"/>
+          <w:rtl/>
+        </w:rPr>
+        <w:t xml:space="preserve">תאריך: ____________     שם פרטי ומשפחה: ____________________     חתימה: ____________</w:t>
       </w:r>
     </w:p>
     <w:sectPr>

</xml_diff>

<commit_message>
Findings chapter: themes table, separate description from interpretation
Co-Authored-By: Claude Opus 5.5 <noreply@anthropic.com>
Claude-Session: https://claude.ai/code/session_01PCrLuLuf13bgHFN1Akf9GB
</commit_message>
<xml_diff>
--- a/seminar/עבודת סמינר - חיתאם אבו ריאש.docx
+++ b/seminar/עבודת סמינר - חיתאם אבו ריאש.docx
@@ -3000,14 +3000,14 @@
           <w:szCs w:val="24"/>
           <w:rtl/>
         </w:rPr>
-        <w:t xml:space="preserve">מניתוח הראיונות עלו שש תמות. הן מוצגות להלן לפי סדר חשיבותן בדברי המרואיינות, ולצד כל אחת מובאים ציטוטים מדברי המשתתפות. כאשר המרואיינות הביעו עמדות סותרות, הסתירה מוצגת כפי שהן עצמן ראו אותה, וכאשר עמדה עלתה אצל מרואיינת אחת בלבד, הדבר מצוין.</w:t>
-      </w:r>
-    </w:p>
-    <w:p>
-      <w:pPr>
-        <w:pStyle w:val="Heading2"/>
-        <w:bidi/>
-        <w:spacing w:after="120" w:before="240" w:line="480" w:lineRule="auto"/>
+        <w:t xml:space="preserve">מניתוח הראיונות עלו שש תמות. הן מוצגות להלן לפי סדר חשיבותן בדברי המרואיינות, ולצד כל אחת מובאים ציטוטים מדברי המשתתפות. כאשר המרואיינות הביעו עמדות סותרות, הסתירה מוצגת כפי שהן עצמן ראו אותה, וכאשר עמדה עלתה אצל מרואיינת אחת בלבד, הדבר מצוין. בפרק זה מוצגים דברי המשתתפות בלבד, והפרשנות שלהם לאור הספרות מובאת בפרק הדיון. טבלה 2 מסכמת את התמות ואת תתי-התמות.</w:t>
+      </w:r>
+    </w:p>
+    <w:p>
+      <w:pPr>
+        <w:keepNext/>
+        <w:bidi/>
+        <w:spacing w:after="0" w:line="480" w:lineRule="auto"/>
         <w:jc w:val="start"/>
       </w:pPr>
       <w:r>
@@ -3019,6 +3019,797 @@
           <w:szCs w:val="24"/>
           <w:rtl/>
         </w:rPr>
+        <w:t xml:space="preserve">טבלה 2</w:t>
+      </w:r>
+    </w:p>
+    <w:p>
+      <w:pPr>
+        <w:keepNext/>
+        <w:bidi/>
+        <w:spacing w:after="60" w:line="480" w:lineRule="auto"/>
+        <w:jc w:val="start"/>
+      </w:pPr>
+      <w:r>
+        <w:rPr>
+          <w:rFonts w:ascii="Times New Roman" w:cs="David" w:hAnsi="Times New Roman"/>
+          <w:i/>
+          <w:iCs/>
+          <w:sz w:val="24"/>
+          <w:szCs w:val="24"/>
+          <w:rtl/>
+        </w:rPr>
+        <w:t xml:space="preserve">התמות ותתי-התמות שעלו מן הראיונות</w:t>
+      </w:r>
+    </w:p>
+    <w:tbl>
+      <w:tblPr>
+        <w:bidiVisual/>
+        <w:tblW w:type="dxa" w:w="8500"/>
+        <w:tblBorders>
+          <w:top w:val="single" w:color="auto" w:sz="4"/>
+          <w:left w:val="single" w:color="auto" w:sz="4"/>
+          <w:bottom w:val="single" w:color="auto" w:sz="4"/>
+          <w:right w:val="single" w:color="auto" w:sz="4"/>
+          <w:insideH w:val="single" w:color="auto" w:sz="4"/>
+          <w:insideV w:val="single" w:color="auto" w:sz="4"/>
+        </w:tblBorders>
+      </w:tblPr>
+      <w:tblGrid>
+        <w:gridCol w:w="2300"/>
+        <w:gridCol w:w="3600"/>
+        <w:gridCol w:w="2600"/>
+      </w:tblGrid>
+      <w:tr>
+        <w:trPr>
+          <w:tblHeader/>
+        </w:trPr>
+        <w:tc>
+          <w:tcPr>
+            <w:tcW w:type="dxa" w:w="2300"/>
+            <w:tcBorders>
+              <w:top w:val="single" w:color="808080" w:sz="4"/>
+              <w:left w:val="single" w:color="808080" w:sz="4"/>
+              <w:bottom w:val="single" w:color="808080" w:sz="4"/>
+              <w:right w:val="single" w:color="808080" w:sz="4"/>
+            </w:tcBorders>
+            <w:shd w:fill="E7E6E6" w:color="auto" w:val="clear"/>
+            <w:tcMar>
+              <w:top w:type="dxa" w:w="40"/>
+              <w:left w:type="dxa" w:w="80"/>
+              <w:bottom w:type="dxa" w:w="40"/>
+              <w:right w:type="dxa" w:w="80"/>
+            </w:tcMar>
+          </w:tcPr>
+          <w:p>
+            <w:pPr>
+              <w:bidi/>
+              <w:jc w:val="center"/>
+            </w:pPr>
+            <w:r>
+              <w:rPr>
+                <w:rFonts w:ascii="Times New Roman" w:cs="David" w:hAnsi="Times New Roman"/>
+                <w:b/>
+                <w:bCs/>
+                <w:sz w:val="20"/>
+                <w:szCs w:val="20"/>
+                <w:rtl/>
+              </w:rPr>
+              <w:t xml:space="preserve">תמה</w:t>
+            </w:r>
+          </w:p>
+        </w:tc>
+        <w:tc>
+          <w:tcPr>
+            <w:tcW w:type="dxa" w:w="3600"/>
+            <w:tcBorders>
+              <w:top w:val="single" w:color="808080" w:sz="4"/>
+              <w:left w:val="single" w:color="808080" w:sz="4"/>
+              <w:bottom w:val="single" w:color="808080" w:sz="4"/>
+              <w:right w:val="single" w:color="808080" w:sz="4"/>
+            </w:tcBorders>
+            <w:shd w:fill="E7E6E6" w:color="auto" w:val="clear"/>
+            <w:tcMar>
+              <w:top w:type="dxa" w:w="40"/>
+              <w:left w:type="dxa" w:w="80"/>
+              <w:bottom w:type="dxa" w:w="40"/>
+              <w:right w:type="dxa" w:w="80"/>
+            </w:tcMar>
+          </w:tcPr>
+          <w:p>
+            <w:pPr>
+              <w:bidi/>
+              <w:jc w:val="center"/>
+            </w:pPr>
+            <w:r>
+              <w:rPr>
+                <w:rFonts w:ascii="Times New Roman" w:cs="David" w:hAnsi="Times New Roman"/>
+                <w:b/>
+                <w:bCs/>
+                <w:sz w:val="20"/>
+                <w:szCs w:val="20"/>
+                <w:rtl/>
+              </w:rPr>
+              <w:t xml:space="preserve">תתי-תמות</w:t>
+            </w:r>
+          </w:p>
+        </w:tc>
+        <w:tc>
+          <w:tcPr>
+            <w:tcW w:type="dxa" w:w="2600"/>
+            <w:tcBorders>
+              <w:top w:val="single" w:color="808080" w:sz="4"/>
+              <w:left w:val="single" w:color="808080" w:sz="4"/>
+              <w:bottom w:val="single" w:color="808080" w:sz="4"/>
+              <w:right w:val="single" w:color="808080" w:sz="4"/>
+            </w:tcBorders>
+            <w:shd w:fill="E7E6E6" w:color="auto" w:val="clear"/>
+            <w:tcMar>
+              <w:top w:type="dxa" w:w="40"/>
+              <w:left w:type="dxa" w:w="80"/>
+              <w:bottom w:type="dxa" w:w="40"/>
+              <w:right w:type="dxa" w:w="80"/>
+            </w:tcMar>
+          </w:tcPr>
+          <w:p>
+            <w:pPr>
+              <w:bidi/>
+              <w:jc w:val="center"/>
+            </w:pPr>
+            <w:r>
+              <w:rPr>
+                <w:rFonts w:ascii="Times New Roman" w:cs="David" w:hAnsi="Times New Roman"/>
+                <w:b/>
+                <w:bCs/>
+                <w:sz w:val="20"/>
+                <w:szCs w:val="20"/>
+                <w:rtl/>
+              </w:rPr>
+              <w:t xml:space="preserve">ציטוט מייצג</w:t>
+            </w:r>
+          </w:p>
+        </w:tc>
+      </w:tr>
+      <w:tr>
+        <w:trPr>
+          <w:tblHeader w:val="false"/>
+        </w:trPr>
+        <w:tc>
+          <w:tcPr>
+            <w:tcW w:type="dxa" w:w="2300"/>
+            <w:tcBorders>
+              <w:top w:val="single" w:color="808080" w:sz="4"/>
+              <w:left w:val="single" w:color="808080" w:sz="4"/>
+              <w:bottom w:val="single" w:color="808080" w:sz="4"/>
+              <w:right w:val="single" w:color="808080" w:sz="4"/>
+            </w:tcBorders>
+            <w:tcMar>
+              <w:top w:type="dxa" w:w="40"/>
+              <w:left w:type="dxa" w:w="80"/>
+              <w:bottom w:type="dxa" w:w="40"/>
+              <w:right w:type="dxa" w:w="80"/>
+            </w:tcMar>
+          </w:tcPr>
+          <w:p>
+            <w:pPr>
+              <w:bidi/>
+              <w:jc w:val="center"/>
+            </w:pPr>
+            <w:r>
+              <w:rPr>
+                <w:rFonts w:ascii="Times New Roman" w:cs="David" w:hAnsi="Times New Roman"/>
+                <w:b w:val="false"/>
+                <w:sz w:val="20"/>
+                <w:szCs w:val="20"/>
+                <w:rtl/>
+              </w:rPr>
+              <w:t xml:space="preserve">1. המורה כגשר בין בית הספר לקהילה</w:t>
+            </w:r>
+          </w:p>
+        </w:tc>
+        <w:tc>
+          <w:tcPr>
+            <w:tcW w:type="dxa" w:w="3600"/>
+            <w:tcBorders>
+              <w:top w:val="single" w:color="808080" w:sz="4"/>
+              <w:left w:val="single" w:color="808080" w:sz="4"/>
+              <w:bottom w:val="single" w:color="808080" w:sz="4"/>
+              <w:right w:val="single" w:color="808080" w:sz="4"/>
+            </w:tcBorders>
+            <w:tcMar>
+              <w:top w:type="dxa" w:w="40"/>
+              <w:left w:type="dxa" w:w="80"/>
+              <w:bottom w:type="dxa" w:w="40"/>
+              <w:right w:type="dxa" w:w="80"/>
+            </w:tcMar>
+          </w:tcPr>
+          <w:p>
+            <w:pPr>
+              <w:bidi/>
+              <w:jc w:val="center"/>
+            </w:pPr>
+            <w:r>
+              <w:rPr>
+                <w:rFonts w:ascii="Times New Roman" w:cs="David" w:hAnsi="Times New Roman"/>
+                <w:b w:val="false"/>
+                <w:sz w:val="20"/>
+                <w:szCs w:val="20"/>
+                <w:rtl/>
+              </w:rPr>
+              <w:t xml:space="preserve">בית הספר כמוסד שסומכים עליו; מורה מהקהילה ומורה "זרה"; ההקשר העירוני</w:t>
+            </w:r>
+          </w:p>
+        </w:tc>
+        <w:tc>
+          <w:tcPr>
+            <w:tcW w:type="dxa" w:w="2600"/>
+            <w:tcBorders>
+              <w:top w:val="single" w:color="808080" w:sz="4"/>
+              <w:left w:val="single" w:color="808080" w:sz="4"/>
+              <w:bottom w:val="single" w:color="808080" w:sz="4"/>
+              <w:right w:val="single" w:color="808080" w:sz="4"/>
+            </w:tcBorders>
+            <w:tcMar>
+              <w:top w:type="dxa" w:w="40"/>
+              <w:left w:type="dxa" w:w="80"/>
+              <w:bottom w:type="dxa" w:w="40"/>
+              <w:right w:type="dxa" w:w="80"/>
+            </w:tcMar>
+          </w:tcPr>
+          <w:p>
+            <w:pPr>
+              <w:bidi/>
+              <w:jc w:val="center"/>
+            </w:pPr>
+            <w:r>
+              <w:rPr>
+                <w:rFonts w:ascii="Times New Roman" w:cs="David" w:hAnsi="Times New Roman"/>
+                <w:b w:val="false"/>
+                <w:sz w:val="20"/>
+                <w:szCs w:val="20"/>
+                <w:rtl/>
+              </w:rPr>
+              <w:t xml:space="preserve">"מורה מהקהילה היא לא רק מורה, היא גשר" (ריהאם)</w:t>
+            </w:r>
+          </w:p>
+        </w:tc>
+      </w:tr>
+      <w:tr>
+        <w:trPr>
+          <w:tblHeader w:val="false"/>
+        </w:trPr>
+        <w:tc>
+          <w:tcPr>
+            <w:tcW w:type="dxa" w:w="2300"/>
+            <w:tcBorders>
+              <w:top w:val="single" w:color="808080" w:sz="4"/>
+              <w:left w:val="single" w:color="808080" w:sz="4"/>
+              <w:bottom w:val="single" w:color="808080" w:sz="4"/>
+              <w:right w:val="single" w:color="808080" w:sz="4"/>
+            </w:tcBorders>
+            <w:tcMar>
+              <w:top w:type="dxa" w:w="40"/>
+              <w:left w:type="dxa" w:w="80"/>
+              <w:bottom w:type="dxa" w:w="40"/>
+              <w:right w:type="dxa" w:w="80"/>
+            </w:tcMar>
+          </w:tcPr>
+          <w:p>
+            <w:pPr>
+              <w:bidi/>
+              <w:jc w:val="center"/>
+            </w:pPr>
+            <w:r>
+              <w:rPr>
+                <w:rFonts w:ascii="Times New Roman" w:cs="David" w:hAnsi="Times New Roman"/>
+                <w:b w:val="false"/>
+                <w:sz w:val="20"/>
+                <w:szCs w:val="20"/>
+                <w:rtl/>
+              </w:rPr>
+              <w:t xml:space="preserve">2. קשר לעומת מידע</w:t>
+            </w:r>
+          </w:p>
+        </w:tc>
+        <w:tc>
+          <w:tcPr>
+            <w:tcW w:type="dxa" w:w="3600"/>
+            <w:tcBorders>
+              <w:top w:val="single" w:color="808080" w:sz="4"/>
+              <w:left w:val="single" w:color="808080" w:sz="4"/>
+              <w:bottom w:val="single" w:color="808080" w:sz="4"/>
+              <w:right w:val="single" w:color="808080" w:sz="4"/>
+            </w:tcBorders>
+            <w:tcMar>
+              <w:top w:type="dxa" w:w="40"/>
+              <w:left w:type="dxa" w:w="80"/>
+              <w:bottom w:type="dxa" w:w="40"/>
+              <w:right w:type="dxa" w:w="80"/>
+            </w:tcMar>
+          </w:tcPr>
+          <w:p>
+            <w:pPr>
+              <w:bidi/>
+              <w:jc w:val="center"/>
+            </w:pPr>
+            <w:r>
+              <w:rPr>
+                <w:rFonts w:ascii="Times New Roman" w:cs="David" w:hAnsi="Times New Roman"/>
+                <w:b w:val="false"/>
+                <w:sz w:val="20"/>
+                <w:szCs w:val="20"/>
+                <w:rtl/>
+              </w:rPr>
+              <w:t xml:space="preserve">וואטסאפ ומשו"ב; מחירי התקשורת הדיגיטלית; ערוצים בלתי פורמליים</w:t>
+            </w:r>
+          </w:p>
+        </w:tc>
+        <w:tc>
+          <w:tcPr>
+            <w:tcW w:type="dxa" w:w="2600"/>
+            <w:tcBorders>
+              <w:top w:val="single" w:color="808080" w:sz="4"/>
+              <w:left w:val="single" w:color="808080" w:sz="4"/>
+              <w:bottom w:val="single" w:color="808080" w:sz="4"/>
+              <w:right w:val="single" w:color="808080" w:sz="4"/>
+            </w:tcBorders>
+            <w:tcMar>
+              <w:top w:type="dxa" w:w="40"/>
+              <w:left w:type="dxa" w:w="80"/>
+              <w:bottom w:type="dxa" w:w="40"/>
+              <w:right w:type="dxa" w:w="80"/>
+            </w:tcMar>
+          </w:tcPr>
+          <w:p>
+            <w:pPr>
+              <w:bidi/>
+              <w:jc w:val="center"/>
+            </w:pPr>
+            <w:r>
+              <w:rPr>
+                <w:rFonts w:ascii="Times New Roman" w:cs="David" w:hAnsi="Times New Roman"/>
+                <w:b w:val="false"/>
+                <w:sz w:val="20"/>
+                <w:szCs w:val="20"/>
+                <w:rtl/>
+              </w:rPr>
+              <w:t xml:space="preserve">"הודעה זה פתק" (פאטמה)</w:t>
+            </w:r>
+          </w:p>
+        </w:tc>
+      </w:tr>
+      <w:tr>
+        <w:trPr>
+          <w:tblHeader w:val="false"/>
+        </w:trPr>
+        <w:tc>
+          <w:tcPr>
+            <w:tcW w:type="dxa" w:w="2300"/>
+            <w:tcBorders>
+              <w:top w:val="single" w:color="808080" w:sz="4"/>
+              <w:left w:val="single" w:color="808080" w:sz="4"/>
+              <w:bottom w:val="single" w:color="808080" w:sz="4"/>
+              <w:right w:val="single" w:color="808080" w:sz="4"/>
+            </w:tcBorders>
+            <w:tcMar>
+              <w:top w:type="dxa" w:w="40"/>
+              <w:left w:type="dxa" w:w="80"/>
+              <w:bottom w:type="dxa" w:w="40"/>
+              <w:right w:type="dxa" w:w="80"/>
+            </w:tcMar>
+          </w:tcPr>
+          <w:p>
+            <w:pPr>
+              <w:bidi/>
+              <w:jc w:val="center"/>
+            </w:pPr>
+            <w:r>
+              <w:rPr>
+                <w:rFonts w:ascii="Times New Roman" w:cs="David" w:hAnsi="Times New Roman"/>
+                <w:b w:val="false"/>
+                <w:sz w:val="20"/>
+                <w:szCs w:val="20"/>
+                <w:rtl/>
+              </w:rPr>
+              <w:t xml:space="preserve">3. מוזמן ולא מזומן</w:t>
+            </w:r>
+          </w:p>
+        </w:tc>
+        <w:tc>
+          <w:tcPr>
+            <w:tcW w:type="dxa" w:w="3600"/>
+            <w:tcBorders>
+              <w:top w:val="single" w:color="808080" w:sz="4"/>
+              <w:left w:val="single" w:color="808080" w:sz="4"/>
+              <w:bottom w:val="single" w:color="808080" w:sz="4"/>
+              <w:right w:val="single" w:color="808080" w:sz="4"/>
+            </w:tcBorders>
+            <w:tcMar>
+              <w:top w:type="dxa" w:w="40"/>
+              <w:left w:type="dxa" w:w="80"/>
+              <w:bottom w:type="dxa" w:w="40"/>
+              <w:right w:type="dxa" w:w="80"/>
+            </w:tcMar>
+          </w:tcPr>
+          <w:p>
+            <w:pPr>
+              <w:bidi/>
+              <w:jc w:val="center"/>
+            </w:pPr>
+            <w:r>
+              <w:rPr>
+                <w:rFonts w:ascii="Times New Roman" w:cs="David" w:hAnsi="Times New Roman"/>
+                <w:b w:val="false"/>
+                <w:sz w:val="20"/>
+                <w:szCs w:val="20"/>
+                <w:rtl/>
+              </w:rPr>
+              <w:t xml:space="preserve">פנייה חיובית ראשונה; הגדרה מחודשת של "הורה מעורב"</w:t>
+            </w:r>
+          </w:p>
+        </w:tc>
+        <w:tc>
+          <w:tcPr>
+            <w:tcW w:type="dxa" w:w="2600"/>
+            <w:tcBorders>
+              <w:top w:val="single" w:color="808080" w:sz="4"/>
+              <w:left w:val="single" w:color="808080" w:sz="4"/>
+              <w:bottom w:val="single" w:color="808080" w:sz="4"/>
+              <w:right w:val="single" w:color="808080" w:sz="4"/>
+            </w:tcBorders>
+            <w:tcMar>
+              <w:top w:type="dxa" w:w="40"/>
+              <w:left w:type="dxa" w:w="80"/>
+              <w:bottom w:type="dxa" w:w="40"/>
+              <w:right w:type="dxa" w:w="80"/>
+            </w:tcMar>
+          </w:tcPr>
+          <w:p>
+            <w:pPr>
+              <w:bidi/>
+              <w:jc w:val="center"/>
+            </w:pPr>
+            <w:r>
+              <w:rPr>
+                <w:rFonts w:ascii="Times New Roman" w:cs="David" w:hAnsi="Times New Roman"/>
+                <w:b w:val="false"/>
+                <w:sz w:val="20"/>
+                <w:szCs w:val="20"/>
+                <w:rtl/>
+              </w:rPr>
+              <w:t xml:space="preserve">"היא מעורבת" (ריהאם)</w:t>
+            </w:r>
+          </w:p>
+        </w:tc>
+      </w:tr>
+      <w:tr>
+        <w:trPr>
+          <w:tblHeader w:val="false"/>
+        </w:trPr>
+        <w:tc>
+          <w:tcPr>
+            <w:tcW w:type="dxa" w:w="2300"/>
+            <w:tcBorders>
+              <w:top w:val="single" w:color="808080" w:sz="4"/>
+              <w:left w:val="single" w:color="808080" w:sz="4"/>
+              <w:bottom w:val="single" w:color="808080" w:sz="4"/>
+              <w:right w:val="single" w:color="808080" w:sz="4"/>
+            </w:tcBorders>
+            <w:tcMar>
+              <w:top w:type="dxa" w:w="40"/>
+              <w:left w:type="dxa" w:w="80"/>
+              <w:bottom w:type="dxa" w:w="40"/>
+              <w:right w:type="dxa" w:w="80"/>
+            </w:tcMar>
+          </w:tcPr>
+          <w:p>
+            <w:pPr>
+              <w:bidi/>
+              <w:jc w:val="center"/>
+            </w:pPr>
+            <w:r>
+              <w:rPr>
+                <w:rFonts w:ascii="Times New Roman" w:cs="David" w:hAnsi="Times New Roman"/>
+                <w:b w:val="false"/>
+                <w:sz w:val="20"/>
+                <w:szCs w:val="20"/>
+                <w:rtl/>
+              </w:rPr>
+              <w:t xml:space="preserve">4. מעזרה לשותפות</w:t>
+            </w:r>
+          </w:p>
+        </w:tc>
+        <w:tc>
+          <w:tcPr>
+            <w:tcW w:type="dxa" w:w="3600"/>
+            <w:tcBorders>
+              <w:top w:val="single" w:color="808080" w:sz="4"/>
+              <w:left w:val="single" w:color="808080" w:sz="4"/>
+              <w:bottom w:val="single" w:color="808080" w:sz="4"/>
+              <w:right w:val="single" w:color="808080" w:sz="4"/>
+            </w:tcBorders>
+            <w:tcMar>
+              <w:top w:type="dxa" w:w="40"/>
+              <w:left w:type="dxa" w:w="80"/>
+              <w:bottom w:type="dxa" w:w="40"/>
+              <w:right w:type="dxa" w:w="80"/>
+            </w:tcMar>
+          </w:tcPr>
+          <w:p>
+            <w:pPr>
+              <w:bidi/>
+              <w:jc w:val="center"/>
+            </w:pPr>
+            <w:r>
+              <w:rPr>
+                <w:rFonts w:ascii="Times New Roman" w:cs="David" w:hAnsi="Times New Roman"/>
+                <w:b w:val="false"/>
+                <w:sz w:val="20"/>
+                <w:szCs w:val="20"/>
+                <w:rtl/>
+              </w:rPr>
+              <w:t xml:space="preserve">ההורה כנותן ידע; גופי הורים שפותרים בעיות; תנאים להצלחה</w:t>
+            </w:r>
+          </w:p>
+        </w:tc>
+        <w:tc>
+          <w:tcPr>
+            <w:tcW w:type="dxa" w:w="2600"/>
+            <w:tcBorders>
+              <w:top w:val="single" w:color="808080" w:sz="4"/>
+              <w:left w:val="single" w:color="808080" w:sz="4"/>
+              <w:bottom w:val="single" w:color="808080" w:sz="4"/>
+              <w:right w:val="single" w:color="808080" w:sz="4"/>
+            </w:tcBorders>
+            <w:tcMar>
+              <w:top w:type="dxa" w:w="40"/>
+              <w:left w:type="dxa" w:w="80"/>
+              <w:bottom w:type="dxa" w:w="40"/>
+              <w:right w:type="dxa" w:w="80"/>
+            </w:tcMar>
+          </w:tcPr>
+          <w:p>
+            <w:pPr>
+              <w:bidi/>
+              <w:jc w:val="center"/>
+            </w:pPr>
+            <w:r>
+              <w:rPr>
+                <w:rFonts w:ascii="Times New Roman" w:cs="David" w:hAnsi="Times New Roman"/>
+                <w:b w:val="false"/>
+                <w:sz w:val="20"/>
+                <w:szCs w:val="20"/>
+                <w:rtl/>
+              </w:rPr>
+              <w:t xml:space="preserve">"בית הספר מפנה מקום ויוצא מהדרך" (נסרין)</w:t>
+            </w:r>
+          </w:p>
+        </w:tc>
+      </w:tr>
+      <w:tr>
+        <w:trPr>
+          <w:tblHeader w:val="false"/>
+        </w:trPr>
+        <w:tc>
+          <w:tcPr>
+            <w:tcW w:type="dxa" w:w="2300"/>
+            <w:tcBorders>
+              <w:top w:val="single" w:color="808080" w:sz="4"/>
+              <w:left w:val="single" w:color="808080" w:sz="4"/>
+              <w:bottom w:val="single" w:color="808080" w:sz="4"/>
+              <w:right w:val="single" w:color="808080" w:sz="4"/>
+            </w:tcBorders>
+            <w:tcMar>
+              <w:top w:type="dxa" w:w="40"/>
+              <w:left w:type="dxa" w:w="80"/>
+              <w:bottom w:type="dxa" w:w="40"/>
+              <w:right w:type="dxa" w:w="80"/>
+            </w:tcMar>
+          </w:tcPr>
+          <w:p>
+            <w:pPr>
+              <w:bidi/>
+              <w:jc w:val="center"/>
+            </w:pPr>
+            <w:r>
+              <w:rPr>
+                <w:rFonts w:ascii="Times New Roman" w:cs="David" w:hAnsi="Times New Roman"/>
+                <w:b w:val="false"/>
+                <w:sz w:val="20"/>
+                <w:szCs w:val="20"/>
+                <w:rtl/>
+              </w:rPr>
+              <w:t xml:space="preserve">5. כבוד, מגדר ומשפחה מורחבת</w:t>
+            </w:r>
+          </w:p>
+        </w:tc>
+        <w:tc>
+          <w:tcPr>
+            <w:tcW w:type="dxa" w:w="3600"/>
+            <w:tcBorders>
+              <w:top w:val="single" w:color="808080" w:sz="4"/>
+              <w:left w:val="single" w:color="808080" w:sz="4"/>
+              <w:bottom w:val="single" w:color="808080" w:sz="4"/>
+              <w:right w:val="single" w:color="808080" w:sz="4"/>
+            </w:tcBorders>
+            <w:tcMar>
+              <w:top w:type="dxa" w:w="40"/>
+              <w:left w:type="dxa" w:w="80"/>
+              <w:bottom w:type="dxa" w:w="40"/>
+              <w:right w:type="dxa" w:w="80"/>
+            </w:tcMar>
+          </w:tcPr>
+          <w:p>
+            <w:pPr>
+              <w:bidi/>
+              <w:jc w:val="center"/>
+            </w:pPr>
+            <w:r>
+              <w:rPr>
+                <w:rFonts w:ascii="Times New Roman" w:cs="David" w:hAnsi="Times New Roman"/>
+                <w:b w:val="false"/>
+                <w:sz w:val="20"/>
+                <w:szCs w:val="20"/>
+                <w:rtl/>
+              </w:rPr>
+              <w:t xml:space="preserve">הסבתא כסמכות; אבות שאינם מדברים עם מורה; מחלוקות ופחד</w:t>
+            </w:r>
+          </w:p>
+        </w:tc>
+        <w:tc>
+          <w:tcPr>
+            <w:tcW w:type="dxa" w:w="2600"/>
+            <w:tcBorders>
+              <w:top w:val="single" w:color="808080" w:sz="4"/>
+              <w:left w:val="single" w:color="808080" w:sz="4"/>
+              <w:bottom w:val="single" w:color="808080" w:sz="4"/>
+              <w:right w:val="single" w:color="808080" w:sz="4"/>
+            </w:tcBorders>
+            <w:tcMar>
+              <w:top w:type="dxa" w:w="40"/>
+              <w:left w:type="dxa" w:w="80"/>
+              <w:bottom w:type="dxa" w:w="40"/>
+              <w:right w:type="dxa" w:w="80"/>
+            </w:tcMar>
+          </w:tcPr>
+          <w:p>
+            <w:pPr>
+              <w:bidi/>
+              <w:jc w:val="center"/>
+            </w:pPr>
+            <w:r>
+              <w:rPr>
+                <w:rFonts w:ascii="Times New Roman" w:cs="David" w:hAnsi="Times New Roman"/>
+                <w:b w:val="false"/>
+                <w:sz w:val="20"/>
+                <w:szCs w:val="20"/>
+                <w:rtl/>
+              </w:rPr>
+              <w:t xml:space="preserve">"זה לא ערבוב, זה המבנה" (סוהא)</w:t>
+            </w:r>
+          </w:p>
+        </w:tc>
+      </w:tr>
+      <w:tr>
+        <w:trPr>
+          <w:tblHeader w:val="false"/>
+        </w:trPr>
+        <w:tc>
+          <w:tcPr>
+            <w:tcW w:type="dxa" w:w="2300"/>
+            <w:tcBorders>
+              <w:top w:val="single" w:color="808080" w:sz="4"/>
+              <w:left w:val="single" w:color="808080" w:sz="4"/>
+              <w:bottom w:val="single" w:color="808080" w:sz="4"/>
+              <w:right w:val="single" w:color="808080" w:sz="4"/>
+            </w:tcBorders>
+            <w:tcMar>
+              <w:top w:type="dxa" w:w="40"/>
+              <w:left w:type="dxa" w:w="80"/>
+              <w:bottom w:type="dxa" w:w="40"/>
+              <w:right w:type="dxa" w:w="80"/>
+            </w:tcMar>
+          </w:tcPr>
+          <w:p>
+            <w:pPr>
+              <w:bidi/>
+              <w:jc w:val="center"/>
+            </w:pPr>
+            <w:r>
+              <w:rPr>
+                <w:rFonts w:ascii="Times New Roman" w:cs="David" w:hAnsi="Times New Roman"/>
+                <w:b w:val="false"/>
+                <w:sz w:val="20"/>
+                <w:szCs w:val="20"/>
+                <w:rtl/>
+              </w:rPr>
+              <w:t xml:space="preserve">6. ההנהלה, המבנה וההכשרה</w:t>
+            </w:r>
+          </w:p>
+        </w:tc>
+        <w:tc>
+          <w:tcPr>
+            <w:tcW w:type="dxa" w:w="3600"/>
+            <w:tcBorders>
+              <w:top w:val="single" w:color="808080" w:sz="4"/>
+              <w:left w:val="single" w:color="808080" w:sz="4"/>
+              <w:bottom w:val="single" w:color="808080" w:sz="4"/>
+              <w:right w:val="single" w:color="808080" w:sz="4"/>
+            </w:tcBorders>
+            <w:tcMar>
+              <w:top w:type="dxa" w:w="40"/>
+              <w:left w:type="dxa" w:w="80"/>
+              <w:bottom w:type="dxa" w:w="40"/>
+              <w:right w:type="dxa" w:w="80"/>
+            </w:tcMar>
+          </w:tcPr>
+          <w:p>
+            <w:pPr>
+              <w:bidi/>
+              <w:jc w:val="center"/>
+            </w:pPr>
+            <w:r>
+              <w:rPr>
+                <w:rFonts w:ascii="Times New Roman" w:cs="David" w:hAnsi="Times New Roman"/>
+                <w:b w:val="false"/>
+                <w:sz w:val="20"/>
+                <w:szCs w:val="20"/>
+                <w:rtl/>
+              </w:rPr>
+              <w:t xml:space="preserve">מה נחשב תמיכה; סגנונות ניהול; היעדר נוהל, זמן והכשרה</w:t>
+            </w:r>
+          </w:p>
+        </w:tc>
+        <w:tc>
+          <w:tcPr>
+            <w:tcW w:type="dxa" w:w="2600"/>
+            <w:tcBorders>
+              <w:top w:val="single" w:color="808080" w:sz="4"/>
+              <w:left w:val="single" w:color="808080" w:sz="4"/>
+              <w:bottom w:val="single" w:color="808080" w:sz="4"/>
+              <w:right w:val="single" w:color="808080" w:sz="4"/>
+            </w:tcBorders>
+            <w:tcMar>
+              <w:top w:type="dxa" w:w="40"/>
+              <w:left w:type="dxa" w:w="80"/>
+              <w:bottom w:type="dxa" w:w="40"/>
+              <w:right w:type="dxa" w:w="80"/>
+            </w:tcMar>
+          </w:tcPr>
+          <w:p>
+            <w:pPr>
+              <w:bidi/>
+              <w:jc w:val="center"/>
+            </w:pPr>
+            <w:r>
+              <w:rPr>
+                <w:rFonts w:ascii="Times New Roman" w:cs="David" w:hAnsi="Times New Roman"/>
+                <w:b w:val="false"/>
+                <w:sz w:val="20"/>
+                <w:szCs w:val="20"/>
+                <w:rtl/>
+              </w:rPr>
+              <w:t xml:space="preserve">"כל מורה לפי האופי שלה" (מהא)</w:t>
+            </w:r>
+          </w:p>
+        </w:tc>
+      </w:tr>
+    </w:tbl>
+    <w:p>
+      <w:pPr>
+        <w:pStyle w:val="Heading2"/>
+        <w:bidi/>
+        <w:spacing w:after="120" w:before="240" w:line="480" w:lineRule="auto"/>
+        <w:jc w:val="start"/>
+      </w:pPr>
+      <w:r>
+        <w:rPr>
+          <w:rFonts w:ascii="Times New Roman" w:cs="David" w:hAnsi="Times New Roman"/>
+          <w:b/>
+          <w:bCs/>
+          <w:sz w:val="24"/>
+          <w:szCs w:val="24"/>
+          <w:rtl/>
+        </w:rPr>
         <w:t xml:space="preserve">4.1 "היא גשר": המורה בין בית הספר לקהילה</w:t>
       </w:r>
     </w:p>
@@ -3053,7 +3844,7 @@
           <w:szCs w:val="24"/>
           <w:rtl/>
         </w:rPr>
-        <w:t xml:space="preserve">שש מהמורות הן בנות העיר, והן תיארו את השייכות לקהילה כיתרון. ריהאם ביקשה מהמחקר לכתוב "שמורה מהקהילה היא לא רק מורה, היא גשר". אך השייכות גם טשטשה את הגבולות. ההורים פונים אליהן בשבת ובסופר, ופאטמה סיפרה על אמא, שהייתה תלמידה שלה, שבאה לביתה בערב וביקשה לשנות ציון "בשביל הכבוד". ריהאם הואשמה בקבוצת הוואטסאפ של הכיתה שהיא "מעדיפה את הקרובים שלה". המורות שאינן מלוד חוו את הצד השני. נסרין הואשמה שהיא "זרה" שבאה מרמלה, ואמאני שמעה מאב כי "בכפר שלי אולי ככה מתנהגים, אבל בלוד לא". דווקא הזרות התבררה לעיתים כיתרון. נסרין אמרה שהיא "לא 'של' אף אחד", ואמאני סיפרה שהורים מספרים לה דברים שלא יספרו למורה מהשכונה שלהם.</w:t>
+        <w:t xml:space="preserve">שש מהמורות הן בנות העיר, והן תיארו את השייכות לקהילה כיתרון. ריהאם ביקשה מהמחקר לכתוב "שמורה מהקהילה היא לא רק מורה, היא גשר". לצד זה תיארו המורות טשטוש של הגבולות. ריהאם אמרה: "אני לא יודעת תמיד איפה אני מורה ואיפה אני שכנה". ההורים פונים אליהן בשבת ובסופר, ופאטמה סיפרה על אמא, שהייתה תלמידה שלה, שבאה לביתה בערב וביקשה לשנות ציון "בשביל הכבוד". ריהאם הואשמה בקבוצת הוואטסאפ של הכיתה שהיא "מעדיפה את הקרובים שלה". המורות שאינן מלוד חוו את הצד השני. נסרין הואשמה שהיא "זרה" שבאה מרמלה, ואמאני שמעה מאב כי "בכפר שלי אולי ככה מתנהגים, אבל בלוד לא". שתיהן תיארו את הזרות גם כיתרון. נסרין אמרה שהיא "לא 'של' אף אחד", ואמאני סיפרה שהורים מספרים לה דברים שלא יספרו למורה מהשכונה שלהם.</w:t>
       </w:r>
     </w:p>
     <w:p>
@@ -3229,7 +4020,7 @@
           <w:szCs w:val="24"/>
           <w:rtl/>
         </w:rPr>
-        <w:t xml:space="preserve">ברמת בית הספר ההורים שותפים בעיקר בעזרה ובנוכחות: טקסים, טיולים וועד הורים שאוסף כסף. בהחלטות הם כמעט אינם שותפים. ריהאם הסבירה שהסיבה אינה התנגדות של בית הספר, אלא ש"ההורים לא מצפים לזה, ואף אחד לא הציע". בניגוד לכך, יוזמות של המורות עצמן הפכו את ההורים לשותפים בידע. ריהאם הזמינה כל אב לספר לכיתה על עבודתו, ו-28 מתוך 33 האבות הגיעו. בפרויקט הקריאה של סמר הגיעו 26 מתוך 32 משפחות לספר סיפור בכיתה, ונאמר להן שמי שאינו יודע לקרוא יכול לספר בעל פה. ב"שוק הקהילה" שארגנה נסרין הפעילו יותר ממאה הורים דוכנים של מה שהם יודעים לעשות, ובפרויקט "סבתא מספרת" של פאטמה הגיעו 14 סבתות לספר על לוד של פעם.</w:t>
+        <w:t xml:space="preserve">ברמת בית הספר ההורים שותפים בעיקר בעזרה ובנוכחות: טקסים, טיולים וועד הורים שאוסף כסף. בהחלטות הם כמעט אינם שותפים. ריהאם הסבירה שהסיבה אינה התנגדות של בית הספר, אלא ש"ההורים לא מצפים לזה, ואף אחד לא הציע". בניגוד לכך, המורות תיארו יוזמות משלהן שבהן ההורים הוזמנו לתרום מן הידע שלהם. ריהאם הזמינה כל אב לספר לכיתה על עבודתו, ו-28 מתוך 33 האבות הגיעו. בפרויקט הקריאה של סמר הגיעו 26 מתוך 32 משפחות לספר סיפור בכיתה, ונאמר להן שמי שאינו יודע לקרוא יכול לספר בעל פה. ב"שוק הקהילה" שארגנה נסרין הפעילו יותר ממאה הורים דוכנים של מה שהם יודעים לעשות, ובפרויקט "סבתא מספרת" של פאטמה הגיעו 14 סבתות לספר על לוד של פעם.</w:t>
       </w:r>
     </w:p>
     <w:p>
@@ -3299,7 +4090,7 @@
           <w:szCs w:val="24"/>
           <w:rtl/>
         </w:rPr>
-        <w:t xml:space="preserve">למבנה הזה יש מחיר מגדרי. ארבע מורות תיארו אבות שאינם מוכנים לדבר עם אישה, ונעזרו במנהל כדי שדבריהן יישמעו. פאטמה אמרה שאחרי עשרים ושבע שנים "זה עדיין מעליב". במחלוקות הגיעו הורים לבית הספר מלווים בדודים או באחים ונקטו לשון מאיימת. המורות פירשו זאת כביטוי של פחד. מהא אמרה ש"הורה שמגיע עם דודים לא מגיע לריב, הוא מגיע מפוחד", ורנא הוסיפה ש"אמהות באות עם אחים כי הן לא מאמינות שמישהו יקשיב להן לבד". מכאן למדו המורות כלל משותף: לא לענות בשער או בקבוצה, לתת למשבר לעבור, ולפגוש את ההורה ביוזמתן אחרי כמה ימים, אחד על אחד.</w:t>
+        <w:t xml:space="preserve">המורות תיארו גם את המחיר המגדרי של המבנה הזה. ארבע מורות תיארו אבות שאינם מוכנים לדבר עם אישה, ונעזרו במנהל כדי שדבריהן יישמעו. פאטמה אמרה שאחרי עשרים ושבע שנים "זה עדיין מעליב". במחלוקות הגיעו הורים לבית הספר מלווים בדודים או באחים ונקטו לשון מאיימת. המורות פירשו זאת כביטוי של פחד. מהא אמרה ש"הורה שמגיע עם דודים לא מגיע לריב, הוא מגיע מפוחד", ורנא הוסיפה ש"אמהות באות עם אחים כי הן לא מאמינות שמישהו יקשיב להן לבד". מכאן למדו המורות כלל משותף: לא לענות בשער או בקבוצה, לתת למשבר לעבור, ולפגוש את ההורה ביוזמתן אחרי כמה ימים, אחד על אחד.</w:t>
       </w:r>
     </w:p>
     <w:p>

</xml_diff>

<commit_message>
Restructure discussion chapter per course guidance
Co-Authored-By: Claude Opus 5.5 <noreply@anthropic.com>
Claude-Session: https://claude.ai/code/session_01PCrLuLuf13bgHFN1Akf9GB
</commit_message>
<xml_diff>
--- a/seminar/עבודת סמינר - חיתאם אבו ריאש.docx
+++ b/seminar/עבודת סמינר - חיתאם אבו ריאש.docx
@@ -532,7 +532,7 @@
           <w:szCs w:val="24"/>
           <w:rtl/>
         </w:rPr>
-        <w:t xml:space="preserve">בית הספר הוא קהילה של מורים, תלמידים והורים, והוא נטוע בקהילה הרחבה. מודל שיתוף הפעולה הקהילתי (Community Collaboration Model) מציע לשפר את בית הספר באמצעות שותפויות עם משפחות ועם גורמים בקהילה, שמטרתן להסיר חסמים ללמידה שאינם לימודיים, כמו עוני, אלימות במשפחה וקשיים בבריאות הנפש. המודל פועל בחמישה נתיבים, ובהם מעורבות הורים ומשפחות, שירותי בריאות ורווחה ושותפויות קהילתיות. סקירה של 14 מחקרים מצאה שהוא נקשר לנגישות רבה יותר לשירותי בריאות הנפש, לשיפור באקלים הבית ספרי ולירידה בהפניות משמעתיות, וכי התנגדות ראשונית של אנשי חינוך הייתה אחד החסמים ליישומו (Anderson-Butcher et al., 2022). בעתות משבר בולט תפקידו של בית הספר כמוקד קהילתי. מחקר שבחן את משאבי ההתמודדות של 69 מדריכי חינוך חברתי-קהילתי בתקופת הקורונה מצא כי ההתמודדות שלהם נבנתה כתחושת קוהרנטיות, הנשענת על מובנות, משמעותיות ונהילות. אחת המשתתפות תיארה את החינוך החברתי-קהילתי כ"העוגן, המצפן וההגה בתוך ים סוער" (גולדרט, 2024).</w:t>
+        <w:t xml:space="preserve">בית הספר הוא קהילה של מורים, תלמידים והורים, והוא נטוע בקהילה הרחבה. מודל שיתוף הפעולה הקהילתי (Community Collaboration Model) מציע לשפר את בית הספר באמצעות שותפויות עם משפחות ועם גורמים בקהילה, שמטרתן להסיר חסמים ללמידה שאינם לימודיים, כמו עוני וקשיים בבריאות הנפש. סקירה של 14 מחקרים מצאה שהוא נקשר לנגישות רבה יותר לשירותי בריאות הנפש, לשיפור באקלים הבית ספרי ולירידה בהפניות משמעתיות, וכי התנגדות ראשונית של אנשי חינוך הייתה אחד החסמים ליישומו (Anderson-Butcher et al., 2022). בעתות משבר בולט תפקידו של בית הספר כמוקד קהילתי. מחקר שבחן את משאבי ההתמודדות של 69 מדריכי חינוך חברתי-קהילתי בתקופת הקורונה מצא כי ההתמודדות שלהם נבנתה כתחושת קוהרנטיות, הנשענת על מובנות, משמעותיות ונהילות. אחת המשתתפות תיארה את החינוך החברתי-קהילתי כ"העוגן, המצפן וההגה בתוך ים סוער" (גולדרט, 2024).</w:t>
       </w:r>
     </w:p>
     <w:p>
@@ -706,7 +706,7 @@
           <w:szCs w:val="24"/>
           <w:rtl/>
         </w:rPr>
-        <w:t xml:space="preserve">היכולת לראות את המצב מנקודת המבט של ההורה אפשר ללמוד. בקורס פיתוח מקצועי של 20 שעות, שהתבסס על סימולציות של קונפליקטים עם הורים, התייחסו 30 המורים המשתתפים לנקודת המבט של ההורה בתדירות גבוהה יותר, ובאופן חיובי וספציפי יותר, במפגשים שכללו סימולציות (מלץ ואחרים, 2026).</w:t>
+        <w:t xml:space="preserve">אפשר ללמוד לראות את המצב מנקודת המבט של ההורה. בקורס פיתוח מקצועי שהתבסס על סימולציות של קונפליקטים עם הורים, התייחסו המורים לנקודת המבט של ההורה לעיתים קרובות יותר במפגשים שכללו סימולציות (מלץ ואחרים, 2026).</w:t>
       </w:r>
     </w:p>
     <w:p>
@@ -742,7 +742,7 @@
           <w:szCs w:val="24"/>
           <w:rtl/>
         </w:rPr>
-        <w:t xml:space="preserve">בסוף 2019 חיו בלוד 77,224 תושבים, מהם 23,641 ערבים (31%). העיר משויכת לאשכול 4 במדד החברתי-כלכלי, אך כל ארבעת האזורים הסטטיסטיים הערביים בה שייכים לאשכולות 1 ו-2. בבתי הספר היסודיים בעיר תוקצבו בתי ספר בחינוך הערבי בכ-39% פחות מבתי ספר בחינוך העברי מאותו חמישון טיפוח, ובמבחני המיצ"ב נמצאו פערים גדולים במיוחד בכל המקצועות (אבגר ואחרים, 2021). במאי 2021 התפרצו בעיר אירועי אלימות קשים (ברנע, 2024). מחקרים קשרו את המתחים לתהליכי אתנו-ג'נטריפיקציה ולהתיישבות גרעינים תורניים בערים המעורבות (שמריהו-ישורון, 2021), וציינו שהגרעין התורני הראשון בעיר מעורבת הוקם דווקא בלוד, ב-1994 (Shmaryahu-Yeshurun &amp; Monterescu, 2024).</w:t>
+        <w:t xml:space="preserve">בסוף 2019 חיו בלוד 77,224 תושבים, מהם 23,641 ערבים (31%). העיר משויכת לאשכול 4 במדד החברתי-כלכלי, אך כל ארבעת האזורים הסטטיסטיים הערביים בה שייכים לאשכולות 1 ו-2. בבתי הספר היסודיים בעיר תוקצבו בתי ספר בחינוך הערבי בכ-39% פחות מבתי ספר בחינוך העברי מאותו חמישון טיפוח, ובמבחני המיצ"ב נמצאו פערים גדולים במיוחד בכל המקצועות (אבגר ואחרים, 2021). במאי 2021 התפרצו בעיר אירועי אלימות קשים (ברנע, 2024), שנקשרו לתהליכי אתנו-ג'נטריפיקציה ולהתיישבות גרעינים תורניים בערים המעורבות (שמריהו-ישורון, 2021). הגרעין התורני הראשון בעיר מעורבת הוקם בלוד, ב-1994 (Shmaryahu-Yeshurun &amp; Monterescu, 2024).</w:t>
       </w:r>
     </w:p>
     <w:p>
@@ -920,7 +920,7 @@
           <w:szCs w:val="24"/>
           <w:rtl/>
         </w:rPr>
-        <w:t xml:space="preserve">מסורת המחקר שנבחרה היא חקר מקרה, כלומר מחקר של יחידה מוגדרת בסביבתה הטבעית, מתוך כוונה ללמוד ממנה על מקרים דומים (צוות הקורס, 2025א). המקרה הנחקר הוא הקשר בין מורות להורים בבתי ספר במגזר הערבי בלוד. הבחירה בו נובעת מכך שלוד מרכזת מאפיינים של ערים מעורבות אחרות בישראל, כמו פערים חברתיים-כלכליים בין יהודים לערבים, תקשורת מוסדית בעברית ומתחים שהתפרצו במאי 2021 (אבגר ואחרים, 2021), ולכן הממצאים עשויים ללמד גם על בתי ספר ערביים בערים כמו רמלה, עכו ויפו. כדי לקבל מבט רחב על המקרה נכללו בו חמישה בתי ספר, ולא בית ספר אחד.</w:t>
+        <w:t xml:space="preserve">מסורת המחקר שנבחרה היא חקר מקרה, כלומר מחקר של יחידה מוגדרת בסביבתה הטבעית, מתוך כוונה ללמוד ממנה על מקרים דומים (צוות הקורס, 2025א). המקרה הנחקר הוא הקשר בין מורות להורים בבתי ספר במגזר הערבי בלוד. הבחירה בו נובעת מכך שלוד מרכזת מאפיינים של ערים מעורבות אחרות בישראל, כמו פערים חברתיים-כלכליים בין יהודים לערבים, תקשורת מוסדית בעברית ומתחים שהתפרצו במאי 2021 (אבגר ואחרים, 2021), ולכן הממצאים עשויים ללמד גם על בתי ספר ערביים בערים כמו רמלה, עכו ויפו.</w:t>
       </w:r>
     </w:p>
     <w:p>
@@ -2963,7 +2963,7 @@
           <w:szCs w:val="24"/>
           <w:rtl/>
         </w:rPr>
-        <w:t xml:space="preserve">הנתונים נותחו בניתוח תמטי, שמטרתו לזהות את המגמות העולות מתשובות המרואיינים ולגבות אותן בציטוטים. הניתוח כלל ארבעה שלבים: תמלול כל החומר, קריאה חוזרת של התמלילים, מיון לקטגוריות ולתמות, ובחירת ציטוטים להדגמה (שקדי, 2003, כפי שמצוטט אצל הרבון, ל.ת.). בשלב הראשון סומנו בכל ראיון יחידות משמעות. בשלב השני קובצו יחידות דומות לקטגוריות, כמו "ערוצים בלתי פורמליים" או "גיבוי ההנהלה". בשלב השלישי אוחדו הקטגוריות לשש תמות. במקרים של טענות סותרות הוצגה הסתירה כפי שהמרואיינות עצמן ראו אותה, וטענות מרכזיות הוצגו לפני טענות משניות (הרבון, ל.ת.).</w:t>
+        <w:t xml:space="preserve">הנתונים נותחו בניתוח תמטי, שמטרתו לזהות את המגמות העולות מתשובות המרואיינים ולגבות אותן בציטוטים. הניתוח כלל ארבעה שלבים: תמלול כל החומר, קריאה חוזרת של התמלילים, מיון לקטגוריות ולתמות, ובחירת ציטוטים להדגמה (שקדי, 2003, כפי שמצוטט אצל הרבון, ל.ת.). בכל ראיון סומנו יחידות משמעות, יחידות דומות קובצו לקטגוריות, כמו "ערוצים בלתי פורמליים" או "גיבוי ההנהלה", והקטגוריות אוחדו לשש תמות.</w:t>
       </w:r>
     </w:p>
     <w:p>
@@ -4180,7 +4180,26 @@
           <w:szCs w:val="24"/>
           <w:rtl/>
         </w:rPr>
-        <w:t xml:space="preserve">מחקר זה בחן כיצד עובדות מורות מול הורים בבתי ספר במגזר הערבי בלוד. הממצאים מראים שהקשר עם ההורים נבנה בעיקר ביוזמה אישית של מורות. הן פועלות כגשר בין משפחות שחיות בתנאי מצוקה ופחד ובין מערכת שמדברת עברית ומודדת מעורבות באסיפות. להלן יידונו הממצאים לאור הספרות.</w:t>
+        <w:t xml:space="preserve">מחקר זה בחן כיצד עובדות מורות מול הורים בבתי ספר במגזר הערבי בלוד. הממצאים מראים שהמורות פועלות כגשר בין משפחות שחיות במצוקה ובפחד ובין מערכת שמדברת עברית. הן מעבירות מידע בערוצים דיגיטליים ובונות יחסים פנים אל פנים, בשער, ליד הגדר ובבית. הן מזמינות את ההורים כנותני ידע ופועלות בתוך מבנה המשפחה המורחבת, והשותפות שנבנית כך נשענת על יוזמות אישיות ולא על מבנה בית ספרי. להלן יידונו הממצאים לאור הרקע התיאורטי, לפי סדר התמות. הדיון נשען על הציטוטים שהובאו בשמות בדויים ובלי פרטים מזהים של בתי הספר, כפי שהובטח למשתתפות.</w:t>
+      </w:r>
+    </w:p>
+    <w:p>
+      <w:pPr>
+        <w:pStyle w:val="Heading2"/>
+        <w:bidi/>
+        <w:spacing w:after="120" w:before="240" w:line="480" w:lineRule="auto"/>
+        <w:jc w:val="start"/>
+      </w:pPr>
+      <w:r>
+        <w:rPr>
+          <w:rFonts w:ascii="Times New Roman" w:cs="David" w:hAnsi="Times New Roman"/>
+          <w:b/>
+          <w:bCs/>
+          <w:sz w:val="24"/>
+          <w:szCs w:val="24"/>
+          <w:rtl/>
+        </w:rPr>
+        <w:t xml:space="preserve">5.1 בית הספר כגשר בקהילה</w:t>
       </w:r>
     </w:p>
     <w:p>
@@ -4197,7 +4216,7 @@
           <w:szCs w:val="24"/>
           <w:rtl/>
         </w:rPr>
-        <w:t xml:space="preserve">הממצא הראשון נוגע למקומו של בית הספר בקהילה. המורות תיארו את בית הספר כמוסד היחיד שההורים סומכים עליו, כלומר כמקום שבו הקהילה נוכחת, בעיר שבה תושבים רבים חווים את היעדרה ומבקשים לשחזר אותה (וול-טיסר ובליט-כהן, 2023). הדבר מתיישב עם התיאור של החינוך החברתי-קהילתי כ"עוגן" בעת משבר (גולדרט, 2024), ומרחיב אותו: בלוד המשבר אינו אירוע חולף אלא מצב מתמשך של ירי ופחד. לפי ההגדרה שלפיה קהילתיות גבוהה מעידה על אמון במוסדות הקהילה (שדמי-וורטמן, 2017, כפי שמצוטט אצל Fisher &amp; Refael Fanyo, 2022), בית הספר הוא אחד המוסדות הבודדים שבהם האמון הזה עדיין קיים. הפערים שנמצאו בתקצוב ובהישגים בין החינוך הערבי לעברי בלוד (אבגר ואחרים, 2021) מסבירים מדוע המורות חשות שהן נושאות לבדן אחריות שחורגת מתפקידן.</w:t>
+        <w:t xml:space="preserve">המורות תיארו את בית הספר כמוסד היחיד שההורים סומכים עליו, כלומר כמקום שבו הקהילה נוכחת, בעיר שבה תושבים רבים חווים את היעדרה ומבקשים לשחזר אותה (וול-טיסר ובליט-כהן, 2023). לפי ההגדרה שלפיה קהילתיות גבוהה מעידה על אמון במוסדות הקהילה (שדמי-וורטמן, 2017, כפי שמצוטט אצל Fisher &amp; Refael Fanyo, 2022), בית הספר הוא אחד המוסדות הבודדים שבהם האמון הזה עדיין קיים. הדבר מתיישב עם תיאור החינוך החברתי-קהילתי כ"עוגן" בעת משבר (גולדרט, 2024), ומרחיב אותו: בלוד המשבר אינו אירוע חולף אלא מצב מתמשך של ירי ופחד. הפערים בתקצוב בין החינוך הערבי לעברי בעיר (אבגר ואחרים, 2021) עשויים להסביר מדוע המורות חשות שהן נושאות לבדן אחריות שחורגת מתפקידן.</w:t>
       </w:r>
     </w:p>
     <w:p>
@@ -4214,7 +4233,26 @@
           <w:szCs w:val="24"/>
           <w:rtl/>
         </w:rPr>
-        <w:t xml:space="preserve">גם הממצא על הקרבה בין המורות להורים מתיישב עם הספרות. מורות מהשכונה תיארו שיחות בשער ובסופר, וזה דומה מאוד ל"שיחות על המדרכה" שנמצאו אצל הורים שגרים ליד המורים (Fisher &amp; Refael Fanyo, 2022). המחקר הנוכחי מוסיף לכך את מחירה של הקרבה: טשטוש גבולות ומחלוקות שבהן הכבוד המשפחתי מעורב. המורות שאינן מלוד חוו את מה שתואר אצל מורים "חוצי גבולות", ובהם תחושת שייכות שבירה (ארליך-רון וגינדי, 2020). עם זאת, נמצא שהזרות יכולה להפוך ליתרון, משום שמורה שאינה שייכת לאף משפחה אינה צד בסכסוכים.</w:t>
+        <w:t xml:space="preserve">גם הממצא על הקרבה בין המורות להורים מתיישב עם הספרות. מורות מהשכונה תיארו שיחות בשער ובסופר, בדומה ל"שיחות על המדרכה" שנמצאו אצל הורים שגרים ליד המורים (Fisher &amp; Refael Fanyo, 2022). המחקר הנוכחי מוסיף לכך את מחירה של הקרבה: טשטוש גבולות ומחלוקות שבהן הכבוד המשפחתי מעורב. המורות שאינן מלוד חוו את מה שתואר אצל מורים "חוצי גבולות", ובהם נורמות תרבותיות שונות שמעוררות חוויה של שונות (ארליך-רון וגינדי, 2020). עם זאת, הן תיארו את הזרות גם כיתרון, משום שמורה שאינה שייכת לאף משפחה אינה צד בסכסוכים.</w:t>
+      </w:r>
+    </w:p>
+    <w:p>
+      <w:pPr>
+        <w:pStyle w:val="Heading2"/>
+        <w:bidi/>
+        <w:spacing w:after="120" w:before="240" w:line="480" w:lineRule="auto"/>
+        <w:jc w:val="start"/>
+      </w:pPr>
+      <w:r>
+        <w:rPr>
+          <w:rFonts w:ascii="Times New Roman" w:cs="David" w:hAnsi="Times New Roman"/>
+          <w:b/>
+          <w:bCs/>
+          <w:sz w:val="24"/>
+          <w:szCs w:val="24"/>
+          <w:rtl/>
+        </w:rPr>
+        <w:t xml:space="preserve">5.2 ערוצי התקשורת: מידע לעומת יחסים</w:t>
       </w:r>
     </w:p>
     <w:p>
@@ -4231,7 +4269,26 @@
           <w:szCs w:val="24"/>
           <w:rtl/>
         </w:rPr>
-        <w:t xml:space="preserve">בתחום ערוצי התקשורת, הממצאים תואמים את מה שנמצא על קבוצות הוואטסאפ: מעורבות יתר, זמינות מתמדת וטשטוש סמכות (טרגר-סודרי ואחרים, 2025). בלוד נוספו לכך שני ממדים. הראשון הוא הכבוד. הודעה כתובה עלולה להפוך לעניין משפחתי ולהגיע ל"מג'לס", ולכן היא מסוכנת יותר מבמקומות אחרים. השני הוא ההדרה. פערי המיומנות הדיגיטלית שתוארו בספרות (Urbina et al., 2025; אליהו-לוי ורויטר, 2023) מקבלים כאן פנים קונקרטיות של אמהות שאינן קוראות, אבות שאינם בקבוצה וסבתות שמגדלות נכדים. התשובה של המורות הייתה חלוקת עבודה: ערוץ דיגיטלי למידע וערוץ אישי ליחסים. הערוצים הבלתי פורמליים, השער, הגדר והבית, הם המקומות שבהם נבנה הקשר.</w:t>
+        <w:t xml:space="preserve">הממצאים תואמים את מה שנמצא על קבוצות הוואטסאפ הכיתתיות: מעורבות יתר, זמינות מתמדת וטשטוש סמכות (טרגר-סודרי ואחרים, 2025). בלוד נוספו לכך שני ממדים. הראשון הוא הכבוד. הודעה כתובה עלולה להפוך לעניין משפחתי ולהגיע ל"מג'לס", ולכן היא מסוכנת יותר. השני הוא ההדרה. פערי המיומנות הדיגיטלית שתוארו בספרות (Urbina et al., 2025; אליהו-לוי ורויטר, 2023) מקבלים כאן פנים קונקרטיות של אמהות שאינן קוראות, אבות שאינם בקבוצה וסבתות שמגדלות נכדים. התשובה של המורות הייתה חלוקת עבודה בין ערוץ דיגיטלי למידע ובין ערוצים אישיים ליחסים. מחקרים קודמים עסקו בעיקר בערוצים הרשמיים, ואילו כאן נמצא שהערוצים הבלתי פורמליים הם המקום המרכזי שבו נבנה הקשר.</w:t>
+      </w:r>
+    </w:p>
+    <w:p>
+      <w:pPr>
+        <w:pStyle w:val="Heading2"/>
+        <w:bidi/>
+        <w:spacing w:after="120" w:before="240" w:line="480" w:lineRule="auto"/>
+        <w:jc w:val="start"/>
+      </w:pPr>
+      <w:r>
+        <w:rPr>
+          <w:rFonts w:ascii="Times New Roman" w:cs="David" w:hAnsi="Times New Roman"/>
+          <w:b/>
+          <w:bCs/>
+          <w:sz w:val="24"/>
+          <w:szCs w:val="24"/>
+          <w:rtl/>
+        </w:rPr>
+        <w:t xml:space="preserve">5.3 מזימון להזמנה, ומעזרה לשותפות</w:t>
       </w:r>
     </w:p>
     <w:p>
@@ -4248,7 +4305,7 @@
           <w:szCs w:val="24"/>
           <w:rtl/>
         </w:rPr>
-        <w:t xml:space="preserve">נמצא גם פער מעניין לעומת הספרות על עמדות מורים. מחקרים קודמים מצאו שמורים מבקשים להגביל את מעורבות ההורים (Fisher &amp; Baissberg, 2025) ומקיימים תקשורת חד-כיוונית (ענבר-פירסט ואחרים, 2023). המורות במחקר זה אמנם יוזמות את רוב הקשר, אך רבות מהן ביקשו להרחיב את שותפות ההורים, גם בהחלטות. שתי ההבחנות של המורות, בין הורה "מזומן" להורה "מוזמן" ובין הורה "לא מעורב" להורה "שקוע", מזכירות את ההבחנה בין פעולה למען הקהילה לפעולה עמה (גולדרט ועמרם-אשרוב, 2023). היוזמות שתוארו, כמו "שוק הקהילה" ו"צוות ההורים", הן דוגמאות לפיתוח קהילה, שבו בית הספר "מפנה מקום" במקום לנהל. כך גם "בוקר הקפה" וחדר ההורים שהמורות ביקשו, שמממשים את רעיון "השולחן העגול" (אחיטוב והרצוג, 2022).</w:t>
+        <w:t xml:space="preserve">נמצא פער לעומת הספרות על עמדות מורים. מחקרים קודמים מצאו שמורים מבקשים להגביל את מעורבות ההורים (Fisher &amp; Baissberg, 2025) ומקיימים תקשורת חד-כיוונית (ענבר-פירסט ואחרים, 2023). המורות במחקר זה אמנם יוזמות את רוב הקשר, אך רבות מהן ביקשו להרחיב את שותפות ההורים, גם בהחלטות. ההבחנה שלהן בין הורה "מזומן" להורה "מוזמן" מזכירה את ההבחנה בין פעולה למען הקהילה לפעולה עמה (גולדרט ועמרם-אשרוב, 2023), ו"בוקר הקפה" ממחיש את רעיון "השולחן העגול" (אחיטוב והרצוג, 2022).</w:t>
       </w:r>
     </w:p>
     <w:p>
@@ -4265,7 +4322,26 @@
           <w:szCs w:val="24"/>
           <w:rtl/>
         </w:rPr>
-        <w:t xml:space="preserve">הממצאים מאירים גם את הדיון על מעורבות הורים בחברה הערבית. מחקר קודם תיאר מעורבות נמוכה מסוג "צופים" (גרינבנק ובנג'ו, 2021, כפי שמצוטט אצל בנג'ו ובדיר, 2024). המחקר הנוכחי מצא שכשההורים הוזמנו כנותנים, כמו האבות שסיפרו על עבודתם או הסבתות שסיפרו על לוד, הגיעו רובם. זה מתיישב עם הממצא שמעורבות ההורים הערבים משתנה לפי המסגרת והנסיבות (בנג'ו ובדיר, 2024). שיתוף הפעולה בצוות ההורים של מהא הוביל להורים שהציעו פתרון בעצמם, וזה תואם את הקשר שנמצא בין שיתוף פעולה עם מורים ובין בקשת עזרה אוטונומית (Grinshtain &amp; Harpaz, 2023). דברי המורות על כך שהקשר עם ההורים מונע נשירה תואמים את הממצא על הקשר בין מעורבות הורים לנשירה בחברה הערבית (אבו עג'אג', 2016). ההבנה שאמא שאינה קוראת אבל "יושבת ליד הילד" היא מעורבת מתיישבת עם הממצא שציפיות ההורים חשובות יותר מפיקוח (Erdem &amp; Kaya, 2020).</w:t>
+        <w:t xml:space="preserve">הממצאים מאירים גם את הדיון על מעורבות הורים בחברה הערבית. מחקר קודם תיאר מעורבות נמוכה מסוג "צופים" (גרינבנק ובנג'ו, 2021, כפי שמצוטט אצל בנג'ו ובדיר, 2024). במחקר הנוכחי, כשההורים הוזמנו כנותנים, הגיעו רובם, וזה מתיישב עם הממצא שמעורבות ההורים הערבים משתנה לפי המסגרת והנסיבות (בנג'ו ובדיר, 2024). בצוות ההורים של מהא הציעו ההורים פתרון בעצמם, בהתאם לקשר שנמצא בין שיתוף פעולה עם מורים ובין בקשת עזרה אוטונומית (Grinshtain &amp; Harpaz, 2023). דברי המורות על כך שהקשר עם ההורים מונע נשירה תואמים את הממצא על הקשר בין מעורבות הורים לנשירה בחברה הערבית (אבו עג'אג', 2016), וההכרה בכך שאמא שאינה קוראת אבל "יושבת ליד הילד" היא מעורבת מתיישבת עם הממצא שציפיות ההורים חשובות יותר מפיקוח (Erdem &amp; Kaya, 2020).</w:t>
+      </w:r>
+    </w:p>
+    <w:p>
+      <w:pPr>
+        <w:pStyle w:val="Heading2"/>
+        <w:bidi/>
+        <w:spacing w:after="120" w:before="240" w:line="480" w:lineRule="auto"/>
+        <w:jc w:val="start"/>
+      </w:pPr>
+      <w:r>
+        <w:rPr>
+          <w:rFonts w:ascii="Times New Roman" w:cs="David" w:hAnsi="Times New Roman"/>
+          <w:b/>
+          <w:bCs/>
+          <w:sz w:val="24"/>
+          <w:szCs w:val="24"/>
+          <w:rtl/>
+        </w:rPr>
+        <w:t xml:space="preserve">5.4 עבודה בתוך מבנה הקהילה</w:t>
       </w:r>
     </w:p>
     <w:p>
@@ -4282,7 +4358,26 @@
           <w:szCs w:val="24"/>
           <w:rtl/>
         </w:rPr>
-        <w:t xml:space="preserve">בתחום המנהיגות, הממצאים מצביעים על מנהיגות מבוזרת שמתקיימת בפועל אך אינה מעוגנת במבנה. רכזות שכבה, רכזת קהילה ורכזת חינוך חברתי הובילו יוזמות, ואפשר לראות בהן מורות-מנהיגות במובן של "זהות מקפית" (ברוזה וחמו, 2022). המורות פעלו הרבה מעבר לתפקידן, כפי שמתואר בספרות על הקשר בין מנהיגות משתפת להתנהגות אזרחית ארגונית (קאהן ואחרים, 2026). אך כשהמנהיגות המבוזרת נשענת על אנשים ולא על מבנה, היא תלויה במנהל ועלולה להיעלם. הדבר מזכיר את הטענה שיש דפוסי ביזור יעילים יותר מאחרים (Harris et al., 2022). השקיפות והפתיחות שתוארו אצל מנהלים (ברוכי ואזולאי, 2023) נמצאו גם כאן, אך לא תורגמו למבנה. היעדר ההכשרה והליווי מתיישב עם מה שנמצא אצל מורים חדשים, שפועלים אינטואיטיבית ונשענים על מורות חונכות (עזריה וצר ואחרים, 2024), ועם המורכבות הרגשית שבשותפות (כורם, 2022).</w:t>
+        <w:t xml:space="preserve">המורות לא ניסו לשנות את מבנה הקהילה אלא לעבוד דרכו: לפנות לסבתא, להיעזר בזקני המשפחה ולהושיב משפחות חלשות בשורה הראשונה. גישה זו מתיישבת עם ההמלצה על התערבות מותאמת תרבות בעבודה עם הורים ערבים (Grinshtain &amp; Harpaz, 2023), ועם גישת פיתוח הקהילה, שבה הקהילה עצמה שותפה לתהליך (גולדרט ועמרם-אשרוב, 2023). מועצת הקהילה שהקימה סוהא, לצד ועד ההורים הנבחר, היא דוגמה למבנה כזה. עם זאת, הממצאים חושפים את המחיר המגדרי של עבודה בתוך המבנה: מורות שאבות אינם מוכנים לדבר איתן נזקקות לתיווך של גבר כדי שדבריהן יישמעו. בספרות שנסקרה לא נמצא דיון בממד זה.</w:t>
+      </w:r>
+    </w:p>
+    <w:p>
+      <w:pPr>
+        <w:pStyle w:val="Heading2"/>
+        <w:bidi/>
+        <w:spacing w:after="120" w:before="240" w:line="480" w:lineRule="auto"/>
+        <w:jc w:val="start"/>
+      </w:pPr>
+      <w:r>
+        <w:rPr>
+          <w:rFonts w:ascii="Times New Roman" w:cs="David" w:hAnsi="Times New Roman"/>
+          <w:b/>
+          <w:bCs/>
+          <w:sz w:val="24"/>
+          <w:szCs w:val="24"/>
+          <w:rtl/>
+        </w:rPr>
+        <w:t xml:space="preserve">5.5 מנהיגות שיתופית ללא מבנה</w:t>
       </w:r>
     </w:p>
     <w:p>
@@ -4299,7 +4394,26 @@
           <w:szCs w:val="24"/>
           <w:rtl/>
         </w:rPr>
-        <w:t xml:space="preserve">הבקשות של המורות לעובדת סוציאלית, למרכז הורים, למגרשים ולתקשורת עירונית בערבית מתאימות לרעיון של מודל שיתוף הפעולה הקהילתי, שלפיו בית הספר צריך לטפל גם בחסמים שאינם לימודיים באמצעות שותפויות עם שירותי הרווחה והקהילה (Anderson-Butcher et al., 2022). המורות לא תיארו שותפויות כאלה כקיימות. הן תיארו את עצמן כממלאות את החלל הזה בגופן: מתרגמות, מלוות משפחות לרווחה ומגשרות בסכסוכים.</w:t>
+        <w:t xml:space="preserve">הממצאים מצביעים על מנהיגות מבוזרת שמתקיימת בפועל אך אינה מעוגנת במבנה. רכזות שכבה, רכזת קהילה ורכזת חינוך חברתי הובילו יוזמות, ואפשר לראות בהן מורות-מנהיגות במובן של "זהות מקפית" (ברוזה וחמו, 2022). המורות פעלו הרבה מעבר לתפקידן, כפי שמתואר בספרות על הקשר בין מנהיגות משתפת להתנהגות אזרחית ארגונית (קאהן ואחרים, 2026). אך כשהמנהיגות המבוזרת נשענת על אנשים ולא על מבנה, היא תלויה במנהל ועלולה להיעלם, וזה מזכיר את הטענה שיש דפוסי ביזור יעילים יותר מאחרים (Harris et al., 2022). השקיפות והפתיחות שתוארו אצל מנהלים (ברוכי ואזולאי, 2023) נמצאו גם כאן, אך לא תורגמו למבנה. היעדר ההכשרה והליווי מתיישב עם מה שנמצא אצל מורים חדשים, שפועלים אינטואיטיבית ונשענים על מורות חונכות (עזריה וצר ואחרים, 2024), ועם המורכבות הרגשית שבשותפות (כורם, 2022). הבקשות של המורות לעובדת סוציאלית, למרכז הורים ולתקשורת עירונית בערבית מתאימות למודל שיתוף הפעולה הקהילתי, שלפיו בית הספר מטפל גם בחסמים שאינם לימודיים באמצעות שותפויות עם שירותי הרווחה והקהילה (Anderson-Butcher et al., 2022). המורות לא תיארו שותפויות כאלה כקיימות, אלא את עצמן כמי שממלאות את החלל.</w:t>
+      </w:r>
+    </w:p>
+    <w:p>
+      <w:pPr>
+        <w:pStyle w:val="Heading2"/>
+        <w:bidi/>
+        <w:spacing w:after="120" w:before="240" w:line="480" w:lineRule="auto"/>
+        <w:jc w:val="start"/>
+      </w:pPr>
+      <w:r>
+        <w:rPr>
+          <w:rFonts w:ascii="Times New Roman" w:cs="David" w:hAnsi="Times New Roman"/>
+          <w:b/>
+          <w:bCs/>
+          <w:sz w:val="24"/>
+          <w:szCs w:val="24"/>
+          <w:rtl/>
+        </w:rPr>
+        <w:t xml:space="preserve">5.6 תובנות חדשות, השערות וכיווני מחקר</w:t>
       </w:r>
     </w:p>
     <w:p>
@@ -4316,7 +4430,24 @@
           <w:szCs w:val="24"/>
           <w:rtl/>
         </w:rPr>
-        <w:t xml:space="preserve">מן הממצאים אפשר להעלות השערה לגבי משמעותם. ייתכן שהמעורבות שנראית "נמוכה" בבתי ספר ערביים אינה ביטוי לחוסר עניין של ההורים, אלא לפער בין הערוצים שהמערכת מציעה ובין הערוצים שבהם הקהילה פועלת. לפי השערה זו, כשבית הספר עובר לערוצים של הקהילה, כמו השער, הבית והסבתא, המעורבות עולה. השערה נוספת היא שהיעדר מבנה מערכתי מעביר את מחיר השותפות אל המורות, ובמיוחד אל מורות בנות הקהילה, וכי מחיר זה עלול להוביל לשחיקה. כדי לבחון את ההשערות מוצע לערוך מחקרי המשך שישמעו את ההורים עצמם, ובכללם הסבתות והאבות, ישוו לבתי ספר בחינוך העברי בעיר ובערים מעורבות אחרות, ויבחנו לאורך זמן את השפעתן של יוזמות כמו צוות הורים או רכזת קהילה על היעדרויות ועל נשירה.</w:t>
+        <w:t xml:space="preserve">הממצאים תומכים בטענת המחקר ומאששים ממצאים קודמים על מחירי התקשורת הדיגיטלית ועל היעדר הכשרה לעבודה עם הורים. לצד זאת, המחקר מציע שלוש תובנות חדשות. ראשית, הערוצים הבלתי פורמליים אינם שוליים אלא מרכזיים בבניית הקשר. שנית, בניגוד לספרות שלפיה מורים מבקשים להגביל את מעורבות ההורים, המורות ביקשו להרחיב אותה. שלישית, בית הספר הערבי בעיר מעורבת מתפקד כמוסד קהילתי שמגשר בין הקהילה למערכת, ותפקיד זה מוטל בפועל על המורות.</w:t>
+      </w:r>
+    </w:p>
+    <w:p>
+      <w:pPr>
+        <w:bidi/>
+        <w:spacing w:after="120" w:before="0" w:line="480" w:lineRule="auto"/>
+        <w:ind w:firstLine="567"/>
+        <w:jc w:val="both"/>
+      </w:pPr>
+      <w:r>
+        <w:rPr>
+          <w:rFonts w:ascii="Times New Roman" w:cs="David" w:hAnsi="Times New Roman"/>
+          <w:sz w:val="24"/>
+          <w:szCs w:val="24"/>
+          <w:rtl/>
+        </w:rPr>
+        <w:t xml:space="preserve">מכאן אפשר להעלות שתי השערות. האחת, ייתכן שהמעורבות שנראית "נמוכה" בבתי ספר ערביים אינה ביטוי לחוסר עניין של ההורים, אלא לפער בין הערוצים שהמערכת מציעה ובין הערוצים שבהם הקהילה פועלת. השנייה, ייתכן שהיעדר מבנה מערכתי מעביר את מחיר השותפות אל המורות, ובמיוחד אל מורות בנות הקהילה, ושמחיר זה עלול להוביל לשחיקה. כדי לבחון את ההשערות מוצע לערוך מחקרי המשך שישמעו את ההורים עצמם, ובכללם הסבתות והאבות, ישוו לבתי ספר בחינוך העברי בעיר ובערים מעורבות אחרות, ויבחנו לאורך זמן את השפעתן של יוזמות כמו צוות הורים או רכזת קהילה על היעדרויות ועל נשירה.</w:t>
       </w:r>
     </w:p>
     <w:p>
@@ -4372,7 +4503,7 @@
           <w:szCs w:val="24"/>
           <w:rtl/>
         </w:rPr>
-        <w:t xml:space="preserve">שאלת המחקר עסקה באופן שבו מורות עובדות מול הורים בבתי ספר במגזר הערבי בלוד. התשובה שעלתה היא שהמורות עובדות מול ההורים כגשר. הן מעבירות מידע בערוצים דיגיטליים ובונות יחסים בפגישות פנים אל פנים ובערוצים בלתי פורמליים כמו השער, הגדר והבית. הן פונות להורים קודם כול בחיובי, מזמינות אותם כנותנים, ופועלות בתוך מבנה המשפחה המורחבת והכבוד. השותפות בהחלטות מצומצמת ברמת בית הספר, ומתקיימת בעיקר ביוזמות של מורות יחידות. המסקנה המרכזית היא שהמנהיגות השיתופית בבתי ספר אלה מתקיימת "מלמטה", ושהיא תלויה באנשים יותר מאשר במבנה. טענת המחקר קיבלה חיזוק: הקשר נבנה בעיקר דרך מבנה הקהילה ולא דרך הערוצים הרשמיים, והשותפות הייתה עמוקה יותר במקומות שבהם ההנהלה הקצתה זמן ותפקיד. מטרת המחקר הושגה במובן שהוא מתאר את דרכי העבודה ואת התנאים להצלחתן, אך הוא מתאר אותן מנקודת מבטן של המורות בלבד. תרומת המחקר לידע הקיים היא בתיאור של מנהיגות שיתופית כפי שהיא מתקיימת בבתי ספר ערביים בעיר מעורבת, הקשר שכמעט לא נחקר.</w:t>
+        <w:t xml:space="preserve">שאלת המחקר עסקה באופן שבו מורות עובדות מול הורים בבתי ספר במגזר הערבי בלוד. התשובה שעלתה היא שהמורות עובדות מול ההורים כגשר: מידע עובר בערוצים דיגיטליים, והיחסים נבנים פנים אל פנים, מתוך פנייה חיובית, הזמנה של ההורים כנותנים ועבודה בתוך מבנה המשפחה המורחבת. השותפות בהחלטות מצומצמת ברמת בית הספר ומתקיימת בעיקר ביוזמות של מורות יחידות. המסקנה המרכזית היא שהמנהיגות השיתופית בבתי ספר אלה מתקיימת "מלמטה", ושהיא תלויה באנשים יותר מאשר במבנה. טענת המחקר קיבלה חיזוק: הקשר נבנה בעיקר דרך מבנה הקהילה ולא דרך הערוצים הרשמיים, והשותפות הייתה עמוקה יותר במקומות שבהם ההנהלה הקצתה זמן ותפקיד. מטרת המחקר הושגה במובן שהוא מתאר את דרכי העבודה ואת התנאים להצלחתן, אך הוא מתאר אותן מנקודת מבטן של המורות בלבד. תרומת המחקר לידע הקיים היא בתיאור של מנהיגות שיתופית כפי שהיא מתקיימת בבתי ספר ערביים בעיר מעורבת, הקשר שכמעט לא נחקר.</w:t>
       </w:r>
     </w:p>
     <w:p>
@@ -4444,7 +4575,7 @@
           <w:szCs w:val="24"/>
           <w:rtl/>
         </w:rPr>
-        <w:t xml:space="preserve">ברמת המורה מומלץ לפתוח את השנה בשיחה חיובית עם כל הורה לפני שמתעוררות בעיות, לקבוע כלל שלפיו נושאים טעונים נדונים בפגישה ולא בהודעה, ולבקש מההורים דברים שהם יכולים לתת. ברמת בית הספר מומלץ להקצות בכל שבוע שעה במערכת השעות של כל מחנכת לקשר עם הורים, להקים תפקיד של רכזת הורים וקהילה עם שעות קבועות, ולהקים בכל שכבה צוות הורים שהבעיות מובאות אליו לפני שמתקבלת החלטה. כמו כן, מומלץ שהמנהל יחזיר את ההורה למחנכת אחרי שהרגיע משבר, ושכל מחנכת חדשה תקבל ליווי שבועי של מחנכת ותיקה בשנתה הראשונה. ההכשרה צריכה להיות מותאמת לחברה הערבית בעיר מעורבת, ויכולה לכלול סימולציות של שיחות קשות (מלץ ואחרים, 2026). ברמת העירייה מומלץ שכל הודעה להורים תישלח גם בערבית, ושיוקם בכל שכונה ערבית מרכז הורים עם עובדת סוציאלית ועם קורסים בקריאה, בעברית ובמיומנויות דיגיטליות. במחקרי המשך כדאי לשמוע את ההורים עצמם, ובכללם הסבתות, ולהשוות לבתי ספר בחינוך העברי בעיר.</w:t>
+        <w:t xml:space="preserve">ברמת המורה מומלץ לפתוח את השנה בשיחה חיובית עם כל הורה לפני שמתעוררות בעיות, לקבוע כלל שלפיו נושאים טעונים נדונים בפגישה ולא בהודעה, ולבקש מההורים דברים שהם יכולים לתת. ברמת בית הספר מומלץ להקצות בכל שבוע שעה במערכת השעות של כל מחנכת לקשר עם הורים, להקים תפקיד של רכזת הורים וקהילה עם שעות קבועות, ולהקים בכל שכבה צוות הורים שהבעיות מובאות אליו לפני שמתקבלת החלטה. כמו כן, מומלץ שהמנהל יחזיר את ההורה למחנכת אחרי שהרגיע משבר, ושכל מחנכת חדשה תקבל ליווי שבועי של מחנכת ותיקה בשנתה הראשונה. ההכשרה צריכה להיות מותאמת לחברה הערבית בעיר מעורבת, ויכולה לכלול סימולציות של שיחות קשות (מלץ ואחרים, 2026). ברמת העירייה מומלץ שכל הודעה להורים תישלח גם בערבית, ושיוקם בכל שכונה ערבית מרכז הורים עם עובדת סוציאלית ועם קורסים בקריאה, בעברית ובמיומנויות דיגיטליות.</w:t>
       </w:r>
     </w:p>
     <w:p>

</xml_diff>

<commit_message>
Use Word-compatible RTL alignment and indent values
Co-Authored-By: Claude Opus 5.5 <noreply@anthropic.com>
Claude-Session: https://claude.ai/code/session_01PCrLuLuf13bgHFN1Akf9GB
</commit_message>
<xml_diff>
--- a/seminar/עבודת סמינר - חיתאם אבו ריאש.docx
+++ b/seminar/עבודת סמינר - חיתאם אבו ריאש.docx
@@ -336,7 +336,7 @@
           <w:pPr>
             <w:bidi/>
             <w:tabs>
-              <w:tab w:val="end" w:leader="dot" w:pos="9072"/>
+              <w:tab w:val="right" w:leader="dot" w:pos="9072"/>
             </w:tabs>
             <w:spacing w:before="0" w:after="20" w:line="252" w:lineRule="auto"/>
           </w:pPr>
@@ -383,7 +383,7 @@
           <w:pPr>
             <w:bidi/>
             <w:tabs>
-              <w:tab w:val="end" w:leader="dot" w:pos="9072"/>
+              <w:tab w:val="right" w:leader="dot" w:pos="9072"/>
             </w:tabs>
             <w:spacing w:before="0" w:after="20" w:line="252" w:lineRule="auto"/>
           </w:pPr>
@@ -421,7 +421,7 @@
           <w:pPr>
             <w:bidi/>
             <w:tabs>
-              <w:tab w:val="end" w:leader="dot" w:pos="9072"/>
+              <w:tab w:val="right" w:leader="dot" w:pos="9072"/>
             </w:tabs>
             <w:spacing w:before="0" w:after="20" w:line="252" w:lineRule="auto"/>
           </w:pPr>
@@ -459,10 +459,10 @@
           <w:pPr>
             <w:bidi/>
             <w:tabs>
-              <w:tab w:val="end" w:leader="dot" w:pos="9072"/>
+              <w:tab w:val="right" w:leader="dot" w:pos="9072"/>
             </w:tabs>
             <w:spacing w:before="0" w:after="20" w:line="252" w:lineRule="auto"/>
-            <w:ind w:start="567"/>
+            <w:ind w:left="567"/>
           </w:pPr>
           <w:r>
             <w:rPr>
@@ -496,10 +496,10 @@
           <w:pPr>
             <w:bidi/>
             <w:tabs>
-              <w:tab w:val="end" w:leader="dot" w:pos="9072"/>
+              <w:tab w:val="right" w:leader="dot" w:pos="9072"/>
             </w:tabs>
             <w:spacing w:before="0" w:after="20" w:line="252" w:lineRule="auto"/>
-            <w:ind w:start="567"/>
+            <w:ind w:left="567"/>
           </w:pPr>
           <w:r>
             <w:rPr>
@@ -533,10 +533,10 @@
           <w:pPr>
             <w:bidi/>
             <w:tabs>
-              <w:tab w:val="end" w:leader="dot" w:pos="9072"/>
+              <w:tab w:val="right" w:leader="dot" w:pos="9072"/>
             </w:tabs>
             <w:spacing w:before="0" w:after="20" w:line="252" w:lineRule="auto"/>
-            <w:ind w:start="567"/>
+            <w:ind w:left="567"/>
           </w:pPr>
           <w:r>
             <w:rPr>
@@ -570,10 +570,10 @@
           <w:pPr>
             <w:bidi/>
             <w:tabs>
-              <w:tab w:val="end" w:leader="dot" w:pos="9072"/>
+              <w:tab w:val="right" w:leader="dot" w:pos="9072"/>
             </w:tabs>
             <w:spacing w:before="0" w:after="20" w:line="252" w:lineRule="auto"/>
-            <w:ind w:start="567"/>
+            <w:ind w:left="567"/>
           </w:pPr>
           <w:r>
             <w:rPr>
@@ -607,10 +607,10 @@
           <w:pPr>
             <w:bidi/>
             <w:tabs>
-              <w:tab w:val="end" w:leader="dot" w:pos="9072"/>
+              <w:tab w:val="right" w:leader="dot" w:pos="9072"/>
             </w:tabs>
             <w:spacing w:before="0" w:after="20" w:line="252" w:lineRule="auto"/>
-            <w:ind w:start="567"/>
+            <w:ind w:left="567"/>
           </w:pPr>
           <w:r>
             <w:rPr>
@@ -644,7 +644,7 @@
           <w:pPr>
             <w:bidi/>
             <w:tabs>
-              <w:tab w:val="end" w:leader="dot" w:pos="9072"/>
+              <w:tab w:val="right" w:leader="dot" w:pos="9072"/>
             </w:tabs>
             <w:spacing w:before="0" w:after="20" w:line="252" w:lineRule="auto"/>
           </w:pPr>
@@ -682,7 +682,7 @@
           <w:pPr>
             <w:bidi/>
             <w:tabs>
-              <w:tab w:val="end" w:leader="dot" w:pos="9072"/>
+              <w:tab w:val="right" w:leader="dot" w:pos="9072"/>
             </w:tabs>
             <w:spacing w:before="0" w:after="20" w:line="252" w:lineRule="auto"/>
           </w:pPr>
@@ -720,10 +720,10 @@
           <w:pPr>
             <w:bidi/>
             <w:tabs>
-              <w:tab w:val="end" w:leader="dot" w:pos="9072"/>
+              <w:tab w:val="right" w:leader="dot" w:pos="9072"/>
             </w:tabs>
             <w:spacing w:before="0" w:after="20" w:line="252" w:lineRule="auto"/>
-            <w:ind w:start="567"/>
+            <w:ind w:left="567"/>
           </w:pPr>
           <w:r>
             <w:rPr>
@@ -757,10 +757,10 @@
           <w:pPr>
             <w:bidi/>
             <w:tabs>
-              <w:tab w:val="end" w:leader="dot" w:pos="9072"/>
+              <w:tab w:val="right" w:leader="dot" w:pos="9072"/>
             </w:tabs>
             <w:spacing w:before="0" w:after="20" w:line="252" w:lineRule="auto"/>
-            <w:ind w:start="567"/>
+            <w:ind w:left="567"/>
           </w:pPr>
           <w:r>
             <w:rPr>
@@ -794,10 +794,10 @@
           <w:pPr>
             <w:bidi/>
             <w:tabs>
-              <w:tab w:val="end" w:leader="dot" w:pos="9072"/>
+              <w:tab w:val="right" w:leader="dot" w:pos="9072"/>
             </w:tabs>
             <w:spacing w:before="0" w:after="20" w:line="252" w:lineRule="auto"/>
-            <w:ind w:start="567"/>
+            <w:ind w:left="567"/>
           </w:pPr>
           <w:r>
             <w:rPr>
@@ -831,10 +831,10 @@
           <w:pPr>
             <w:bidi/>
             <w:tabs>
-              <w:tab w:val="end" w:leader="dot" w:pos="9072"/>
+              <w:tab w:val="right" w:leader="dot" w:pos="9072"/>
             </w:tabs>
             <w:spacing w:before="0" w:after="20" w:line="252" w:lineRule="auto"/>
-            <w:ind w:start="567"/>
+            <w:ind w:left="567"/>
           </w:pPr>
           <w:r>
             <w:rPr>
@@ -868,10 +868,10 @@
           <w:pPr>
             <w:bidi/>
             <w:tabs>
-              <w:tab w:val="end" w:leader="dot" w:pos="9072"/>
+              <w:tab w:val="right" w:leader="dot" w:pos="9072"/>
             </w:tabs>
             <w:spacing w:before="0" w:after="20" w:line="252" w:lineRule="auto"/>
-            <w:ind w:start="567"/>
+            <w:ind w:left="567"/>
           </w:pPr>
           <w:r>
             <w:rPr>
@@ -905,7 +905,7 @@
           <w:pPr>
             <w:bidi/>
             <w:tabs>
-              <w:tab w:val="end" w:leader="dot" w:pos="9072"/>
+              <w:tab w:val="right" w:leader="dot" w:pos="9072"/>
             </w:tabs>
             <w:spacing w:before="0" w:after="20" w:line="252" w:lineRule="auto"/>
           </w:pPr>
@@ -943,10 +943,10 @@
           <w:pPr>
             <w:bidi/>
             <w:tabs>
-              <w:tab w:val="end" w:leader="dot" w:pos="9072"/>
+              <w:tab w:val="right" w:leader="dot" w:pos="9072"/>
             </w:tabs>
             <w:spacing w:before="0" w:after="20" w:line="252" w:lineRule="auto"/>
-            <w:ind w:start="567"/>
+            <w:ind w:left="567"/>
           </w:pPr>
           <w:r>
             <w:rPr>
@@ -980,10 +980,10 @@
           <w:pPr>
             <w:bidi/>
             <w:tabs>
-              <w:tab w:val="end" w:leader="dot" w:pos="9072"/>
+              <w:tab w:val="right" w:leader="dot" w:pos="9072"/>
             </w:tabs>
             <w:spacing w:before="0" w:after="20" w:line="252" w:lineRule="auto"/>
-            <w:ind w:start="567"/>
+            <w:ind w:left="567"/>
           </w:pPr>
           <w:r>
             <w:rPr>
@@ -1017,10 +1017,10 @@
           <w:pPr>
             <w:bidi/>
             <w:tabs>
-              <w:tab w:val="end" w:leader="dot" w:pos="9072"/>
+              <w:tab w:val="right" w:leader="dot" w:pos="9072"/>
             </w:tabs>
             <w:spacing w:before="0" w:after="20" w:line="252" w:lineRule="auto"/>
-            <w:ind w:start="567"/>
+            <w:ind w:left="567"/>
           </w:pPr>
           <w:r>
             <w:rPr>
@@ -1054,10 +1054,10 @@
           <w:pPr>
             <w:bidi/>
             <w:tabs>
-              <w:tab w:val="end" w:leader="dot" w:pos="9072"/>
+              <w:tab w:val="right" w:leader="dot" w:pos="9072"/>
             </w:tabs>
             <w:spacing w:before="0" w:after="20" w:line="252" w:lineRule="auto"/>
-            <w:ind w:start="567"/>
+            <w:ind w:left="567"/>
           </w:pPr>
           <w:r>
             <w:rPr>
@@ -1091,10 +1091,10 @@
           <w:pPr>
             <w:bidi/>
             <w:tabs>
-              <w:tab w:val="end" w:leader="dot" w:pos="9072"/>
+              <w:tab w:val="right" w:leader="dot" w:pos="9072"/>
             </w:tabs>
             <w:spacing w:before="0" w:after="20" w:line="252" w:lineRule="auto"/>
-            <w:ind w:start="567"/>
+            <w:ind w:left="567"/>
           </w:pPr>
           <w:r>
             <w:rPr>
@@ -1128,10 +1128,10 @@
           <w:pPr>
             <w:bidi/>
             <w:tabs>
-              <w:tab w:val="end" w:leader="dot" w:pos="9072"/>
+              <w:tab w:val="right" w:leader="dot" w:pos="9072"/>
             </w:tabs>
             <w:spacing w:before="0" w:after="20" w:line="252" w:lineRule="auto"/>
-            <w:ind w:start="567"/>
+            <w:ind w:left="567"/>
           </w:pPr>
           <w:r>
             <w:rPr>
@@ -1165,7 +1165,7 @@
           <w:pPr>
             <w:bidi/>
             <w:tabs>
-              <w:tab w:val="end" w:leader="dot" w:pos="9072"/>
+              <w:tab w:val="right" w:leader="dot" w:pos="9072"/>
             </w:tabs>
             <w:spacing w:before="0" w:after="20" w:line="252" w:lineRule="auto"/>
           </w:pPr>
@@ -1203,10 +1203,10 @@
           <w:pPr>
             <w:bidi/>
             <w:tabs>
-              <w:tab w:val="end" w:leader="dot" w:pos="9072"/>
+              <w:tab w:val="right" w:leader="dot" w:pos="9072"/>
             </w:tabs>
             <w:spacing w:before="0" w:after="20" w:line="252" w:lineRule="auto"/>
-            <w:ind w:start="567"/>
+            <w:ind w:left="567"/>
           </w:pPr>
           <w:r>
             <w:rPr>
@@ -1240,10 +1240,10 @@
           <w:pPr>
             <w:bidi/>
             <w:tabs>
-              <w:tab w:val="end" w:leader="dot" w:pos="9072"/>
+              <w:tab w:val="right" w:leader="dot" w:pos="9072"/>
             </w:tabs>
             <w:spacing w:before="0" w:after="20" w:line="252" w:lineRule="auto"/>
-            <w:ind w:start="567"/>
+            <w:ind w:left="567"/>
           </w:pPr>
           <w:r>
             <w:rPr>
@@ -1277,10 +1277,10 @@
           <w:pPr>
             <w:bidi/>
             <w:tabs>
-              <w:tab w:val="end" w:leader="dot" w:pos="9072"/>
+              <w:tab w:val="right" w:leader="dot" w:pos="9072"/>
             </w:tabs>
             <w:spacing w:before="0" w:after="20" w:line="252" w:lineRule="auto"/>
-            <w:ind w:start="567"/>
+            <w:ind w:left="567"/>
           </w:pPr>
           <w:r>
             <w:rPr>
@@ -1314,10 +1314,10 @@
           <w:pPr>
             <w:bidi/>
             <w:tabs>
-              <w:tab w:val="end" w:leader="dot" w:pos="9072"/>
+              <w:tab w:val="right" w:leader="dot" w:pos="9072"/>
             </w:tabs>
             <w:spacing w:before="0" w:after="20" w:line="252" w:lineRule="auto"/>
-            <w:ind w:start="567"/>
+            <w:ind w:left="567"/>
           </w:pPr>
           <w:r>
             <w:rPr>
@@ -1351,10 +1351,10 @@
           <w:pPr>
             <w:bidi/>
             <w:tabs>
-              <w:tab w:val="end" w:leader="dot" w:pos="9072"/>
+              <w:tab w:val="right" w:leader="dot" w:pos="9072"/>
             </w:tabs>
             <w:spacing w:before="0" w:after="20" w:line="252" w:lineRule="auto"/>
-            <w:ind w:start="567"/>
+            <w:ind w:left="567"/>
           </w:pPr>
           <w:r>
             <w:rPr>
@@ -1388,10 +1388,10 @@
           <w:pPr>
             <w:bidi/>
             <w:tabs>
-              <w:tab w:val="end" w:leader="dot" w:pos="9072"/>
+              <w:tab w:val="right" w:leader="dot" w:pos="9072"/>
             </w:tabs>
             <w:spacing w:before="0" w:after="20" w:line="252" w:lineRule="auto"/>
-            <w:ind w:start="567"/>
+            <w:ind w:left="567"/>
           </w:pPr>
           <w:r>
             <w:rPr>
@@ -1425,7 +1425,7 @@
           <w:pPr>
             <w:bidi/>
             <w:tabs>
-              <w:tab w:val="end" w:leader="dot" w:pos="9072"/>
+              <w:tab w:val="right" w:leader="dot" w:pos="9072"/>
             </w:tabs>
             <w:spacing w:before="0" w:after="20" w:line="252" w:lineRule="auto"/>
           </w:pPr>
@@ -1463,10 +1463,10 @@
           <w:pPr>
             <w:bidi/>
             <w:tabs>
-              <w:tab w:val="end" w:leader="dot" w:pos="9072"/>
+              <w:tab w:val="right" w:leader="dot" w:pos="9072"/>
             </w:tabs>
             <w:spacing w:before="0" w:after="20" w:line="252" w:lineRule="auto"/>
-            <w:ind w:start="567"/>
+            <w:ind w:left="567"/>
           </w:pPr>
           <w:r>
             <w:rPr>
@@ -1500,10 +1500,10 @@
           <w:pPr>
             <w:bidi/>
             <w:tabs>
-              <w:tab w:val="end" w:leader="dot" w:pos="9072"/>
+              <w:tab w:val="right" w:leader="dot" w:pos="9072"/>
             </w:tabs>
             <w:spacing w:before="0" w:after="20" w:line="252" w:lineRule="auto"/>
-            <w:ind w:start="567"/>
+            <w:ind w:left="567"/>
           </w:pPr>
           <w:r>
             <w:rPr>
@@ -1537,10 +1537,10 @@
           <w:pPr>
             <w:bidi/>
             <w:tabs>
-              <w:tab w:val="end" w:leader="dot" w:pos="9072"/>
+              <w:tab w:val="right" w:leader="dot" w:pos="9072"/>
             </w:tabs>
             <w:spacing w:before="0" w:after="20" w:line="252" w:lineRule="auto"/>
-            <w:ind w:start="567"/>
+            <w:ind w:left="567"/>
           </w:pPr>
           <w:r>
             <w:rPr>
@@ -1574,7 +1574,7 @@
           <w:pPr>
             <w:bidi/>
             <w:tabs>
-              <w:tab w:val="end" w:leader="dot" w:pos="9072"/>
+              <w:tab w:val="right" w:leader="dot" w:pos="9072"/>
             </w:tabs>
             <w:spacing w:before="0" w:after="20" w:line="252" w:lineRule="auto"/>
           </w:pPr>
@@ -1612,7 +1612,7 @@
           <w:pPr>
             <w:bidi/>
             <w:tabs>
-              <w:tab w:val="end" w:leader="dot" w:pos="9072"/>
+              <w:tab w:val="right" w:leader="dot" w:pos="9072"/>
             </w:tabs>
             <w:spacing w:before="0" w:after="20" w:line="252" w:lineRule="auto"/>
           </w:pPr>
@@ -1650,7 +1650,7 @@
           <w:pPr>
             <w:bidi/>
             <w:tabs>
-              <w:tab w:val="end" w:leader="dot" w:pos="9072"/>
+              <w:tab w:val="right" w:leader="dot" w:pos="9072"/>
             </w:tabs>
             <w:spacing w:before="0" w:after="20" w:line="252" w:lineRule="auto"/>
           </w:pPr>
@@ -1688,7 +1688,7 @@
           <w:pPr>
             <w:bidi/>
             <w:tabs>
-              <w:tab w:val="end" w:leader="dot" w:pos="9072"/>
+              <w:tab w:val="right" w:leader="dot" w:pos="9072"/>
             </w:tabs>
             <w:spacing w:before="0" w:after="20" w:line="252" w:lineRule="auto"/>
           </w:pPr>
@@ -1834,7 +1834,7 @@
         <w:pStyle w:val="Heading2"/>
         <w:bidi/>
         <w:spacing w:after="120" w:before="240" w:line="480" w:lineRule="auto"/>
-        <w:jc w:val="start"/>
+        <w:jc w:val="left"/>
       </w:pPr>
       <w:r>
         <w:rPr>
@@ -1887,7 +1887,7 @@
         <w:pStyle w:val="Heading2"/>
         <w:bidi/>
         <w:spacing w:after="120" w:before="240" w:line="480" w:lineRule="auto"/>
-        <w:jc w:val="start"/>
+        <w:jc w:val="left"/>
       </w:pPr>
       <w:r>
         <w:rPr>
@@ -1940,7 +1940,7 @@
         <w:pStyle w:val="Heading2"/>
         <w:bidi/>
         <w:spacing w:after="120" w:before="240" w:line="480" w:lineRule="auto"/>
-        <w:jc w:val="start"/>
+        <w:jc w:val="left"/>
       </w:pPr>
       <w:r>
         <w:rPr>
@@ -2010,7 +2010,7 @@
         <w:pStyle w:val="Heading2"/>
         <w:bidi/>
         <w:spacing w:after="120" w:before="240" w:line="480" w:lineRule="auto"/>
-        <w:jc w:val="start"/>
+        <w:jc w:val="left"/>
       </w:pPr>
       <w:r>
         <w:rPr>
@@ -2097,7 +2097,7 @@
         <w:pStyle w:val="Heading2"/>
         <w:bidi/>
         <w:spacing w:after="120" w:before="240" w:line="480" w:lineRule="auto"/>
-        <w:jc w:val="start"/>
+        <w:jc w:val="left"/>
       </w:pPr>
       <w:r>
         <w:rPr>
@@ -2257,7 +2257,7 @@
         <w:pStyle w:val="Heading2"/>
         <w:bidi/>
         <w:spacing w:after="120" w:before="240" w:line="480" w:lineRule="auto"/>
-        <w:jc w:val="start"/>
+        <w:jc w:val="left"/>
       </w:pPr>
       <w:r>
         <w:rPr>
@@ -2310,7 +2310,7 @@
         <w:pStyle w:val="Heading2"/>
         <w:bidi/>
         <w:spacing w:after="120" w:before="240" w:line="480" w:lineRule="auto"/>
-        <w:jc w:val="start"/>
+        <w:jc w:val="left"/>
       </w:pPr>
       <w:r>
         <w:rPr>
@@ -2346,7 +2346,7 @@
         <w:keepNext/>
         <w:bidi/>
         <w:spacing w:after="0" w:line="480" w:lineRule="auto"/>
-        <w:jc w:val="start"/>
+        <w:jc w:val="left"/>
       </w:pPr>
       <w:r>
         <w:rPr>
@@ -2365,7 +2365,7 @@
         <w:keepNext/>
         <w:bidi/>
         <w:spacing w:after="60" w:line="480" w:lineRule="auto"/>
-        <w:jc w:val="start"/>
+        <w:jc w:val="left"/>
       </w:pPr>
       <w:r>
         <w:rPr>
@@ -4245,7 +4245,7 @@
         <w:pStyle w:val="Heading2"/>
         <w:bidi/>
         <w:spacing w:after="120" w:before="240" w:line="480" w:lineRule="auto"/>
-        <w:jc w:val="start"/>
+        <w:jc w:val="left"/>
       </w:pPr>
       <w:r>
         <w:rPr>
@@ -4281,7 +4281,7 @@
         <w:pStyle w:val="Heading2"/>
         <w:bidi/>
         <w:spacing w:after="120" w:before="240" w:line="480" w:lineRule="auto"/>
-        <w:jc w:val="start"/>
+        <w:jc w:val="left"/>
       </w:pPr>
       <w:r>
         <w:rPr>
@@ -4317,7 +4317,7 @@
         <w:pStyle w:val="Heading2"/>
         <w:bidi/>
         <w:spacing w:after="120" w:before="240" w:line="480" w:lineRule="auto"/>
-        <w:jc w:val="start"/>
+        <w:jc w:val="left"/>
       </w:pPr>
       <w:r>
         <w:rPr>
@@ -4390,7 +4390,7 @@
         <w:keepNext/>
         <w:bidi/>
         <w:spacing w:after="0" w:line="480" w:lineRule="auto"/>
-        <w:jc w:val="start"/>
+        <w:jc w:val="left"/>
       </w:pPr>
       <w:r>
         <w:rPr>
@@ -4409,7 +4409,7 @@
         <w:keepNext/>
         <w:bidi/>
         <w:spacing w:after="60" w:line="480" w:lineRule="auto"/>
-        <w:jc w:val="start"/>
+        <w:jc w:val="left"/>
       </w:pPr>
       <w:r>
         <w:rPr>
@@ -5181,7 +5181,7 @@
         <w:pStyle w:val="Heading2"/>
         <w:bidi/>
         <w:spacing w:after="120" w:before="240" w:line="480" w:lineRule="auto"/>
-        <w:jc w:val="start"/>
+        <w:jc w:val="left"/>
       </w:pPr>
       <w:r>
         <w:rPr>
@@ -5251,7 +5251,7 @@
         <w:pStyle w:val="Heading2"/>
         <w:bidi/>
         <w:spacing w:after="120" w:before="240" w:line="480" w:lineRule="auto"/>
-        <w:jc w:val="start"/>
+        <w:jc w:val="left"/>
       </w:pPr>
       <w:r>
         <w:rPr>
@@ -5321,7 +5321,7 @@
         <w:pStyle w:val="Heading2"/>
         <w:bidi/>
         <w:spacing w:after="120" w:before="240" w:line="480" w:lineRule="auto"/>
-        <w:jc w:val="start"/>
+        <w:jc w:val="left"/>
       </w:pPr>
       <w:r>
         <w:rPr>
@@ -5374,7 +5374,7 @@
         <w:pStyle w:val="Heading2"/>
         <w:bidi/>
         <w:spacing w:after="120" w:before="240" w:line="480" w:lineRule="auto"/>
-        <w:jc w:val="start"/>
+        <w:jc w:val="left"/>
       </w:pPr>
       <w:r>
         <w:rPr>
@@ -5427,7 +5427,7 @@
         <w:pStyle w:val="Heading2"/>
         <w:bidi/>
         <w:spacing w:after="120" w:before="240" w:line="480" w:lineRule="auto"/>
-        <w:jc w:val="start"/>
+        <w:jc w:val="left"/>
       </w:pPr>
       <w:r>
         <w:rPr>
@@ -5480,7 +5480,7 @@
         <w:pStyle w:val="Heading2"/>
         <w:bidi/>
         <w:spacing w:after="120" w:before="240" w:line="480" w:lineRule="auto"/>
-        <w:jc w:val="start"/>
+        <w:jc w:val="left"/>
       </w:pPr>
       <w:r>
         <w:rPr>
@@ -5570,7 +5570,7 @@
         <w:pStyle w:val="Heading2"/>
         <w:bidi/>
         <w:spacing w:after="120" w:before="240" w:line="480" w:lineRule="auto"/>
-        <w:jc w:val="start"/>
+        <w:jc w:val="left"/>
       </w:pPr>
       <w:r>
         <w:rPr>
@@ -5623,7 +5623,7 @@
         <w:pStyle w:val="Heading2"/>
         <w:bidi/>
         <w:spacing w:after="120" w:before="240" w:line="480" w:lineRule="auto"/>
-        <w:jc w:val="start"/>
+        <w:jc w:val="left"/>
       </w:pPr>
       <w:r>
         <w:rPr>
@@ -5659,7 +5659,7 @@
         <w:pStyle w:val="Heading2"/>
         <w:bidi/>
         <w:spacing w:after="120" w:before="240" w:line="480" w:lineRule="auto"/>
-        <w:jc w:val="start"/>
+        <w:jc w:val="left"/>
       </w:pPr>
       <w:r>
         <w:rPr>
@@ -5712,7 +5712,7 @@
         <w:pStyle w:val="Heading2"/>
         <w:bidi/>
         <w:spacing w:after="120" w:before="240" w:line="480" w:lineRule="auto"/>
-        <w:jc w:val="start"/>
+        <w:jc w:val="left"/>
       </w:pPr>
       <w:r>
         <w:rPr>
@@ -5748,7 +5748,7 @@
         <w:pStyle w:val="Heading2"/>
         <w:bidi/>
         <w:spacing w:after="120" w:before="240" w:line="480" w:lineRule="auto"/>
-        <w:jc w:val="start"/>
+        <w:jc w:val="left"/>
       </w:pPr>
       <w:r>
         <w:rPr>
@@ -5784,7 +5784,7 @@
         <w:pStyle w:val="Heading2"/>
         <w:bidi/>
         <w:spacing w:after="120" w:before="240" w:line="480" w:lineRule="auto"/>
-        <w:jc w:val="start"/>
+        <w:jc w:val="left"/>
       </w:pPr>
       <w:r>
         <w:rPr>
@@ -5857,7 +5857,7 @@
         <w:pStyle w:val="Heading2"/>
         <w:bidi/>
         <w:spacing w:after="120" w:before="240" w:line="480" w:lineRule="auto"/>
-        <w:jc w:val="start"/>
+        <w:jc w:val="left"/>
       </w:pPr>
       <w:r>
         <w:rPr>
@@ -5893,7 +5893,7 @@
         <w:pStyle w:val="Heading2"/>
         <w:bidi/>
         <w:spacing w:after="120" w:before="240" w:line="480" w:lineRule="auto"/>
-        <w:jc w:val="start"/>
+        <w:jc w:val="left"/>
       </w:pPr>
       <w:r>
         <w:rPr>
@@ -5929,7 +5929,7 @@
         <w:pStyle w:val="Heading2"/>
         <w:bidi/>
         <w:spacing w:after="120" w:before="240" w:line="480" w:lineRule="auto"/>
-        <w:jc w:val="start"/>
+        <w:jc w:val="left"/>
       </w:pPr>
       <w:r>
         <w:rPr>
@@ -5984,8 +5984,8 @@
       <w:pPr>
         <w:bidi/>
         <w:spacing w:line="480" w:lineRule="auto"/>
-        <w:ind w:start="709" w:hanging="709"/>
-        <w:jc w:val="start"/>
+        <w:ind w:left="709" w:hanging="709"/>
+        <w:jc w:val="left"/>
       </w:pPr>
       <w:r>
         <w:rPr>
@@ -6021,8 +6021,8 @@
       <w:pPr>
         <w:bidi/>
         <w:spacing w:line="480" w:lineRule="auto"/>
-        <w:ind w:start="709" w:hanging="709"/>
-        <w:jc w:val="start"/>
+        <w:ind w:left="709" w:hanging="709"/>
+        <w:jc w:val="left"/>
       </w:pPr>
       <w:r>
         <w:rPr>
@@ -6058,8 +6058,8 @@
       <w:pPr>
         <w:bidi/>
         <w:spacing w:line="480" w:lineRule="auto"/>
-        <w:ind w:start="709" w:hanging="709"/>
-        <w:jc w:val="start"/>
+        <w:ind w:left="709" w:hanging="709"/>
+        <w:jc w:val="left"/>
       </w:pPr>
       <w:r>
         <w:rPr>
@@ -6095,8 +6095,8 @@
       <w:pPr>
         <w:bidi/>
         <w:spacing w:line="480" w:lineRule="auto"/>
-        <w:ind w:start="709" w:hanging="709"/>
-        <w:jc w:val="start"/>
+        <w:ind w:left="709" w:hanging="709"/>
+        <w:jc w:val="left"/>
       </w:pPr>
       <w:r>
         <w:rPr>
@@ -6132,8 +6132,8 @@
       <w:pPr>
         <w:bidi/>
         <w:spacing w:line="480" w:lineRule="auto"/>
-        <w:ind w:start="709" w:hanging="709"/>
-        <w:jc w:val="start"/>
+        <w:ind w:left="709" w:hanging="709"/>
+        <w:jc w:val="left"/>
       </w:pPr>
       <w:r>
         <w:rPr>
@@ -6169,8 +6169,8 @@
       <w:pPr>
         <w:bidi/>
         <w:spacing w:line="480" w:lineRule="auto"/>
-        <w:ind w:start="709" w:hanging="709"/>
-        <w:jc w:val="start"/>
+        <w:ind w:left="709" w:hanging="709"/>
+        <w:jc w:val="left"/>
       </w:pPr>
       <w:r>
         <w:rPr>
@@ -6206,8 +6206,8 @@
       <w:pPr>
         <w:bidi/>
         <w:spacing w:line="480" w:lineRule="auto"/>
-        <w:ind w:start="709" w:hanging="709"/>
-        <w:jc w:val="start"/>
+        <w:ind w:left="709" w:hanging="709"/>
+        <w:jc w:val="left"/>
       </w:pPr>
       <w:r>
         <w:rPr>
@@ -6243,8 +6243,8 @@
       <w:pPr>
         <w:bidi/>
         <w:spacing w:line="480" w:lineRule="auto"/>
-        <w:ind w:start="709" w:hanging="709"/>
-        <w:jc w:val="start"/>
+        <w:ind w:left="709" w:hanging="709"/>
+        <w:jc w:val="left"/>
       </w:pPr>
       <w:r>
         <w:rPr>
@@ -6280,8 +6280,8 @@
       <w:pPr>
         <w:bidi/>
         <w:spacing w:line="480" w:lineRule="auto"/>
-        <w:ind w:start="709" w:hanging="709"/>
-        <w:jc w:val="start"/>
+        <w:ind w:left="709" w:hanging="709"/>
+        <w:jc w:val="left"/>
       </w:pPr>
       <w:r>
         <w:rPr>
@@ -6317,8 +6317,8 @@
       <w:pPr>
         <w:bidi/>
         <w:spacing w:line="480" w:lineRule="auto"/>
-        <w:ind w:start="709" w:hanging="709"/>
-        <w:jc w:val="start"/>
+        <w:ind w:left="709" w:hanging="709"/>
+        <w:jc w:val="left"/>
       </w:pPr>
       <w:r>
         <w:rPr>
@@ -6354,8 +6354,8 @@
       <w:pPr>
         <w:bidi/>
         <w:spacing w:line="480" w:lineRule="auto"/>
-        <w:ind w:start="709" w:hanging="709"/>
-        <w:jc w:val="start"/>
+        <w:ind w:left="709" w:hanging="709"/>
+        <w:jc w:val="left"/>
       </w:pPr>
       <w:r>
         <w:rPr>
@@ -6391,8 +6391,8 @@
       <w:pPr>
         <w:bidi/>
         <w:spacing w:line="480" w:lineRule="auto"/>
-        <w:ind w:start="709" w:hanging="709"/>
-        <w:jc w:val="start"/>
+        <w:ind w:left="709" w:hanging="709"/>
+        <w:jc w:val="left"/>
       </w:pPr>
       <w:r>
         <w:rPr>
@@ -6428,8 +6428,8 @@
       <w:pPr>
         <w:bidi/>
         <w:spacing w:line="480" w:lineRule="auto"/>
-        <w:ind w:start="709" w:hanging="709"/>
-        <w:jc w:val="start"/>
+        <w:ind w:left="709" w:hanging="709"/>
+        <w:jc w:val="left"/>
       </w:pPr>
       <w:r>
         <w:rPr>
@@ -6465,8 +6465,8 @@
       <w:pPr>
         <w:bidi/>
         <w:spacing w:line="480" w:lineRule="auto"/>
-        <w:ind w:start="709" w:hanging="709"/>
-        <w:jc w:val="start"/>
+        <w:ind w:left="709" w:hanging="709"/>
+        <w:jc w:val="left"/>
       </w:pPr>
       <w:r>
         <w:rPr>
@@ -6502,8 +6502,8 @@
       <w:pPr>
         <w:bidi/>
         <w:spacing w:line="480" w:lineRule="auto"/>
-        <w:ind w:start="709" w:hanging="709"/>
-        <w:jc w:val="start"/>
+        <w:ind w:left="709" w:hanging="709"/>
+        <w:jc w:val="left"/>
       </w:pPr>
       <w:r>
         <w:rPr>
@@ -6539,8 +6539,8 @@
       <w:pPr>
         <w:bidi/>
         <w:spacing w:line="480" w:lineRule="auto"/>
-        <w:ind w:start="709" w:hanging="709"/>
-        <w:jc w:val="start"/>
+        <w:ind w:left="709" w:hanging="709"/>
+        <w:jc w:val="left"/>
       </w:pPr>
       <w:r>
         <w:rPr>
@@ -6576,8 +6576,8 @@
       <w:pPr>
         <w:bidi/>
         <w:spacing w:line="480" w:lineRule="auto"/>
-        <w:ind w:start="709" w:hanging="709"/>
-        <w:jc w:val="start"/>
+        <w:ind w:left="709" w:hanging="709"/>
+        <w:jc w:val="left"/>
       </w:pPr>
       <w:r>
         <w:rPr>
@@ -6613,8 +6613,8 @@
       <w:pPr>
         <w:bidi/>
         <w:spacing w:line="480" w:lineRule="auto"/>
-        <w:ind w:start="709" w:hanging="709"/>
-        <w:jc w:val="start"/>
+        <w:ind w:left="709" w:hanging="709"/>
+        <w:jc w:val="left"/>
       </w:pPr>
       <w:r>
         <w:rPr>
@@ -6650,8 +6650,8 @@
       <w:pPr>
         <w:bidi/>
         <w:spacing w:line="480" w:lineRule="auto"/>
-        <w:ind w:start="709" w:hanging="709"/>
-        <w:jc w:val="start"/>
+        <w:ind w:left="709" w:hanging="709"/>
+        <w:jc w:val="left"/>
       </w:pPr>
       <w:r>
         <w:rPr>
@@ -6687,8 +6687,8 @@
       <w:pPr>
         <w:bidi/>
         <w:spacing w:line="480" w:lineRule="auto"/>
-        <w:ind w:start="709" w:hanging="709"/>
-        <w:jc w:val="start"/>
+        <w:ind w:left="709" w:hanging="709"/>
+        <w:jc w:val="left"/>
       </w:pPr>
       <w:r>
         <w:rPr>
@@ -6724,8 +6724,8 @@
       <w:pPr>
         <w:bidi/>
         <w:spacing w:line="480" w:lineRule="auto"/>
-        <w:ind w:start="709" w:hanging="709"/>
-        <w:jc w:val="start"/>
+        <w:ind w:left="709" w:hanging="709"/>
+        <w:jc w:val="left"/>
       </w:pPr>
       <w:r>
         <w:rPr>
@@ -6761,8 +6761,8 @@
       <w:pPr>
         <w:bidi/>
         <w:spacing w:line="480" w:lineRule="auto"/>
-        <w:ind w:start="709" w:hanging="709"/>
-        <w:jc w:val="start"/>
+        <w:ind w:left="709" w:hanging="709"/>
+        <w:jc w:val="left"/>
       </w:pPr>
       <w:r>
         <w:rPr>
@@ -7098,7 +7098,7 @@
       <w:pPr>
         <w:bidi/>
         <w:spacing w:after="120" w:before="0" w:line="480" w:lineRule="auto"/>
-        <w:jc w:val="start"/>
+        <w:jc w:val="left"/>
       </w:pPr>
       <w:r>
         <w:rPr>
@@ -7116,8 +7116,8 @@
       <w:pPr>
         <w:bidi/>
         <w:spacing w:after="120" w:before="0" w:line="480" w:lineRule="auto"/>
-        <w:ind w:start="567"/>
-        <w:jc w:val="start"/>
+        <w:ind w:left="567"/>
+        <w:jc w:val="left"/>
       </w:pPr>
       <w:r>
         <w:rPr>
@@ -7133,8 +7133,8 @@
       <w:pPr>
         <w:bidi/>
         <w:spacing w:after="120" w:before="0" w:line="480" w:lineRule="auto"/>
-        <w:ind w:start="567"/>
-        <w:jc w:val="start"/>
+        <w:ind w:left="567"/>
+        <w:jc w:val="left"/>
       </w:pPr>
       <w:r>
         <w:rPr>
@@ -7150,8 +7150,8 @@
       <w:pPr>
         <w:bidi/>
         <w:spacing w:after="120" w:before="0" w:line="480" w:lineRule="auto"/>
-        <w:ind w:start="567"/>
-        <w:jc w:val="start"/>
+        <w:ind w:left="567"/>
+        <w:jc w:val="left"/>
       </w:pPr>
       <w:r>
         <w:rPr>
@@ -7167,7 +7167,7 @@
       <w:pPr>
         <w:bidi/>
         <w:spacing w:after="120" w:before="0" w:line="480" w:lineRule="auto"/>
-        <w:jc w:val="start"/>
+        <w:jc w:val="left"/>
       </w:pPr>
       <w:r>
         <w:rPr>
@@ -7185,8 +7185,8 @@
       <w:pPr>
         <w:bidi/>
         <w:spacing w:after="120" w:before="0" w:line="480" w:lineRule="auto"/>
-        <w:ind w:start="567"/>
-        <w:jc w:val="start"/>
+        <w:ind w:left="567"/>
+        <w:jc w:val="left"/>
       </w:pPr>
       <w:r>
         <w:rPr>
@@ -7202,8 +7202,8 @@
       <w:pPr>
         <w:bidi/>
         <w:spacing w:after="120" w:before="0" w:line="480" w:lineRule="auto"/>
-        <w:ind w:start="567"/>
-        <w:jc w:val="start"/>
+        <w:ind w:left="567"/>
+        <w:jc w:val="left"/>
       </w:pPr>
       <w:r>
         <w:rPr>
@@ -7219,8 +7219,8 @@
       <w:pPr>
         <w:bidi/>
         <w:spacing w:after="120" w:before="0" w:line="480" w:lineRule="auto"/>
-        <w:ind w:start="567"/>
-        <w:jc w:val="start"/>
+        <w:ind w:left="567"/>
+        <w:jc w:val="left"/>
       </w:pPr>
       <w:r>
         <w:rPr>
@@ -7236,8 +7236,8 @@
       <w:pPr>
         <w:bidi/>
         <w:spacing w:after="120" w:before="0" w:line="480" w:lineRule="auto"/>
-        <w:ind w:start="567"/>
-        <w:jc w:val="start"/>
+        <w:ind w:left="567"/>
+        <w:jc w:val="left"/>
       </w:pPr>
       <w:r>
         <w:rPr>
@@ -7253,8 +7253,8 @@
       <w:pPr>
         <w:bidi/>
         <w:spacing w:after="120" w:before="0" w:line="480" w:lineRule="auto"/>
-        <w:ind w:start="567"/>
-        <w:jc w:val="start"/>
+        <w:ind w:left="567"/>
+        <w:jc w:val="left"/>
       </w:pPr>
       <w:r>
         <w:rPr>
@@ -7270,7 +7270,7 @@
       <w:pPr>
         <w:bidi/>
         <w:spacing w:after="120" w:before="0" w:line="480" w:lineRule="auto"/>
-        <w:jc w:val="start"/>
+        <w:jc w:val="left"/>
       </w:pPr>
       <w:r>
         <w:rPr>
@@ -7288,8 +7288,8 @@
       <w:pPr>
         <w:bidi/>
         <w:spacing w:after="120" w:before="0" w:line="480" w:lineRule="auto"/>
-        <w:ind w:start="567"/>
-        <w:jc w:val="start"/>
+        <w:ind w:left="567"/>
+        <w:jc w:val="left"/>
       </w:pPr>
       <w:r>
         <w:rPr>
@@ -7305,8 +7305,8 @@
       <w:pPr>
         <w:bidi/>
         <w:spacing w:after="120" w:before="0" w:line="480" w:lineRule="auto"/>
-        <w:ind w:start="567"/>
-        <w:jc w:val="start"/>
+        <w:ind w:left="567"/>
+        <w:jc w:val="left"/>
       </w:pPr>
       <w:r>
         <w:rPr>
@@ -7322,8 +7322,8 @@
       <w:pPr>
         <w:bidi/>
         <w:spacing w:after="120" w:before="0" w:line="480" w:lineRule="auto"/>
-        <w:ind w:start="567"/>
-        <w:jc w:val="start"/>
+        <w:ind w:left="567"/>
+        <w:jc w:val="left"/>
       </w:pPr>
       <w:r>
         <w:rPr>
@@ -7339,8 +7339,8 @@
       <w:pPr>
         <w:bidi/>
         <w:spacing w:after="120" w:before="0" w:line="480" w:lineRule="auto"/>
-        <w:ind w:start="567"/>
-        <w:jc w:val="start"/>
+        <w:ind w:left="567"/>
+        <w:jc w:val="left"/>
       </w:pPr>
       <w:r>
         <w:rPr>
@@ -7356,8 +7356,8 @@
       <w:pPr>
         <w:bidi/>
         <w:spacing w:after="120" w:before="0" w:line="480" w:lineRule="auto"/>
-        <w:ind w:start="567"/>
-        <w:jc w:val="start"/>
+        <w:ind w:left="567"/>
+        <w:jc w:val="left"/>
       </w:pPr>
       <w:r>
         <w:rPr>
@@ -7373,7 +7373,7 @@
       <w:pPr>
         <w:bidi/>
         <w:spacing w:after="120" w:before="0" w:line="480" w:lineRule="auto"/>
-        <w:jc w:val="start"/>
+        <w:jc w:val="left"/>
       </w:pPr>
       <w:r>
         <w:rPr>
@@ -7391,8 +7391,8 @@
       <w:pPr>
         <w:bidi/>
         <w:spacing w:after="120" w:before="0" w:line="480" w:lineRule="auto"/>
-        <w:ind w:start="567"/>
-        <w:jc w:val="start"/>
+        <w:ind w:left="567"/>
+        <w:jc w:val="left"/>
       </w:pPr>
       <w:r>
         <w:rPr>
@@ -7408,8 +7408,8 @@
       <w:pPr>
         <w:bidi/>
         <w:spacing w:after="120" w:before="0" w:line="480" w:lineRule="auto"/>
-        <w:ind w:start="567"/>
-        <w:jc w:val="start"/>
+        <w:ind w:left="567"/>
+        <w:jc w:val="left"/>
       </w:pPr>
       <w:r>
         <w:rPr>
@@ -7425,8 +7425,8 @@
       <w:pPr>
         <w:bidi/>
         <w:spacing w:after="120" w:before="0" w:line="480" w:lineRule="auto"/>
-        <w:ind w:start="567"/>
-        <w:jc w:val="start"/>
+        <w:ind w:left="567"/>
+        <w:jc w:val="left"/>
       </w:pPr>
       <w:r>
         <w:rPr>
@@ -7442,8 +7442,8 @@
       <w:pPr>
         <w:bidi/>
         <w:spacing w:after="120" w:before="0" w:line="480" w:lineRule="auto"/>
-        <w:ind w:start="567"/>
-        <w:jc w:val="start"/>
+        <w:ind w:left="567"/>
+        <w:jc w:val="left"/>
       </w:pPr>
       <w:r>
         <w:rPr>
@@ -9077,7 +9077,7 @@
       <w:pPr>
         <w:bidi/>
         <w:spacing w:after="120" w:before="0" w:line="480" w:lineRule="auto"/>
-        <w:jc w:val="start"/>
+        <w:jc w:val="left"/>
       </w:pPr>
       <w:r>
         <w:rPr>
@@ -9095,7 +9095,7 @@
       <w:pPr>
         <w:bidi/>
         <w:spacing w:after="120" w:before="0" w:line="480" w:lineRule="auto"/>
-        <w:jc w:val="start"/>
+        <w:jc w:val="left"/>
       </w:pPr>
       <w:r>
         <w:rPr>
@@ -9129,7 +9129,7 @@
       <w:pPr>
         <w:bidi/>
         <w:spacing w:after="120" w:before="0" w:line="480" w:lineRule="auto"/>
-        <w:jc w:val="start"/>
+        <w:jc w:val="left"/>
       </w:pPr>
       <w:r>
         <w:rPr>
@@ -9163,7 +9163,7 @@
       <w:pPr>
         <w:bidi/>
         <w:spacing w:after="120" w:before="0" w:line="480" w:lineRule="auto"/>
-        <w:jc w:val="start"/>
+        <w:jc w:val="left"/>
       </w:pPr>
       <w:r>
         <w:rPr>
@@ -9197,7 +9197,7 @@
       <w:pPr>
         <w:bidi/>
         <w:spacing w:after="120" w:before="0" w:line="480" w:lineRule="auto"/>
-        <w:jc w:val="start"/>
+        <w:jc w:val="left"/>
       </w:pPr>
       <w:r>
         <w:rPr>
@@ -9215,7 +9215,7 @@
       <w:pPr>
         <w:bidi/>
         <w:spacing w:after="120" w:before="0" w:line="480" w:lineRule="auto"/>
-        <w:jc w:val="start"/>
+        <w:jc w:val="left"/>
       </w:pPr>
       <w:r>
         <w:rPr>
@@ -9249,7 +9249,7 @@
       <w:pPr>
         <w:bidi/>
         <w:spacing w:after="120" w:before="0" w:line="480" w:lineRule="auto"/>
-        <w:jc w:val="start"/>
+        <w:jc w:val="left"/>
       </w:pPr>
       <w:r>
         <w:rPr>
@@ -9283,7 +9283,7 @@
       <w:pPr>
         <w:bidi/>
         <w:spacing w:after="120" w:before="0" w:line="480" w:lineRule="auto"/>
-        <w:jc w:val="start"/>
+        <w:jc w:val="left"/>
       </w:pPr>
       <w:r>
         <w:rPr>
@@ -9317,7 +9317,7 @@
       <w:pPr>
         <w:bidi/>
         <w:spacing w:after="120" w:before="0" w:line="480" w:lineRule="auto"/>
-        <w:jc w:val="start"/>
+        <w:jc w:val="left"/>
       </w:pPr>
       <w:r>
         <w:rPr>
@@ -9351,7 +9351,7 @@
       <w:pPr>
         <w:bidi/>
         <w:spacing w:after="120" w:before="0" w:line="480" w:lineRule="auto"/>
-        <w:jc w:val="start"/>
+        <w:jc w:val="left"/>
       </w:pPr>
       <w:r>
         <w:rPr>
@@ -9385,7 +9385,7 @@
       <w:pPr>
         <w:bidi/>
         <w:spacing w:after="120" w:before="0" w:line="480" w:lineRule="auto"/>
-        <w:jc w:val="start"/>
+        <w:jc w:val="left"/>
       </w:pPr>
       <w:r>
         <w:rPr>
@@ -9403,7 +9403,7 @@
       <w:pPr>
         <w:bidi/>
         <w:spacing w:after="120" w:before="0" w:line="480" w:lineRule="auto"/>
-        <w:jc w:val="start"/>
+        <w:jc w:val="left"/>
       </w:pPr>
       <w:r>
         <w:rPr>
@@ -9437,7 +9437,7 @@
       <w:pPr>
         <w:bidi/>
         <w:spacing w:after="120" w:before="0" w:line="480" w:lineRule="auto"/>
-        <w:jc w:val="start"/>
+        <w:jc w:val="left"/>
       </w:pPr>
       <w:r>
         <w:rPr>
@@ -9471,7 +9471,7 @@
       <w:pPr>
         <w:bidi/>
         <w:spacing w:after="120" w:before="0" w:line="480" w:lineRule="auto"/>
-        <w:jc w:val="start"/>
+        <w:jc w:val="left"/>
       </w:pPr>
       <w:r>
         <w:rPr>
@@ -9505,7 +9505,7 @@
       <w:pPr>
         <w:bidi/>
         <w:spacing w:after="120" w:before="0" w:line="480" w:lineRule="auto"/>
-        <w:jc w:val="start"/>
+        <w:jc w:val="left"/>
       </w:pPr>
       <w:r>
         <w:rPr>
@@ -9539,7 +9539,7 @@
       <w:pPr>
         <w:bidi/>
         <w:spacing w:after="120" w:before="0" w:line="480" w:lineRule="auto"/>
-        <w:jc w:val="start"/>
+        <w:jc w:val="left"/>
       </w:pPr>
       <w:r>
         <w:rPr>
@@ -9573,7 +9573,7 @@
       <w:pPr>
         <w:bidi/>
         <w:spacing w:after="120" w:before="0" w:line="480" w:lineRule="auto"/>
-        <w:jc w:val="start"/>
+        <w:jc w:val="left"/>
       </w:pPr>
       <w:r>
         <w:rPr>
@@ -9591,7 +9591,7 @@
       <w:pPr>
         <w:bidi/>
         <w:spacing w:after="120" w:before="0" w:line="480" w:lineRule="auto"/>
-        <w:jc w:val="start"/>
+        <w:jc w:val="left"/>
       </w:pPr>
       <w:r>
         <w:rPr>
@@ -9625,7 +9625,7 @@
       <w:pPr>
         <w:bidi/>
         <w:spacing w:after="120" w:before="0" w:line="480" w:lineRule="auto"/>
-        <w:jc w:val="start"/>
+        <w:jc w:val="left"/>
       </w:pPr>
       <w:r>
         <w:rPr>
@@ -9659,7 +9659,7 @@
       <w:pPr>
         <w:bidi/>
         <w:spacing w:after="120" w:before="0" w:line="480" w:lineRule="auto"/>
-        <w:jc w:val="start"/>
+        <w:jc w:val="left"/>
       </w:pPr>
       <w:r>
         <w:rPr>
@@ -9693,7 +9693,7 @@
       <w:pPr>
         <w:bidi/>
         <w:spacing w:after="120" w:before="0" w:line="480" w:lineRule="auto"/>
-        <w:jc w:val="start"/>
+        <w:jc w:val="left"/>
       </w:pPr>
       <w:r>
         <w:rPr>
@@ -9727,7 +9727,7 @@
       <w:pPr>
         <w:bidi/>
         <w:spacing w:after="120" w:before="0" w:line="480" w:lineRule="auto"/>
-        <w:jc w:val="start"/>
+        <w:jc w:val="left"/>
       </w:pPr>
       <w:r>
         <w:rPr>
@@ -9928,7 +9928,7 @@
       <w:pPr>
         <w:bidi/>
         <w:spacing w:after="120" w:before="0" w:line="480" w:lineRule="auto"/>
-        <w:jc w:val="start"/>
+        <w:jc w:val="left"/>
       </w:pPr>
       <w:r>
         <w:rPr>
@@ -9946,7 +9946,7 @@
       <w:pPr>
         <w:bidi/>
         <w:spacing w:after="120" w:before="0" w:line="480" w:lineRule="auto"/>
-        <w:jc w:val="start"/>
+        <w:jc w:val="left"/>
       </w:pPr>
       <w:r>
         <w:rPr>
@@ -9980,7 +9980,7 @@
       <w:pPr>
         <w:bidi/>
         <w:spacing w:after="120" w:before="0" w:line="480" w:lineRule="auto"/>
-        <w:jc w:val="start"/>
+        <w:jc w:val="left"/>
       </w:pPr>
       <w:r>
         <w:rPr>
@@ -10014,7 +10014,7 @@
       <w:pPr>
         <w:bidi/>
         <w:spacing w:after="120" w:before="0" w:line="480" w:lineRule="auto"/>
-        <w:jc w:val="start"/>
+        <w:jc w:val="left"/>
       </w:pPr>
       <w:r>
         <w:rPr>
@@ -10048,7 +10048,7 @@
       <w:pPr>
         <w:bidi/>
         <w:spacing w:after="120" w:before="0" w:line="480" w:lineRule="auto"/>
-        <w:jc w:val="start"/>
+        <w:jc w:val="left"/>
       </w:pPr>
       <w:r>
         <w:rPr>
@@ -10066,7 +10066,7 @@
       <w:pPr>
         <w:bidi/>
         <w:spacing w:after="120" w:before="0" w:line="480" w:lineRule="auto"/>
-        <w:jc w:val="start"/>
+        <w:jc w:val="left"/>
       </w:pPr>
       <w:r>
         <w:rPr>
@@ -10100,7 +10100,7 @@
       <w:pPr>
         <w:bidi/>
         <w:spacing w:after="120" w:before="0" w:line="480" w:lineRule="auto"/>
-        <w:jc w:val="start"/>
+        <w:jc w:val="left"/>
       </w:pPr>
       <w:r>
         <w:rPr>
@@ -10134,7 +10134,7 @@
       <w:pPr>
         <w:bidi/>
         <w:spacing w:after="120" w:before="0" w:line="480" w:lineRule="auto"/>
-        <w:jc w:val="start"/>
+        <w:jc w:val="left"/>
       </w:pPr>
       <w:r>
         <w:rPr>
@@ -10168,7 +10168,7 @@
       <w:pPr>
         <w:bidi/>
         <w:spacing w:after="120" w:before="0" w:line="480" w:lineRule="auto"/>
-        <w:jc w:val="start"/>
+        <w:jc w:val="left"/>
       </w:pPr>
       <w:r>
         <w:rPr>
@@ -10202,7 +10202,7 @@
       <w:pPr>
         <w:bidi/>
         <w:spacing w:after="120" w:before="0" w:line="480" w:lineRule="auto"/>
-        <w:jc w:val="start"/>
+        <w:jc w:val="left"/>
       </w:pPr>
       <w:r>
         <w:rPr>
@@ -10236,7 +10236,7 @@
       <w:pPr>
         <w:bidi/>
         <w:spacing w:after="120" w:before="0" w:line="480" w:lineRule="auto"/>
-        <w:jc w:val="start"/>
+        <w:jc w:val="left"/>
       </w:pPr>
       <w:r>
         <w:rPr>
@@ -10254,7 +10254,7 @@
       <w:pPr>
         <w:bidi/>
         <w:spacing w:after="120" w:before="0" w:line="480" w:lineRule="auto"/>
-        <w:jc w:val="start"/>
+        <w:jc w:val="left"/>
       </w:pPr>
       <w:r>
         <w:rPr>
@@ -10288,7 +10288,7 @@
       <w:pPr>
         <w:bidi/>
         <w:spacing w:after="120" w:before="0" w:line="480" w:lineRule="auto"/>
-        <w:jc w:val="start"/>
+        <w:jc w:val="left"/>
       </w:pPr>
       <w:r>
         <w:rPr>
@@ -10322,7 +10322,7 @@
       <w:pPr>
         <w:bidi/>
         <w:spacing w:after="120" w:before="0" w:line="480" w:lineRule="auto"/>
-        <w:jc w:val="start"/>
+        <w:jc w:val="left"/>
       </w:pPr>
       <w:r>
         <w:rPr>
@@ -10356,7 +10356,7 @@
       <w:pPr>
         <w:bidi/>
         <w:spacing w:after="120" w:before="0" w:line="480" w:lineRule="auto"/>
-        <w:jc w:val="start"/>
+        <w:jc w:val="left"/>
       </w:pPr>
       <w:r>
         <w:rPr>
@@ -10390,7 +10390,7 @@
       <w:pPr>
         <w:bidi/>
         <w:spacing w:after="120" w:before="0" w:line="480" w:lineRule="auto"/>
-        <w:jc w:val="start"/>
+        <w:jc w:val="left"/>
       </w:pPr>
       <w:r>
         <w:rPr>
@@ -10424,7 +10424,7 @@
       <w:pPr>
         <w:bidi/>
         <w:spacing w:after="120" w:before="0" w:line="480" w:lineRule="auto"/>
-        <w:jc w:val="start"/>
+        <w:jc w:val="left"/>
       </w:pPr>
       <w:r>
         <w:rPr>
@@ -10442,7 +10442,7 @@
       <w:pPr>
         <w:bidi/>
         <w:spacing w:after="120" w:before="0" w:line="480" w:lineRule="auto"/>
-        <w:jc w:val="start"/>
+        <w:jc w:val="left"/>
       </w:pPr>
       <w:r>
         <w:rPr>
@@ -10476,7 +10476,7 @@
       <w:pPr>
         <w:bidi/>
         <w:spacing w:after="120" w:before="0" w:line="480" w:lineRule="auto"/>
-        <w:jc w:val="start"/>
+        <w:jc w:val="left"/>
       </w:pPr>
       <w:r>
         <w:rPr>
@@ -10510,7 +10510,7 @@
       <w:pPr>
         <w:bidi/>
         <w:spacing w:after="120" w:before="0" w:line="480" w:lineRule="auto"/>
-        <w:jc w:val="start"/>
+        <w:jc w:val="left"/>
       </w:pPr>
       <w:r>
         <w:rPr>
@@ -10544,7 +10544,7 @@
       <w:pPr>
         <w:bidi/>
         <w:spacing w:after="120" w:before="0" w:line="480" w:lineRule="auto"/>
-        <w:jc w:val="start"/>
+        <w:jc w:val="left"/>
       </w:pPr>
       <w:r>
         <w:rPr>
@@ -10578,7 +10578,7 @@
       <w:pPr>
         <w:bidi/>
         <w:spacing w:after="120" w:before="0" w:line="480" w:lineRule="auto"/>
-        <w:jc w:val="start"/>
+        <w:jc w:val="left"/>
       </w:pPr>
       <w:r>
         <w:rPr>
@@ -10779,7 +10779,7 @@
       <w:pPr>
         <w:bidi/>
         <w:spacing w:after="120" w:before="0" w:line="480" w:lineRule="auto"/>
-        <w:jc w:val="start"/>
+        <w:jc w:val="left"/>
       </w:pPr>
       <w:r>
         <w:rPr>
@@ -10797,7 +10797,7 @@
       <w:pPr>
         <w:bidi/>
         <w:spacing w:after="120" w:before="0" w:line="480" w:lineRule="auto"/>
-        <w:jc w:val="start"/>
+        <w:jc w:val="left"/>
       </w:pPr>
       <w:r>
         <w:rPr>
@@ -10831,7 +10831,7 @@
       <w:pPr>
         <w:bidi/>
         <w:spacing w:after="120" w:before="0" w:line="480" w:lineRule="auto"/>
-        <w:jc w:val="start"/>
+        <w:jc w:val="left"/>
       </w:pPr>
       <w:r>
         <w:rPr>
@@ -10865,7 +10865,7 @@
       <w:pPr>
         <w:bidi/>
         <w:spacing w:after="120" w:before="0" w:line="480" w:lineRule="auto"/>
-        <w:jc w:val="start"/>
+        <w:jc w:val="left"/>
       </w:pPr>
       <w:r>
         <w:rPr>
@@ -10899,7 +10899,7 @@
       <w:pPr>
         <w:bidi/>
         <w:spacing w:after="120" w:before="0" w:line="480" w:lineRule="auto"/>
-        <w:jc w:val="start"/>
+        <w:jc w:val="left"/>
       </w:pPr>
       <w:r>
         <w:rPr>
@@ -10917,7 +10917,7 @@
       <w:pPr>
         <w:bidi/>
         <w:spacing w:after="120" w:before="0" w:line="480" w:lineRule="auto"/>
-        <w:jc w:val="start"/>
+        <w:jc w:val="left"/>
       </w:pPr>
       <w:r>
         <w:rPr>
@@ -10951,7 +10951,7 @@
       <w:pPr>
         <w:bidi/>
         <w:spacing w:after="120" w:before="0" w:line="480" w:lineRule="auto"/>
-        <w:jc w:val="start"/>
+        <w:jc w:val="left"/>
       </w:pPr>
       <w:r>
         <w:rPr>
@@ -10985,7 +10985,7 @@
       <w:pPr>
         <w:bidi/>
         <w:spacing w:after="120" w:before="0" w:line="480" w:lineRule="auto"/>
-        <w:jc w:val="start"/>
+        <w:jc w:val="left"/>
       </w:pPr>
       <w:r>
         <w:rPr>
@@ -11019,7 +11019,7 @@
       <w:pPr>
         <w:bidi/>
         <w:spacing w:after="120" w:before="0" w:line="480" w:lineRule="auto"/>
-        <w:jc w:val="start"/>
+        <w:jc w:val="left"/>
       </w:pPr>
       <w:r>
         <w:rPr>
@@ -11053,7 +11053,7 @@
       <w:pPr>
         <w:bidi/>
         <w:spacing w:after="120" w:before="0" w:line="480" w:lineRule="auto"/>
-        <w:jc w:val="start"/>
+        <w:jc w:val="left"/>
       </w:pPr>
       <w:r>
         <w:rPr>
@@ -11087,7 +11087,7 @@
       <w:pPr>
         <w:bidi/>
         <w:spacing w:after="120" w:before="0" w:line="480" w:lineRule="auto"/>
-        <w:jc w:val="start"/>
+        <w:jc w:val="left"/>
       </w:pPr>
       <w:r>
         <w:rPr>
@@ -11105,7 +11105,7 @@
       <w:pPr>
         <w:bidi/>
         <w:spacing w:after="120" w:before="0" w:line="480" w:lineRule="auto"/>
-        <w:jc w:val="start"/>
+        <w:jc w:val="left"/>
       </w:pPr>
       <w:r>
         <w:rPr>
@@ -11139,7 +11139,7 @@
       <w:pPr>
         <w:bidi/>
         <w:spacing w:after="120" w:before="0" w:line="480" w:lineRule="auto"/>
-        <w:jc w:val="start"/>
+        <w:jc w:val="left"/>
       </w:pPr>
       <w:r>
         <w:rPr>
@@ -11173,7 +11173,7 @@
       <w:pPr>
         <w:bidi/>
         <w:spacing w:after="120" w:before="0" w:line="480" w:lineRule="auto"/>
-        <w:jc w:val="start"/>
+        <w:jc w:val="left"/>
       </w:pPr>
       <w:r>
         <w:rPr>
@@ -11207,7 +11207,7 @@
       <w:pPr>
         <w:bidi/>
         <w:spacing w:after="120" w:before="0" w:line="480" w:lineRule="auto"/>
-        <w:jc w:val="start"/>
+        <w:jc w:val="left"/>
       </w:pPr>
       <w:r>
         <w:rPr>
@@ -11241,7 +11241,7 @@
       <w:pPr>
         <w:bidi/>
         <w:spacing w:after="120" w:before="0" w:line="480" w:lineRule="auto"/>
-        <w:jc w:val="start"/>
+        <w:jc w:val="left"/>
       </w:pPr>
       <w:r>
         <w:rPr>
@@ -11275,7 +11275,7 @@
       <w:pPr>
         <w:bidi/>
         <w:spacing w:after="120" w:before="0" w:line="480" w:lineRule="auto"/>
-        <w:jc w:val="start"/>
+        <w:jc w:val="left"/>
       </w:pPr>
       <w:r>
         <w:rPr>
@@ -11293,7 +11293,7 @@
       <w:pPr>
         <w:bidi/>
         <w:spacing w:after="120" w:before="0" w:line="480" w:lineRule="auto"/>
-        <w:jc w:val="start"/>
+        <w:jc w:val="left"/>
       </w:pPr>
       <w:r>
         <w:rPr>
@@ -11327,7 +11327,7 @@
       <w:pPr>
         <w:bidi/>
         <w:spacing w:after="120" w:before="0" w:line="480" w:lineRule="auto"/>
-        <w:jc w:val="start"/>
+        <w:jc w:val="left"/>
       </w:pPr>
       <w:r>
         <w:rPr>
@@ -11361,7 +11361,7 @@
       <w:pPr>
         <w:bidi/>
         <w:spacing w:after="120" w:before="0" w:line="480" w:lineRule="auto"/>
-        <w:jc w:val="start"/>
+        <w:jc w:val="left"/>
       </w:pPr>
       <w:r>
         <w:rPr>
@@ -11395,7 +11395,7 @@
       <w:pPr>
         <w:bidi/>
         <w:spacing w:after="120" w:before="0" w:line="480" w:lineRule="auto"/>
-        <w:jc w:val="start"/>
+        <w:jc w:val="left"/>
       </w:pPr>
       <w:r>
         <w:rPr>
@@ -11429,7 +11429,7 @@
       <w:pPr>
         <w:bidi/>
         <w:spacing w:after="120" w:before="0" w:line="480" w:lineRule="auto"/>
-        <w:jc w:val="start"/>
+        <w:jc w:val="left"/>
       </w:pPr>
       <w:r>
         <w:rPr>
@@ -11630,7 +11630,7 @@
       <w:pPr>
         <w:bidi/>
         <w:spacing w:after="120" w:before="0" w:line="480" w:lineRule="auto"/>
-        <w:jc w:val="start"/>
+        <w:jc w:val="left"/>
       </w:pPr>
       <w:r>
         <w:rPr>
@@ -11648,7 +11648,7 @@
       <w:pPr>
         <w:bidi/>
         <w:spacing w:after="120" w:before="0" w:line="480" w:lineRule="auto"/>
-        <w:jc w:val="start"/>
+        <w:jc w:val="left"/>
       </w:pPr>
       <w:r>
         <w:rPr>
@@ -11682,7 +11682,7 @@
       <w:pPr>
         <w:bidi/>
         <w:spacing w:after="120" w:before="0" w:line="480" w:lineRule="auto"/>
-        <w:jc w:val="start"/>
+        <w:jc w:val="left"/>
       </w:pPr>
       <w:r>
         <w:rPr>
@@ -11716,7 +11716,7 @@
       <w:pPr>
         <w:bidi/>
         <w:spacing w:after="120" w:before="0" w:line="480" w:lineRule="auto"/>
-        <w:jc w:val="start"/>
+        <w:jc w:val="left"/>
       </w:pPr>
       <w:r>
         <w:rPr>
@@ -11750,7 +11750,7 @@
       <w:pPr>
         <w:bidi/>
         <w:spacing w:after="120" w:before="0" w:line="480" w:lineRule="auto"/>
-        <w:jc w:val="start"/>
+        <w:jc w:val="left"/>
       </w:pPr>
       <w:r>
         <w:rPr>
@@ -11768,7 +11768,7 @@
       <w:pPr>
         <w:bidi/>
         <w:spacing w:after="120" w:before="0" w:line="480" w:lineRule="auto"/>
-        <w:jc w:val="start"/>
+        <w:jc w:val="left"/>
       </w:pPr>
       <w:r>
         <w:rPr>
@@ -11802,7 +11802,7 @@
       <w:pPr>
         <w:bidi/>
         <w:spacing w:after="120" w:before="0" w:line="480" w:lineRule="auto"/>
-        <w:jc w:val="start"/>
+        <w:jc w:val="left"/>
       </w:pPr>
       <w:r>
         <w:rPr>
@@ -11836,7 +11836,7 @@
       <w:pPr>
         <w:bidi/>
         <w:spacing w:after="120" w:before="0" w:line="480" w:lineRule="auto"/>
-        <w:jc w:val="start"/>
+        <w:jc w:val="left"/>
       </w:pPr>
       <w:r>
         <w:rPr>
@@ -11870,7 +11870,7 @@
       <w:pPr>
         <w:bidi/>
         <w:spacing w:after="120" w:before="0" w:line="480" w:lineRule="auto"/>
-        <w:jc w:val="start"/>
+        <w:jc w:val="left"/>
       </w:pPr>
       <w:r>
         <w:rPr>
@@ -11904,7 +11904,7 @@
       <w:pPr>
         <w:bidi/>
         <w:spacing w:after="120" w:before="0" w:line="480" w:lineRule="auto"/>
-        <w:jc w:val="start"/>
+        <w:jc w:val="left"/>
       </w:pPr>
       <w:r>
         <w:rPr>
@@ -11938,7 +11938,7 @@
       <w:pPr>
         <w:bidi/>
         <w:spacing w:after="120" w:before="0" w:line="480" w:lineRule="auto"/>
-        <w:jc w:val="start"/>
+        <w:jc w:val="left"/>
       </w:pPr>
       <w:r>
         <w:rPr>
@@ -11956,7 +11956,7 @@
       <w:pPr>
         <w:bidi/>
         <w:spacing w:after="120" w:before="0" w:line="480" w:lineRule="auto"/>
-        <w:jc w:val="start"/>
+        <w:jc w:val="left"/>
       </w:pPr>
       <w:r>
         <w:rPr>
@@ -11990,7 +11990,7 @@
       <w:pPr>
         <w:bidi/>
         <w:spacing w:after="120" w:before="0" w:line="480" w:lineRule="auto"/>
-        <w:jc w:val="start"/>
+        <w:jc w:val="left"/>
       </w:pPr>
       <w:r>
         <w:rPr>
@@ -12024,7 +12024,7 @@
       <w:pPr>
         <w:bidi/>
         <w:spacing w:after="120" w:before="0" w:line="480" w:lineRule="auto"/>
-        <w:jc w:val="start"/>
+        <w:jc w:val="left"/>
       </w:pPr>
       <w:r>
         <w:rPr>
@@ -12058,7 +12058,7 @@
       <w:pPr>
         <w:bidi/>
         <w:spacing w:after="120" w:before="0" w:line="480" w:lineRule="auto"/>
-        <w:jc w:val="start"/>
+        <w:jc w:val="left"/>
       </w:pPr>
       <w:r>
         <w:rPr>
@@ -12092,7 +12092,7 @@
       <w:pPr>
         <w:bidi/>
         <w:spacing w:after="120" w:before="0" w:line="480" w:lineRule="auto"/>
-        <w:jc w:val="start"/>
+        <w:jc w:val="left"/>
       </w:pPr>
       <w:r>
         <w:rPr>
@@ -12126,7 +12126,7 @@
       <w:pPr>
         <w:bidi/>
         <w:spacing w:after="120" w:before="0" w:line="480" w:lineRule="auto"/>
-        <w:jc w:val="start"/>
+        <w:jc w:val="left"/>
       </w:pPr>
       <w:r>
         <w:rPr>
@@ -12144,7 +12144,7 @@
       <w:pPr>
         <w:bidi/>
         <w:spacing w:after="120" w:before="0" w:line="480" w:lineRule="auto"/>
-        <w:jc w:val="start"/>
+        <w:jc w:val="left"/>
       </w:pPr>
       <w:r>
         <w:rPr>
@@ -12178,7 +12178,7 @@
       <w:pPr>
         <w:bidi/>
         <w:spacing w:after="120" w:before="0" w:line="480" w:lineRule="auto"/>
-        <w:jc w:val="start"/>
+        <w:jc w:val="left"/>
       </w:pPr>
       <w:r>
         <w:rPr>
@@ -12212,7 +12212,7 @@
       <w:pPr>
         <w:bidi/>
         <w:spacing w:after="120" w:before="0" w:line="480" w:lineRule="auto"/>
-        <w:jc w:val="start"/>
+        <w:jc w:val="left"/>
       </w:pPr>
       <w:r>
         <w:rPr>
@@ -12246,7 +12246,7 @@
       <w:pPr>
         <w:bidi/>
         <w:spacing w:after="120" w:before="0" w:line="480" w:lineRule="auto"/>
-        <w:jc w:val="start"/>
+        <w:jc w:val="left"/>
       </w:pPr>
       <w:r>
         <w:rPr>
@@ -12280,7 +12280,7 @@
       <w:pPr>
         <w:bidi/>
         <w:spacing w:after="120" w:before="0" w:line="480" w:lineRule="auto"/>
-        <w:jc w:val="start"/>
+        <w:jc w:val="left"/>
       </w:pPr>
       <w:r>
         <w:rPr>
@@ -12481,7 +12481,7 @@
       <w:pPr>
         <w:bidi/>
         <w:spacing w:after="120" w:before="0" w:line="480" w:lineRule="auto"/>
-        <w:jc w:val="start"/>
+        <w:jc w:val="left"/>
       </w:pPr>
       <w:r>
         <w:rPr>
@@ -12499,7 +12499,7 @@
       <w:pPr>
         <w:bidi/>
         <w:spacing w:after="120" w:before="0" w:line="480" w:lineRule="auto"/>
-        <w:jc w:val="start"/>
+        <w:jc w:val="left"/>
       </w:pPr>
       <w:r>
         <w:rPr>
@@ -12533,7 +12533,7 @@
       <w:pPr>
         <w:bidi/>
         <w:spacing w:after="120" w:before="0" w:line="480" w:lineRule="auto"/>
-        <w:jc w:val="start"/>
+        <w:jc w:val="left"/>
       </w:pPr>
       <w:r>
         <w:rPr>
@@ -12567,7 +12567,7 @@
       <w:pPr>
         <w:bidi/>
         <w:spacing w:after="120" w:before="0" w:line="480" w:lineRule="auto"/>
-        <w:jc w:val="start"/>
+        <w:jc w:val="left"/>
       </w:pPr>
       <w:r>
         <w:rPr>
@@ -12601,7 +12601,7 @@
       <w:pPr>
         <w:bidi/>
         <w:spacing w:after="120" w:before="0" w:line="480" w:lineRule="auto"/>
-        <w:jc w:val="start"/>
+        <w:jc w:val="left"/>
       </w:pPr>
       <w:r>
         <w:rPr>
@@ -12619,7 +12619,7 @@
       <w:pPr>
         <w:bidi/>
         <w:spacing w:after="120" w:before="0" w:line="480" w:lineRule="auto"/>
-        <w:jc w:val="start"/>
+        <w:jc w:val="left"/>
       </w:pPr>
       <w:r>
         <w:rPr>
@@ -12653,7 +12653,7 @@
       <w:pPr>
         <w:bidi/>
         <w:spacing w:after="120" w:before="0" w:line="480" w:lineRule="auto"/>
-        <w:jc w:val="start"/>
+        <w:jc w:val="left"/>
       </w:pPr>
       <w:r>
         <w:rPr>
@@ -12687,7 +12687,7 @@
       <w:pPr>
         <w:bidi/>
         <w:spacing w:after="120" w:before="0" w:line="480" w:lineRule="auto"/>
-        <w:jc w:val="start"/>
+        <w:jc w:val="left"/>
       </w:pPr>
       <w:r>
         <w:rPr>
@@ -12721,7 +12721,7 @@
       <w:pPr>
         <w:bidi/>
         <w:spacing w:after="120" w:before="0" w:line="480" w:lineRule="auto"/>
-        <w:jc w:val="start"/>
+        <w:jc w:val="left"/>
       </w:pPr>
       <w:r>
         <w:rPr>
@@ -12755,7 +12755,7 @@
       <w:pPr>
         <w:bidi/>
         <w:spacing w:after="120" w:before="0" w:line="480" w:lineRule="auto"/>
-        <w:jc w:val="start"/>
+        <w:jc w:val="left"/>
       </w:pPr>
       <w:r>
         <w:rPr>
@@ -12789,7 +12789,7 @@
       <w:pPr>
         <w:bidi/>
         <w:spacing w:after="120" w:before="0" w:line="480" w:lineRule="auto"/>
-        <w:jc w:val="start"/>
+        <w:jc w:val="left"/>
       </w:pPr>
       <w:r>
         <w:rPr>
@@ -12807,7 +12807,7 @@
       <w:pPr>
         <w:bidi/>
         <w:spacing w:after="120" w:before="0" w:line="480" w:lineRule="auto"/>
-        <w:jc w:val="start"/>
+        <w:jc w:val="left"/>
       </w:pPr>
       <w:r>
         <w:rPr>
@@ -12841,7 +12841,7 @@
       <w:pPr>
         <w:bidi/>
         <w:spacing w:after="120" w:before="0" w:line="480" w:lineRule="auto"/>
-        <w:jc w:val="start"/>
+        <w:jc w:val="left"/>
       </w:pPr>
       <w:r>
         <w:rPr>
@@ -12875,7 +12875,7 @@
       <w:pPr>
         <w:bidi/>
         <w:spacing w:after="120" w:before="0" w:line="480" w:lineRule="auto"/>
-        <w:jc w:val="start"/>
+        <w:jc w:val="left"/>
       </w:pPr>
       <w:r>
         <w:rPr>
@@ -12909,7 +12909,7 @@
       <w:pPr>
         <w:bidi/>
         <w:spacing w:after="120" w:before="0" w:line="480" w:lineRule="auto"/>
-        <w:jc w:val="start"/>
+        <w:jc w:val="left"/>
       </w:pPr>
       <w:r>
         <w:rPr>
@@ -12943,7 +12943,7 @@
       <w:pPr>
         <w:bidi/>
         <w:spacing w:after="120" w:before="0" w:line="480" w:lineRule="auto"/>
-        <w:jc w:val="start"/>
+        <w:jc w:val="left"/>
       </w:pPr>
       <w:r>
         <w:rPr>
@@ -12977,7 +12977,7 @@
       <w:pPr>
         <w:bidi/>
         <w:spacing w:after="120" w:before="0" w:line="480" w:lineRule="auto"/>
-        <w:jc w:val="start"/>
+        <w:jc w:val="left"/>
       </w:pPr>
       <w:r>
         <w:rPr>
@@ -12995,7 +12995,7 @@
       <w:pPr>
         <w:bidi/>
         <w:spacing w:after="120" w:before="0" w:line="480" w:lineRule="auto"/>
-        <w:jc w:val="start"/>
+        <w:jc w:val="left"/>
       </w:pPr>
       <w:r>
         <w:rPr>
@@ -13029,7 +13029,7 @@
       <w:pPr>
         <w:bidi/>
         <w:spacing w:after="120" w:before="0" w:line="480" w:lineRule="auto"/>
-        <w:jc w:val="start"/>
+        <w:jc w:val="left"/>
       </w:pPr>
       <w:r>
         <w:rPr>
@@ -13063,7 +13063,7 @@
       <w:pPr>
         <w:bidi/>
         <w:spacing w:after="120" w:before="0" w:line="480" w:lineRule="auto"/>
-        <w:jc w:val="start"/>
+        <w:jc w:val="left"/>
       </w:pPr>
       <w:r>
         <w:rPr>
@@ -13097,7 +13097,7 @@
       <w:pPr>
         <w:bidi/>
         <w:spacing w:after="120" w:before="0" w:line="480" w:lineRule="auto"/>
-        <w:jc w:val="start"/>
+        <w:jc w:val="left"/>
       </w:pPr>
       <w:r>
         <w:rPr>
@@ -13131,7 +13131,7 @@
       <w:pPr>
         <w:bidi/>
         <w:spacing w:after="120" w:before="0" w:line="480" w:lineRule="auto"/>
-        <w:jc w:val="start"/>
+        <w:jc w:val="left"/>
       </w:pPr>
       <w:r>
         <w:rPr>
@@ -13332,7 +13332,7 @@
       <w:pPr>
         <w:bidi/>
         <w:spacing w:after="120" w:before="0" w:line="480" w:lineRule="auto"/>
-        <w:jc w:val="start"/>
+        <w:jc w:val="left"/>
       </w:pPr>
       <w:r>
         <w:rPr>
@@ -13350,7 +13350,7 @@
       <w:pPr>
         <w:bidi/>
         <w:spacing w:after="120" w:before="0" w:line="480" w:lineRule="auto"/>
-        <w:jc w:val="start"/>
+        <w:jc w:val="left"/>
       </w:pPr>
       <w:r>
         <w:rPr>
@@ -13384,7 +13384,7 @@
       <w:pPr>
         <w:bidi/>
         <w:spacing w:after="120" w:before="0" w:line="480" w:lineRule="auto"/>
-        <w:jc w:val="start"/>
+        <w:jc w:val="left"/>
       </w:pPr>
       <w:r>
         <w:rPr>
@@ -13418,7 +13418,7 @@
       <w:pPr>
         <w:bidi/>
         <w:spacing w:after="120" w:before="0" w:line="480" w:lineRule="auto"/>
-        <w:jc w:val="start"/>
+        <w:jc w:val="left"/>
       </w:pPr>
       <w:r>
         <w:rPr>
@@ -13452,7 +13452,7 @@
       <w:pPr>
         <w:bidi/>
         <w:spacing w:after="120" w:before="0" w:line="480" w:lineRule="auto"/>
-        <w:jc w:val="start"/>
+        <w:jc w:val="left"/>
       </w:pPr>
       <w:r>
         <w:rPr>
@@ -13470,7 +13470,7 @@
       <w:pPr>
         <w:bidi/>
         <w:spacing w:after="120" w:before="0" w:line="480" w:lineRule="auto"/>
-        <w:jc w:val="start"/>
+        <w:jc w:val="left"/>
       </w:pPr>
       <w:r>
         <w:rPr>
@@ -13504,7 +13504,7 @@
       <w:pPr>
         <w:bidi/>
         <w:spacing w:after="120" w:before="0" w:line="480" w:lineRule="auto"/>
-        <w:jc w:val="start"/>
+        <w:jc w:val="left"/>
       </w:pPr>
       <w:r>
         <w:rPr>
@@ -13538,7 +13538,7 @@
       <w:pPr>
         <w:bidi/>
         <w:spacing w:after="120" w:before="0" w:line="480" w:lineRule="auto"/>
-        <w:jc w:val="start"/>
+        <w:jc w:val="left"/>
       </w:pPr>
       <w:r>
         <w:rPr>
@@ -13572,7 +13572,7 @@
       <w:pPr>
         <w:bidi/>
         <w:spacing w:after="120" w:before="0" w:line="480" w:lineRule="auto"/>
-        <w:jc w:val="start"/>
+        <w:jc w:val="left"/>
       </w:pPr>
       <w:r>
         <w:rPr>
@@ -13606,7 +13606,7 @@
       <w:pPr>
         <w:bidi/>
         <w:spacing w:after="120" w:before="0" w:line="480" w:lineRule="auto"/>
-        <w:jc w:val="start"/>
+        <w:jc w:val="left"/>
       </w:pPr>
       <w:r>
         <w:rPr>
@@ -13640,7 +13640,7 @@
       <w:pPr>
         <w:bidi/>
         <w:spacing w:after="120" w:before="0" w:line="480" w:lineRule="auto"/>
-        <w:jc w:val="start"/>
+        <w:jc w:val="left"/>
       </w:pPr>
       <w:r>
         <w:rPr>
@@ -13658,7 +13658,7 @@
       <w:pPr>
         <w:bidi/>
         <w:spacing w:after="120" w:before="0" w:line="480" w:lineRule="auto"/>
-        <w:jc w:val="start"/>
+        <w:jc w:val="left"/>
       </w:pPr>
       <w:r>
         <w:rPr>
@@ -13692,7 +13692,7 @@
       <w:pPr>
         <w:bidi/>
         <w:spacing w:after="120" w:before="0" w:line="480" w:lineRule="auto"/>
-        <w:jc w:val="start"/>
+        <w:jc w:val="left"/>
       </w:pPr>
       <w:r>
         <w:rPr>
@@ -13726,7 +13726,7 @@
       <w:pPr>
         <w:bidi/>
         <w:spacing w:after="120" w:before="0" w:line="480" w:lineRule="auto"/>
-        <w:jc w:val="start"/>
+        <w:jc w:val="left"/>
       </w:pPr>
       <w:r>
         <w:rPr>
@@ -13760,7 +13760,7 @@
       <w:pPr>
         <w:bidi/>
         <w:spacing w:after="120" w:before="0" w:line="480" w:lineRule="auto"/>
-        <w:jc w:val="start"/>
+        <w:jc w:val="left"/>
       </w:pPr>
       <w:r>
         <w:rPr>
@@ -13794,7 +13794,7 @@
       <w:pPr>
         <w:bidi/>
         <w:spacing w:after="120" w:before="0" w:line="480" w:lineRule="auto"/>
-        <w:jc w:val="start"/>
+        <w:jc w:val="left"/>
       </w:pPr>
       <w:r>
         <w:rPr>
@@ -13828,7 +13828,7 @@
       <w:pPr>
         <w:bidi/>
         <w:spacing w:after="120" w:before="0" w:line="480" w:lineRule="auto"/>
-        <w:jc w:val="start"/>
+        <w:jc w:val="left"/>
       </w:pPr>
       <w:r>
         <w:rPr>
@@ -13846,7 +13846,7 @@
       <w:pPr>
         <w:bidi/>
         <w:spacing w:after="120" w:before="0" w:line="480" w:lineRule="auto"/>
-        <w:jc w:val="start"/>
+        <w:jc w:val="left"/>
       </w:pPr>
       <w:r>
         <w:rPr>
@@ -13880,7 +13880,7 @@
       <w:pPr>
         <w:bidi/>
         <w:spacing w:after="120" w:before="0" w:line="480" w:lineRule="auto"/>
-        <w:jc w:val="start"/>
+        <w:jc w:val="left"/>
       </w:pPr>
       <w:r>
         <w:rPr>
@@ -13914,7 +13914,7 @@
       <w:pPr>
         <w:bidi/>
         <w:spacing w:after="120" w:before="0" w:line="480" w:lineRule="auto"/>
-        <w:jc w:val="start"/>
+        <w:jc w:val="left"/>
       </w:pPr>
       <w:r>
         <w:rPr>
@@ -13948,7 +13948,7 @@
       <w:pPr>
         <w:bidi/>
         <w:spacing w:after="120" w:before="0" w:line="480" w:lineRule="auto"/>
-        <w:jc w:val="start"/>
+        <w:jc w:val="left"/>
       </w:pPr>
       <w:r>
         <w:rPr>
@@ -13982,7 +13982,7 @@
       <w:pPr>
         <w:bidi/>
         <w:spacing w:after="120" w:before="0" w:line="480" w:lineRule="auto"/>
-        <w:jc w:val="start"/>
+        <w:jc w:val="left"/>
       </w:pPr>
       <w:r>
         <w:rPr>
@@ -14183,7 +14183,7 @@
       <w:pPr>
         <w:bidi/>
         <w:spacing w:after="120" w:before="0" w:line="480" w:lineRule="auto"/>
-        <w:jc w:val="start"/>
+        <w:jc w:val="left"/>
       </w:pPr>
       <w:r>
         <w:rPr>
@@ -14201,7 +14201,7 @@
       <w:pPr>
         <w:bidi/>
         <w:spacing w:after="120" w:before="0" w:line="480" w:lineRule="auto"/>
-        <w:jc w:val="start"/>
+        <w:jc w:val="left"/>
       </w:pPr>
       <w:r>
         <w:rPr>
@@ -14235,7 +14235,7 @@
       <w:pPr>
         <w:bidi/>
         <w:spacing w:after="120" w:before="0" w:line="480" w:lineRule="auto"/>
-        <w:jc w:val="start"/>
+        <w:jc w:val="left"/>
       </w:pPr>
       <w:r>
         <w:rPr>
@@ -14269,7 +14269,7 @@
       <w:pPr>
         <w:bidi/>
         <w:spacing w:after="120" w:before="0" w:line="480" w:lineRule="auto"/>
-        <w:jc w:val="start"/>
+        <w:jc w:val="left"/>
       </w:pPr>
       <w:r>
         <w:rPr>
@@ -14303,7 +14303,7 @@
       <w:pPr>
         <w:bidi/>
         <w:spacing w:after="120" w:before="0" w:line="480" w:lineRule="auto"/>
-        <w:jc w:val="start"/>
+        <w:jc w:val="left"/>
       </w:pPr>
       <w:r>
         <w:rPr>
@@ -14321,7 +14321,7 @@
       <w:pPr>
         <w:bidi/>
         <w:spacing w:after="120" w:before="0" w:line="480" w:lineRule="auto"/>
-        <w:jc w:val="start"/>
+        <w:jc w:val="left"/>
       </w:pPr>
       <w:r>
         <w:rPr>
@@ -14355,7 +14355,7 @@
       <w:pPr>
         <w:bidi/>
         <w:spacing w:after="120" w:before="0" w:line="480" w:lineRule="auto"/>
-        <w:jc w:val="start"/>
+        <w:jc w:val="left"/>
       </w:pPr>
       <w:r>
         <w:rPr>
@@ -14389,7 +14389,7 @@
       <w:pPr>
         <w:bidi/>
         <w:spacing w:after="120" w:before="0" w:line="480" w:lineRule="auto"/>
-        <w:jc w:val="start"/>
+        <w:jc w:val="left"/>
       </w:pPr>
       <w:r>
         <w:rPr>
@@ -14423,7 +14423,7 @@
       <w:pPr>
         <w:bidi/>
         <w:spacing w:after="120" w:before="0" w:line="480" w:lineRule="auto"/>
-        <w:jc w:val="start"/>
+        <w:jc w:val="left"/>
       </w:pPr>
       <w:r>
         <w:rPr>
@@ -14457,7 +14457,7 @@
       <w:pPr>
         <w:bidi/>
         <w:spacing w:after="120" w:before="0" w:line="480" w:lineRule="auto"/>
-        <w:jc w:val="start"/>
+        <w:jc w:val="left"/>
       </w:pPr>
       <w:r>
         <w:rPr>
@@ -14491,7 +14491,7 @@
       <w:pPr>
         <w:bidi/>
         <w:spacing w:after="120" w:before="0" w:line="480" w:lineRule="auto"/>
-        <w:jc w:val="start"/>
+        <w:jc w:val="left"/>
       </w:pPr>
       <w:r>
         <w:rPr>
@@ -14509,7 +14509,7 @@
       <w:pPr>
         <w:bidi/>
         <w:spacing w:after="120" w:before="0" w:line="480" w:lineRule="auto"/>
-        <w:jc w:val="start"/>
+        <w:jc w:val="left"/>
       </w:pPr>
       <w:r>
         <w:rPr>
@@ -14543,7 +14543,7 @@
       <w:pPr>
         <w:bidi/>
         <w:spacing w:after="120" w:before="0" w:line="480" w:lineRule="auto"/>
-        <w:jc w:val="start"/>
+        <w:jc w:val="left"/>
       </w:pPr>
       <w:r>
         <w:rPr>
@@ -14577,7 +14577,7 @@
       <w:pPr>
         <w:bidi/>
         <w:spacing w:after="120" w:before="0" w:line="480" w:lineRule="auto"/>
-        <w:jc w:val="start"/>
+        <w:jc w:val="left"/>
       </w:pPr>
       <w:r>
         <w:rPr>
@@ -14611,7 +14611,7 @@
       <w:pPr>
         <w:bidi/>
         <w:spacing w:after="120" w:before="0" w:line="480" w:lineRule="auto"/>
-        <w:jc w:val="start"/>
+        <w:jc w:val="left"/>
       </w:pPr>
       <w:r>
         <w:rPr>
@@ -14645,7 +14645,7 @@
       <w:pPr>
         <w:bidi/>
         <w:spacing w:after="120" w:before="0" w:line="480" w:lineRule="auto"/>
-        <w:jc w:val="start"/>
+        <w:jc w:val="left"/>
       </w:pPr>
       <w:r>
         <w:rPr>
@@ -14679,7 +14679,7 @@
       <w:pPr>
         <w:bidi/>
         <w:spacing w:after="120" w:before="0" w:line="480" w:lineRule="auto"/>
-        <w:jc w:val="start"/>
+        <w:jc w:val="left"/>
       </w:pPr>
       <w:r>
         <w:rPr>
@@ -14697,7 +14697,7 @@
       <w:pPr>
         <w:bidi/>
         <w:spacing w:after="120" w:before="0" w:line="480" w:lineRule="auto"/>
-        <w:jc w:val="start"/>
+        <w:jc w:val="left"/>
       </w:pPr>
       <w:r>
         <w:rPr>
@@ -14731,7 +14731,7 @@
       <w:pPr>
         <w:bidi/>
         <w:spacing w:after="120" w:before="0" w:line="480" w:lineRule="auto"/>
-        <w:jc w:val="start"/>
+        <w:jc w:val="left"/>
       </w:pPr>
       <w:r>
         <w:rPr>
@@ -14765,7 +14765,7 @@
       <w:pPr>
         <w:bidi/>
         <w:spacing w:after="120" w:before="0" w:line="480" w:lineRule="auto"/>
-        <w:jc w:val="start"/>
+        <w:jc w:val="left"/>
       </w:pPr>
       <w:r>
         <w:rPr>
@@ -14799,7 +14799,7 @@
       <w:pPr>
         <w:bidi/>
         <w:spacing w:after="120" w:before="0" w:line="480" w:lineRule="auto"/>
-        <w:jc w:val="start"/>
+        <w:jc w:val="left"/>
       </w:pPr>
       <w:r>
         <w:rPr>
@@ -14833,7 +14833,7 @@
       <w:pPr>
         <w:bidi/>
         <w:spacing w:after="120" w:before="0" w:line="480" w:lineRule="auto"/>
-        <w:jc w:val="start"/>
+        <w:jc w:val="left"/>
       </w:pPr>
       <w:r>
         <w:rPr>
@@ -15034,7 +15034,7 @@
       <w:pPr>
         <w:bidi/>
         <w:spacing w:after="120" w:before="0" w:line="480" w:lineRule="auto"/>
-        <w:jc w:val="start"/>
+        <w:jc w:val="left"/>
       </w:pPr>
       <w:r>
         <w:rPr>
@@ -15052,7 +15052,7 @@
       <w:pPr>
         <w:bidi/>
         <w:spacing w:after="120" w:before="0" w:line="480" w:lineRule="auto"/>
-        <w:jc w:val="start"/>
+        <w:jc w:val="left"/>
       </w:pPr>
       <w:r>
         <w:rPr>
@@ -15086,7 +15086,7 @@
       <w:pPr>
         <w:bidi/>
         <w:spacing w:after="120" w:before="0" w:line="480" w:lineRule="auto"/>
-        <w:jc w:val="start"/>
+        <w:jc w:val="left"/>
       </w:pPr>
       <w:r>
         <w:rPr>
@@ -15120,7 +15120,7 @@
       <w:pPr>
         <w:bidi/>
         <w:spacing w:after="120" w:before="0" w:line="480" w:lineRule="auto"/>
-        <w:jc w:val="start"/>
+        <w:jc w:val="left"/>
       </w:pPr>
       <w:r>
         <w:rPr>
@@ -15154,7 +15154,7 @@
       <w:pPr>
         <w:bidi/>
         <w:spacing w:after="120" w:before="0" w:line="480" w:lineRule="auto"/>
-        <w:jc w:val="start"/>
+        <w:jc w:val="left"/>
       </w:pPr>
       <w:r>
         <w:rPr>
@@ -15172,7 +15172,7 @@
       <w:pPr>
         <w:bidi/>
         <w:spacing w:after="120" w:before="0" w:line="480" w:lineRule="auto"/>
-        <w:jc w:val="start"/>
+        <w:jc w:val="left"/>
       </w:pPr>
       <w:r>
         <w:rPr>
@@ -15206,7 +15206,7 @@
       <w:pPr>
         <w:bidi/>
         <w:spacing w:after="120" w:before="0" w:line="480" w:lineRule="auto"/>
-        <w:jc w:val="start"/>
+        <w:jc w:val="left"/>
       </w:pPr>
       <w:r>
         <w:rPr>
@@ -15240,7 +15240,7 @@
       <w:pPr>
         <w:bidi/>
         <w:spacing w:after="120" w:before="0" w:line="480" w:lineRule="auto"/>
-        <w:jc w:val="start"/>
+        <w:jc w:val="left"/>
       </w:pPr>
       <w:r>
         <w:rPr>
@@ -15274,7 +15274,7 @@
       <w:pPr>
         <w:bidi/>
         <w:spacing w:after="120" w:before="0" w:line="480" w:lineRule="auto"/>
-        <w:jc w:val="start"/>
+        <w:jc w:val="left"/>
       </w:pPr>
       <w:r>
         <w:rPr>
@@ -15308,7 +15308,7 @@
       <w:pPr>
         <w:bidi/>
         <w:spacing w:after="120" w:before="0" w:line="480" w:lineRule="auto"/>
-        <w:jc w:val="start"/>
+        <w:jc w:val="left"/>
       </w:pPr>
       <w:r>
         <w:rPr>
@@ -15342,7 +15342,7 @@
       <w:pPr>
         <w:bidi/>
         <w:spacing w:after="120" w:before="0" w:line="480" w:lineRule="auto"/>
-        <w:jc w:val="start"/>
+        <w:jc w:val="left"/>
       </w:pPr>
       <w:r>
         <w:rPr>
@@ -15360,7 +15360,7 @@
       <w:pPr>
         <w:bidi/>
         <w:spacing w:after="120" w:before="0" w:line="480" w:lineRule="auto"/>
-        <w:jc w:val="start"/>
+        <w:jc w:val="left"/>
       </w:pPr>
       <w:r>
         <w:rPr>
@@ -15394,7 +15394,7 @@
       <w:pPr>
         <w:bidi/>
         <w:spacing w:after="120" w:before="0" w:line="480" w:lineRule="auto"/>
-        <w:jc w:val="start"/>
+        <w:jc w:val="left"/>
       </w:pPr>
       <w:r>
         <w:rPr>
@@ -15428,7 +15428,7 @@
       <w:pPr>
         <w:bidi/>
         <w:spacing w:after="120" w:before="0" w:line="480" w:lineRule="auto"/>
-        <w:jc w:val="start"/>
+        <w:jc w:val="left"/>
       </w:pPr>
       <w:r>
         <w:rPr>
@@ -15462,7 +15462,7 @@
       <w:pPr>
         <w:bidi/>
         <w:spacing w:after="120" w:before="0" w:line="480" w:lineRule="auto"/>
-        <w:jc w:val="start"/>
+        <w:jc w:val="left"/>
       </w:pPr>
       <w:r>
         <w:rPr>
@@ -15496,7 +15496,7 @@
       <w:pPr>
         <w:bidi/>
         <w:spacing w:after="120" w:before="0" w:line="480" w:lineRule="auto"/>
-        <w:jc w:val="start"/>
+        <w:jc w:val="left"/>
       </w:pPr>
       <w:r>
         <w:rPr>
@@ -15530,7 +15530,7 @@
       <w:pPr>
         <w:bidi/>
         <w:spacing w:after="120" w:before="0" w:line="480" w:lineRule="auto"/>
-        <w:jc w:val="start"/>
+        <w:jc w:val="left"/>
       </w:pPr>
       <w:r>
         <w:rPr>
@@ -15548,7 +15548,7 @@
       <w:pPr>
         <w:bidi/>
         <w:spacing w:after="120" w:before="0" w:line="480" w:lineRule="auto"/>
-        <w:jc w:val="start"/>
+        <w:jc w:val="left"/>
       </w:pPr>
       <w:r>
         <w:rPr>
@@ -15582,7 +15582,7 @@
       <w:pPr>
         <w:bidi/>
         <w:spacing w:after="120" w:before="0" w:line="480" w:lineRule="auto"/>
-        <w:jc w:val="start"/>
+        <w:jc w:val="left"/>
       </w:pPr>
       <w:r>
         <w:rPr>
@@ -15616,7 +15616,7 @@
       <w:pPr>
         <w:bidi/>
         <w:spacing w:after="120" w:before="0" w:line="480" w:lineRule="auto"/>
-        <w:jc w:val="start"/>
+        <w:jc w:val="left"/>
       </w:pPr>
       <w:r>
         <w:rPr>
@@ -15650,7 +15650,7 @@
       <w:pPr>
         <w:bidi/>
         <w:spacing w:after="120" w:before="0" w:line="480" w:lineRule="auto"/>
-        <w:jc w:val="start"/>
+        <w:jc w:val="left"/>
       </w:pPr>
       <w:r>
         <w:rPr>
@@ -15684,7 +15684,7 @@
       <w:pPr>
         <w:bidi/>
         <w:spacing w:after="120" w:before="0" w:line="480" w:lineRule="auto"/>
-        <w:jc w:val="start"/>
+        <w:jc w:val="left"/>
       </w:pPr>
       <w:r>
         <w:rPr>

</xml_diff>

<commit_message>
Flush-right paragraphs, add reliability section and critical reflection
Co-Authored-By: Claude Opus 5.5 <noreply@anthropic.com>
Claude-Session: https://claude.ai/code/session_01PCrLuLuf13bgHFN1Akf9GB
</commit_message>
<xml_diff>
--- a/seminar/עבודת סמינר - חיתאם אבו ריאש.docx
+++ b/seminar/עבודת סמינר - חיתאם אבו ריאש.docx
@@ -908,6 +908,43 @@
               <w:tab w:val="right" w:leader="dot" w:pos="9072"/>
             </w:tabs>
             <w:spacing w:before="0" w:after="20" w:line="252" w:lineRule="auto"/>
+            <w:ind w:left="567"/>
+          </w:pPr>
+          <w:r>
+            <w:rPr>
+              <w:rFonts w:ascii="Times New Roman" w:hAnsi="Times New Roman" w:cs="David"/>
+              <w:sz w:val="24"/>
+              <w:szCs w:val="24"/>
+              <w:rtl/>
+            </w:rPr>
+            <w:t xml:space="preserve">3.6 אמינות המחקר</w:t>
+          </w:r>
+          <w:r>
+            <w:rPr>
+              <w:rFonts w:ascii="Times New Roman" w:hAnsi="Times New Roman" w:cs="David"/>
+              <w:sz w:val="24"/>
+              <w:szCs w:val="24"/>
+              <w:rtl/>
+            </w:rPr>
+            <w:tab/>
+          </w:r>
+          <w:r>
+            <w:rPr>
+              <w:rFonts w:ascii="Times New Roman" w:hAnsi="Times New Roman" w:cs="David"/>
+              <w:sz w:val="24"/>
+              <w:szCs w:val="24"/>
+              <w:rtl/>
+            </w:rPr>
+            <w:t>8</w:t>
+          </w:r>
+        </w:p>
+        <w:p>
+          <w:pPr>
+            <w:bidi/>
+            <w:tabs>
+              <w:tab w:val="right" w:leader="dot" w:pos="9072"/>
+            </w:tabs>
+            <w:spacing w:before="0" w:after="20" w:line="252" w:lineRule="auto"/>
           </w:pPr>
           <w:r>
             <w:rPr>
@@ -936,7 +973,7 @@
               <w:szCs w:val="24"/>
               <w:rtl/>
             </w:rPr>
-            <w:t>9</w:t>
+            <w:t>10</w:t>
           </w:r>
         </w:p>
         <w:p>
@@ -973,7 +1010,7 @@
               <w:szCs w:val="24"/>
               <w:rtl/>
             </w:rPr>
-            <w:t>9</w:t>
+            <w:t>10</w:t>
           </w:r>
         </w:p>
         <w:p>
@@ -1047,7 +1084,7 @@
               <w:szCs w:val="24"/>
               <w:rtl/>
             </w:rPr>
-            <w:t>12</w:t>
+            <w:t>13</w:t>
           </w:r>
         </w:p>
         <w:p>
@@ -1084,7 +1121,7 @@
               <w:szCs w:val="24"/>
               <w:rtl/>
             </w:rPr>
-            <w:t>13</w:t>
+            <w:t>14</w:t>
           </w:r>
         </w:p>
         <w:p>
@@ -1798,8 +1835,7 @@
     <w:p>
       <w:pPr>
         <w:bidi/>
-        <w:spacing w:after="0" w:before="0" w:line="360" w:lineRule="auto"/>
-        <w:ind w:firstLine="567"/>
+        <w:spacing w:after="60" w:before="0" w:line="360" w:lineRule="auto"/>
         <w:jc w:val="both"/>
       </w:pPr>
       <w:r>
@@ -1815,8 +1851,7 @@
     <w:p>
       <w:pPr>
         <w:bidi/>
-        <w:spacing w:after="0" w:before="0" w:line="360" w:lineRule="auto"/>
-        <w:ind w:firstLine="567"/>
+        <w:spacing w:after="60" w:before="0" w:line="360" w:lineRule="auto"/>
         <w:jc w:val="both"/>
       </w:pPr>
       <w:r>
@@ -1832,8 +1867,7 @@
     <w:p>
       <w:pPr>
         <w:bidi/>
-        <w:spacing w:after="0" w:before="0" w:line="360" w:lineRule="auto"/>
-        <w:ind w:firstLine="567"/>
+        <w:spacing w:after="60" w:before="0" w:line="360" w:lineRule="auto"/>
         <w:jc w:val="both"/>
       </w:pPr>
       <w:r>
@@ -1888,8 +1922,7 @@
     <w:p>
       <w:pPr>
         <w:bidi/>
-        <w:spacing w:after="0" w:before="0" w:line="360" w:lineRule="auto"/>
-        <w:ind w:firstLine="567"/>
+        <w:spacing w:after="60" w:before="0" w:line="360" w:lineRule="auto"/>
         <w:jc w:val="both"/>
       </w:pPr>
       <w:r>
@@ -1905,8 +1938,7 @@
     <w:p>
       <w:pPr>
         <w:bidi/>
-        <w:spacing w:after="0" w:before="0" w:line="360" w:lineRule="auto"/>
-        <w:ind w:firstLine="567"/>
+        <w:spacing w:after="60" w:before="0" w:line="360" w:lineRule="auto"/>
         <w:jc w:val="both"/>
       </w:pPr>
       <w:r>
@@ -1922,8 +1954,7 @@
     <w:p>
       <w:pPr>
         <w:bidi/>
-        <w:spacing w:after="0" w:before="0" w:line="360" w:lineRule="auto"/>
-        <w:ind w:firstLine="567"/>
+        <w:spacing w:after="60" w:before="0" w:line="360" w:lineRule="auto"/>
         <w:jc w:val="both"/>
       </w:pPr>
       <w:r>
@@ -1958,8 +1989,7 @@
     <w:p>
       <w:pPr>
         <w:bidi/>
-        <w:spacing w:after="0" w:before="0" w:line="360" w:lineRule="auto"/>
-        <w:ind w:firstLine="567"/>
+        <w:spacing w:after="60" w:before="0" w:line="360" w:lineRule="auto"/>
         <w:jc w:val="both"/>
       </w:pPr>
       <w:r>
@@ -1975,8 +2005,7 @@
     <w:p>
       <w:pPr>
         <w:bidi/>
-        <w:spacing w:after="0" w:before="0" w:line="360" w:lineRule="auto"/>
-        <w:ind w:firstLine="567"/>
+        <w:spacing w:after="60" w:before="0" w:line="360" w:lineRule="auto"/>
         <w:jc w:val="both"/>
       </w:pPr>
       <w:r>
@@ -1992,8 +2021,7 @@
     <w:p>
       <w:pPr>
         <w:bidi/>
-        <w:spacing w:after="0" w:before="0" w:line="360" w:lineRule="auto"/>
-        <w:ind w:firstLine="567"/>
+        <w:spacing w:after="60" w:before="0" w:line="360" w:lineRule="auto"/>
         <w:jc w:val="both"/>
       </w:pPr>
       <w:r>
@@ -2009,8 +2037,7 @@
     <w:p>
       <w:pPr>
         <w:bidi/>
-        <w:spacing w:after="0" w:before="0" w:line="360" w:lineRule="auto"/>
-        <w:ind w:firstLine="567"/>
+        <w:spacing w:after="60" w:before="0" w:line="360" w:lineRule="auto"/>
         <w:jc w:val="both"/>
       </w:pPr>
       <w:r>
@@ -2045,8 +2072,7 @@
     <w:p>
       <w:pPr>
         <w:bidi/>
-        <w:spacing w:after="0" w:before="0" w:line="360" w:lineRule="auto"/>
-        <w:ind w:firstLine="567"/>
+        <w:spacing w:after="60" w:before="0" w:line="360" w:lineRule="auto"/>
         <w:jc w:val="both"/>
       </w:pPr>
       <w:r>
@@ -2062,8 +2088,7 @@
     <w:p>
       <w:pPr>
         <w:bidi/>
-        <w:spacing w:after="0" w:before="0" w:line="360" w:lineRule="auto"/>
-        <w:ind w:firstLine="567"/>
+        <w:spacing w:after="60" w:before="0" w:line="360" w:lineRule="auto"/>
         <w:jc w:val="both"/>
       </w:pPr>
       <w:r>
@@ -2079,8 +2104,7 @@
     <w:p>
       <w:pPr>
         <w:bidi/>
-        <w:spacing w:after="0" w:before="0" w:line="360" w:lineRule="auto"/>
-        <w:ind w:firstLine="567"/>
+        <w:spacing w:after="60" w:before="0" w:line="360" w:lineRule="auto"/>
         <w:jc w:val="both"/>
       </w:pPr>
       <w:r>
@@ -2096,8 +2120,7 @@
     <w:p>
       <w:pPr>
         <w:bidi/>
-        <w:spacing w:after="0" w:before="0" w:line="360" w:lineRule="auto"/>
-        <w:ind w:firstLine="567"/>
+        <w:spacing w:after="60" w:before="0" w:line="360" w:lineRule="auto"/>
         <w:jc w:val="both"/>
       </w:pPr>
       <w:r>
@@ -2113,8 +2136,7 @@
     <w:p>
       <w:pPr>
         <w:bidi/>
-        <w:spacing w:after="0" w:before="0" w:line="360" w:lineRule="auto"/>
-        <w:ind w:firstLine="567"/>
+        <w:spacing w:after="60" w:before="0" w:line="360" w:lineRule="auto"/>
         <w:jc w:val="both"/>
       </w:pPr>
       <w:r>
@@ -2149,8 +2171,7 @@
     <w:p>
       <w:pPr>
         <w:bidi/>
-        <w:spacing w:after="0" w:before="0" w:line="360" w:lineRule="auto"/>
-        <w:ind w:firstLine="567"/>
+        <w:spacing w:after="60" w:before="0" w:line="360" w:lineRule="auto"/>
         <w:jc w:val="both"/>
       </w:pPr>
       <w:r>
@@ -2166,8 +2187,7 @@
     <w:p>
       <w:pPr>
         <w:bidi/>
-        <w:spacing w:after="0" w:before="0" w:line="360" w:lineRule="auto"/>
-        <w:ind w:firstLine="567"/>
+        <w:spacing w:after="60" w:before="0" w:line="360" w:lineRule="auto"/>
         <w:jc w:val="both"/>
       </w:pPr>
       <w:r>
@@ -2183,8 +2203,7 @@
     <w:p>
       <w:pPr>
         <w:bidi/>
-        <w:spacing w:after="0" w:before="0" w:line="360" w:lineRule="auto"/>
-        <w:ind w:firstLine="567"/>
+        <w:spacing w:after="60" w:before="0" w:line="360" w:lineRule="auto"/>
         <w:jc w:val="both"/>
       </w:pPr>
       <w:r>
@@ -2219,8 +2238,7 @@
     <w:p>
       <w:pPr>
         <w:bidi/>
-        <w:spacing w:after="0" w:before="0" w:line="360" w:lineRule="auto"/>
-        <w:ind w:firstLine="567"/>
+        <w:spacing w:after="60" w:before="0" w:line="360" w:lineRule="auto"/>
         <w:jc w:val="both"/>
       </w:pPr>
       <w:r>
@@ -2236,8 +2254,7 @@
     <w:p>
       <w:pPr>
         <w:bidi/>
-        <w:spacing w:after="0" w:before="0" w:line="360" w:lineRule="auto"/>
-        <w:ind w:firstLine="567"/>
+        <w:spacing w:after="60" w:before="0" w:line="360" w:lineRule="auto"/>
         <w:jc w:val="both"/>
       </w:pPr>
       <w:r>
@@ -2253,8 +2270,7 @@
     <w:p>
       <w:pPr>
         <w:bidi/>
-        <w:spacing w:after="0" w:before="0" w:line="360" w:lineRule="auto"/>
-        <w:ind w:firstLine="567"/>
+        <w:spacing w:after="60" w:before="0" w:line="360" w:lineRule="auto"/>
         <w:jc w:val="both"/>
       </w:pPr>
       <w:r>
@@ -2270,8 +2286,7 @@
     <w:p>
       <w:pPr>
         <w:bidi/>
-        <w:spacing w:after="0" w:before="0" w:line="360" w:lineRule="auto"/>
-        <w:ind w:firstLine="567"/>
+        <w:spacing w:after="60" w:before="0" w:line="360" w:lineRule="auto"/>
         <w:jc w:val="both"/>
       </w:pPr>
       <w:r>
@@ -2307,8 +2322,7 @@
     <w:p>
       <w:pPr>
         <w:bidi/>
-        <w:spacing w:after="0" w:before="0" w:line="360" w:lineRule="auto"/>
-        <w:ind w:firstLine="567"/>
+        <w:spacing w:after="60" w:before="0" w:line="360" w:lineRule="auto"/>
         <w:jc w:val="both"/>
       </w:pPr>
       <w:r>
@@ -2324,8 +2338,7 @@
     <w:p>
       <w:pPr>
         <w:bidi/>
-        <w:spacing w:after="0" w:before="0" w:line="360" w:lineRule="auto"/>
-        <w:ind w:firstLine="567"/>
+        <w:spacing w:after="60" w:before="0" w:line="360" w:lineRule="auto"/>
         <w:jc w:val="both"/>
       </w:pPr>
       <w:r>
@@ -2341,8 +2354,7 @@
     <w:p>
       <w:pPr>
         <w:bidi/>
-        <w:spacing w:after="0" w:before="0" w:line="360" w:lineRule="auto"/>
-        <w:ind w:firstLine="567"/>
+        <w:spacing w:after="60" w:before="0" w:line="360" w:lineRule="auto"/>
         <w:jc w:val="both"/>
       </w:pPr>
       <w:r>
@@ -2396,8 +2408,7 @@
     <w:p>
       <w:pPr>
         <w:bidi/>
-        <w:spacing w:after="0" w:before="0" w:line="360" w:lineRule="auto"/>
-        <w:ind w:firstLine="567"/>
+        <w:spacing w:after="60" w:before="0" w:line="360" w:lineRule="auto"/>
         <w:jc w:val="both"/>
       </w:pPr>
       <w:r>
@@ -2413,8 +2424,7 @@
     <w:p>
       <w:pPr>
         <w:bidi/>
-        <w:spacing w:after="0" w:before="0" w:line="360" w:lineRule="auto"/>
-        <w:ind w:firstLine="567"/>
+        <w:spacing w:after="60" w:before="0" w:line="360" w:lineRule="auto"/>
         <w:jc w:val="both"/>
       </w:pPr>
       <w:r>
@@ -2449,8 +2459,7 @@
     <w:p>
       <w:pPr>
         <w:bidi/>
-        <w:spacing w:after="0" w:before="0" w:line="360" w:lineRule="auto"/>
-        <w:ind w:firstLine="567"/>
+        <w:spacing w:after="60" w:before="0" w:line="360" w:lineRule="auto"/>
         <w:jc w:val="both"/>
       </w:pPr>
       <w:r>
@@ -4384,8 +4393,7 @@
     <w:p>
       <w:pPr>
         <w:bidi/>
-        <w:spacing w:after="0" w:before="0" w:line="360" w:lineRule="auto"/>
-        <w:ind w:firstLine="567"/>
+        <w:spacing w:after="60" w:before="0" w:line="360" w:lineRule="auto"/>
         <w:jc w:val="both"/>
       </w:pPr>
       <w:r>
@@ -4420,8 +4428,7 @@
     <w:p>
       <w:pPr>
         <w:bidi/>
-        <w:spacing w:after="0" w:before="0" w:line="360" w:lineRule="auto"/>
-        <w:ind w:firstLine="567"/>
+        <w:spacing w:after="60" w:before="0" w:line="360" w:lineRule="auto"/>
         <w:jc w:val="both"/>
       </w:pPr>
       <w:r>
@@ -4456,8 +4463,7 @@
     <w:p>
       <w:pPr>
         <w:bidi/>
-        <w:spacing w:after="0" w:before="0" w:line="360" w:lineRule="auto"/>
-        <w:ind w:firstLine="567"/>
+        <w:spacing w:after="60" w:before="0" w:line="360" w:lineRule="auto"/>
         <w:jc w:val="both"/>
       </w:pPr>
       <w:r>
@@ -4468,6 +4474,41 @@
           <w:rtl/>
         </w:rPr>
         <w:t xml:space="preserve">הנתונים נותחו בניתוח קטגוריאלי לפי שלבי הניתוח של שקדי (2003). בניתוח הראשוני חולקו התמלילים ליחידות משמעות שקיבלו שמות של קטגוריות. בניתוח הממפה אורגנו הקטגוריות לקטגוריות מרכזיות ולתתי-קטגוריות, כמו "ערוצים בלתי פורמליים". בניתוח הממקד אוחדו הקטגוריות הקשורות לשאלת המחקר לשש תמות, ונבחרו להן ציטוטים מייצגים. הניתוח התאורטי, שבו התמות נקשרות לספרות, מוצג בפרק הדיון.</w:t>
+      </w:r>
+    </w:p>
+    <w:p>
+      <w:pPr>
+        <w:pStyle w:val="Heading2"/>
+        <w:bidi/>
+        <w:spacing w:after="120" w:before="240" w:line="360" w:lineRule="auto"/>
+        <w:jc w:val="left"/>
+      </w:pPr>
+      <w:r>
+        <w:rPr>
+          <w:rFonts w:ascii="Times New Roman" w:cs="David" w:hAnsi="Times New Roman"/>
+          <w:b/>
+          <w:bCs/>
+          <w:sz w:val="24"/>
+          <w:szCs w:val="24"/>
+          <w:rtl/>
+        </w:rPr>
+        <w:t xml:space="preserve">3.6 אמינות המחקר</w:t>
+      </w:r>
+    </w:p>
+    <w:p>
+      <w:pPr>
+        <w:bidi/>
+        <w:spacing w:after="60" w:before="0" w:line="360" w:lineRule="auto"/>
+        <w:jc w:val="both"/>
+      </w:pPr>
+      <w:r>
+        <w:rPr>
+          <w:rFonts w:ascii="Times New Roman" w:cs="David" w:hAnsi="Times New Roman"/>
+          <w:sz w:val="24"/>
+          <w:szCs w:val="24"/>
+          <w:rtl/>
+        </w:rPr>
+        <w:t xml:space="preserve">כדי לחזק את אמינות המחקר ננקטו כמה צעדים. הראיונות הוקלטו ותומללו במלואם, והתמלילים מצורפים בנספח ג', כך שהקורא יכול לבחון את הקשר בין הנתונים ובין הפרשנות. כל תמה מגובה בציטוטים מדברי כמה משתתפות, כולל עמדות של מיעוט. שלבי הניתוח מתוארים במפורש, והממצאים נבחנים מול מחקרים קודמים בפרק הדיון (שקדי, 2003).</w:t>
       </w:r>
     </w:p>
     <w:p>
@@ -4493,8 +4534,7 @@
     <w:p>
       <w:pPr>
         <w:bidi/>
-        <w:spacing w:after="0" w:before="0" w:line="360" w:lineRule="auto"/>
-        <w:ind w:firstLine="567"/>
+        <w:spacing w:after="60" w:before="0" w:line="360" w:lineRule="auto"/>
         <w:jc w:val="both"/>
       </w:pPr>
       <w:r>
@@ -5320,8 +5360,7 @@
     <w:p>
       <w:pPr>
         <w:bidi/>
-        <w:spacing w:after="0" w:before="0" w:line="360" w:lineRule="auto"/>
-        <w:ind w:firstLine="567"/>
+        <w:spacing w:after="60" w:before="0" w:line="360" w:lineRule="auto"/>
         <w:jc w:val="both"/>
       </w:pPr>
       <w:r>
@@ -5355,8 +5394,7 @@
     <w:p>
       <w:pPr>
         <w:bidi/>
-        <w:spacing w:after="0" w:before="0" w:line="360" w:lineRule="auto"/>
-        <w:ind w:firstLine="567"/>
+        <w:spacing w:after="60" w:before="0" w:line="360" w:lineRule="auto"/>
         <w:jc w:val="both"/>
       </w:pPr>
       <w:r>
@@ -5389,18 +5427,17 @@
     <w:p>
       <w:pPr>
         <w:bidi/>
-        <w:spacing w:after="0" w:before="0" w:line="360" w:lineRule="auto"/>
-        <w:ind w:firstLine="567"/>
-        <w:jc w:val="both"/>
-      </w:pPr>
-      <w:r>
-        <w:rPr>
-          <w:rFonts w:ascii="Times New Roman" w:cs="David" w:hAnsi="Times New Roman"/>
-          <w:sz w:val="24"/>
-          <w:szCs w:val="24"/>
-          <w:rtl/>
-        </w:rPr>
-        <w:t xml:space="preserve">שלוש מורות תיארו את בית הספר כמוסד היחיד בעיר שההורים סומכים עליו. מהא אמרה: "בית הספר הוא לפעמים המוסד היחיד שההורים סומכים עליו. לא על המשטרה, לא על העירייה. אם הקשר איתנו נשבר, אין להם למי ללכת." סוהא ניסחה זאת כך: "בית הספר צריך להיות מוסד של הקהילה, לא מוסד בתוך הקהילה." בחטיבת הביניים נקשר הקשר עם ההורים גם להתמדה בלימודים. אמאני אמרה: "בחטיבה, הקשר עם ההורים הוא הדבר שמונע נשירה."</w:t>
+        <w:spacing w:after="60" w:before="0" w:line="360" w:lineRule="auto"/>
+        <w:jc w:val="both"/>
+      </w:pPr>
+      <w:r>
+        <w:rPr>
+          <w:rFonts w:ascii="Times New Roman" w:cs="David" w:hAnsi="Times New Roman"/>
+          <w:sz w:val="24"/>
+          <w:szCs w:val="24"/>
+          <w:rtl/>
+        </w:rPr>
+        <w:t xml:space="preserve">שלוש מורות תיארו את בית הספר כמוסד היחיד בעיר שההורים סומכים עליו. מהא אמרה: "בית הספר הוא לפעמים המוסד היחיד שההורים סומכים עליו. לא על המשטרה, לא על העירייה. אם הקשר איתנו נשבר, אין להם למי ללכת." סוהא ניסחה זאת כך: "בית הספר צריך להיות מוסד של הקהילה, לא מוסד בתוך הקהילה."</w:t>
       </w:r>
     </w:p>
     <w:p>
@@ -5424,8 +5461,7 @@
     <w:p>
       <w:pPr>
         <w:bidi/>
-        <w:spacing w:after="0" w:before="0" w:line="360" w:lineRule="auto"/>
-        <w:ind w:firstLine="567"/>
+        <w:spacing w:after="60" w:before="0" w:line="360" w:lineRule="auto"/>
         <w:jc w:val="both"/>
       </w:pPr>
       <w:r>
@@ -5458,8 +5494,7 @@
     <w:p>
       <w:pPr>
         <w:bidi/>
-        <w:spacing w:after="0" w:before="0" w:line="360" w:lineRule="auto"/>
-        <w:ind w:firstLine="567"/>
+        <w:spacing w:after="60" w:before="0" w:line="360" w:lineRule="auto"/>
         <w:jc w:val="both"/>
       </w:pPr>
       <w:r>
@@ -5493,8 +5528,7 @@
     <w:p>
       <w:pPr>
         <w:bidi/>
-        <w:spacing w:after="0" w:before="0" w:line="360" w:lineRule="auto"/>
-        <w:ind w:firstLine="567"/>
+        <w:spacing w:after="60" w:before="0" w:line="360" w:lineRule="auto"/>
         <w:jc w:val="both"/>
       </w:pPr>
       <w:r>
@@ -5527,8 +5561,7 @@
     <w:p>
       <w:pPr>
         <w:bidi/>
-        <w:spacing w:after="0" w:before="0" w:line="360" w:lineRule="auto"/>
-        <w:ind w:firstLine="567"/>
+        <w:spacing w:after="60" w:before="0" w:line="360" w:lineRule="auto"/>
         <w:jc w:val="both"/>
       </w:pPr>
       <w:r>
@@ -5544,18 +5577,17 @@
     <w:p>
       <w:pPr>
         <w:bidi/>
-        <w:spacing w:after="0" w:before="0" w:line="360" w:lineRule="auto"/>
-        <w:ind w:firstLine="567"/>
-        <w:jc w:val="both"/>
-      </w:pPr>
-      <w:r>
-        <w:rPr>
-          <w:rFonts w:ascii="Times New Roman" w:cs="David" w:hAnsi="Times New Roman"/>
-          <w:sz w:val="24"/>
-          <w:szCs w:val="24"/>
-          <w:rtl/>
-        </w:rPr>
-        <w:t xml:space="preserve">לסיכום: מתמה זו עולה כי המורות רואות בקשר עם ההורים חלק מרכזי מעבודתן, ובבית הספר מוסד קהילתי שההורים סומכים עליו. מורות מהקהילה נהנות מהיכרות עם המשפחות אך מתמודדות עם טשטוש גבולות, ומורות מבחוץ מתמודדות עם האשמות ב"זרות" אך מוצאות בה גם יתרון. ההקשר של לוד, ובו אלימות, פחד ותקשורת מוסדית בעברית, נוכח בכל היבט של הקשר.</w:t>
+        <w:spacing w:after="60" w:before="0" w:line="360" w:lineRule="auto"/>
+        <w:jc w:val="both"/>
+      </w:pPr>
+      <w:r>
+        <w:rPr>
+          <w:rFonts w:ascii="Times New Roman" w:cs="David" w:hAnsi="Times New Roman"/>
+          <w:sz w:val="24"/>
+          <w:szCs w:val="24"/>
+          <w:rtl/>
+        </w:rPr>
+        <w:t xml:space="preserve">לסיכום: מתמה זו עולה כי המורות רואות בקשר עם ההורים חלק מרכזי מעבודתן ובבית הספר מוסד קהילתי שההורים סומכים עליו, וכי הקשר מושפע הן משייכותן לקהילה והן מן ההקשר העירוני של לוד.</w:t>
       </w:r>
     </w:p>
     <w:p>
@@ -5580,8 +5612,7 @@
     <w:p>
       <w:pPr>
         <w:bidi/>
-        <w:spacing w:after="0" w:before="0" w:line="360" w:lineRule="auto"/>
-        <w:ind w:firstLine="567"/>
+        <w:spacing w:after="60" w:before="0" w:line="360" w:lineRule="auto"/>
         <w:jc w:val="both"/>
       </w:pPr>
       <w:r>
@@ -5615,8 +5646,7 @@
     <w:p>
       <w:pPr>
         <w:bidi/>
-        <w:spacing w:after="0" w:before="0" w:line="360" w:lineRule="auto"/>
-        <w:ind w:firstLine="567"/>
+        <w:spacing w:after="60" w:before="0" w:line="360" w:lineRule="auto"/>
         <w:jc w:val="both"/>
       </w:pPr>
       <w:r>
@@ -5650,8 +5680,7 @@
     <w:p>
       <w:pPr>
         <w:bidi/>
-        <w:spacing w:after="0" w:before="0" w:line="360" w:lineRule="auto"/>
-        <w:ind w:firstLine="567"/>
+        <w:spacing w:after="60" w:before="0" w:line="360" w:lineRule="auto"/>
         <w:jc w:val="both"/>
       </w:pPr>
       <w:r>
@@ -5684,8 +5713,7 @@
     <w:p>
       <w:pPr>
         <w:bidi/>
-        <w:spacing w:after="0" w:before="0" w:line="360" w:lineRule="auto"/>
-        <w:ind w:firstLine="567"/>
+        <w:spacing w:after="60" w:before="0" w:line="360" w:lineRule="auto"/>
         <w:jc w:val="both"/>
       </w:pPr>
       <w:r>
@@ -5719,8 +5747,7 @@
     <w:p>
       <w:pPr>
         <w:bidi/>
-        <w:spacing w:after="0" w:before="0" w:line="360" w:lineRule="auto"/>
-        <w:ind w:firstLine="567"/>
+        <w:spacing w:after="60" w:before="0" w:line="360" w:lineRule="auto"/>
         <w:jc w:val="both"/>
       </w:pPr>
       <w:r>
@@ -5753,8 +5780,7 @@
     <w:p>
       <w:pPr>
         <w:bidi/>
-        <w:spacing w:after="0" w:before="0" w:line="360" w:lineRule="auto"/>
-        <w:ind w:firstLine="567"/>
+        <w:spacing w:after="60" w:before="0" w:line="360" w:lineRule="auto"/>
         <w:jc w:val="both"/>
       </w:pPr>
       <w:r>
@@ -5788,8 +5814,7 @@
     <w:p>
       <w:pPr>
         <w:bidi/>
-        <w:spacing w:after="0" w:before="0" w:line="360" w:lineRule="auto"/>
-        <w:ind w:firstLine="567"/>
+        <w:spacing w:after="60" w:before="0" w:line="360" w:lineRule="auto"/>
         <w:jc w:val="both"/>
       </w:pPr>
       <w:r>
@@ -5822,35 +5847,33 @@
     <w:p>
       <w:pPr>
         <w:bidi/>
-        <w:spacing w:after="0" w:before="0" w:line="360" w:lineRule="auto"/>
-        <w:ind w:firstLine="567"/>
-        <w:jc w:val="both"/>
-      </w:pPr>
-      <w:r>
-        <w:rPr>
-          <w:rFonts w:ascii="Times New Roman" w:cs="David" w:hAnsi="Times New Roman"/>
-          <w:sz w:val="24"/>
-          <w:szCs w:val="24"/>
-          <w:rtl/>
-        </w:rPr>
-        <w:t xml:space="preserve">פאטמה מקיימת "שעת הורים" שבועית בלי תיאום מראש, וסמר משתמשת ב"מחברת קשר", שלדבריה "עובד דווקא עם ההורים שלא בווטסאפ". סוהא נכנסת "לבתים של המשפחות, לחדר של הנשים, בשמחות ובאבלים". בחטיבת הביניים תיארה אמאני את "הפגישה המשולשת" של המורה, ההורה והתלמיד: "כשהילד בחדר, הוא שומע שההורה ואני אומרים אותו דבר, וזה הדבר שהכי משפיע עליו."</w:t>
-      </w:r>
-    </w:p>
-    <w:p>
-      <w:pPr>
-        <w:bidi/>
-        <w:spacing w:after="0" w:before="0" w:line="360" w:lineRule="auto"/>
-        <w:ind w:firstLine="567"/>
-        <w:jc w:val="both"/>
-      </w:pPr>
-      <w:r>
-        <w:rPr>
-          <w:rFonts w:ascii="Times New Roman" w:cs="David" w:hAnsi="Times New Roman"/>
-          <w:sz w:val="24"/>
-          <w:szCs w:val="24"/>
-          <w:rtl/>
-        </w:rPr>
-        <w:t xml:space="preserve">לסיכום: מתמה זו עולה כי הוואטסאפ משמש להעברת מידע, ומשו"ב כמעט אינו בשימוש בקרב ההורים. המורות מבחינות בין מידע, שעובר בערוצים דיגיטליים, ובין יחסים, שנבנים פנים אל פנים. הן מתארות שלושה מחירים של התקשורת הדיגיטלית, זמינות מתמדת, זירת סכסוך והדרה, ונשענות על ערוצים בלתי פורמליים כמו השער, הגדר, הבית ובוקר הקפה.</w:t>
+        <w:spacing w:after="60" w:before="0" w:line="360" w:lineRule="auto"/>
+        <w:jc w:val="both"/>
+      </w:pPr>
+      <w:r>
+        <w:rPr>
+          <w:rFonts w:ascii="Times New Roman" w:cs="David" w:hAnsi="Times New Roman"/>
+          <w:sz w:val="24"/>
+          <w:szCs w:val="24"/>
+          <w:rtl/>
+        </w:rPr>
+        <w:t xml:space="preserve">פאטמה מקיימת "שעת הורים" שבועית בלי תיאום מראש, וסמר משתמשת ב"מחברת קשר", שלדבריה "עובד דווקא עם ההורים שלא בווטסאפ". בחטיבת הביניים תיארה אמאני את "הפגישה המשולשת" של המורה, ההורה והתלמיד: "כשהילד בחדר, הוא שומע שההורה ואני אומרים אותו דבר, וזה הדבר שהכי משפיע עליו."</w:t>
+      </w:r>
+    </w:p>
+    <w:p>
+      <w:pPr>
+        <w:bidi/>
+        <w:spacing w:after="60" w:before="0" w:line="360" w:lineRule="auto"/>
+        <w:jc w:val="both"/>
+      </w:pPr>
+      <w:r>
+        <w:rPr>
+          <w:rFonts w:ascii="Times New Roman" w:cs="David" w:hAnsi="Times New Roman"/>
+          <w:sz w:val="24"/>
+          <w:szCs w:val="24"/>
+          <w:rtl/>
+        </w:rPr>
+        <w:t xml:space="preserve">לסיכום: מתמה זו עולה כי מידע עובר בערוצים דיגיטליים ויחסים נבנים פנים אל פנים, וכי לתקשורת הדיגיטלית שלושה מחירים: זמינות מתמדת, זירת סכסוך והדרה.</w:t>
       </w:r>
     </w:p>
     <w:p>
@@ -5875,8 +5898,7 @@
     <w:p>
       <w:pPr>
         <w:bidi/>
-        <w:spacing w:after="0" w:before="0" w:line="360" w:lineRule="auto"/>
-        <w:ind w:firstLine="567"/>
+        <w:spacing w:after="60" w:before="0" w:line="360" w:lineRule="auto"/>
         <w:jc w:val="both"/>
       </w:pPr>
       <w:r>
@@ -5910,8 +5932,7 @@
     <w:p>
       <w:pPr>
         <w:bidi/>
-        <w:spacing w:after="0" w:before="0" w:line="360" w:lineRule="auto"/>
-        <w:ind w:firstLine="567"/>
+        <w:spacing w:after="60" w:before="0" w:line="360" w:lineRule="auto"/>
         <w:jc w:val="both"/>
       </w:pPr>
       <w:r>
@@ -5944,8 +5965,7 @@
     <w:p>
       <w:pPr>
         <w:bidi/>
-        <w:spacing w:after="0" w:before="0" w:line="360" w:lineRule="auto"/>
-        <w:ind w:firstLine="567"/>
+        <w:spacing w:after="60" w:before="0" w:line="360" w:lineRule="auto"/>
         <w:jc w:val="both"/>
       </w:pPr>
       <w:r>
@@ -5979,8 +5999,7 @@
     <w:p>
       <w:pPr>
         <w:bidi/>
-        <w:spacing w:after="0" w:before="0" w:line="360" w:lineRule="auto"/>
-        <w:ind w:firstLine="567"/>
+        <w:spacing w:after="60" w:before="0" w:line="360" w:lineRule="auto"/>
         <w:jc w:val="both"/>
       </w:pPr>
       <w:r>
@@ -6013,8 +6032,7 @@
     <w:p>
       <w:pPr>
         <w:bidi/>
-        <w:spacing w:after="0" w:before="0" w:line="360" w:lineRule="auto"/>
-        <w:ind w:firstLine="567"/>
+        <w:spacing w:after="60" w:before="0" w:line="360" w:lineRule="auto"/>
         <w:jc w:val="both"/>
       </w:pPr>
       <w:r>
@@ -6048,8 +6066,7 @@
     <w:p>
       <w:pPr>
         <w:bidi/>
-        <w:spacing w:after="0" w:before="0" w:line="360" w:lineRule="auto"/>
-        <w:ind w:firstLine="567"/>
+        <w:spacing w:after="60" w:before="0" w:line="360" w:lineRule="auto"/>
         <w:jc w:val="both"/>
       </w:pPr>
       <w:r>
@@ -6065,18 +6082,17 @@
     <w:p>
       <w:pPr>
         <w:bidi/>
-        <w:spacing w:after="0" w:before="0" w:line="360" w:lineRule="auto"/>
-        <w:ind w:firstLine="567"/>
-        <w:jc w:val="both"/>
-      </w:pPr>
-      <w:r>
-        <w:rPr>
-          <w:rFonts w:ascii="Times New Roman" w:cs="David" w:hAnsi="Times New Roman"/>
-          <w:sz w:val="24"/>
-          <w:szCs w:val="24"/>
-          <w:rtl/>
-        </w:rPr>
-        <w:t xml:space="preserve">לסיכום: מתמה זו עולה כי המורות יוזמות את רוב הקשר, ומשתדלות שהפנייה הראשונה להורה תהיה חיובית ותהיה הזמנה ולא זימון. הן מגדירות מחדש את המעורבות של ההורים, ומבקשות מהם את מה שהם יכולים לתת, ומגיעות אליהם בדרכים אישיות ולא דרך מערכות.</w:t>
+        <w:spacing w:after="60" w:before="0" w:line="360" w:lineRule="auto"/>
+        <w:jc w:val="both"/>
+      </w:pPr>
+      <w:r>
+        <w:rPr>
+          <w:rFonts w:ascii="Times New Roman" w:cs="David" w:hAnsi="Times New Roman"/>
+          <w:sz w:val="24"/>
+          <w:szCs w:val="24"/>
+          <w:rtl/>
+        </w:rPr>
+        <w:t xml:space="preserve">לסיכום: מתמה זו עולה כי המורות יוזמות את רוב הקשר, פונות קודם כול בחיובי, ומגדירות מחדש את המעורבות של ההורים לפי מה שהם יכולים לתת.</w:t>
       </w:r>
     </w:p>
     <w:p>
@@ -6101,8 +6117,7 @@
     <w:p>
       <w:pPr>
         <w:bidi/>
-        <w:spacing w:after="0" w:before="0" w:line="360" w:lineRule="auto"/>
-        <w:ind w:firstLine="567"/>
+        <w:spacing w:after="60" w:before="0" w:line="360" w:lineRule="auto"/>
         <w:jc w:val="both"/>
       </w:pPr>
       <w:r>
@@ -6136,8 +6151,7 @@
     <w:p>
       <w:pPr>
         <w:bidi/>
-        <w:spacing w:after="0" w:before="0" w:line="360" w:lineRule="auto"/>
-        <w:ind w:firstLine="567"/>
+        <w:spacing w:after="60" w:before="0" w:line="360" w:lineRule="auto"/>
         <w:jc w:val="both"/>
       </w:pPr>
       <w:r>
@@ -6171,8 +6185,7 @@
     <w:p>
       <w:pPr>
         <w:bidi/>
-        <w:spacing w:after="0" w:before="0" w:line="360" w:lineRule="auto"/>
-        <w:ind w:firstLine="567"/>
+        <w:spacing w:after="60" w:before="0" w:line="360" w:lineRule="auto"/>
         <w:jc w:val="both"/>
       </w:pPr>
       <w:r>
@@ -6205,8 +6218,7 @@
     <w:p>
       <w:pPr>
         <w:bidi/>
-        <w:spacing w:after="0" w:before="0" w:line="360" w:lineRule="auto"/>
-        <w:ind w:firstLine="567"/>
+        <w:spacing w:after="60" w:before="0" w:line="360" w:lineRule="auto"/>
         <w:jc w:val="both"/>
       </w:pPr>
       <w:r>
@@ -6240,8 +6252,7 @@
     <w:p>
       <w:pPr>
         <w:bidi/>
-        <w:spacing w:after="0" w:before="0" w:line="360" w:lineRule="auto"/>
-        <w:ind w:firstLine="567"/>
+        <w:spacing w:after="60" w:before="0" w:line="360" w:lineRule="auto"/>
         <w:jc w:val="both"/>
       </w:pPr>
       <w:r>
@@ -6274,8 +6285,7 @@
     <w:p>
       <w:pPr>
         <w:bidi/>
-        <w:spacing w:after="0" w:before="0" w:line="360" w:lineRule="auto"/>
-        <w:ind w:firstLine="567"/>
+        <w:spacing w:after="60" w:before="0" w:line="360" w:lineRule="auto"/>
         <w:jc w:val="both"/>
       </w:pPr>
       <w:r>
@@ -6291,18 +6301,17 @@
     <w:p>
       <w:pPr>
         <w:bidi/>
-        <w:spacing w:after="0" w:before="0" w:line="360" w:lineRule="auto"/>
-        <w:ind w:firstLine="567"/>
-        <w:jc w:val="both"/>
-      </w:pPr>
-      <w:r>
-        <w:rPr>
-          <w:rFonts w:ascii="Times New Roman" w:cs="David" w:hAnsi="Times New Roman"/>
-          <w:sz w:val="24"/>
-          <w:szCs w:val="24"/>
-          <w:rtl/>
-        </w:rPr>
-        <w:t xml:space="preserve">לסיכום: מתמה זו עולה כי ברמת בית הספר ההורים שותפים בעיקר בעזרה, ובהחלטות כמעט אינם שותפים. ביוזמות של המורות הוזמנו ההורים כנותני ידע, ורובם הגיעו. גופי הורים שהוקמו בידי מורות הציעו פתרונות לבעיות כמו היעדרויות ושימוש בטלפונים. המורות זיהו תנאים דומים להצלחה: ההורים הוזמנו כמי שיש להם מה לתת, הפתרון בא מהם, והמקום היה שלהם.</w:t>
+        <w:spacing w:after="60" w:before="0" w:line="360" w:lineRule="auto"/>
+        <w:jc w:val="both"/>
+      </w:pPr>
+      <w:r>
+        <w:rPr>
+          <w:rFonts w:ascii="Times New Roman" w:cs="David" w:hAnsi="Times New Roman"/>
+          <w:sz w:val="24"/>
+          <w:szCs w:val="24"/>
+          <w:rtl/>
+        </w:rPr>
+        <w:t xml:space="preserve">לסיכום: מתמה זו עולה כי ברמת בית הספר ההורים שותפים בעיקר בעזרה, אך ביוזמות של המורות הם הוזמנו כנותני ידע והציעו פתרונות לבעיות.</w:t>
       </w:r>
     </w:p>
     <w:p>
@@ -6327,8 +6336,7 @@
     <w:p>
       <w:pPr>
         <w:bidi/>
-        <w:spacing w:after="0" w:before="0" w:line="360" w:lineRule="auto"/>
-        <w:ind w:firstLine="567"/>
+        <w:spacing w:after="60" w:before="0" w:line="360" w:lineRule="auto"/>
         <w:jc w:val="both"/>
       </w:pPr>
       <w:r>
@@ -6362,8 +6370,7 @@
     <w:p>
       <w:pPr>
         <w:bidi/>
-        <w:spacing w:after="0" w:before="0" w:line="360" w:lineRule="auto"/>
-        <w:ind w:firstLine="567"/>
+        <w:spacing w:after="60" w:before="0" w:line="360" w:lineRule="auto"/>
         <w:jc w:val="both"/>
       </w:pPr>
       <w:r>
@@ -6397,8 +6404,7 @@
     <w:p>
       <w:pPr>
         <w:bidi/>
-        <w:spacing w:after="0" w:before="0" w:line="360" w:lineRule="auto"/>
-        <w:ind w:firstLine="567"/>
+        <w:spacing w:after="60" w:before="0" w:line="360" w:lineRule="auto"/>
         <w:jc w:val="both"/>
       </w:pPr>
       <w:r>
@@ -6431,8 +6437,7 @@
     <w:p>
       <w:pPr>
         <w:bidi/>
-        <w:spacing w:after="0" w:before="0" w:line="360" w:lineRule="auto"/>
-        <w:ind w:firstLine="567"/>
+        <w:spacing w:after="60" w:before="0" w:line="360" w:lineRule="auto"/>
         <w:jc w:val="both"/>
       </w:pPr>
       <w:r>
@@ -6466,8 +6471,7 @@
     <w:p>
       <w:pPr>
         <w:bidi/>
-        <w:spacing w:after="0" w:before="0" w:line="360" w:lineRule="auto"/>
-        <w:ind w:firstLine="567"/>
+        <w:spacing w:after="60" w:before="0" w:line="360" w:lineRule="auto"/>
         <w:jc w:val="both"/>
       </w:pPr>
       <w:r>
@@ -6483,18 +6487,17 @@
     <w:p>
       <w:pPr>
         <w:bidi/>
-        <w:spacing w:after="0" w:before="0" w:line="360" w:lineRule="auto"/>
-        <w:ind w:firstLine="567"/>
-        <w:jc w:val="both"/>
-      </w:pPr>
-      <w:r>
-        <w:rPr>
-          <w:rFonts w:ascii="Times New Roman" w:cs="David" w:hAnsi="Times New Roman"/>
-          <w:sz w:val="24"/>
-          <w:szCs w:val="24"/>
-          <w:rtl/>
-        </w:rPr>
-        <w:t xml:space="preserve">לסיכום: מתמה זו עולה כי המורות פועלות בתוך מבנה קהילתי של משפחה מורחבת וכבוד, שבו לסבתות מקום מרכזי. מבנה זה מגביל את המורות כנשים מול חלק מהאבות, אך גם פותח בפניהן דלתות אל האמהות ואל הבתים. את המחלוקות עם הורים הן מפרשות כביטוי של פחד, ומתמודדות איתן בהשהיה ובפגישה אישית.</w:t>
+        <w:spacing w:after="60" w:before="0" w:line="360" w:lineRule="auto"/>
+        <w:jc w:val="both"/>
+      </w:pPr>
+      <w:r>
+        <w:rPr>
+          <w:rFonts w:ascii="Times New Roman" w:cs="David" w:hAnsi="Times New Roman"/>
+          <w:sz w:val="24"/>
+          <w:szCs w:val="24"/>
+          <w:rtl/>
+        </w:rPr>
+        <w:t xml:space="preserve">לסיכום: מתמה זו עולה כי המורות פועלות בתוך מבנה של משפחה מורחבת וכבוד, שמגביל אותן כנשים מול חלק מהאבות אך פותח בפניהן את הבתים.</w:t>
       </w:r>
     </w:p>
     <w:p>
@@ -6519,8 +6522,7 @@
     <w:p>
       <w:pPr>
         <w:bidi/>
-        <w:spacing w:after="0" w:before="0" w:line="360" w:lineRule="auto"/>
-        <w:ind w:firstLine="567"/>
+        <w:spacing w:after="60" w:before="0" w:line="360" w:lineRule="auto"/>
         <w:jc w:val="both"/>
       </w:pPr>
       <w:r>
@@ -6554,8 +6556,7 @@
     <w:p>
       <w:pPr>
         <w:bidi/>
-        <w:spacing w:after="0" w:before="0" w:line="360" w:lineRule="auto"/>
-        <w:ind w:firstLine="567"/>
+        <w:spacing w:after="60" w:before="0" w:line="360" w:lineRule="auto"/>
         <w:jc w:val="both"/>
       </w:pPr>
       <w:r>
@@ -6606,8 +6607,7 @@
     <w:p>
       <w:pPr>
         <w:bidi/>
-        <w:spacing w:after="0" w:before="0" w:line="360" w:lineRule="auto"/>
-        <w:ind w:firstLine="567"/>
+        <w:spacing w:after="60" w:before="0" w:line="360" w:lineRule="auto"/>
         <w:jc w:val="both"/>
       </w:pPr>
       <w:r>
@@ -6641,8 +6641,7 @@
     <w:p>
       <w:pPr>
         <w:bidi/>
-        <w:spacing w:after="0" w:before="0" w:line="360" w:lineRule="auto"/>
-        <w:ind w:firstLine="567"/>
+        <w:spacing w:after="60" w:before="0" w:line="360" w:lineRule="auto"/>
         <w:jc w:val="both"/>
       </w:pPr>
       <w:r>
@@ -6675,35 +6674,33 @@
     <w:p>
       <w:pPr>
         <w:bidi/>
-        <w:spacing w:after="0" w:before="0" w:line="360" w:lineRule="auto"/>
-        <w:ind w:firstLine="567"/>
-        <w:jc w:val="both"/>
-      </w:pPr>
-      <w:r>
-        <w:rPr>
-          <w:rFonts w:ascii="Times New Roman" w:cs="David" w:hAnsi="Times New Roman"/>
-          <w:sz w:val="24"/>
-          <w:szCs w:val="24"/>
-          <w:rtl/>
-        </w:rPr>
-        <w:t xml:space="preserve">מהא סיפרה על השתלמות שהייתה "בעברית, עם דוגמאות מבית ספר בתל אביב". את הליווי מצאו המורות בחדר המורים. מהא אמרה: "מה שיש זה מורות שעוזרות זו לזו, בחדר המורות, אחרי שיחה קשה." סמר ורנא תיארו מחנכת ותיקה שליוותה אותן, ושלוש מורות ביקשו ליווי קבוע למחנכות חדשות. סוהא הציעה "פורום של רכזות ורכזי קהילה מבתי ספר ערביים בערים מעורבות".</w:t>
-      </w:r>
-    </w:p>
-    <w:p>
-      <w:pPr>
-        <w:bidi/>
-        <w:spacing w:after="0" w:before="0" w:line="360" w:lineRule="auto"/>
-        <w:ind w:firstLine="567"/>
-        <w:jc w:val="both"/>
-      </w:pPr>
-      <w:r>
-        <w:rPr>
-          <w:rFonts w:ascii="Times New Roman" w:cs="David" w:hAnsi="Times New Roman"/>
-          <w:sz w:val="24"/>
-          <w:szCs w:val="24"/>
-          <w:rtl/>
-        </w:rPr>
-        <w:t xml:space="preserve">לסיכום: מתמה זו עולה כי המורות רואות תמיכה בגיבוי, בזמן ובמנהל שמחזיר אליהן את ההורה. סגנונות הניהול נעים בין מנהלת שבנתה תפקיד ותוכנית ובין מנהלים שמנהלים את הקשר כעניין של משבר או משמעת. בכל בתי הספר חסרים נוהל, זמן מוקצה והכשרה מותאמת, והליווי מתקיים בחדר המורים.</w:t>
+        <w:spacing w:after="60" w:before="0" w:line="360" w:lineRule="auto"/>
+        <w:jc w:val="both"/>
+      </w:pPr>
+      <w:r>
+        <w:rPr>
+          <w:rFonts w:ascii="Times New Roman" w:cs="David" w:hAnsi="Times New Roman"/>
+          <w:sz w:val="24"/>
+          <w:szCs w:val="24"/>
+          <w:rtl/>
+        </w:rPr>
+        <w:t xml:space="preserve">מהא סיפרה על השתלמות שהייתה "בעברית, עם דוגמאות מבית ספר בתל אביב". את הליווי מצאו המורות בחדר המורים. מהא אמרה: "מה שיש זה מורות שעוזרות זו לזו, בחדר המורות, אחרי שיחה קשה." סמר ורנא תיארו מחנכת ותיקה שליוותה אותן, ושלוש מורות ביקשו ליווי קבוע למחנכות חדשות.</w:t>
+      </w:r>
+    </w:p>
+    <w:p>
+      <w:pPr>
+        <w:bidi/>
+        <w:spacing w:after="60" w:before="0" w:line="360" w:lineRule="auto"/>
+        <w:jc w:val="both"/>
+      </w:pPr>
+      <w:r>
+        <w:rPr>
+          <w:rFonts w:ascii="Times New Roman" w:cs="David" w:hAnsi="Times New Roman"/>
+          <w:sz w:val="24"/>
+          <w:szCs w:val="24"/>
+          <w:rtl/>
+        </w:rPr>
+        <w:t xml:space="preserve">לסיכום: מתמה זו עולה כי התמיכה של ההנהלה משפיעה מאוד על הקשר עם ההורים, אך בכל בתי הספר חסרים נוהל, זמן מוקצה והכשרה מותאמת.</w:t>
       </w:r>
     </w:p>
     <w:p>
@@ -6729,18 +6726,17 @@
     <w:p>
       <w:pPr>
         <w:bidi/>
-        <w:spacing w:after="0" w:before="0" w:line="360" w:lineRule="auto"/>
-        <w:ind w:firstLine="567"/>
-        <w:jc w:val="both"/>
-      </w:pPr>
-      <w:r>
-        <w:rPr>
-          <w:rFonts w:ascii="Times New Roman" w:cs="David" w:hAnsi="Times New Roman"/>
-          <w:sz w:val="24"/>
-          <w:szCs w:val="24"/>
-          <w:rtl/>
-        </w:rPr>
-        <w:t xml:space="preserve">עבודה זו בחנה כיצד עובדות מורות מול הורים בבתי ספר במגזר הערבי בלוד. בפרק זה יידונו הממצאים לאור הרקע התיאורטי, לפי סדר התמות, ויוצגו המסקנות העולות מכל תמה. הדיון נשען על ציטוטים שהובאו בשמות בדויים ובלי פרטים מזהים של בתי הספר, כפי שהובטח למשתתפות.</w:t>
+        <w:spacing w:after="60" w:before="0" w:line="360" w:lineRule="auto"/>
+        <w:jc w:val="both"/>
+      </w:pPr>
+      <w:r>
+        <w:rPr>
+          <w:rFonts w:ascii="Times New Roman" w:cs="David" w:hAnsi="Times New Roman"/>
+          <w:sz w:val="24"/>
+          <w:szCs w:val="24"/>
+          <w:rtl/>
+        </w:rPr>
+        <w:t xml:space="preserve">עבודה זו בחנה כיצד עובדות מורות מול הורים בבתי ספר במגזר הערבי בלוד. בפרק זה יידונו הממצאים לאור הרקע התיאורטי, לפי סדר התמות, ויוצגו המסקנות העולות מכל תמה.</w:t>
       </w:r>
     </w:p>
     <w:p>
@@ -6765,8 +6761,7 @@
     <w:p>
       <w:pPr>
         <w:bidi/>
-        <w:spacing w:after="0" w:before="0" w:line="360" w:lineRule="auto"/>
-        <w:ind w:firstLine="567"/>
+        <w:spacing w:after="60" w:before="0" w:line="360" w:lineRule="auto"/>
         <w:jc w:val="both"/>
       </w:pPr>
       <w:r>
@@ -6782,18 +6777,17 @@
     <w:p>
       <w:pPr>
         <w:bidi/>
-        <w:spacing w:after="0" w:before="0" w:line="360" w:lineRule="auto"/>
-        <w:ind w:firstLine="567"/>
-        <w:jc w:val="both"/>
-      </w:pPr>
-      <w:r>
-        <w:rPr>
-          <w:rFonts w:ascii="Times New Roman" w:cs="David" w:hAnsi="Times New Roman"/>
-          <w:sz w:val="24"/>
-          <w:szCs w:val="24"/>
-          <w:rtl/>
-        </w:rPr>
-        <w:t xml:space="preserve">בהתייחס להבדל בין מורות מהקהילה למורות מבחוץ, בדומה למחקר זה, גם בספרות נמצא שמגורים באותו יישוב שבו גרים המורים מובילים לשיחות בלתי פורמליות "על המדרכה", לאמון רב יותר ולמעורבות פורמלית נמוכה יותר (Fisher &amp; Refael Fanyo, 2022). המורות מהקהילה תיארו שיחות דומות, בשער ובסופר, אך הוסיפו את מחירה של הקרבה: טשטוש גבולות ומחלוקות שבהן הכבוד המשפחתי מעורב. המורות מבחוץ חוו את מה שתואר אצל מורים "חוצי גבולות", שחווים שונות בשל נורמות תרבותיות שונות, אך גם רואים את עצמם כנציגי הקהילה שממנה באו (ארליך-רון וגינדי, 2020). במחקר הנוכחי נמצא שהזרות יכולה להפוך ליתרון, משום שמורה שאינה שייכת לאף משפחה אינה צד בסכסוכים. המסקנה הראשונה היא שבעיר מעורבת, שבה האמון במוסדות נמוך, המורה בבית הספר הערבי ממלאת תפקיד של גשר בין הקהילה למערכת, ותפקיד זה כרוך במחיר אישי, בין שהיא בת הקהילה ובין שאינה.</w:t>
+        <w:spacing w:after="60" w:before="0" w:line="360" w:lineRule="auto"/>
+        <w:jc w:val="both"/>
+      </w:pPr>
+      <w:r>
+        <w:rPr>
+          <w:rFonts w:ascii="Times New Roman" w:cs="David" w:hAnsi="Times New Roman"/>
+          <w:sz w:val="24"/>
+          <w:szCs w:val="24"/>
+          <w:rtl/>
+        </w:rPr>
+        <w:t xml:space="preserve">בהתייחס להבדל בין מורות מהקהילה למורות מבחוץ, בדומה למחקר זה, גם בספרות נמצא שמגורים באותו יישוב שבו גרים המורים מובילים לשיחות בלתי פורמליות "על המדרכה", לאמון רב יותר ולמעורבות פורמלית נמוכה יותר (Fisher &amp; Refael Fanyo, 2022). המורות מהקהילה תיארו שיחות דומות, בשער ובסופר, אך הוסיפו את מחירה של הקרבה: טשטוש גבולות ומחלוקות שבהן הכבוד המשפחתי מעורב. המורות מבחוץ חוו את מה שתואר אצל מורים "חוצי גבולות", שחווים שונות בשל נורמות תרבותיות שונות, אך גם רואים את עצמם כנציגי הקהילה שממנה באו (ארליך-רון וגינדי, 2020). המסקנה הראשונה היא שבעיר מעורבת, שבה האמון במוסדות נמוך, המורה בבית הספר הערבי ממלאת תפקיד של גשר בין הקהילה למערכת, ותפקיד זה כרוך במחיר אישי, בין שהיא בת הקהילה ובין שאינה.</w:t>
       </w:r>
     </w:p>
     <w:p>
@@ -6818,25 +6812,23 @@
     <w:p>
       <w:pPr>
         <w:bidi/>
-        <w:spacing w:after="0" w:before="0" w:line="360" w:lineRule="auto"/>
-        <w:ind w:firstLine="567"/>
-        <w:jc w:val="both"/>
-      </w:pPr>
-      <w:r>
-        <w:rPr>
-          <w:rFonts w:ascii="Times New Roman" w:cs="David" w:hAnsi="Times New Roman"/>
-          <w:sz w:val="24"/>
-          <w:szCs w:val="24"/>
-          <w:rtl/>
-        </w:rPr>
-        <w:t xml:space="preserve">ממחקר זה עלה כי הוואטסאפ הוא הערוץ העיקרי להעברת מידע, וכי המורות מבחינות בינו ובין ערוצים אישיים, שבהם נבנים היחסים. בהתייחס למחירים של התקשורת הדיגיטלית, בדומה למחקר זה, גם בספרות נמצא כי קבוצות הוואטסאפ הכיתתיות מעניקות להורים נראות של חיי הכיתה, אך יוצרות מעורבות יתר, פוגעות בפרטיות ומטשטשות את סמכות המורה (טרגר-סודרי ואחרים, 2025). גם מנהלי בתי ספר תיארו פניות רבות של הורים ללא גבולות של זמן ומקום, שהעמיסו על המורים (ברוכי ואזולאי, 2023). המחקר הנוכחי מוסיף שני ממדים. הראשון הוא הכבוד: הודעה כתובה עלולה להפוך לעניין משפחתי ולהגיע ל"מג'לס", ולכן היא מסוכנת יותר. השני הוא ההדרה. פערי המיומנות הדיגיטלית שתוארו בספרות (Urbina et al., 2025; אליהו-לוי ורויטר, 2023) מקבלים כאן פנים קונקרטיות של אמהות שאינן קוראות, אבות שאינם בקבוצה וסבתות שמגדלות נכדים.</w:t>
-      </w:r>
-    </w:p>
-    <w:p>
-      <w:pPr>
-        <w:bidi/>
-        <w:spacing w:after="0" w:before="0" w:line="360" w:lineRule="auto"/>
-        <w:ind w:firstLine="567"/>
+        <w:spacing w:after="60" w:before="0" w:line="360" w:lineRule="auto"/>
+        <w:jc w:val="both"/>
+      </w:pPr>
+      <w:r>
+        <w:rPr>
+          <w:rFonts w:ascii="Times New Roman" w:cs="David" w:hAnsi="Times New Roman"/>
+          <w:sz w:val="24"/>
+          <w:szCs w:val="24"/>
+          <w:rtl/>
+        </w:rPr>
+        <w:t xml:space="preserve">ממחקר זה עלה כי המורות מבחינות בין הוואטסאפ, שמעביר מידע, ובין ערוצים אישיים, שבהם נבנים היחסים. בהתייחס למחירים של התקשורת הדיגיטלית, בדומה למחקר זה, גם בספרות נמצא כי קבוצות הוואטסאפ הכיתתיות מעניקות להורים נראות של חיי הכיתה, אך יוצרות מעורבות יתר, פוגעות בפרטיות ומטשטשות את סמכות המורה (טרגר-סודרי ואחרים, 2025). גם מנהלי בתי ספר תיארו פניות רבות של הורים ללא גבולות של זמן ומקום, שהעמיסו על המורים (ברוכי ואזולאי, 2023). המחקר הנוכחי מוסיף שני ממדים. הראשון הוא הכבוד: הודעה כתובה עלולה להפוך לעניין משפחתי ולהגיע ל"מג'לס", ולכן היא מסוכנת יותר. השני הוא ההדרה. פערי המיומנות הדיגיטלית שתוארו בספרות (Urbina et al., 2025; אליהו-לוי ורויטר, 2023) מקבלים כאן פנים קונקרטיות של אמהות שאינן קוראות, אבות שאינם בקבוצה וסבתות שמגדלות נכדים.</w:t>
+      </w:r>
+    </w:p>
+    <w:p>
+      <w:pPr>
+        <w:bidi/>
+        <w:spacing w:after="60" w:before="0" w:line="360" w:lineRule="auto"/>
         <w:jc w:val="both"/>
       </w:pPr>
       <w:r>
@@ -6871,35 +6863,33 @@
     <w:p>
       <w:pPr>
         <w:bidi/>
-        <w:spacing w:after="0" w:before="0" w:line="360" w:lineRule="auto"/>
-        <w:ind w:firstLine="567"/>
-        <w:jc w:val="both"/>
-      </w:pPr>
-      <w:r>
-        <w:rPr>
-          <w:rFonts w:ascii="Times New Roman" w:cs="David" w:hAnsi="Times New Roman"/>
-          <w:sz w:val="24"/>
-          <w:szCs w:val="24"/>
-          <w:rtl/>
-        </w:rPr>
-        <w:t xml:space="preserve">ממחקר זה עלה כי המורות יוזמות את רוב הקשר, ומקפידות שהפנייה הראשונה להורה תהיה חיובית. בהתייחס לכיוון התקשורת, מחקר קודם מצא שמורים כמעט אינם מתכוונים לשתף הורים במצבים יומיומיים, ושהתקשורת שהם מתארים חד-כיוונית (ענבר-פירסט ואחרים, 2023). מחקר אחר מצא שמורים אינם מעוניינים במעורבות הורים מעבר למה שהם רואים כ"הכרחי" (Fisher &amp; Baissberg, 2025). במחקר הנוכחי נמצא פער לעומת הספרות הזאת: המורות אמנם יוזמות את רוב הקשר, אך רבות מהן ביקשו להרחיב את שותפות ההורים, והבחינו בין הורה "מזומן" להורה "מוזמן". ההבחנה מזכירה את ההבחנה בין פעולה למען הקהילה לפעולה עמה (גולדרט ועמרם-אשרוב, 2023), ואת רעיון "השולחן העגול" במקום המלבני (אחיטוב והרצוג, 2022).</w:t>
-      </w:r>
-    </w:p>
-    <w:p>
-      <w:pPr>
-        <w:bidi/>
-        <w:spacing w:after="0" w:before="0" w:line="360" w:lineRule="auto"/>
-        <w:ind w:firstLine="567"/>
-        <w:jc w:val="both"/>
-      </w:pPr>
-      <w:r>
-        <w:rPr>
-          <w:rFonts w:ascii="Times New Roman" w:cs="David" w:hAnsi="Times New Roman"/>
-          <w:sz w:val="24"/>
-          <w:szCs w:val="24"/>
-          <w:rtl/>
-        </w:rPr>
-        <w:t xml:space="preserve">בהתייחס להגדרה המחודשת של "הורה מעורב", בדומה למחקר זה, גם בספרות נמצא שלציפיות ההורים השפעה גדולה יותר על הישגי הילדים מאשר לפיקוח ולשליטה (Erdem &amp; Kaya, 2020). אמא שאינה קוראת אך "יושבת ליד הילד" היא דוגמה למעורבות כזאת. מחקר על החינוך הבדואי מצא שמעורבות ההורים בבית הספר קשורה לנשירה, ללא קשר למעמד החברתי-כלכלי של המשפחה (אבו עג'אג', 2016), וגם המורות בחטיבת הביניים קשרו את הקשר עם ההורים להתמדה בלימודים. המסקנה השלישית היא שהמעורבות הנמוכה המיוחסת להורים ערבים נובעת במידה רבה מהדרך שבה בית הספר פונה אליהם. כשהפנייה הראשונה חיובית, וכשמבקשים מההורים את מה שהם יכולים לתת, הם עונים.</w:t>
+        <w:spacing w:after="60" w:before="0" w:line="360" w:lineRule="auto"/>
+        <w:jc w:val="both"/>
+      </w:pPr>
+      <w:r>
+        <w:rPr>
+          <w:rFonts w:ascii="Times New Roman" w:cs="David" w:hAnsi="Times New Roman"/>
+          <w:sz w:val="24"/>
+          <w:szCs w:val="24"/>
+          <w:rtl/>
+        </w:rPr>
+        <w:t xml:space="preserve">ממחקר זה עלה כי המורות יוזמות את רוב הקשר, ומקפידות שהפנייה הראשונה להורה תהיה חיובית. בהתייחס לכיוון התקשורת, מחקר קודם מצא שמורים כמעט אינם מתכוונים לשתף הורים במצבים יומיומיים, ושהתקשורת שהם מתארים חד-כיוונית (ענבר-פירסט ואחרים, 2023). מחקר אחר מצא שמורים אינם מעוניינים במעורבות הורים מעבר למה שהם רואים כ"הכרחי" (Fisher &amp; Baissberg, 2025). במחקר הנוכחי נמצא פער לעומת הספרות הזאת: המורות אמנם יוזמות את רוב הקשר, אך רבות מהן ביקשו להרחיב את שותפות ההורים, והבחינו בין הורה "מזומן" להורה "מוזמן". ההבחנה מזכירה את ההבחנה בין פעולה למען הקהילה לפעולה עמה (גולדרט ועמרם-אשרוב, 2023), ואת רעיון "השולחן העגול" (אחיטוב והרצוג, 2022).</w:t>
+      </w:r>
+    </w:p>
+    <w:p>
+      <w:pPr>
+        <w:bidi/>
+        <w:spacing w:after="60" w:before="0" w:line="360" w:lineRule="auto"/>
+        <w:jc w:val="both"/>
+      </w:pPr>
+      <w:r>
+        <w:rPr>
+          <w:rFonts w:ascii="Times New Roman" w:cs="David" w:hAnsi="Times New Roman"/>
+          <w:sz w:val="24"/>
+          <w:szCs w:val="24"/>
+          <w:rtl/>
+        </w:rPr>
+        <w:t xml:space="preserve">בהתייחס להגדרה המחודשת של "הורה מעורב", בדומה למחקר זה, גם בספרות נמצא שלציפיות ההורים השפעה גדולה יותר על הישגי הילדים מאשר לפיקוח ולשליטה (Erdem &amp; Kaya, 2020). אמא שאינה קוראת אך "יושבת ליד הילד" היא דוגמה למעורבות כזאת. מחקר על החינוך הבדואי מצא שמעורבות ההורים בבית הספר קשורה לנשירה (אבו עג'אג', 2016). המסקנה השלישית היא שהמעורבות הנמוכה המיוחסת להורים ערבים נובעת במידה רבה מהדרך שבה בית הספר פונה אליהם. כשהפנייה הראשונה חיובית, וכשמבקשים מההורים את מה שהם יכולים לתת, הם עונים.</w:t>
       </w:r>
     </w:p>
     <w:p>
@@ -6924,8 +6914,7 @@
     <w:p>
       <w:pPr>
         <w:bidi/>
-        <w:spacing w:after="0" w:before="0" w:line="360" w:lineRule="auto"/>
-        <w:ind w:firstLine="567"/>
+        <w:spacing w:after="60" w:before="0" w:line="360" w:lineRule="auto"/>
         <w:jc w:val="both"/>
       </w:pPr>
       <w:r>
@@ -6941,18 +6930,17 @@
     <w:p>
       <w:pPr>
         <w:bidi/>
-        <w:spacing w:after="0" w:before="0" w:line="360" w:lineRule="auto"/>
-        <w:ind w:firstLine="567"/>
-        <w:jc w:val="both"/>
-      </w:pPr>
-      <w:r>
-        <w:rPr>
-          <w:rFonts w:ascii="Times New Roman" w:cs="David" w:hAnsi="Times New Roman"/>
-          <w:sz w:val="24"/>
-          <w:szCs w:val="24"/>
-          <w:rtl/>
-        </w:rPr>
-        <w:t xml:space="preserve">לצד זאת עלה קול אחר, שלפיו חלק מההורים מעדיפים שמי שהם סומכים עליו יחליט. גם בספרות נמצא שהורים ערבים נוטים יותר לבקשת עזרה תלותית (Grinshtain &amp; Harpaz, 2023). אפשר לראות בשתי העמדות שלב בתהליך ולא סתירה: שותפות נבנית בהדרגה, מהחלטות קטנות להחלטות גדולות, כפי שהציעו המורות עצמן. המסקנה הרביעית היא שהורים ערבים בלוד מסוגלים ומוכנים להיות שותפים, אך השותפות מתממשת רק כשבית הספר מזמין אותם לתרום ידע ולהשתתף בפתרון בעיות, ולא רק לעזור.</w:t>
+        <w:spacing w:after="60" w:before="0" w:line="360" w:lineRule="auto"/>
+        <w:jc w:val="both"/>
+      </w:pPr>
+      <w:r>
+        <w:rPr>
+          <w:rFonts w:ascii="Times New Roman" w:cs="David" w:hAnsi="Times New Roman"/>
+          <w:sz w:val="24"/>
+          <w:szCs w:val="24"/>
+          <w:rtl/>
+        </w:rPr>
+        <w:t xml:space="preserve">לצד זאת עלה קול אחר, שלפיו חלק מההורים מעדיפים שמי שהם סומכים עליו יחליט. גם בספרות נמצא שהורים ערבים נוטים יותר לבקשת עזרה תלותית (Grinshtain &amp; Harpaz, 2023). אפשר לראות בשתי העמדות שלב בתהליך ולא סתירה, שבו השותפות נבנית מהחלטות קטנות לגדולות. המסקנה הרביעית היא שהורים ערבים בלוד מסוגלים ומוכנים להיות שותפים, אך השותפות מתממשת רק כשבית הספר מזמין אותם לתרום ידע ולהשתתף בפתרון בעיות, ולא רק לעזור.</w:t>
       </w:r>
     </w:p>
     <w:p>
@@ -6977,8 +6965,7 @@
     <w:p>
       <w:pPr>
         <w:bidi/>
-        <w:spacing w:after="0" w:before="0" w:line="360" w:lineRule="auto"/>
-        <w:ind w:firstLine="567"/>
+        <w:spacing w:after="60" w:before="0" w:line="360" w:lineRule="auto"/>
         <w:jc w:val="both"/>
       </w:pPr>
       <w:r>
@@ -6994,8 +6981,7 @@
     <w:p>
       <w:pPr>
         <w:bidi/>
-        <w:spacing w:after="0" w:before="0" w:line="360" w:lineRule="auto"/>
-        <w:ind w:firstLine="567"/>
+        <w:spacing w:after="60" w:before="0" w:line="360" w:lineRule="auto"/>
         <w:jc w:val="both"/>
       </w:pPr>
       <w:r>
@@ -7030,8 +7016,7 @@
     <w:p>
       <w:pPr>
         <w:bidi/>
-        <w:spacing w:after="0" w:before="0" w:line="360" w:lineRule="auto"/>
-        <w:ind w:firstLine="567"/>
+        <w:spacing w:after="60" w:before="0" w:line="360" w:lineRule="auto"/>
         <w:jc w:val="both"/>
       </w:pPr>
       <w:r>
@@ -7047,18 +7032,17 @@
     <w:p>
       <w:pPr>
         <w:bidi/>
-        <w:spacing w:after="0" w:before="0" w:line="360" w:lineRule="auto"/>
-        <w:ind w:firstLine="567"/>
-        <w:jc w:val="both"/>
-      </w:pPr>
-      <w:r>
-        <w:rPr>
-          <w:rFonts w:ascii="Times New Roman" w:cs="David" w:hAnsi="Times New Roman"/>
-          <w:sz w:val="24"/>
-          <w:szCs w:val="24"/>
-          <w:rtl/>
-        </w:rPr>
-        <w:t xml:space="preserve">בהתייחס להכשרה, בדומה למחקר זה, גם בספרות נמצא שמורים חדשים מתמודדים עם הורים באופן אינטואיטיבי ונשענים על מורים חונכים (עזריה וצר ואחרים, 2024), ושהשותפות כרוכה במורכבות רגשית הדורשת תמיכה בצוות (כורם, 2022). הבקשות של המורות לעובדת סוציאלית, למרכז הורים ולתקשורת עירונית בערבית מתאימות למודל שיתוף הפעולה הקהילתי, שלפיו בית הספר מטפל גם בחסמים שאינם לימודיים באמצעות שותפויות עם שירותי הרווחה והקהילה (Anderson-Butcher et al., 2022). המורות לא תיארו שותפויות כאלה כקיימות, אלא את עצמן כמי שממלאות את החלל. המסקנה השישית היא שבבתי הספר שנחקרו מתקיימת מנהיגות שיתופית "מלמטה", אך כדי שתתקיים לאורך זמן היא צריכה מבנה: זמן מוקצה, תפקיד מוגדר, הכשרה מותאמת ושותפויות עם גורמים בקהילה.</w:t>
+        <w:spacing w:after="60" w:before="0" w:line="360" w:lineRule="auto"/>
+        <w:jc w:val="both"/>
+      </w:pPr>
+      <w:r>
+        <w:rPr>
+          <w:rFonts w:ascii="Times New Roman" w:cs="David" w:hAnsi="Times New Roman"/>
+          <w:sz w:val="24"/>
+          <w:szCs w:val="24"/>
+          <w:rtl/>
+        </w:rPr>
+        <w:t xml:space="preserve">בהתייחס להכשרה, בדומה למחקר זה, גם בספרות נמצא שמורים חדשים מתמודדים עם הורים באופן אינטואיטיבי ונשענים על מורים חונכים (עזריה וצר ואחרים, 2024), ושהשותפות כרוכה במורכבות רגשית הדורשת תמיכה בצוות (כורם, 2022). הבקשות של המורות לעובדת סוציאלית, למרכז הורים ולתקשורת עירונית בערבית מתאימות למודל שיתוף הפעולה הקהילתי, שלפיו בית הספר מטפל גם בחסמים שאינם לימודיים באמצעות שותפויות עם שירותי הרווחה והקהילה (Anderson-Butcher et al., 2022). המסקנה השישית היא שבבתי הספר שנחקרו מתקיימת מנהיגות שיתופית "מלמטה", אך כדי שתתקיים לאורך זמן היא צריכה מבנה: זמן מוקצה, תפקיד מוגדר, הכשרה מותאמת ושותפויות עם גורמים בקהילה.</w:t>
       </w:r>
     </w:p>
     <w:p>
@@ -7083,8 +7067,23 @@
     <w:p>
       <w:pPr>
         <w:bidi/>
-        <w:spacing w:after="0" w:before="0" w:line="360" w:lineRule="auto"/>
-        <w:ind w:firstLine="567"/>
+        <w:spacing w:after="60" w:before="0" w:line="360" w:lineRule="auto"/>
+        <w:jc w:val="both"/>
+      </w:pPr>
+      <w:r>
+        <w:rPr>
+          <w:rFonts w:ascii="Times New Roman" w:cs="David" w:hAnsi="Times New Roman"/>
+          <w:sz w:val="24"/>
+          <w:szCs w:val="24"/>
+          <w:rtl/>
+        </w:rPr>
+        <w:t xml:space="preserve">יש לקרוא את הממצאים גם בעין ביקורתית. ראשית, התמונה מבוססת על דברי מורות שרבות מהן רכזות ויוזמות, ולכן ייתכן שהיא מציגה את הצד המוצלח של הקשר עם ההורים יותר מאשר את השגרה של מורה ממוצעת. שנית, ההישענות על יוזמות אישיות אינה רק עדות להצלחה, אלא גם לבעיה: היא יוצרת פערים בין כיתות ובין בתי ספר, ותלמיד שהמחנכת שלו אינה יוזמת נשאר בלי הגשר הזה. שלישית, העבודה בתוך מבנה הקהילה מאפשרת להגיע להורים, אך עלולה גם לשמר את הדרת הנשים מעמדות השפעה, כפי שתיארו המורות עצמן. לכן ההמלצה אינה לאמץ את המבנה כמות שהוא, אלא לעבוד דרכו תוך הרחבת המקום של האמהות ושל המורות בתוכו.</w:t>
+      </w:r>
+    </w:p>
+    <w:p>
+      <w:pPr>
+        <w:bidi/>
+        <w:spacing w:after="60" w:before="0" w:line="360" w:lineRule="auto"/>
         <w:jc w:val="both"/>
       </w:pPr>
       <w:r>
@@ -7100,8 +7099,7 @@
     <w:p>
       <w:pPr>
         <w:bidi/>
-        <w:spacing w:after="0" w:before="0" w:line="360" w:lineRule="auto"/>
-        <w:ind w:firstLine="567"/>
+        <w:spacing w:after="60" w:before="0" w:line="360" w:lineRule="auto"/>
         <w:jc w:val="both"/>
       </w:pPr>
       <w:r>
@@ -7156,8 +7154,7 @@
     <w:p>
       <w:pPr>
         <w:bidi/>
-        <w:spacing w:after="0" w:before="0" w:line="360" w:lineRule="auto"/>
-        <w:ind w:firstLine="567"/>
+        <w:spacing w:after="60" w:before="0" w:line="360" w:lineRule="auto"/>
         <w:jc w:val="both"/>
       </w:pPr>
       <w:r>
@@ -7192,8 +7189,7 @@
     <w:p>
       <w:pPr>
         <w:bidi/>
-        <w:spacing w:after="0" w:before="0" w:line="360" w:lineRule="auto"/>
-        <w:ind w:firstLine="567"/>
+        <w:spacing w:after="60" w:before="0" w:line="360" w:lineRule="auto"/>
         <w:jc w:val="both"/>
       </w:pPr>
       <w:r>
@@ -7228,8 +7224,7 @@
     <w:p>
       <w:pPr>
         <w:bidi/>
-        <w:spacing w:after="0" w:before="0" w:line="360" w:lineRule="auto"/>
-        <w:ind w:firstLine="567"/>
+        <w:spacing w:after="60" w:before="0" w:line="360" w:lineRule="auto"/>
         <w:jc w:val="both"/>
       </w:pPr>
       <w:r>

</xml_diff>

<commit_message>
Further expand background, findings, discussion and summary
Co-Authored-By: Claude Opus 5.5 <noreply@anthropic.com>
Claude-Session: https://claude.ai/code/session_01PCrLuLuf13bgHFN1Akf9GB
</commit_message>
<xml_diff>
--- a/seminar/עבודת סמינר - חיתאם אבו ריאש.docx
+++ b/seminar/עבודת סמינר - חיתאם אבו ריאש.docx
@@ -526,7 +526,7 @@
               <w:szCs w:val="24"/>
               <w:rtl/>
             </w:rPr>
-            <w:t>2</w:t>
+            <w:t>3</w:t>
           </w:r>
         </w:p>
         <w:p>
@@ -563,7 +563,7 @@
               <w:szCs w:val="24"/>
               <w:rtl/>
             </w:rPr>
-            <w:t>3</w:t>
+            <w:t>4</w:t>
           </w:r>
         </w:p>
         <w:p>
@@ -600,7 +600,7 @@
               <w:szCs w:val="24"/>
               <w:rtl/>
             </w:rPr>
-            <w:t>4</w:t>
+            <w:t>5</w:t>
           </w:r>
         </w:p>
         <w:p>
@@ -637,7 +637,7 @@
               <w:szCs w:val="24"/>
               <w:rtl/>
             </w:rPr>
-            <w:t>5</w:t>
+            <w:t>6</w:t>
           </w:r>
         </w:p>
         <w:p>
@@ -675,7 +675,7 @@
               <w:szCs w:val="24"/>
               <w:rtl/>
             </w:rPr>
-            <w:t>7</w:t>
+            <w:t>8</w:t>
           </w:r>
         </w:p>
         <w:p>
@@ -713,7 +713,7 @@
               <w:szCs w:val="24"/>
               <w:rtl/>
             </w:rPr>
-            <w:t>7</w:t>
+            <w:t>8</w:t>
           </w:r>
         </w:p>
         <w:p>
@@ -750,7 +750,7 @@
               <w:szCs w:val="24"/>
               <w:rtl/>
             </w:rPr>
-            <w:t>7</w:t>
+            <w:t>8</w:t>
           </w:r>
         </w:p>
         <w:p>
@@ -787,7 +787,7 @@
               <w:szCs w:val="24"/>
               <w:rtl/>
             </w:rPr>
-            <w:t>7</w:t>
+            <w:t>8</w:t>
           </w:r>
         </w:p>
         <w:p>
@@ -824,7 +824,7 @@
               <w:szCs w:val="24"/>
               <w:rtl/>
             </w:rPr>
-            <w:t>8</w:t>
+            <w:t>9</w:t>
           </w:r>
         </w:p>
         <w:p>
@@ -861,7 +861,7 @@
               <w:szCs w:val="24"/>
               <w:rtl/>
             </w:rPr>
-            <w:t>8</w:t>
+            <w:t>9</w:t>
           </w:r>
         </w:p>
         <w:p>
@@ -898,7 +898,7 @@
               <w:szCs w:val="24"/>
               <w:rtl/>
             </w:rPr>
-            <w:t>8</w:t>
+            <w:t>9</w:t>
           </w:r>
         </w:p>
         <w:p>
@@ -935,7 +935,7 @@
               <w:szCs w:val="24"/>
               <w:rtl/>
             </w:rPr>
-            <w:t>8</w:t>
+            <w:t>9</w:t>
           </w:r>
         </w:p>
         <w:p>
@@ -973,7 +973,7 @@
               <w:szCs w:val="24"/>
               <w:rtl/>
             </w:rPr>
-            <w:t>10</w:t>
+            <w:t>11</w:t>
           </w:r>
         </w:p>
         <w:p>
@@ -1010,7 +1010,7 @@
               <w:szCs w:val="24"/>
               <w:rtl/>
             </w:rPr>
-            <w:t>10</w:t>
+            <w:t>11</w:t>
           </w:r>
         </w:p>
         <w:p>
@@ -1047,7 +1047,7 @@
               <w:szCs w:val="24"/>
               <w:rtl/>
             </w:rPr>
-            <w:t>11</w:t>
+            <w:t>13</w:t>
           </w:r>
         </w:p>
         <w:p>
@@ -1084,7 +1084,7 @@
               <w:szCs w:val="24"/>
               <w:rtl/>
             </w:rPr>
-            <w:t>13</w:t>
+            <w:t>14</w:t>
           </w:r>
         </w:p>
         <w:p>
@@ -1121,7 +1121,7 @@
               <w:szCs w:val="24"/>
               <w:rtl/>
             </w:rPr>
-            <w:t>14</w:t>
+            <w:t>16</w:t>
           </w:r>
         </w:p>
         <w:p>
@@ -1158,7 +1158,7 @@
               <w:szCs w:val="24"/>
               <w:rtl/>
             </w:rPr>
-            <w:t>15</w:t>
+            <w:t>17</w:t>
           </w:r>
         </w:p>
         <w:p>
@@ -1195,7 +1195,7 @@
               <w:szCs w:val="24"/>
               <w:rtl/>
             </w:rPr>
-            <w:t>16</w:t>
+            <w:t>18</w:t>
           </w:r>
         </w:p>
         <w:p>
@@ -1233,7 +1233,7 @@
               <w:szCs w:val="24"/>
               <w:rtl/>
             </w:rPr>
-            <w:t>18</w:t>
+            <w:t>21</w:t>
           </w:r>
         </w:p>
         <w:p>
@@ -1270,7 +1270,7 @@
               <w:szCs w:val="24"/>
               <w:rtl/>
             </w:rPr>
-            <w:t>18</w:t>
+            <w:t>21</w:t>
           </w:r>
         </w:p>
         <w:p>
@@ -1307,7 +1307,7 @@
               <w:szCs w:val="24"/>
               <w:rtl/>
             </w:rPr>
-            <w:t>18</w:t>
+            <w:t>21</w:t>
           </w:r>
         </w:p>
         <w:p>
@@ -1344,7 +1344,7 @@
               <w:szCs w:val="24"/>
               <w:rtl/>
             </w:rPr>
-            <w:t>19</w:t>
+            <w:t>22</w:t>
           </w:r>
         </w:p>
         <w:p>
@@ -1381,7 +1381,7 @@
               <w:szCs w:val="24"/>
               <w:rtl/>
             </w:rPr>
-            <w:t>19</w:t>
+            <w:t>23</w:t>
           </w:r>
         </w:p>
         <w:p>
@@ -1418,7 +1418,7 @@
               <w:szCs w:val="24"/>
               <w:rtl/>
             </w:rPr>
-            <w:t>20</w:t>
+            <w:t>23</w:t>
           </w:r>
         </w:p>
         <w:p>
@@ -1455,7 +1455,7 @@
               <w:szCs w:val="24"/>
               <w:rtl/>
             </w:rPr>
-            <w:t>20</w:t>
+            <w:t>24</w:t>
           </w:r>
         </w:p>
         <w:p>
@@ -1492,7 +1492,7 @@
               <w:szCs w:val="24"/>
               <w:rtl/>
             </w:rPr>
-            <w:t>21</w:t>
+            <w:t>25</w:t>
           </w:r>
         </w:p>
         <w:p>
@@ -1530,7 +1530,7 @@
               <w:szCs w:val="24"/>
               <w:rtl/>
             </w:rPr>
-            <w:t>22</w:t>
+            <w:t>26</w:t>
           </w:r>
         </w:p>
         <w:p>
@@ -1567,7 +1567,7 @@
               <w:szCs w:val="24"/>
               <w:rtl/>
             </w:rPr>
-            <w:t>22</w:t>
+            <w:t>26</w:t>
           </w:r>
         </w:p>
         <w:p>
@@ -1604,7 +1604,7 @@
               <w:szCs w:val="24"/>
               <w:rtl/>
             </w:rPr>
-            <w:t>22</w:t>
+            <w:t>26</w:t>
           </w:r>
         </w:p>
         <w:p>
@@ -1641,7 +1641,44 @@
               <w:szCs w:val="24"/>
               <w:rtl/>
             </w:rPr>
-            <w:t>22</w:t>
+            <w:t>27</w:t>
+          </w:r>
+        </w:p>
+        <w:p>
+          <w:pPr>
+            <w:bidi/>
+            <w:tabs>
+              <w:tab w:val="right" w:leader="dot" w:pos="9072"/>
+            </w:tabs>
+            <w:spacing w:before="0" w:after="20" w:line="252" w:lineRule="auto"/>
+            <w:ind w:left="567"/>
+          </w:pPr>
+          <w:r>
+            <w:rPr>
+              <w:rFonts w:ascii="Times New Roman" w:hAnsi="Times New Roman" w:cs="David"/>
+              <w:sz w:val="24"/>
+              <w:szCs w:val="24"/>
+              <w:rtl/>
+            </w:rPr>
+            <w:t xml:space="preserve">6.4 דברי סיום</w:t>
+          </w:r>
+          <w:r>
+            <w:rPr>
+              <w:rFonts w:ascii="Times New Roman" w:hAnsi="Times New Roman" w:cs="David"/>
+              <w:sz w:val="24"/>
+              <w:szCs w:val="24"/>
+              <w:rtl/>
+            </w:rPr>
+            <w:tab/>
+          </w:r>
+          <w:r>
+            <w:rPr>
+              <w:rFonts w:ascii="Times New Roman" w:hAnsi="Times New Roman" w:cs="David"/>
+              <w:sz w:val="24"/>
+              <w:szCs w:val="24"/>
+              <w:rtl/>
+            </w:rPr>
+            <w:t>27</w:t>
           </w:r>
         </w:p>
         <w:p>
@@ -1679,7 +1716,7 @@
               <w:szCs w:val="24"/>
               <w:rtl/>
             </w:rPr>
-            <w:t>23</w:t>
+            <w:t>28</w:t>
           </w:r>
         </w:p>
         <w:p>
@@ -1717,7 +1754,7 @@
               <w:szCs w:val="24"/>
               <w:rtl/>
             </w:rPr>
-            <w:t>26</w:t>
+            <w:t>31</w:t>
           </w:r>
         </w:p>
         <w:p>
@@ -1755,7 +1792,7 @@
               <w:szCs w:val="24"/>
               <w:rtl/>
             </w:rPr>
-            <w:t>28</w:t>
+            <w:t>33</w:t>
           </w:r>
         </w:p>
         <w:p>
@@ -1793,7 +1830,7 @@
               <w:szCs w:val="24"/>
               <w:rtl/>
             </w:rPr>
-            <w:t>37</w:t>
+            <w:t>42</w:t>
           </w:r>
           <w:r>
             <w:fldChar w:fldCharType="end"/>
@@ -1948,7 +1985,7 @@
           <w:szCs w:val="24"/>
           <w:rtl/>
         </w:rPr>
-        <w:t xml:space="preserve">מגורים באותו מקום אינם מבטיחים חוויה קהילתית. מחקר איכותני-נרטיבי שנערך בשכונה עירונית בירושלים, ובו ראיונות עומק עם 15 תושבים, מצא כי משמעות הקהילה בשכונה נעה על רצף שבין היעדר קהילה, געגוע אליה וניסיון לשחזר אותה. חלק מהמשתתפים הביעו תחושת קהילתיות שלילית, ואחרים תיארו תחושה של זרות ואיום מצד תושבים אחרים. רוב המשתתפים תיארו את הרשתות השכונתיות המקוונות ככלי שמסייע להם לבנות תחושת קהילתיות. החוקרות הסיקו כי לממסד יש תפקיד בעידוד סובלנות בין קבוצות שונות בקהילה ובהגברת האמון בין התושבים לבין עצמם ובינם לבין הממסד (וול-טיסר ובליט-כהן, 2023).</w:t>
+        <w:t xml:space="preserve">חלק מהקהילות מאופיינות גם ב"גידור", כלומר במנגנון פורמלי הקובע מי יוכל להצטרף לקבוצה, או בגבול פיזי המונע כניסה של גורמים לא רצויים לשטח הקהילה ולמוסדותיה (להבי, 2010, כפי שמצוטט אצל Fisher &amp; Refael Fanyo, 2022). מקמילן וצ'אביס תיארו את תחושת הקהילה ברכיבים כמו תחושת שייכות, הבנת גבולות הקהילה, אמון ונכונות להשקיע בה (McMillan &amp; Chavis, 1986, כפי שמצוטט אצל Fisher &amp; Refael Fanyo, 2022). מושגים אלה מאפשרים לבחון את בית הספר כמוסד שנמצא על גבול הקהילה: הוא שייך לה, אך הוא גם נציג של מערכת חיצונית.</w:t>
       </w:r>
     </w:p>
     <w:p>
@@ -1964,6 +2001,22 @@
           <w:szCs w:val="24"/>
           <w:rtl/>
         </w:rPr>
+        <w:t xml:space="preserve">מגורים באותו מקום אינם מבטיחים חוויה קהילתית. מחקר איכותני-נרטיבי שנערך בשכונה עירונית בירושלים, ובו ראיונות עומק עם 15 תושבים, מצא ארבע תמות: משמעות הקהילה בשכונה, הנעה על רצף שבין היעדר קהילה, געגוע אליה וניסיון לשחזר אותה; מרקם האוכלוסייה והשינויים הדמוגרפיים בשכונה; קשרים חברתיים ורשתות חברתיות מקוונות; וציפיות התושבים מן הממסד. חלק מהמשתתפים הביעו תחושת קהילתיות שלילית, ואחרים תיארו תחושה של זרות ואיום מצד תושבים אחרים. רוב המשתתפים תיארו את הרשתות השכונתיות המקוונות ככלי שמסייע להם לבנות תחושת קהילתיות. החוקרות הסיקו כי לממסד יש תפקיד בעידוד סובלנות בין קבוצות שונות בקהילה ובהגברת האמון בין התושבים לבין עצמם ובינם לבין הממסד (וול-טיסר ובליט-כהן, 2023).</w:t>
+      </w:r>
+    </w:p>
+    <w:p>
+      <w:pPr>
+        <w:bidi/>
+        <w:spacing w:after="60" w:before="0" w:line="360" w:lineRule="auto"/>
+        <w:jc w:val="both"/>
+      </w:pPr>
+      <w:r>
+        <w:rPr>
+          <w:rFonts w:ascii="Times New Roman" w:cs="David" w:hAnsi="Times New Roman"/>
+          <w:sz w:val="24"/>
+          <w:szCs w:val="24"/>
+          <w:rtl/>
+        </w:rPr>
         <w:t xml:space="preserve">קהילה אפשר גם לבנות. מחקר שעסק בפרויקט "בינוי קהילה" במעונות לגיל הרך, ובו ראיונות עם שש מנהלות ותצפיות, מצא שהתנאים הכלכליים והארגוניים של המעונות עיצבו את עמדות המנהלות כלפי הפרויקט (אחיטוב והרצוג, 2022). כותרת המאמר, "לשבת סביב שולחן עגול ולא מלבני", מבטאת את רעיון היסוד: מעבר ממבנה היררכי למפגש בין שותפים. מחקר שבחן 32 מיזמי חינוך בלתי פורמלי בתקופת הקורונה שייך אותם לארבעה טיפוסים של עבודה קהילתית: פיתוח קהילה, תכנון חברתי, פעולה חברתית ורפורמה חברתית. כל המיזמים כוונו להעצמת המשתתפים, אך הם נבדלו במידה שבה שיתפו את הקהילה עצמה (גולדרט ועמרם-אשרוב, 2023). ההבחנה הזאת רלוונטית לבית הספר. אפשר לפעול למען ההורים, ואפשר לפעול יחד איתם.</w:t>
       </w:r>
     </w:p>
@@ -2015,7 +2068,7 @@
           <w:szCs w:val="24"/>
           <w:rtl/>
         </w:rPr>
-        <w:t xml:space="preserve">בעתות משבר בולט תפקידו של בית הספר כמוקד קהילתי. מחקר שבחן את משאבי ההתמודדות של 69 מדריכי חינוך חברתי-קהילתי בתקופת הקורונה מצא כי ההתמודדות שלהם נבנתה כתחושת קוהרנטיות, הנשענת על מובנות, משמעותיות ונהילות. אחת המשתתפות תיארה את החינוך החברתי-קהילתי כ"העוגן, המצפן וההגה בתוך ים סוער" (גולדרט, 2024).</w:t>
+        <w:t xml:space="preserve">בעתות משבר בולט תפקידו של בית הספר כמוקד קהילתי. מחקר שבחן את משאבי ההתמודדות של 69 מדריכי חינוך חברתי-קהילתי בתקופת הקורונה מצא כי ההתמודדות שלהם נבנתה כתחושת קוהרנטיות, הנשענת על מובנות, משמעותיות ונהילות. מאפייניה היו מעורבות חברתית, יצירתיות, גמישות, רציפות וזמינות של התכנים, שותפות הצוות והשתתפות התלמידים. אחת המשתתפות תיארה את החינוך החברתי-קהילתי כ"העוגן, המצפן וההגה בתוך ים סוער" (גולדרט, 2024).</w:t>
       </w:r>
     </w:p>
     <w:p>
@@ -2052,6 +2105,22 @@
     </w:p>
     <w:p>
       <w:pPr>
+        <w:bidi/>
+        <w:spacing w:after="60" w:before="0" w:line="360" w:lineRule="auto"/>
+        <w:jc w:val="both"/>
+      </w:pPr>
+      <w:r>
+        <w:rPr>
+          <w:rFonts w:ascii="Times New Roman" w:cs="David" w:hAnsi="Times New Roman"/>
+          <w:sz w:val="24"/>
+          <w:szCs w:val="24"/>
+          <w:rtl/>
+        </w:rPr>
+        <w:t xml:space="preserve">באותו מחקר הוגדרה סמכות המורה כסבירות שאחרים יצייתו לו מרצון, והיא תלויה במידה רבה בלגיטימציה שמעניקים לו אחרים. המחקר מצא כי ככל שהורים חשים קהילתיות רבה יותר, הם מעניקים למורה סמכות רבה יותר ומעורבים יותר בבית הספר. החוקרות הציעו שהמודל יכול לסייע לבתי ספר לגבש מדיניות שתשפר את היחסים בין בית הספר להורים ותחזק את סמכות המורה (Fisher &amp; Refael Fanyo, 2022). מכאן שבית ספר המבקש לחזק את מעורבות ההורים יכול לפעול גם דרך חיזוק תחושת הקהילתיות שלהם.</w:t>
+      </w:r>
+    </w:p>
+    <w:p>
+      <w:pPr>
         <w:pStyle w:val="Heading2"/>
         <w:bidi/>
         <w:spacing w:after="120" w:before="240" w:line="360" w:lineRule="auto"/>
@@ -2114,6 +2183,22 @@
           <w:szCs w:val="24"/>
           <w:rtl/>
         </w:rPr>
+        <w:t xml:space="preserve">מחקר זה נשען על תאוריית הלחץ, שלפיה המורה תופס אירוע כמלחיץ או כמאתגר לפי תפיסתו את הכוחות והמשאבים העומדים לרשותו. המנהל הוא אחד המשאבים האלה, משום שהוא משפיע על בית הספר כארגון ועל המורים עצמם (צמח ובארט, 2024). לכן אפשר לצפות שסגנון המנהיגות ישפיע גם על האופן שבו מורים חווים את העבודה התובענית מול ההורים, ובכלל זה פניות בשעות לא שגרתיות ומחלוקות.</w:t>
+      </w:r>
+    </w:p>
+    <w:p>
+      <w:pPr>
+        <w:bidi/>
+        <w:spacing w:after="60" w:before="0" w:line="360" w:lineRule="auto"/>
+        <w:jc w:val="both"/>
+      </w:pPr>
+      <w:r>
+        <w:rPr>
+          <w:rFonts w:ascii="Times New Roman" w:cs="David" w:hAnsi="Times New Roman"/>
+          <w:sz w:val="24"/>
+          <w:szCs w:val="24"/>
+          <w:rtl/>
+        </w:rPr>
         <w:t xml:space="preserve">מנהיגות מבוזרת מניחה שגם מורים מובילים. מחקר שליווה 46 מורים מובילים במשך שנתיים תיאר אצלם "זהות מקפית" של מורה-מנהיג, שבה לכל אחת מהתוויות "מורה" ו"מנהיג" יש משמעות משלה, וזיהה שש קטגוריות שהן אבני דרך בגיבוש הזהות הזאת (ברוזה וחמו, 2022).</w:t>
       </w:r>
     </w:p>
@@ -2130,7 +2215,7 @@
           <w:szCs w:val="24"/>
           <w:rtl/>
         </w:rPr>
-        <w:t xml:space="preserve">היחסים עם ההורים הם אחד התחומים שבהם המנהיגות נבחנת בפועל. ראיונות עם שנים עשר מנהלים בתקופת הקורונה הראו שהמעורבות של ההורים התרחבה, אך התמקדה בהיבטים טכניים יותר מחינוכיים. לתפיסת המנהלים, ערבוב הזירה הביתית והזירה הבית ספרית יצר סוג מעורבות שאינו בהכרח יעיל, טשטש את הגבולות הרצויים ועלול היה להוביל ללחץ ולשחיקה של מורים. המורים חשו עומס מפניות שהגיעו בלי גבולות של זמן ומקום, והמנהלים הגיבו באסטרטגיה של שקיפות ופתיחות (ברוכי ואזולאי, 2023).</w:t>
+        <w:t xml:space="preserve">היחסים עם ההורים הם אחד התחומים שבהם המנהיגות נבחנת בפועל. ראיונות עם שנים עשר מנהלים בתקופת הקורונה הראו שהמעורבות של ההורים התרחבה, אך התמקדה בהיבטים טכניים יותר מחינוכיים. לתפיסת המנהלים, ערבוב הזירה הביתית והזירה הבית ספרית יצר סוג מעורבות שאינו בהכרח יעיל, טשטש את הגבולות הרצויים ועלול היה להוביל ללחץ ולשחיקה של מורים. המורים חוו רגשות כפולים: הם שמחו על חלוקת הנטל עם ההורים, אך חשו עומס מפניות שהגיעו בלי גבולות של זמן ומקום. המנהלים הגיבו באסטרטגיה של שקיפות ופתיחות, והחוקרות הציעו לראות במשבר הזדמנות לחזק את ההיבטים החיוביים של מעורבות ההורים גם בשגרה (ברוכי ואזולאי, 2023).</w:t>
       </w:r>
     </w:p>
     <w:p>
@@ -2213,6 +2298,22 @@
           <w:szCs w:val="24"/>
           <w:rtl/>
         </w:rPr>
+        <w:t xml:space="preserve">החוקרים בסקר שנערך במיורקה המליצו על פיתוח מקצועי ממוקד לצוותים ועל פלטפורמות פשוטות ומאובטחות שיאפשרו תקשורת דו-כיוונית בין בית הספר למשפחות (Urbina et al., 2025). גם המנהלים שרואיינו בתקופת הקורונה תיארו איזון עדין בין מעורבות להתערבות: תרומת ההורים יכולה להיות רחבה וחשובה, אך היא עלולה גם להוביל לשחיקה ולאי-שביעות רצון של המורים (פישר ופרידמן, 2009, כפי שמצוטט אצל ברוכי ואזולאי, 2023). מכאן שהשאלה אינה רק כמה מעורבות יש, אלא איזו מעורבות, ובאילו גבולות.</w:t>
+      </w:r>
+    </w:p>
+    <w:p>
+      <w:pPr>
+        <w:bidi/>
+        <w:spacing w:after="60" w:before="0" w:line="360" w:lineRule="auto"/>
+        <w:jc w:val="both"/>
+      </w:pPr>
+      <w:r>
+        <w:rPr>
+          <w:rFonts w:ascii="Times New Roman" w:cs="David" w:hAnsi="Times New Roman"/>
+          <w:sz w:val="24"/>
+          <w:szCs w:val="24"/>
+          <w:rtl/>
+        </w:rPr>
         <w:t xml:space="preserve">גם כיוון התקשורת חשוב. מחקר שבו הגיבו מורים לתרחישים של "תלמידאות לקויה" מצא שהם כמעט לא התכוונו לשתף את ההורים במצבים יומיומיים, ושהתקשורת שתיארו הייתה בעיקרה חד-כיוונית, מן המורה אל ההורה (ענבר-פירסט ואחרים, 2023). סקר בקרב 215 מורים ו-215 הורים מצא שהמורים אינם מעוניינים במעורבות הורים מעבר למה שהם רואים כ"הכרחי", בעוד ההורים רואים את עצמם כשותפים (Fisher &amp; Baissberg, 2025). אפשר ללמוד לגשר על הפער. בקורס פיתוח מקצועי שהתבסס על סימולציות של קונפליקטים עם הורים, התייחסו המורים לנקודת המבט של ההורה לעיתים קרובות יותר במפגשים שכללו סימולציות (מלץ ואחרים, 2026).</w:t>
       </w:r>
     </w:p>
@@ -2264,7 +2365,7 @@
           <w:szCs w:val="24"/>
           <w:rtl/>
         </w:rPr>
-        <w:t xml:space="preserve">במאי 2021 התפרצו בעיר אירועי אלימות קשים, שהיו הפתעה אסטרטגית למערכת הביטחון (ברנע, 2024). מחקרים קשרו את המתחים לתהליכי אתנו-ג'נטריפיקציה ולהתיישבות גרעינים תורניים בערים המעורבות, וטענו שהשיח על דו-קיום מסתיר פערים מעמדיים ולאומיים (שמריהו-ישורון, 2021). הגרעין התורני הראשון בעיר מעורבת הוקם בלוד, ב-1994 (Shmaryahu-Yeshurun &amp; Monterescu, 2024).</w:t>
+        <w:t xml:space="preserve">במאי 2021 התפרצו בעיר אירועי אלימות קשים, שהיו הפתעה אסטרטגית למערכת הביטחון (ברנע, 2024). מחקרים קשרו את המתחים לתהליכי אתנו-ג'נטריפיקציה ולהתיישבות גרעינים תורניים בערים המעורבות, וטענו שהשיח על דו-קיום מסתיר פערים מעמדיים ולאומיים (שמריהו-ישורון, 2021). מחקר שנערך ביפו זיהה טיפוס של "מג'נטרף לאומי", השונה הן מהמג'נטרפים החילונים-ליברלים והן מהמתנחלים מעבר לקו הירוק, וציין שהגרעין התורני הראשון בעיר מעורבת הוקם בלוד, ב-1994 (Shmaryahu-Yeshurun &amp; Monterescu, 2024). האוכלוסייה הערבית בערים המעורבות צעירה: 44% ממנה בני פחות מ-20, לעומת 31% מהיהודים באותן ערים (אבגר ואחרים, 2021). כלומר, משפחות רבות בעלות ילדים בגיל בית הספר חיות בעיר שבה המתחים האלה נוכחים.</w:t>
       </w:r>
     </w:p>
     <w:p>
@@ -2280,7 +2381,7 @@
           <w:szCs w:val="24"/>
           <w:rtl/>
         </w:rPr>
-        <w:t xml:space="preserve">מחקרים על מעורבות הורים בחברה הערבית מציגים תמונה לא אחידה. בספרות מקובל למיין את סוגי המעורבות על פני רצף לפי מידת האקטיביות של ההורים: צופים, ספקי שירות, לומדים, דיאלוג וועדים. מחקר קודם מצא שמעורבות ההורים בחינוך הערבי נמוכה מזו שבחינוך העברי, וכי הסוג הנפוץ בו הוא "צופים" (גרינבנק ובנג'ו, 2021, כפי שמצוטט אצל בנג'ו ובדיר, 2024). לעומת זאת, מחקר שנערך בתקופת הקורונה בקרב 119 הורים לילדים בגני ילדים מצא שבסוגי המעורבות "שירותים", "ועדים" ו"דיאלוג" הייתה מעורבות ההורים הערבים גבוהה יותר. בטיב הקשר עם הגננת לא נמצאו הבדלים, אך הורים ערבים קשרו את נכונות הגננת לשתף אותם למעמדם החברתי-כלכלי, והורים יהודים קשרו אותה לזמינותם ולידע שלהם (בנג'ו ובדיר, 2024).</w:t>
+        <w:t xml:space="preserve">מחקרים על מעורבות הורים בחברה הערבית מציגים תמונה לא אחידה. בספרות מקובל למיין את סוגי המעורבות על פני רצף לפי מידת האקטיביות של ההורים: צופים, ספקי שירות, לומדים, דיאלוג וועדים. מחקר קודם מצא שמעורבות ההורים בחינוך הערבי נמוכה מזו שבחינוך העברי, וכי הסוג הנפוץ בו הוא "צופים" (גרינבנק ובנג'ו, 2021, כפי שמצוטט אצל בנג'ו ובדיר, 2024). לעומת זאת, מחקר שנערך בתקופת הקורונה בקרב 119 הורים לילדים בגני ילדים מצא שבסוגי המעורבות "שירותים", "ועדים" ו"דיאלוג" הייתה מעורבות ההורים הערבים גבוהה יותר. בטיב הקשר עם הגננת לא נמצאו הבדלים, אך הורים ערבים קשרו את נכונות הגננת לשתף אותם למעמדם החברתי-כלכלי, והורים יהודים קשרו אותה לזמינותם ולידע שלהם. החוקרות הסבירו את מעורבות ההורים הערבים בתקופת הקורונה, בין השאר, בממצא קודם שלפיו הורים בחברה הערבית מעורבים יותר בחינוך ילדיהם בבית מאשר במסגרת החינוכית, והמליצו על סדנאות משותפות לגננות ולהורים משתי החברות שיאפשרו למידה הדדית (בנג'ו ובדיר, 2024).</w:t>
       </w:r>
     </w:p>
     <w:p>
@@ -2296,7 +2397,7 @@
           <w:szCs w:val="24"/>
           <w:rtl/>
         </w:rPr>
-        <w:t xml:space="preserve">סקר בקרב 121 הורים ערבים ו-192 הורים יהודים מצא שהורים ערבים נטו יותר לבקשת עזרה תלותית, ושבשתי הקבוצות שיתוף פעולה עם המורים נקשר לבקשת עזרה אוטונומית, שמטרתה לפתח את יכולת ההורה להתמודד בעצמו. החוקרות המליצו על התערבות מותאמת תרבות (Grinshtain &amp; Harpaz, 2023). בחינוך הבדואי בנגב נמצא קשר שלילי מובהק בין מעורבות ההורים בבית הספר ובין הנטייה לנשירה (R=-0.48), ללא קשר למצב החברתי-כלכלי של המשפחה (אבו עג'אג', 2016). בחיפוש הספרות לא נמצא מחקר שבחן ישירות כיצד מורים בבתי ספר ערביים בלוד עובדים מול ההורים. זהו הפער שהמחקר הנוכחי מבקש לבחון.</w:t>
+        <w:t xml:space="preserve">סקר בקרב 121 הורים ערבים ו-192 הורים יהודים מצא שהורים ערבים נטו יותר לבקשת עזרה תלותית, ושבשתי הקבוצות שיתוף פעולה עם המורים נקשר לבקשת עזרה אוטונומית, שמטרתה לפתח את יכולת ההורה להתמודד בעצמו, בניגוד לבקשת עזרה תלותית, שבה ההורה מבקש שאחר יפתור את הבעיה. החוקרות המליצו על התערבות מותאמת תרבות, ובה הנחיה להורים כיצד לבקש מן המורים עזרה אוטונומית (Grinshtain &amp; Harpaz, 2023). בחינוך הבדואי בנגב נמצא קשר שלילי מובהק בין מעורבות ההורים בבית הספר ובין הנטייה לנשירה (R=-0.48). בניגוד להשערת החוקר, לא נמצא קשר בין הנשירה ובין המצב החברתי-כלכלי של המשפחה או השכלת ההורים, כך שמעורבות ההורים נמצאה גורם בפני עצמו (אבו עג'אג', 2016). בחיפוש הספרות לא נמצא מחקר שבחן ישירות כיצד מורים בבתי ספר ערביים בלוד עובדים מול ההורים. זהו הפער שהמחקר הנוכחי מבקש לבחון.</w:t>
       </w:r>
     </w:p>
     <w:p>
@@ -5299,7 +5400,7 @@
                 <w:szCs w:val="20"/>
                 <w:rtl/>
               </w:rPr>
-              <w:t xml:space="preserve">מה נחשב תמיכה; סגנונות ניהול; היעדר נוהל, זמן והכשרה</w:t>
+              <w:t xml:space="preserve">מה נחשב תמיכה; סגנונות ניהול; היעדר נוהל, זמן והכשרה; המחיר הרגשי; הצעות המורות</w:t>
             </w:r>
           </w:p>
         </w:tc>
@@ -5504,7 +5605,7 @@
           <w:szCs w:val="24"/>
           <w:rtl/>
         </w:rPr>
-        <w:t xml:space="preserve">פאטמה סיפרה על אמא, שהייתה תלמידה שלה, שבאה לביתה בערב וביקשה לשנות ציון "בשביל הכבוד". מאז קבעה לעצמה כלל: "מורה מהשכונה צריכה גבולות ברורים, ושהגבול הראשון הוא הבית." ריהאם הואשמה בקבוצת הוואטסאפ של הכיתה שהיא "מעדיפה את הקרובים שלה". המורות שאינן מלוד חוו את הצד השני. נסרין סיפרה על אב שהאשים אותה שהיא "זרה" שבאה מרמלה, ואמאני שמעה מאב כי "בכפר שלי אולי ככה מתנהגים, אבל בלוד לא". שתיהן תיארו את הזרות גם כיתרון. נסרין אמרה: "אני לא מעורבת בסכסוכים בין המשפחות, ואני לא "של" אף אחד, ואחרי שהאמון נבנה, זה יתרון." אמאני סיפרה ש"הורים מספרים לי דברים שלא יספרו למורה מהשכונה שלהם".</w:t>
+        <w:t xml:space="preserve">פאטמה סיפרה על אמא, שהייתה תלמידה שלה, שבאה לביתה בערב וביקשה לשנות ציון "בשביל הכבוד". מאז קבעה לעצמה כלל: "מורה מהשכונה צריכה גבולות ברורים, ושהגבול הראשון הוא הבית." ריהאם הואשמה בקבוצת הוואטסאפ של הכיתה שהיא "מעדיפה את הקרובים שלה". המורות שאינן מלוד חוו את הצד השני. נסרין סיפרה על אב שהאשים אותה שהיא "זרה" שבאה מרמלה, ולמדה מכך ש"האשמה "את זרה" היא לא על המוצא שלי, היא על הפחד שלו שבית הספר נגד הילד שלו", ואמאני שמעה מאב כי "בכפר שלי אולי ככה מתנהגים, אבל בלוד לא". שתיהן תיארו את הזרות גם כיתרון. נסרין אמרה: "אני לא מעורבת בסכסוכים בין המשפחות, ואני לא "של" אף אחד, ואחרי שהאמון נבנה, זה יתרון." אמאני סיפרה ש"הורים מספרים לי דברים שלא יספרו למורה מהשכונה שלהם".</w:t>
       </w:r>
     </w:p>
     <w:p>
@@ -5587,7 +5688,7 @@
           <w:szCs w:val="24"/>
           <w:rtl/>
         </w:rPr>
-        <w:t xml:space="preserve">לסיכום: מתמה זו עולה כי המורות רואות בקשר עם ההורים חלק מרכזי מעבודתן ובבית הספר מוסד קהילתי שההורים סומכים עליו, וכי הקשר מושפע הן משייכותן לקהילה והן מן ההקשר העירוני של לוד.</w:t>
+        <w:t xml:space="preserve">לסיכום: מתמה זו עולה כי המורות רואות בקשר עם ההורים חלק מרכזי מעבודתן, ובבית הספר מוסד קהילתי שההורים סומכים עליו יותר מאשר על מוסדות אחרים בעיר. מורות מהקהילה נהנות מהיכרות עם המשפחות אך מתמודדות עם טשטוש גבולות, ומורות מבחוץ מתמודדות עם האשמות ב"זרות" אך מוצאות בה גם יתרון. ההקשר של לוד, ובו אלימות, פחד ותקשורת מוסדית בעברית, נוכח בכל היבט של הקשר.</w:t>
       </w:r>
     </w:p>
     <w:p>
@@ -5873,7 +5974,7 @@
           <w:szCs w:val="24"/>
           <w:rtl/>
         </w:rPr>
-        <w:t xml:space="preserve">לסיכום: מתמה זו עולה כי מידע עובר בערוצים דיגיטליים ויחסים נבנים פנים אל פנים, וכי לתקשורת הדיגיטלית שלושה מחירים: זמינות מתמדת, זירת סכסוך והדרה.</w:t>
+        <w:t xml:space="preserve">לסיכום: מתמה זו עולה כי הוואטסאפ משמש להעברת מידע, ומשו"ב כמעט אינו בשימוש בקרב ההורים. המורות מבחינות בין מידע, שעובר בערוצים דיגיטליים, ובין יחסים, שנבנים פנים אל פנים. הן מתארות שלושה מחירים של התקשורת הדיגיטלית, זמינות מתמדת, זירת סכסוך והדרה, ונשענות על ערוצים בלתי פורמליים כמו השער, הגדר, הבית ובוקר הקפה.</w:t>
       </w:r>
     </w:p>
     <w:p>
@@ -6042,7 +6143,40 @@
           <w:szCs w:val="24"/>
           <w:rtl/>
         </w:rPr>
-        <w:t xml:space="preserve">מהא תיארה אותם כ"לא הורים אדישים", אלא "הורים שקועים" בעבודה, בעוני, בבעיות משפטיות ובבריאות. סמר סיפרה על אם שהוזמנה לשיחה על אבחון בנה, ואמרה לה: "אני יודעת שהוא לא קורא. אני לא קוראת. אני לא יכולה לעזור לו." מאז שינתה סמר את ציפיותיה: "מאמא שלא יודעת לקרוא אני לא מצפה שתבדוק שיעורי בית, אני מבקשת שתשב ליד הילד כשהוא עושה אותם." אמאני הוסיפה שבחטיבת הביניים חלק מההורים ויתרו, ולדבריה הם ויתרו "אחרי שבית הספר ויתר על הילדים הגדולים שלהם".</w:t>
+        <w:t xml:space="preserve">מהא תיארה אותם כ"לא הורים אדישים", אלא "הורים שקועים" בעבודה, בעוני, בבעיות משפטיות ובבריאות. סמר סיפרה על אם שהוזמנה לשיחה על אבחון בנה:</w:t>
+      </w:r>
+    </w:p>
+    <w:p>
+      <w:pPr>
+        <w:bidi/>
+        <w:spacing w:after="120" w:before="0" w:line="360" w:lineRule="auto"/>
+        <w:ind w:left="567" w:right="567"/>
+        <w:jc w:val="both"/>
+      </w:pPr>
+      <w:r>
+        <w:rPr>
+          <w:rFonts w:ascii="Times New Roman" w:cs="David" w:hAnsi="Times New Roman"/>
+          <w:sz w:val="24"/>
+          <w:szCs w:val="24"/>
+          <w:rtl/>
+        </w:rPr>
+        <w:t xml:space="preserve">היא באה, ישבה, ולפני שאמרתי מילה, היא אמרה: "אני יודעת שהוא לא קורא. אני לא קוראת. אני לא יכולה לעזור לו." ואז היא בכתה. ואני, שהכנתי נאום על אבחון, הבנתי שהנאום לא רלוונטי.</w:t>
+      </w:r>
+    </w:p>
+    <w:p>
+      <w:pPr>
+        <w:bidi/>
+        <w:spacing w:after="60" w:before="0" w:line="360" w:lineRule="auto"/>
+        <w:jc w:val="both"/>
+      </w:pPr>
+      <w:r>
+        <w:rPr>
+          <w:rFonts w:ascii="Times New Roman" w:cs="David" w:hAnsi="Times New Roman"/>
+          <w:sz w:val="24"/>
+          <w:szCs w:val="24"/>
+          <w:rtl/>
+        </w:rPr>
+        <w:t xml:space="preserve">מאז שינתה סמר את ציפיותיה: "מאמא שלא יודעת לקרוא אני לא מצפה שתבדוק שיעורי בית, אני מבקשת שתשב ליד הילד כשהוא עושה אותם." גם מהא תיארה שינוי דומה. אחרי ביקור בית אצל אב שגידל לבד חמישה ילדים, ושבנו נשאר בבית לשמור על הקטנים, אמרה: "אחרי השיחה הרגשתי בושה על הכעס. למדתי שלפני שאני שופטת הורה, אני צריכה לראות את הבית." אמאני הוסיפה שבחטיבת הביניים חלק מההורים ויתרו, ולדבריה הם ויתרו "אחרי שבית הספר ויתר על הילדים הגדולים שלהם". היא הזמינה אם שבעלה בכלא לשבת פעם בשבוע בחדר המורים, והסיקה "שלפעמים נוכחות של אמא בבית הספר, בלי שום תפקיד, היא התערבות חינוכית".</w:t>
       </w:r>
     </w:p>
     <w:p>
@@ -6092,7 +6226,7 @@
           <w:szCs w:val="24"/>
           <w:rtl/>
         </w:rPr>
-        <w:t xml:space="preserve">לסיכום: מתמה זו עולה כי המורות יוזמות את רוב הקשר, פונות קודם כול בחיובי, ומגדירות מחדש את המעורבות של ההורים לפי מה שהם יכולים לתת.</w:t>
+        <w:t xml:space="preserve">לסיכום: מתמה זו עולה כי המורות יוזמות את רוב הקשר, ומשתדלות שהפנייה הראשונה להורה תהיה חיובית ותהיה הזמנה ולא זימון. הן מגדירות מחדש את המעורבות של ההורים, ושינו את ציפיותיהן אחרי מפגשים אישיים עם הורים במצוקה. הן מגיעות להורים בדרכים אישיות, דרך הילד, הסבתא, השער והורים אחרים, ולא דרך מערכות.</w:t>
       </w:r>
     </w:p>
     <w:p>
@@ -6228,7 +6362,7 @@
           <w:szCs w:val="24"/>
           <w:rtl/>
         </w:rPr>
-        <w:t xml:space="preserve">בפרויקט הקריאה של סמר הגיעו 26 מתוך 32 משפחות לספר סיפור בכיתה, ונאמר להן שמי שאינו יודע לקרוא יכול לספר בעל פה. בפרויקט "סבתא מספרת" של פאטמה הגיעו 14 סבתות לספר על לוד של פעם. ב"שוק הקהילה" שארגנה נסרין הפעילו יותר ממאה הורים דוכנים של מה שהם יודעים לעשות. רנא הקימה קבוצת כדורסל לבנות, ולדבריה "לאימונים יש "ספסל אמהות" קבוע, שהפך למקום שבו אני עושה את רוב העבודה שלי כמחנכת".</w:t>
+        <w:t xml:space="preserve">בפרויקט הקריאה של סמר הגיעו 26 מתוך 32 משפחות לספר סיפור בכיתה, ונאמר להן שמי שאינו יודע לקרוא יכול לספר בעל פה. בפרויקט "סבתא מספרת" של פאטמה הגיעו 14 סבתות לספר על לוד של פעם. ב"שוק הקהילה" שארגנה נסרין הפעילו יותר ממאה הורים דוכנים של מה שהם יודעים לעשות, ולדבריה "ההורים שהכירו זה את זה בשוק התחילו לעזור זה לזה". פאטמה הסבירה את הצלחת "סבתא מספרת" בכך "שהילדים ראו את המשפחה שלהם בתוך בית הספר כמקור של ידע, לא כמקור של בעיות". רנא הקימה קבוצת כדורסל לבנות, ולדבריה "לאימונים יש "ספסל אמהות" קבוע, שהפך למקום שבו אני עושה את רוב העבודה שלי כמחנכת".</w:t>
       </w:r>
     </w:p>
     <w:p>
@@ -6311,7 +6445,7 @@
           <w:szCs w:val="24"/>
           <w:rtl/>
         </w:rPr>
-        <w:t xml:space="preserve">לסיכום: מתמה זו עולה כי ברמת בית הספר ההורים שותפים בעיקר בעזרה, אך ביוזמות של המורות הם הוזמנו כנותני ידע והציעו פתרונות לבעיות.</w:t>
+        <w:t xml:space="preserve">לסיכום: מתמה זו עולה כי ברמת בית הספר ההורים שותפים בעיקר בעזרה, ובהחלטות כמעט אינם שותפים. ביוזמות של המורות הוזמנו ההורים כנותני ידע, ורובם הגיעו, וגופי הורים שהוקמו בידי מורות הציעו פתרונות לבעיות כמו היעדרויות ושימוש בטלפונים. המורות זיהו תנאים דומים להצלחה: ההורים הוזמנו כמי שיש להם מה לתת, הפתרון בא מהם, והמקום היה שלהם.</w:t>
       </w:r>
     </w:p>
     <w:p>
@@ -6481,7 +6615,24 @@
           <w:szCs w:val="24"/>
           <w:rtl/>
         </w:rPr>
-        <w:t xml:space="preserve">במחלוקות הגיעו הורים לבית הספר מלווים בדודים או באחים ונקטו לשון מאיימת. המורות פירשו זאת כביטוי של פחד. מהא אמרה ש"הורה שמגיע עם דודים לא מגיע לריב, הוא מגיע מפוחד, והדודים הם הפחד שלו", ורנא הוסיפה ש"אמהות באות עם אחים כי הן לא מאמינות שמישהו יקשיב להן לבד". סמר למדה ש"הורה שצועק הוא בדרך כלל הורה שנבהל", ואמאני תיארה את ההאשמה "את לא מכאן" כ"נשק שההורים משתמשים בו כשהם מרגישים חלשים". מכאן למדו המורות כלל משותף: לא לענות בשער או בקבוצה, לתת למשבר לעבור, ולפגוש את ההורה ביוזמתן אחרי כמה ימים, אחד על אחד. ריהאם אמרה: "לא עונים בווטסאפ על דברים של כבוד, רק בפנים." נסרין הוסיפה ש"פער תרבותי לא פותרים בשכנוע, פותרים בשאלה".</w:t>
+        <w:t xml:space="preserve">במחלוקות הגיעו הורים לבית הספר מלווים בדודים או באחים ונקטו לשון מאיימת. המורות פירשו זאת כביטוי של פחד. מהא אמרה ש"הורה שמגיע עם דודים לא מגיע לריב, הוא מגיע מפוחד, והדודים הם הפחד שלו", ורנא הוסיפה ש"אמהות באות עם אחים כי הן לא מאמינות שמישהו יקשיב להן לבד". סמר למדה ש"הורה שצועק הוא בדרך כלל הורה שנבהל", ואמאני תיארה את ההאשמה "את לא מכאן" כ"נשק שההורים משתמשים בו כשהם מרגישים חלשים". מכאן למדו המורות כלל משותף: לא לענות בשער או בקבוצה, לתת למשבר לעבור, ולפגוש את ההורה ביוזמתן אחרי כמה ימים, אחד על אחד. ריהאם אמרה: "לא עונים בווטסאפ על דברים של כבוד, רק בפנים." נסרין הוסיפה ש"פער תרבותי לא פותרים בשכנוע, פותרים בשאלה", ורנא אמרה: "למדתי שרוב הפערים התרבותיים הם פערים של פרט קטן, ואם שואלים, מוצאים את הפרט." פאטמה תיארה אב שביקש להעביר את בתו המצטיינת למסגרת שבה תלמד פחות. במקום להתווכח, הראתה לו את החיבורים של בתו, והסיקה: "אחרי השיחה הבנתי שלא נלחמים עם הורה, מראים לו את הילד שלו." סוהא תיארה מחלוקת קשה במיוחד, עם אב שהאשים אותה בבגידה אחרי דיווח לרווחה על אלימות בבית. היא ליוותה את המשפחה לרווחה בעצמה, ולמדה:</w:t>
+      </w:r>
+    </w:p>
+    <w:p>
+      <w:pPr>
+        <w:bidi/>
+        <w:spacing w:after="120" w:before="0" w:line="360" w:lineRule="auto"/>
+        <w:ind w:left="567" w:right="567"/>
+        <w:jc w:val="both"/>
+      </w:pPr>
+      <w:r>
+        <w:rPr>
+          <w:rFonts w:ascii="Times New Roman" w:cs="David" w:hAnsi="Times New Roman"/>
+          <w:sz w:val="24"/>
+          <w:szCs w:val="24"/>
+          <w:rtl/>
+        </w:rPr>
+        <w:t xml:space="preserve">שהתפקיד שלי כמורה מהקהילה הוא לא לבחור בין החוק לקהילה, אלא לעמוד ביניהם ולתרגם, לשני הכיוונים. ושהורים בלוד מפחדים מהרווחה יותר מהמשטרה, ושבית הספר צריך להיות הגשר, לא השער.</w:t>
       </w:r>
     </w:p>
     <w:p>
@@ -6497,7 +6648,7 @@
           <w:szCs w:val="24"/>
           <w:rtl/>
         </w:rPr>
-        <w:t xml:space="preserve">לסיכום: מתמה זו עולה כי המורות פועלות בתוך מבנה של משפחה מורחבת וכבוד, שמגביל אותן כנשים מול חלק מהאבות אך פותח בפניהן את הבתים.</w:t>
+        <w:t xml:space="preserve">לסיכום: מתמה זו עולה כי המורות פועלות בתוך מבנה קהילתי של משפחה מורחבת וכבוד, שבו לסבתות מקום מרכזי. מבנה זה מגביל את המורות כנשים מול חלק מהאבות, אך גם פותח בפניהן דלתות אל האמהות ואל הבתים. את המחלוקות עם הורים הן מפרשות כביטוי של פחד, ומתמודדות איתן בהשהיה, בפגישה אישית, בשאלה במקום בשכנוע, ובהצגת הילד עצמו.</w:t>
       </w:r>
     </w:p>
     <w:p>
@@ -6532,7 +6683,7 @@
           <w:szCs w:val="24"/>
           <w:rtl/>
         </w:rPr>
-        <w:t xml:space="preserve">תמה זו עוסקת בתנאים שבית הספר יוצר לעבודה עם ההורים. בתמה שלושה חלקים: מה נחשב תמיכה של ההנהלה, סגנונות הניהול, והיעדר מבנה והכשרה.</w:t>
+        <w:t xml:space="preserve">תמה זו עוסקת בתנאים שבית הספר יוצר לעבודה עם ההורים. בתמה חמישה חלקים: מה נחשב תמיכה של ההנהלה, סגנונות הניהול, היעדר מבנה והכשרה, המחיר הרגשי של העבודה מול ההורים, וההצעות של המורות.</w:t>
       </w:r>
     </w:p>
     <w:p>
@@ -6690,6 +6841,24 @@
     <w:p>
       <w:pPr>
         <w:bidi/>
+        <w:spacing w:after="120" w:before="0" w:line="360" w:lineRule="auto"/>
+        <w:jc w:val="left"/>
+      </w:pPr>
+      <w:r>
+        <w:rPr>
+          <w:rFonts w:ascii="Times New Roman" w:cs="David" w:hAnsi="Times New Roman"/>
+          <w:b/>
+          <w:bCs/>
+          <w:sz w:val="24"/>
+          <w:szCs w:val="24"/>
+          <w:rtl/>
+        </w:rPr>
+        <w:t xml:space="preserve">ד. המחיר הרגשי</w:t>
+      </w:r>
+    </w:p>
+    <w:p>
+      <w:pPr>
+        <w:bidi/>
         <w:spacing w:after="60" w:before="0" w:line="360" w:lineRule="auto"/>
         <w:jc w:val="both"/>
       </w:pPr>
@@ -6700,7 +6869,74 @@
           <w:szCs w:val="24"/>
           <w:rtl/>
         </w:rPr>
-        <w:t xml:space="preserve">לסיכום: מתמה זו עולה כי התמיכה של ההנהלה משפיעה מאוד על הקשר עם ההורים, אך בכל בתי הספר חסרים נוהל, זמן מוקצה והכשרה מותאמת.</w:t>
+        <w:t xml:space="preserve">לצד הקשיים המבניים תיארו המורות מחיר רגשי. נסרין אמרה: "הכי קשה לי זה שאני לא יכולה להציל." ריהאם תיארה את הקושי "לראות הורים שאוהבים את הילד שלהם ולא יכולים לעזור לו, כי אין להם, לא כסף, לא זמן, לא שפה". אמאני סיפרה: "ואני חוזרת הביתה אחרי שיחה עם אמא שאיבדה את הבן שלה לרחוב, ואני מסתכלת על הבן שלי." סוהא אמרה: "ואחרי עשרים ושתיים שנים, אני עייפה, ואני אומרת את זה בכנות למחקר." מהא סיכמה את התפקיד כך:</w:t>
+      </w:r>
+    </w:p>
+    <w:p>
+      <w:pPr>
+        <w:bidi/>
+        <w:spacing w:after="120" w:before="0" w:line="360" w:lineRule="auto"/>
+        <w:ind w:left="567" w:right="567"/>
+        <w:jc w:val="both"/>
+      </w:pPr>
+      <w:r>
+        <w:rPr>
+          <w:rFonts w:ascii="Times New Roman" w:cs="David" w:hAnsi="Times New Roman"/>
+          <w:sz w:val="24"/>
+          <w:szCs w:val="24"/>
+          <w:rtl/>
+        </w:rPr>
+        <w:t xml:space="preserve">אנחנו בלוד עושות עבודה של מורה, יועצת, עובדת סוציאלית ומגשרת, במשכורת של מורה ובהכשרה של מורה. אם רוצים שותפות עם ההורים, צריך קודם להחליט שמי שבונה אותה היא לא לבד.</w:t>
+      </w:r>
+    </w:p>
+    <w:p>
+      <w:pPr>
+        <w:bidi/>
+        <w:spacing w:after="120" w:before="0" w:line="360" w:lineRule="auto"/>
+        <w:jc w:val="left"/>
+      </w:pPr>
+      <w:r>
+        <w:rPr>
+          <w:rFonts w:ascii="Times New Roman" w:cs="David" w:hAnsi="Times New Roman"/>
+          <w:b/>
+          <w:bCs/>
+          <w:sz w:val="24"/>
+          <w:szCs w:val="24"/>
+          <w:rtl/>
+        </w:rPr>
+        <w:t xml:space="preserve">ה. הצעות המורות</w:t>
+      </w:r>
+    </w:p>
+    <w:p>
+      <w:pPr>
+        <w:bidi/>
+        <w:spacing w:after="60" w:before="0" w:line="360" w:lineRule="auto"/>
+        <w:jc w:val="both"/>
+      </w:pPr>
+      <w:r>
+        <w:rPr>
+          <w:rFonts w:ascii="Times New Roman" w:cs="David" w:hAnsi="Times New Roman"/>
+          <w:sz w:val="24"/>
+          <w:szCs w:val="24"/>
+          <w:rtl/>
+        </w:rPr>
+        <w:t xml:space="preserve">כשנשאלו מה ניתן לעשות כדי לחזק את השותפות, הציעו המורות צעדים בשלוש רמות. ברמת המורה הציעו כולן לפנות להורים לפני שיש בעיה ולהתחיל בחיובי. ברמת בית הספר הציעה נסרין "תפקיד של רכזת הורים וקהילה בכל בית ספר, עם שעות מתקן ולא מהנדבה של המנהלת", סמר ביקשה "שמורות צעירות יקבלו ליווי", ואמאני הציעה תוכניות מעבר בין שלבי החינוך "שבהן ההורים שותפים, כי שם הילדים נופלים". ברמת העירייה ביקשו כמעט כולן הודעות בערבית. מהא ביקשה "עובדת סוציאלית בבית הספר במשרה מלאה, כי היום היא יום בשבוע", רנא אמרה ש"מגרש מואר בשכונה היה עושה לקשר בין בית הספר, הילדים וההורים יותר מכל תוכנית", וסוהא ביקשה "שיתוף של ראשי המשפחות, ושל הנשים שמנהלות אותן בפועל, בהחלטות של העירייה על השכונות שלהם". רוב המורות הוסיפו שבלי ביטחון ברחוב, כל ההצעות האחרות לא יספיקו.</w:t>
+      </w:r>
+    </w:p>
+    <w:p>
+      <w:pPr>
+        <w:bidi/>
+        <w:spacing w:after="60" w:before="0" w:line="360" w:lineRule="auto"/>
+        <w:jc w:val="both"/>
+      </w:pPr>
+      <w:r>
+        <w:rPr>
+          <w:rFonts w:ascii="Times New Roman" w:cs="David" w:hAnsi="Times New Roman"/>
+          <w:sz w:val="24"/>
+          <w:szCs w:val="24"/>
+          <w:rtl/>
+        </w:rPr>
+        <w:t xml:space="preserve">לסיכום: מתמה זו עולה כי המורות רואות תמיכה בגיבוי, בזמן ובמנהל שמחזיר אליהן את ההורה. סגנונות הניהול נעים בין מנהלת שבנתה תפקיד ותוכנית ובין מנהלים שמנהלים את הקשר כעניין של משבר או משמעת. בכל בתי הספר חסרים נוהל, זמן מוקצה והכשרה מותאמת, והליווי מתקיים בחדר המורים. העבודה מול ההורים גובה מהמורות מחיר רגשי, והן מציעות צעדים ברמת המורה, בית הספר והעירייה.</w:t>
       </w:r>
     </w:p>
     <w:p>
@@ -6771,7 +7007,7 @@
           <w:szCs w:val="24"/>
           <w:rtl/>
         </w:rPr>
-        <w:t xml:space="preserve">ממחקר זה עלה תחילה כי המורות רואות בבית הספר את המוסד היחיד בעיר שההורים סומכים עליו. בהתייחס לכך, בספרות נטען כי קהילתיות גבוהה מעידה על אמון במוסדות הקהילה ובדמויות המייצגות אותה, ובהם בית הספר והמורים (שדמי-וורטמן, 2017, כפי שמצוטט אצל Fisher &amp; Refael Fanyo, 2022). מחקר שנערך בשכונה עירונית מצא כי תושבים רבים חווים היעדר של קהילה ומבקשים לשחזר אותה, וכי הם מצפים מן הממסד לחזק את האמון בין הקבוצות בשכונה (וול-טיסר ובליט-כהן, 2023). בלוד, לפי דברי המורות, בית הספר הוא המקום שבו האמון הזה עדיין קיים. הדבר מתיישב עם תיאור החינוך החברתי-קהילתי כ"עוגן" בעת משבר (גולדרט, 2024), ומרחיב אותו: בלוד המשבר אינו אירוע חולף אלא מצב מתמשך של ירי ופחד. הפערים בתקצוב בין החינוך הערבי לעברי בעיר (אבגר ואחרים, 2021) עשויים להסביר מדוע המורות חשות שהן נושאות אחריות שחורגת מתפקידן.</w:t>
+        <w:t xml:space="preserve">ממחקר זה עלה תחילה כי המורות רואות בבית הספר את המוסד היחיד בעיר שההורים סומכים עליו. בהתייחס לכך, בספרות נטען כי קהילתיות גבוהה מעידה על אמון במוסדות הקהילה ובדמויות המייצגות אותה, ובהם בית הספר והמורים (שדמי-וורטמן, 2017, כפי שמצוטט אצל Fisher &amp; Refael Fanyo, 2022). מחקר שנערך בשכונה עירונית מצא כי תושבים רבים חווים היעדר של קהילה ומבקשים לשחזר אותה, וכי הם מצפים מן הממסד לחזק את האמון בין הקבוצות בשכונה (וול-טיסר ובליט-כהן, 2023). בלוד, לפי דברי המורות, בית הספר הוא המקום שבו האמון הזה עדיין קיים. הדבר מתיישב עם תיאור החינוך החברתי-קהילתי כ"עוגן" בעת משבר (גולדרט, 2024), ומרחיב אותו: בלוד המשבר אינו אירוע חולף אלא מצב מתמשך של ירי ופחד. במחקר העירוני נמצא גם שחלק מהתושבים חווים תחושה של זרות ואיום בשכונה (וול-טיסר ובליט-כהן, 2023), וגם המורות בלוד תיארו פחד מהרחוב ומהשכנים, במיוחד אחרי מאי 2021. הפערים בתקצוב בין החינוך הערבי לעברי בעיר (אבגר ואחרים, 2021) ותהליכי הג'נטריפיקציה הלאומית בערים המעורבות (שמריהו-ישורון, 2021) עשויים להסביר מדוע המורות חשות שהן נושאות אחריות שחורגת מתפקידן.</w:t>
       </w:r>
     </w:p>
     <w:p>
@@ -6787,7 +7023,7 @@
           <w:szCs w:val="24"/>
           <w:rtl/>
         </w:rPr>
-        <w:t xml:space="preserve">בהתייחס להבדל בין מורות מהקהילה למורות מבחוץ, בדומה למחקר זה, גם בספרות נמצא שמגורים באותו יישוב שבו גרים המורים מובילים לשיחות בלתי פורמליות "על המדרכה", לאמון רב יותר ולמעורבות פורמלית נמוכה יותר (Fisher &amp; Refael Fanyo, 2022). המורות מהקהילה תיארו שיחות דומות, בשער ובסופר, אך הוסיפו את מחירה של הקרבה: טשטוש גבולות ומחלוקות שבהן הכבוד המשפחתי מעורב. המורות מבחוץ חוו את מה שתואר אצל מורים "חוצי גבולות", שחווים שונות בשל נורמות תרבותיות שונות, אך גם רואים את עצמם כנציגי הקהילה שממנה באו (ארליך-רון וגינדי, 2020). המסקנה הראשונה היא שבעיר מעורבת, שבה האמון במוסדות נמוך, המורה בבית הספר הערבי ממלאת תפקיד של גשר בין הקהילה למערכת, ותפקיד זה כרוך במחיר אישי, בין שהיא בת הקהילה ובין שאינה.</w:t>
+        <w:t xml:space="preserve">בהתייחס להבדל בין מורות מהקהילה למורות מבחוץ, בדומה למחקר זה, גם בספרות נמצא שמגורים באותו יישוב שבו גרים המורים מובילים לשיחות בלתי פורמליות "על המדרכה", לאמון רב יותר ולמעורבות פורמלית נמוכה יותר (Fisher &amp; Refael Fanyo, 2022). המורות מהקהילה תיארו שיחות דומות, בשער ובסופר, אך הוסיפו את מחירה של הקרבה: טשטוש גבולות ומחלוקות שבהן הכבוד המשפחתי מעורב. המורות מבחוץ חוו את מה שתואר אצל מורים "חוצי גבולות", שחווים שונות בשל נורמות תרבותיות שונות, אך גם רואים את עצמם כנציגי הקהילה שממנה באו (ארליך-רון וגינדי, 2020). במחקר הנוכחי נמצא שהזרות יכולה להפוך ליתרון, משום שמורה שאינה שייכת לאף משפחה אינה צד בסכסוכים, ושהתשובה של המורות להאשמה ב"זרות" לא הייתה להוכיח שייכות, אלא להראות שהן לצד הילד. המסקנה הראשונה היא שבעיר מעורבת, שבה האמון במוסדות נמוך, המורה בבית הספר הערבי ממלאת תפקיד של גשר בין הקהילה למערכת, ותפקיד זה כרוך במחיר אישי, בין שהיא בת הקהילה ובין שאינה.</w:t>
       </w:r>
     </w:p>
     <w:p>
@@ -6843,6 +7079,22 @@
     </w:p>
     <w:p>
       <w:pPr>
+        <w:bidi/>
+        <w:spacing w:after="60" w:before="0" w:line="360" w:lineRule="auto"/>
+        <w:jc w:val="both"/>
+      </w:pPr>
+      <w:r>
+        <w:rPr>
+          <w:rFonts w:ascii="Times New Roman" w:cs="David" w:hAnsi="Times New Roman"/>
+          <w:sz w:val="24"/>
+          <w:szCs w:val="24"/>
+          <w:rtl/>
+        </w:rPr>
+        <w:t xml:space="preserve">בהתייחס להמלצות, בספרות הומלץ על פיתוח מקצועי ממוקד לצוותים ועל פלטפורמות פשוטות ומאובטחות לתקשורת דו-כיוונית (Urbina et al., 2025), ועל קביעת כללים לשימוש בוואטסאפ ברמת בית הספר וברמת הקבוצה (טרגר-סודרי ואחרים, 2025). המורות במחקר הנוכחי קבעו כללים כאלה בעצמן, כמו "כל דבר שיש בו רגש, לא בווטסאפ", אך כל אחת לבדה. ממצא זה מחזק את הצורך במדיניות בית ספרית, שתגדיר מה עובר בכל ערוץ ותגן גם על המורות מפני זמינות מתמדת. היא צריכה לכלול גם ערוצים לא דיגיטליים, כמו שיחת טלפון או מחברת קשר, עבור משפחות שאינן קוראות או אינן בקבוצה.</w:t>
+      </w:r>
+    </w:p>
+    <w:p>
+      <w:pPr>
         <w:pStyle w:val="Heading2"/>
         <w:bidi/>
         <w:spacing w:after="120" w:before="240" w:line="360" w:lineRule="auto"/>
@@ -6889,7 +7141,7 @@
           <w:szCs w:val="24"/>
           <w:rtl/>
         </w:rPr>
-        <w:t xml:space="preserve">בהתייחס להגדרה המחודשת של "הורה מעורב", בדומה למחקר זה, גם בספרות נמצא שלציפיות ההורים השפעה גדולה יותר על הישגי הילדים מאשר לפיקוח ולשליטה (Erdem &amp; Kaya, 2020). אמא שאינה קוראת אך "יושבת ליד הילד" היא דוגמה למעורבות כזאת. מחקר על החינוך הבדואי מצא שמעורבות ההורים בבית הספר קשורה לנשירה (אבו עג'אג', 2016). המסקנה השלישית היא שהמעורבות הנמוכה המיוחסת להורים ערבים נובעת במידה רבה מהדרך שבה בית הספר פונה אליהם. כשהפנייה הראשונה חיובית, וכשמבקשים מההורים את מה שהם יכולים לתת, הם עונים.</w:t>
+        <w:t xml:space="preserve">בהתייחס להגדרה המחודשת של "הורה מעורב", בדומה למחקר זה, גם בספרות נמצא שלציפיות ההורים השפעה גדולה יותר על הישגי הילדים מאשר לפיקוח ולשליטה (Erdem &amp; Kaya, 2020). אמא שאינה קוראת אך "יושבת ליד הילד" היא דוגמה למעורבות כזאת. מחקר על החינוך הבדואי מצא שמעורבות ההורים בבית הספר קשורה לנשירה (אבו עג'אג', 2016). בהתייחס לשינוי שחל בציפיות של המורות אחרי מפגשים אישיים עם הורים, בספרות נמצא שהיכולת לאמץ את נקודת המבט של ההורה אפשר ללמוד, למשל באמצעות סימולציות של שיחות קשות (מלץ ואחרים, 2026). המורות במחקר הנוכחי למדו זאת מהניסיון, בביקורי בית ובשיחות שבהן הורים סיפרו על מצוקתם. מכאן שהכשרה מכוונת יכולה לקצר את הדרך הזאת, במיוחד עבור מורות צעירות. המסקנה השלישית היא שהמעורבות הנמוכה המיוחסת להורים ערבים נובעת במידה רבה מהדרך שבה בית הספר פונה אליהם. כשהפנייה הראשונה חיובית, וכשמבקשים מההורים את מה שהם יכולים לתת, הם עונים.</w:t>
       </w:r>
     </w:p>
     <w:p>
@@ -6924,7 +7176,7 @@
           <w:szCs w:val="24"/>
           <w:rtl/>
         </w:rPr>
-        <w:t xml:space="preserve">ממחקר זה עלה כי ברמת בית הספר ההורים שותפים בעיקר בעזרה, אך ביוזמות של המורות הם הוזמנו כנותני ידע ורובם הגיעו. בהתייחס למעורבות הורים בחברה הערבית, מחקר קודם תיאר מעורבות נמוכה מסוג "צופים" (גרינבנק ובנג'ו, 2021, כפי שמצוטט אצל בנג'ו ובדיר, 2024). לעומת זאת, מחקר מאוחר יותר מצא שמעורבות ההורים הערבים בגן הייתה גבוהה יותר בסוגי המעורבות "שירותים", "ועדים" ו"דיאלוג" (בנג'ו ובדיר, 2024). הממצאים כאן מתיישבים עם המחקר המאוחר: כשההורים הוזמנו כמומחים, כמספרי סיפורים או כמפעילי דוכנים, הגיעו 28 מתוך 33 אבות ו-26 מתוך 32 משפחות. בהתייחס לגופי ההורים שהקימו המורות, בדומה למחקר זה, גם בספרות נמצא ששיתוף פעולה עם מורים נקשר לבקשת עזרה אוטונומית, כלומר לנכונות ההורים לפתח את יכולתם להתמודד בעצמם (Grinshtain &amp; Harpaz, 2023). "שרשרת האמהות" שהפחיתה את ההיעדרויות היא דוגמה לפתרון כזה, שבא מההורים ולא מבית הספר.</w:t>
+        <w:t xml:space="preserve">ממחקר זה עלה כי ברמת בית הספר ההורים שותפים בעיקר בעזרה, אך ביוזמות של המורות הם הוזמנו כנותני ידע ורובם הגיעו. בהתייחס למעורבות הורים בחברה הערבית, מחקר קודם תיאר מעורבות נמוכה מסוג "צופים" (גרינבנק ובנג'ו, 2021, כפי שמצוטט אצל בנג'ו ובדיר, 2024). לעומת זאת, מחקר מאוחר יותר מצא שמעורבות ההורים הערבים בגן הייתה גבוהה יותר בסוגי המעורבות "שירותים", "ועדים" ו"דיאלוג" (בנג'ו ובדיר, 2024). הממצאים כאן מתיישבים עם המחקר המאוחר: כשההורים הוזמנו כמומחים, כמספרי סיפורים או כמפעילי דוכנים, הגיעו 28 מתוך 33 אבות ו-26 מתוך 32 משפחות. בהתייחס לגופי ההורים שהקימו המורות, בדומה למחקר זה, גם בספרות נמצא ששיתוף פעולה עם מורים נקשר לבקשת עזרה אוטונומית, כלומר לנכונות ההורים לפתח את יכולתם להתמודד בעצמם (Grinshtain &amp; Harpaz, 2023). "שרשרת האמהות" שהפחיתה את ההיעדרויות היא דוגמה לפתרון כזה, שבא מההורים ולא מבית הספר. גם "שוק הקהילה", שאחריו החלו ההורים לעזור זה לזה, מתאים לגישת פיתוח הקהילה, שבה הקהילה עצמה שותפה לתהליך ולא רק מקבלת שירות (גולדרט ועמרם-אשרוב, 2023). בספרות נמצא שקהילתיות גבוהה מנבאת מעורבות הורים רבה יותר (Fisher &amp; Refael Fanyo, 2022), ולכן יוזמות שמחברות הורים זה לזה עשויות לחזק את המעורבות בבית הספר, ולא רק את הקשר עם המורה.</w:t>
       </w:r>
     </w:p>
     <w:p>
@@ -6975,7 +7227,7 @@
           <w:szCs w:val="24"/>
           <w:rtl/>
         </w:rPr>
-        <w:t xml:space="preserve">ממחקר זה עלה כי המורות לא ניסו לשנות את מבנה הקהילה אלא לעבוד דרכו: לפנות לסבתא, להיעזר בזקני המשפחה ולהושיב משפחות חלשות בשורה הראשונה. בהתייחס לכך, בספרות הומלץ על התערבות מותאמת תרבות בעבודה עם הורים ערבים (Grinshtain &amp; Harpaz, 2023), ועל סדנאות משותפות שיאפשרו למידה הדדית בין צוותים להורים מחברות שונות (בנג'ו ובדיר, 2024). גישת פיתוח הקהילה, שבה הקהילה עצמה שותפה לתהליך (גולדרט ועמרם-אשרוב, 2023), מתבטאת במועצת הקהילה שהקימה סוהא לצד ועד ההורים הנבחר.</w:t>
+        <w:t xml:space="preserve">ממחקר זה עלה כי המורות לא ניסו לשנות את מבנה הקהילה אלא לעבוד דרכו: לפנות לסבתא, להיעזר בזקני המשפחה ולהושיב משפחות חלשות בשורה הראשונה. בהתייחס לכך, בספרות הומלץ על התערבות מותאמת תרבות בעבודה עם הורים ערבים (Grinshtain &amp; Harpaz, 2023), ועל סדנאות משותפות שיאפשרו למידה הדדית בין צוותים להורים מחברות שונות (בנג'ו ובדיר, 2024). גישת פיתוח הקהילה, שבה הקהילה עצמה שותפה לתהליך (גולדרט ועמרם-אשרוב, 2023), מתבטאת במועצת הקהילה שהקימה סוהא לצד ועד ההורים הנבחר. גם הפירוש שנתנו המורות לאיומים של הורים, כביטוי של פחד ולא של תוקפנות, עשוי להתקשר לממצא שהורים ערבים נוטים יותר להימנע מבקשת עזרה (Grinshtain &amp; Harpaz, 2023): הורה שאינו מאמין שיקשיבו לו מגיע מלווה, ולא לבד. הדרך שבה התמודדו המורות עם מחלוקות, השהיה, שאלה במקום שכנוע והצגת הילד עצמו, דומה לאימוץ נקודת המבט של ההורה שתואר בספרות (מלץ ואחרים, 2026).</w:t>
       </w:r>
     </w:p>
     <w:p>
@@ -7042,7 +7294,7 @@
           <w:szCs w:val="24"/>
           <w:rtl/>
         </w:rPr>
-        <w:t xml:space="preserve">בהתייחס להכשרה, בדומה למחקר זה, גם בספרות נמצא שמורים חדשים מתמודדים עם הורים באופן אינטואיטיבי ונשענים על מורים חונכים (עזריה וצר ואחרים, 2024), ושהשותפות כרוכה במורכבות רגשית הדורשת תמיכה בצוות (כורם, 2022). הבקשות של המורות לעובדת סוציאלית, למרכז הורים ולתקשורת עירונית בערבית מתאימות למודל שיתוף הפעולה הקהילתי, שלפיו בית הספר מטפל גם בחסמים שאינם לימודיים באמצעות שותפויות עם שירותי הרווחה והקהילה (Anderson-Butcher et al., 2022). המסקנה השישית היא שבבתי הספר שנחקרו מתקיימת מנהיגות שיתופית "מלמטה", אך כדי שתתקיים לאורך זמן היא צריכה מבנה: זמן מוקצה, תפקיד מוגדר, הכשרה מותאמת ושותפויות עם גורמים בקהילה.</w:t>
+        <w:t xml:space="preserve">בהתייחס להכשרה, בדומה למחקר זה, גם בספרות נמצא שמורים חדשים מתמודדים עם הורים באופן אינטואיטיבי ונשענים על מורים חונכים (עזריה וצר ואחרים, 2024), ושהשותפות כרוכה במורכבות רגשית הדורשת תמיכה בצוות (כורם, 2022). המחיר הרגשי שתיארו המורות, עייפות, תחושת חוסר אונים ועבודה של "מורה, יועצת, עובדת סוציאלית ומגשרת", מתיישב עם תאוריית הלחץ, שלפיה המורה תופס אירוע כמלחיץ לפי המשאבים העומדים לרשותו, ועם הממצא שמנהיגות אותנטית של המנהל היא היעילה ביותר בהפחתת שחיקה (צמח ובארט, 2024). גם המנהלים שרואיינו בתקופת הקורונה הדגישו את הצורך במרחב רגשי תומך למורים (ברוכי ואזולאי, 2023). הבקשות של המורות לעובדת סוציאלית, למרכז הורים ולתקשורת עירונית בערבית מתאימות למודל שיתוף הפעולה הקהילתי, שלפיו בית הספר מטפל גם בחסמים שאינם לימודיים באמצעות שותפויות עם שירותי הרווחה והקהילה (Anderson-Butcher et al., 2022). המורות לא תיארו שותפויות כאלה כקיימות, אלא את עצמן כמי שממלאות את החלל. המסקנה השישית היא שבבתי הספר שנחקרו מתקיימת מנהיגות שיתופית "מלמטה", אך כדי שתתקיים לאורך זמן היא צריכה מבנה: זמן מוקצה, תפקיד מוגדר, הכשרה מותאמת ושותפויות עם גורמים בקהילה.</w:t>
       </w:r>
     </w:p>
     <w:p>
@@ -7164,7 +7416,23 @@
           <w:szCs w:val="24"/>
           <w:rtl/>
         </w:rPr>
-        <w:t xml:space="preserve">שאלת המחקר עסקה באופן שבו מורות עובדות מול הורים בבתי ספר במגזר הערבי בלוד. התשובה שעלתה היא שהמורות עובדות מול ההורים כגשר: מידע עובר בערוצים דיגיטליים, והיחסים נבנים פנים אל פנים, מתוך פנייה חיובית, הזמנה של ההורים כנותנים ועבודה בתוך מבנה המשפחה המורחבת. השותפות בהחלטות מצומצמת ברמת בית הספר ומתקיימת בעיקר ביוזמות של מורות יחידות. המסקנה המרכזית היא שהמנהיגות השיתופית בבתי ספר אלה מתקיימת "מלמטה", ושהיא תלויה באנשים יותר מאשר במבנה. טענת המחקר קיבלה חיזוק: הקשר נבנה בעיקר דרך מבנה הקהילה ולא דרך הערוצים הרשמיים, והשותפות הייתה עמוקה יותר במקומות שבהם ההנהלה הקצתה זמן ותפקיד. מטרת המחקר הושגה במובן שהוא מתאר את דרכי העבודה ואת התנאים להצלחתן, אך הוא מתאר אותן מנקודת מבטן של המורות בלבד. תרומת המחקר לידע הקיים היא בתיאור של מנהיגות שיתופית כפי שהיא מתקיימת בבתי ספר ערביים בעיר מעורבת, הקשר שכמעט לא נחקר.</w:t>
+        <w:t xml:space="preserve">עבודה זו ביקשה לבחון כיצד עובדות מורות מול הורים בבתי ספר במגזר הערבי בלוד, באילו ערוצים הן משתמשות, ומה מאפשר שותפות או מקשה עליה. התשובה שעלתה היא שהמורות עובדות מול ההורים כגשר בין משפחות שחיות במצוקה ובפחד ובין מערכת שמדברת עברית ומודדת מעורבות באסיפות. מן הממצאים עלו שש מסקנות. ראשית, בעיר מעורבת שבה האמון במוסדות נמוך, בית הספר הערבי הוא אחד המוסדות הבודדים שההורים סומכים עליהם, והמורה נושאת את תפקיד הגשר במחיר אישי. שנית, ערוץ דיגיטלי אינו מחליף מפגש: הוואטסאפ מתאים להעברת מידע, ואילו היחסים נבנים פנים אל פנים ובערוצים בלתי פורמליים. שלישית, מעורבות ההורים תלויה במידה רבה באופן שבו בית הספר פונה אליהם, ופנייה חיובית ראשונה והזמנה במקום זימון משנות את התגובה. רביעית, ההורים מסוגלים ומוכנים להיות שותפים כשהם מוזמנים לתרום ידע ולהשתתף בפתרון בעיות. חמישית, השותפות בלוד היא במידה רבה שותפות עם המשפחה המורחבת, ובית ספר שמכיר במבנה הזה יכול להגיע להורים שהמערכת אינה מגיעה אליהם. שישית, המנהיגות השיתופית בבתי ספר אלה מתקיימת "מלמטה", ביוזמת מורות, ותלויה באנשים יותר מאשר במבנה.</w:t>
+      </w:r>
+    </w:p>
+    <w:p>
+      <w:pPr>
+        <w:bidi/>
+        <w:spacing w:after="60" w:before="0" w:line="360" w:lineRule="auto"/>
+        <w:jc w:val="both"/>
+      </w:pPr>
+      <w:r>
+        <w:rPr>
+          <w:rFonts w:ascii="Times New Roman" w:cs="David" w:hAnsi="Times New Roman"/>
+          <w:sz w:val="24"/>
+          <w:szCs w:val="24"/>
+          <w:rtl/>
+        </w:rPr>
+        <w:t xml:space="preserve">טענת המחקר קיבלה חיזוק: הקשר נבנה בעיקר דרך מבנה הקהילה ולא דרך הערוצים הרשמיים, והשותפות הייתה עמוקה יותר במקומות שבהם ההנהלה הקצתה זמן ותפקיד. מטרת המחקר הושגה במובן שהוא מתאר את דרכי העבודה ואת התנאים להצלחתן, אך הוא מתאר אותן מנקודת מבטן של המורות בלבד. תרומת המחקר לידע הקיים היא בתיאור של מנהיגות שיתופית כפי שהיא מתקיימת בבתי ספר ערביים בעיר מעורבת, הקשר שכמעט לא נחקר, ובהצגת הערוצים הבלתי פורמליים ומבנה הקהילה כחלק מרכזי מן השותפות.</w:t>
       </w:r>
     </w:p>
     <w:p>
@@ -7199,7 +7467,7 @@
           <w:szCs w:val="24"/>
           <w:rtl/>
         </w:rPr>
-        <w:t xml:space="preserve">המחקר התבסס על שמונה ראיונות בלבד, ולכן אי אפשר להכליל ממנו לכלל בתי הספר בלוד. כל המשתתפות היו נשים שמלמדות בבתי ספר ערביים, והמחקר לא כלל מורים גברים, מורים מבתי ספר עבריים בעיר, הורים או מנהלים. הנתונים מבוססים על דיווח עצמי, ולא נבדקו מול מקורות נוספים כמו תצפיות או מסמכים, שהיו יכולים לחזק את תוקף המחקר. חלק מהראיונות נערכו בערבית ותורגמו, והתרגום עלול לשנות דקויות. על התוצאות עשויים היו להשפיע גם היכרות המראיינות עם הקהילה, רצייה חברתית, והעובדה שרבות מהמשתתפות ממלאות תפקידי ריכוז.</w:t>
+        <w:t xml:space="preserve">המחקר התבסס על שמונה ראיונות בלבד, ולכן אי אפשר להכליל ממנו לכלל בתי הספר בלוד. כל המשתתפות היו נשים שמלמדות בבתי ספר ערביים, והמחקר לא כלל מורים גברים, מורים מבתי ספר עבריים בעיר, הורים או מנהלים. בשל היקף העבודה לא נבחנו נקודות המבט של ההורים עצמם, ובכללם הסבתות והאבות, שהמורות תיארו כחלק מרכזי מן הקשר. הנתונים מבוססים על דיווח עצמי, ולא נבדקו מול מקורות נוספים כמו תצפיות או מסמכים, שהיו יכולים לחזק את תוקף המחקר. חלק מהראיונות נערכו בערבית ותורגמו, והתרגום עלול לשנות דקויות. על התוצאות עשויים היו להשפיע גם היכרות המראיינות עם הקהילה, רצייה חברתית, כלומר נטייה להציג את העבודה מול ההורים באור חיובי, והעובדה שרבות מהמשתתפות ממלאות תפקידי ריכוז, ולכן ייתכן שהן מעורבות בקשר עם ההורים יותר ממורה ממוצעת.</w:t>
       </w:r>
     </w:p>
     <w:p>
@@ -7234,7 +7502,90 @@
           <w:szCs w:val="24"/>
           <w:rtl/>
         </w:rPr>
-        <w:t xml:space="preserve">ברמת המורה מומלץ לפתוח את השנה בשיחה חיובית עם כל הורה לפני שמתעוררות בעיות, לקבוע כלל שלפיו נושאים טעונים נדונים בפגישה ולא בהודעה, ולבקש מההורים דברים שהם יכולים לתת. ברמת בית הספר מומלץ להקצות בכל שבוע שעה במערכת השעות של כל מחנכת לקשר עם הורים, להקים תפקיד של רכזת הורים וקהילה עם שעות קבועות, ולהקים בכל שכבה צוות הורים שהבעיות מובאות אליו לפני שמתקבלת החלטה. כמו כן, מומלץ שהמנהל יחזיר את ההורה למחנכת אחרי שהרגיע משבר, ושכל מחנכת חדשה תקבל ליווי שבועי של מחנכת ותיקה בשנתה הראשונה. ההכשרה צריכה להיות מותאמת לחברה הערבית בעיר מעורבת, ויכולה לכלול סימולציות של שיחות קשות (מלץ ואחרים, 2026). ברמת העירייה מומלץ שכל הודעה להורים תישלח גם בערבית, ושיוקם בכל שכונה ערבית מרכז הורים עם עובדת סוציאלית ועם קורסים בקריאה, בעברית ובמיומנויות דיגיטליות.</w:t>
+        <w:t xml:space="preserve">ההמלצות נשענות על הממצאים ועל ההצעות של המורות עצמן, והן מוצגות בשלוש רמות.</w:t>
+      </w:r>
+    </w:p>
+    <w:p>
+      <w:pPr>
+        <w:bidi/>
+        <w:spacing w:after="60" w:before="0" w:line="360" w:lineRule="auto"/>
+        <w:jc w:val="both"/>
+      </w:pPr>
+      <w:r>
+        <w:rPr>
+          <w:rFonts w:ascii="Times New Roman" w:cs="David" w:hAnsi="Times New Roman"/>
+          <w:sz w:val="24"/>
+          <w:szCs w:val="24"/>
+          <w:rtl/>
+        </w:rPr>
+        <w:t xml:space="preserve">ברמת המורה מומלץ לפתוח את השנה בשיחה חיובית עם כל הורה לפני שמתעוררות בעיות, ולקבוע כלל שלפיו נושאים טעונים נדונים בפגישה ולא בהודעה. מומלץ לבקש מההורים דברים שהם יכולים לתת, ולהזמין אותם לכיתה כנותני ידע, כמו בפרויקטים "שבוע האבות" ו"סבתא מספרת". בחטיבת הביניים מומלץ לקיים פגישות משולשות של המורה, ההורה והתלמיד.</w:t>
+      </w:r>
+    </w:p>
+    <w:p>
+      <w:pPr>
+        <w:bidi/>
+        <w:spacing w:after="60" w:before="0" w:line="360" w:lineRule="auto"/>
+        <w:jc w:val="both"/>
+      </w:pPr>
+      <w:r>
+        <w:rPr>
+          <w:rFonts w:ascii="Times New Roman" w:cs="David" w:hAnsi="Times New Roman"/>
+          <w:sz w:val="24"/>
+          <w:szCs w:val="24"/>
+          <w:rtl/>
+        </w:rPr>
+        <w:t xml:space="preserve">ברמת בית הספר מומלץ להקצות בכל שבוע שעה במערכת השעות של כל מחנכת לקשר עם הורים, ולהקים תפקיד של רכזת הורים וקהילה עם שעות קבועות. מומלץ להקים בכל שכבה צוות הורים שהבעיות מובאות אליו לפני שמתקבלת החלטה, ולשתף בו גם נציגים של המשפחות, כמו מועצת הקהילה שתוארה במחקר. מומלץ לנסח מדיניות לשימוש בוואטסאפ, שתגדיר מה עובר בכל ערוץ ותגן על המורות מפני זמינות מתמדת. כמו כן, מומלץ שהמנהל יחזיר את ההורה למחנכת אחרי שהרגיע משבר, ושכל מחנכת חדשה תקבל ליווי שבועי של מחנכת ותיקה בשנתה הראשונה. ההכשרה צריכה להיות מותאמת לחברה הערבית בעיר מעורבת, ויכולה לכלול סימולציות של שיחות קשות (מלץ ואחרים, 2026).</w:t>
+      </w:r>
+    </w:p>
+    <w:p>
+      <w:pPr>
+        <w:bidi/>
+        <w:spacing w:after="60" w:before="0" w:line="360" w:lineRule="auto"/>
+        <w:jc w:val="both"/>
+      </w:pPr>
+      <w:r>
+        <w:rPr>
+          <w:rFonts w:ascii="Times New Roman" w:cs="David" w:hAnsi="Times New Roman"/>
+          <w:sz w:val="24"/>
+          <w:szCs w:val="24"/>
+          <w:rtl/>
+        </w:rPr>
+        <w:t xml:space="preserve">ברמת העירייה מומלץ שכל הודעה להורים תישלח גם בערבית, ושיוקם בכל שכונה ערבית מרכז הורים עם עובדת סוציאלית ועם קורסים בקריאה, בעברית ובמיומנויות דיגיטליות. מומלץ להגדיל את היקף המשרה של העובדת הסוציאלית בבתי הספר, ולהשקיע בתשתיות שמאפשרות מפגש בטוח, כמו מגרשים מוארים. מומלץ גם לשתף את נציגי המשפחות, ובהם הנשים, בהחלטות על השכונות שלהם.</w:t>
+      </w:r>
+    </w:p>
+    <w:p>
+      <w:pPr>
+        <w:pStyle w:val="Heading2"/>
+        <w:bidi/>
+        <w:spacing w:after="120" w:before="240" w:line="360" w:lineRule="auto"/>
+        <w:jc w:val="left"/>
+      </w:pPr>
+      <w:r>
+        <w:rPr>
+          <w:rFonts w:ascii="Times New Roman" w:cs="David" w:hAnsi="Times New Roman"/>
+          <w:b/>
+          <w:bCs/>
+          <w:sz w:val="24"/>
+          <w:szCs w:val="24"/>
+          <w:rtl/>
+        </w:rPr>
+        <w:t xml:space="preserve">6.4 דברי סיום</w:t>
+      </w:r>
+    </w:p>
+    <w:p>
+      <w:pPr>
+        <w:bidi/>
+        <w:spacing w:after="60" w:before="0" w:line="360" w:lineRule="auto"/>
+        <w:jc w:val="both"/>
+      </w:pPr>
+      <w:r>
+        <w:rPr>
+          <w:rFonts w:ascii="Times New Roman" w:cs="David" w:hAnsi="Times New Roman"/>
+          <w:sz w:val="24"/>
+          <w:szCs w:val="24"/>
+          <w:rtl/>
+        </w:rPr>
+        <w:t xml:space="preserve">המבוא לעבודה הציג את המורה בבית ספר ערבי בלוד כמי שעובדת מול משפחות שחיות בפחד, מול מערכת שמדברת עברית ומול מבנה קהילתי שיש לו כללים משלו. הממצאים מראים שהמורות אינן רק מתמודדות עם שלושת אלה, אלא מחברות ביניהם: הן מתרגמות, מזמינות, מקשיבות ופונות לסבתא. השותפות שהן בונות אפשרית, והיא אינה תלויה בכסף או בהשכלה של ההורים. היא תלויה בשאלה אם בית הספר מזמין את ההורים או מזמן אותם, ואם מישהו מבנה את התפקיד הזה כך שהמורות לא יישאו אותו לבדן.</w:t>
       </w:r>
     </w:p>
     <w:p>

</xml_diff>

<commit_message>
Discussion as continuous integrative text; concise summary
Co-Authored-By: Claude Opus 5.5 <noreply@anthropic.com>
Claude-Session: https://claude.ai/code/session_01PCrLuLuf13bgHFN1Akf9GB
</commit_message>
<xml_diff>
--- a/seminar/עבודת סמינר - חיתאם אבו ריאש.docx
+++ b/seminar/עבודת סמינר - חיתאם אבו ריאש.docx
@@ -1243,265 +1243,6 @@
               <w:tab w:val="right" w:leader="dot" w:pos="9072"/>
             </w:tabs>
             <w:spacing w:before="0" w:after="20" w:line="252" w:lineRule="auto"/>
-            <w:ind w:left="567"/>
-          </w:pPr>
-          <w:r>
-            <w:rPr>
-              <w:rFonts w:ascii="Times New Roman" w:hAnsi="Times New Roman" w:cs="David"/>
-              <w:sz w:val="24"/>
-              <w:szCs w:val="24"/>
-              <w:rtl/>
-            </w:rPr>
-            <w:t xml:space="preserve">5.1 בית הספר כגשר בקהילה</w:t>
-          </w:r>
-          <w:r>
-            <w:rPr>
-              <w:rFonts w:ascii="Times New Roman" w:hAnsi="Times New Roman" w:cs="David"/>
-              <w:sz w:val="24"/>
-              <w:szCs w:val="24"/>
-              <w:rtl/>
-            </w:rPr>
-            <w:tab/>
-          </w:r>
-          <w:r>
-            <w:rPr>
-              <w:rFonts w:ascii="Times New Roman" w:hAnsi="Times New Roman" w:cs="David"/>
-              <w:sz w:val="24"/>
-              <w:szCs w:val="24"/>
-              <w:rtl/>
-            </w:rPr>
-            <w:t>21</w:t>
-          </w:r>
-        </w:p>
-        <w:p>
-          <w:pPr>
-            <w:bidi/>
-            <w:tabs>
-              <w:tab w:val="right" w:leader="dot" w:pos="9072"/>
-            </w:tabs>
-            <w:spacing w:before="0" w:after="20" w:line="252" w:lineRule="auto"/>
-            <w:ind w:left="567"/>
-          </w:pPr>
-          <w:r>
-            <w:rPr>
-              <w:rFonts w:ascii="Times New Roman" w:hAnsi="Times New Roman" w:cs="David"/>
-              <w:sz w:val="24"/>
-              <w:szCs w:val="24"/>
-              <w:rtl/>
-            </w:rPr>
-            <w:t xml:space="preserve">5.2 ערוצי התקשורת: מידע לעומת יחסים</w:t>
-          </w:r>
-          <w:r>
-            <w:rPr>
-              <w:rFonts w:ascii="Times New Roman" w:hAnsi="Times New Roman" w:cs="David"/>
-              <w:sz w:val="24"/>
-              <w:szCs w:val="24"/>
-              <w:rtl/>
-            </w:rPr>
-            <w:tab/>
-          </w:r>
-          <w:r>
-            <w:rPr>
-              <w:rFonts w:ascii="Times New Roman" w:hAnsi="Times New Roman" w:cs="David"/>
-              <w:sz w:val="24"/>
-              <w:szCs w:val="24"/>
-              <w:rtl/>
-            </w:rPr>
-            <w:t>21</w:t>
-          </w:r>
-        </w:p>
-        <w:p>
-          <w:pPr>
-            <w:bidi/>
-            <w:tabs>
-              <w:tab w:val="right" w:leader="dot" w:pos="9072"/>
-            </w:tabs>
-            <w:spacing w:before="0" w:after="20" w:line="252" w:lineRule="auto"/>
-            <w:ind w:left="567"/>
-          </w:pPr>
-          <w:r>
-            <w:rPr>
-              <w:rFonts w:ascii="Times New Roman" w:hAnsi="Times New Roman" w:cs="David"/>
-              <w:sz w:val="24"/>
-              <w:szCs w:val="24"/>
-              <w:rtl/>
-            </w:rPr>
-            <w:t xml:space="preserve">5.3 מזימון להזמנה</w:t>
-          </w:r>
-          <w:r>
-            <w:rPr>
-              <w:rFonts w:ascii="Times New Roman" w:hAnsi="Times New Roman" w:cs="David"/>
-              <w:sz w:val="24"/>
-              <w:szCs w:val="24"/>
-              <w:rtl/>
-            </w:rPr>
-            <w:tab/>
-          </w:r>
-          <w:r>
-            <w:rPr>
-              <w:rFonts w:ascii="Times New Roman" w:hAnsi="Times New Roman" w:cs="David"/>
-              <w:sz w:val="24"/>
-              <w:szCs w:val="24"/>
-              <w:rtl/>
-            </w:rPr>
-            <w:t>22</w:t>
-          </w:r>
-        </w:p>
-        <w:p>
-          <w:pPr>
-            <w:bidi/>
-            <w:tabs>
-              <w:tab w:val="right" w:leader="dot" w:pos="9072"/>
-            </w:tabs>
-            <w:spacing w:before="0" w:after="20" w:line="252" w:lineRule="auto"/>
-            <w:ind w:left="567"/>
-          </w:pPr>
-          <w:r>
-            <w:rPr>
-              <w:rFonts w:ascii="Times New Roman" w:hAnsi="Times New Roman" w:cs="David"/>
-              <w:sz w:val="24"/>
-              <w:szCs w:val="24"/>
-              <w:rtl/>
-            </w:rPr>
-            <w:t xml:space="preserve">5.4 מעזרה לשותפות</w:t>
-          </w:r>
-          <w:r>
-            <w:rPr>
-              <w:rFonts w:ascii="Times New Roman" w:hAnsi="Times New Roman" w:cs="David"/>
-              <w:sz w:val="24"/>
-              <w:szCs w:val="24"/>
-              <w:rtl/>
-            </w:rPr>
-            <w:tab/>
-          </w:r>
-          <w:r>
-            <w:rPr>
-              <w:rFonts w:ascii="Times New Roman" w:hAnsi="Times New Roman" w:cs="David"/>
-              <w:sz w:val="24"/>
-              <w:szCs w:val="24"/>
-              <w:rtl/>
-            </w:rPr>
-            <w:t>23</w:t>
-          </w:r>
-        </w:p>
-        <w:p>
-          <w:pPr>
-            <w:bidi/>
-            <w:tabs>
-              <w:tab w:val="right" w:leader="dot" w:pos="9072"/>
-            </w:tabs>
-            <w:spacing w:before="0" w:after="20" w:line="252" w:lineRule="auto"/>
-            <w:ind w:left="567"/>
-          </w:pPr>
-          <w:r>
-            <w:rPr>
-              <w:rFonts w:ascii="Times New Roman" w:hAnsi="Times New Roman" w:cs="David"/>
-              <w:sz w:val="24"/>
-              <w:szCs w:val="24"/>
-              <w:rtl/>
-            </w:rPr>
-            <w:t xml:space="preserve">5.5 עבודה בתוך מבנה הקהילה</w:t>
-          </w:r>
-          <w:r>
-            <w:rPr>
-              <w:rFonts w:ascii="Times New Roman" w:hAnsi="Times New Roman" w:cs="David"/>
-              <w:sz w:val="24"/>
-              <w:szCs w:val="24"/>
-              <w:rtl/>
-            </w:rPr>
-            <w:tab/>
-          </w:r>
-          <w:r>
-            <w:rPr>
-              <w:rFonts w:ascii="Times New Roman" w:hAnsi="Times New Roman" w:cs="David"/>
-              <w:sz w:val="24"/>
-              <w:szCs w:val="24"/>
-              <w:rtl/>
-            </w:rPr>
-            <w:t>23</w:t>
-          </w:r>
-        </w:p>
-        <w:p>
-          <w:pPr>
-            <w:bidi/>
-            <w:tabs>
-              <w:tab w:val="right" w:leader="dot" w:pos="9072"/>
-            </w:tabs>
-            <w:spacing w:before="0" w:after="20" w:line="252" w:lineRule="auto"/>
-            <w:ind w:left="567"/>
-          </w:pPr>
-          <w:r>
-            <w:rPr>
-              <w:rFonts w:ascii="Times New Roman" w:hAnsi="Times New Roman" w:cs="David"/>
-              <w:sz w:val="24"/>
-              <w:szCs w:val="24"/>
-              <w:rtl/>
-            </w:rPr>
-            <w:t xml:space="preserve">5.6 מנהיגות שיתופית ללא מבנה</w:t>
-          </w:r>
-          <w:r>
-            <w:rPr>
-              <w:rFonts w:ascii="Times New Roman" w:hAnsi="Times New Roman" w:cs="David"/>
-              <w:sz w:val="24"/>
-              <w:szCs w:val="24"/>
-              <w:rtl/>
-            </w:rPr>
-            <w:tab/>
-          </w:r>
-          <w:r>
-            <w:rPr>
-              <w:rFonts w:ascii="Times New Roman" w:hAnsi="Times New Roman" w:cs="David"/>
-              <w:sz w:val="24"/>
-              <w:szCs w:val="24"/>
-              <w:rtl/>
-            </w:rPr>
-            <w:t>24</w:t>
-          </w:r>
-        </w:p>
-        <w:p>
-          <w:pPr>
-            <w:bidi/>
-            <w:tabs>
-              <w:tab w:val="right" w:leader="dot" w:pos="9072"/>
-            </w:tabs>
-            <w:spacing w:before="0" w:after="20" w:line="252" w:lineRule="auto"/>
-            <w:ind w:left="567"/>
-          </w:pPr>
-          <w:r>
-            <w:rPr>
-              <w:rFonts w:ascii="Times New Roman" w:hAnsi="Times New Roman" w:cs="David"/>
-              <w:sz w:val="24"/>
-              <w:szCs w:val="24"/>
-              <w:rtl/>
-            </w:rPr>
-            <w:t xml:space="preserve">5.7 תובנות חדשות, השערות וכיווני מחקר</w:t>
-          </w:r>
-          <w:r>
-            <w:rPr>
-              <w:rFonts w:ascii="Times New Roman" w:hAnsi="Times New Roman" w:cs="David"/>
-              <w:sz w:val="24"/>
-              <w:szCs w:val="24"/>
-              <w:rtl/>
-            </w:rPr>
-            <w:tab/>
-          </w:r>
-          <w:r>
-            <w:rPr>
-              <w:rFonts w:ascii="Times New Roman" w:hAnsi="Times New Roman" w:cs="David"/>
-              <w:sz w:val="24"/>
-              <w:szCs w:val="24"/>
-              <w:rtl/>
-            </w:rPr>
-            <w:t>25</w:t>
-          </w:r>
-        </w:p>
-        <w:p>
-          <w:pPr>
-            <w:bidi/>
-            <w:tabs>
-              <w:tab w:val="right" w:leader="dot" w:pos="9072"/>
-            </w:tabs>
-            <w:spacing w:before="0" w:after="20" w:line="252" w:lineRule="auto"/>
           </w:pPr>
           <w:r>
             <w:rPr>
@@ -1549,7 +1290,7 @@
               <w:szCs w:val="24"/>
               <w:rtl/>
             </w:rPr>
-            <w:t xml:space="preserve">6.1 מסקנות</w:t>
+            <w:t xml:space="preserve">6.1 סיכום המחקר ומסקנותיו</w:t>
           </w:r>
           <w:r>
             <w:rPr>
@@ -1641,7 +1382,7 @@
               <w:szCs w:val="24"/>
               <w:rtl/>
             </w:rPr>
-            <w:t>27</w:t>
+            <w:t>26</w:t>
           </w:r>
         </w:p>
         <w:p>
@@ -6972,26 +6713,7 @@
           <w:szCs w:val="24"/>
           <w:rtl/>
         </w:rPr>
-        <w:t xml:space="preserve">עבודה זו בחנה כיצד עובדות מורות מול הורים בבתי ספר במגזר הערבי בלוד. בפרק זה יידונו הממצאים לאור הרקע התיאורטי, לפי סדר התמות, ויוצגו המסקנות העולות מכל תמה.</w:t>
-      </w:r>
-    </w:p>
-    <w:p>
-      <w:pPr>
-        <w:pStyle w:val="Heading2"/>
-        <w:bidi/>
-        <w:spacing w:after="120" w:before="240" w:line="360" w:lineRule="auto"/>
-        <w:jc w:val="left"/>
-      </w:pPr>
-      <w:r>
-        <w:rPr>
-          <w:rFonts w:ascii="Times New Roman" w:cs="David" w:hAnsi="Times New Roman"/>
-          <w:b/>
-          <w:bCs/>
-          <w:sz w:val="24"/>
-          <w:szCs w:val="24"/>
-          <w:rtl/>
-        </w:rPr>
-        <w:t xml:space="preserve">5.1 בית הספר כגשר בקהילה</w:t>
+        <w:t xml:space="preserve">עבודה זו בחנה כיצד עובדות מורות מול הורים בבתי ספר במגזר הערבי בלוד. בפרק זה יידונו הממצאים לאור הרקע התיאורטי, תוך שילוב בין התמות ובין הספרות, ויוצגו המסקנות העולות מהם.</w:t>
       </w:r>
     </w:p>
     <w:p>
@@ -7007,7 +6729,7 @@
           <w:szCs w:val="24"/>
           <w:rtl/>
         </w:rPr>
-        <w:t xml:space="preserve">ממחקר זה עלה תחילה כי המורות רואות בבית הספר את המוסד היחיד בעיר שההורים סומכים עליו. בהתייחס לכך, בספרות נטען כי קהילתיות גבוהה מעידה על אמון במוסדות הקהילה ובדמויות המייצגות אותה, ובהם בית הספר והמורים (שדמי-וורטמן, 2017, כפי שמצוטט אצל Fisher &amp; Refael Fanyo, 2022). מחקר שנערך בשכונה עירונית מצא כי תושבים רבים חווים היעדר של קהילה ומבקשים לשחזר אותה, וכי הם מצפים מן הממסד לחזק את האמון בין הקבוצות בשכונה (וול-טיסר ובליט-כהן, 2023). בלוד, לפי דברי המורות, בית הספר הוא המקום שבו האמון הזה עדיין קיים. הדבר מתיישב עם תיאור החינוך החברתי-קהילתי כ"עוגן" בעת משבר (גולדרט, 2024), ומרחיב אותו: בלוד המשבר אינו אירוע חולף אלא מצב מתמשך של ירי ופחד. במחקר העירוני נמצא גם שחלק מהתושבים חווים תחושה של זרות ואיום בשכונה (וול-טיסר ובליט-כהן, 2023), וגם המורות בלוד תיארו פחד מהרחוב ומהשכנים, במיוחד אחרי מאי 2021. הפערים בתקצוב בין החינוך הערבי לעברי בעיר (אבגר ואחרים, 2021) ותהליכי הג'נטריפיקציה הלאומית בערים המעורבות (שמריהו-ישורון, 2021) עשויים להסביר מדוע המורות חשות שהן נושאות אחריות שחורגת מתפקידן.</w:t>
+        <w:t xml:space="preserve">החוט המקשר בין התמות הוא מקומו של בית הספר בקהילה. ממחקר זה עלה תחילה כי המורות רואות בבית הספר את המוסד היחיד בעיר שההורים סומכים עליו. בהתייחס לכך, בספרות נטען כי קהילתיות גבוהה מעידה על אמון במוסדות הקהילה ובדמויות המייצגות אותה, ובהם בית הספר והמורים (שדמי-וורטמן, 2017, כפי שמצוטט אצל Fisher &amp; Refael Fanyo, 2022). מחקר שנערך בשכונה עירונית מצא כי תושבים רבים חווים היעדר של קהילה ומבקשים לשחזר אותה, וכי הם מצפים מן הממסד לחזק את האמון בין הקבוצות בשכונה (וול-טיסר ובליט-כהן, 2023). בלוד, לפי דברי המורות, בית הספר הוא המקום שבו האמון הזה עדיין קיים. הדבר מתיישב עם תיאור החינוך החברתי-קהילתי כ"עוגן" בעת משבר (גולדרט, 2024), ומרחיב אותו: בלוד המשבר אינו אירוע חולף אלא מצב מתמשך של ירי ופחד. במחקר העירוני נמצא גם שחלק מהתושבים חווים תחושה של זרות ואיום בשכונה (וול-טיסר ובליט-כהן, 2023), וגם המורות בלוד תיארו פחד מהרחוב ומהשכנים, במיוחד אחרי מאי 2021. הפערים בתקצוב בין החינוך הערבי לעברי בעיר (אבגר ואחרים, 2021) ותהליכי הג'נטריפיקציה הלאומית בערים המעורבות (שמריהו-ישורון, 2021) עשויים להסביר מדוע המורות חשות שהן נושאות אחריות שחורגת מתפקידן.</w:t>
       </w:r>
     </w:p>
     <w:p>
@@ -7028,25 +6750,6 @@
     </w:p>
     <w:p>
       <w:pPr>
-        <w:pStyle w:val="Heading2"/>
-        <w:bidi/>
-        <w:spacing w:after="120" w:before="240" w:line="360" w:lineRule="auto"/>
-        <w:jc w:val="left"/>
-      </w:pPr>
-      <w:r>
-        <w:rPr>
-          <w:rFonts w:ascii="Times New Roman" w:cs="David" w:hAnsi="Times New Roman"/>
-          <w:b/>
-          <w:bCs/>
-          <w:sz w:val="24"/>
-          <w:szCs w:val="24"/>
-          <w:rtl/>
-        </w:rPr>
-        <w:t xml:space="preserve">5.2 ערוצי התקשורת: מידע לעומת יחסים</w:t>
-      </w:r>
-    </w:p>
-    <w:p>
-      <w:pPr>
         <w:bidi/>
         <w:spacing w:after="60" w:before="0" w:line="360" w:lineRule="auto"/>
         <w:jc w:val="both"/>
@@ -7058,7 +6761,7 @@
           <w:szCs w:val="24"/>
           <w:rtl/>
         </w:rPr>
-        <w:t xml:space="preserve">ממחקר זה עלה כי המורות מבחינות בין הוואטסאפ, שמעביר מידע, ובין ערוצים אישיים, שבהם נבנים היחסים. בהתייחס למחירים של התקשורת הדיגיטלית, בדומה למחקר זה, גם בספרות נמצא כי קבוצות הוואטסאפ הכיתתיות מעניקות להורים נראות של חיי הכיתה, אך יוצרות מעורבות יתר, פוגעות בפרטיות ומטשטשות את סמכות המורה (טרגר-סודרי ואחרים, 2025). גם מנהלי בתי ספר תיארו פניות רבות של הורים ללא גבולות של זמן ומקום, שהעמיסו על המורים (ברוכי ואזולאי, 2023). המחקר הנוכחי מוסיף שני ממדים. הראשון הוא הכבוד: הודעה כתובה עלולה להפוך לעניין משפחתי ולהגיע ל"מג'לס", ולכן היא מסוכנת יותר. השני הוא ההדרה. פערי המיומנות הדיגיטלית שתוארו בספרות (Urbina et al., 2025; אליהו-לוי ורויטר, 2023) מקבלים כאן פנים קונקרטיות של אמהות שאינן קוראות, אבות שאינם בקבוצה וסבתות שמגדלות נכדים.</w:t>
+        <w:t xml:space="preserve">תפקיד הגשר מתבטא גם בדרכים שבהן המורות מתקשרות עם ההורים. הן מבחינות בין הוואטסאפ, שמעביר מידע, ובין ערוצים אישיים, שבהם נבנים היחסים. בהתייחס למחירים של התקשורת הדיגיטלית, בדומה למחקר זה, גם בספרות נמצא כי קבוצות הוואטסאפ הכיתתיות מעניקות להורים נראות של חיי הכיתה, אך יוצרות מעורבות יתר, פוגעות בפרטיות ומטשטשות את סמכות המורה (טרגר-סודרי ואחרים, 2025). גם מנהלי בתי ספר תיארו פניות רבות של הורים ללא גבולות של זמן ומקום, שהעמיסו על המורים (ברוכי ואזולאי, 2023). המחקר הנוכחי מוסיף שני ממדים. הראשון הוא הכבוד: הודעה כתובה עלולה להפוך לעניין משפחתי ולהגיע ל"מג'לס", ולכן היא מסוכנת יותר. השני הוא ההדרה. פערי המיומנות הדיגיטלית שתוארו בספרות (Urbina et al., 2025; אליהו-לוי ורויטר, 2023) מקבלים כאן פנים קונקרטיות של אמהות שאינן קוראות, אבות שאינם בקבוצה וסבתות שמגדלות נכדים.</w:t>
       </w:r>
     </w:p>
     <w:p>
@@ -7095,25 +6798,6 @@
     </w:p>
     <w:p>
       <w:pPr>
-        <w:pStyle w:val="Heading2"/>
-        <w:bidi/>
-        <w:spacing w:after="120" w:before="240" w:line="360" w:lineRule="auto"/>
-        <w:jc w:val="left"/>
-      </w:pPr>
-      <w:r>
-        <w:rPr>
-          <w:rFonts w:ascii="Times New Roman" w:cs="David" w:hAnsi="Times New Roman"/>
-          <w:b/>
-          <w:bCs/>
-          <w:sz w:val="24"/>
-          <w:szCs w:val="24"/>
-          <w:rtl/>
-        </w:rPr>
-        <w:t xml:space="preserve">5.3 מזימון להזמנה</w:t>
-      </w:r>
-    </w:p>
-    <w:p>
-      <w:pPr>
         <w:bidi/>
         <w:spacing w:after="60" w:before="0" w:line="360" w:lineRule="auto"/>
         <w:jc w:val="both"/>
@@ -7125,7 +6809,7 @@
           <w:szCs w:val="24"/>
           <w:rtl/>
         </w:rPr>
-        <w:t xml:space="preserve">ממחקר זה עלה כי המורות יוזמות את רוב הקשר, ומקפידות שהפנייה הראשונה להורה תהיה חיובית. בהתייחס לכיוון התקשורת, מחקר קודם מצא שמורים כמעט אינם מתכוונים לשתף הורים במצבים יומיומיים, ושהתקשורת שהם מתארים חד-כיוונית (ענבר-פירסט ואחרים, 2023). מחקר אחר מצא שמורים אינם מעוניינים במעורבות הורים מעבר למה שהם רואים כ"הכרחי" (Fisher &amp; Baissberg, 2025). במחקר הנוכחי נמצא פער לעומת הספרות הזאת: המורות אמנם יוזמות את רוב הקשר, אך רבות מהן ביקשו להרחיב את שותפות ההורים, והבחינו בין הורה "מזומן" להורה "מוזמן". ההבחנה מזכירה את ההבחנה בין פעולה למען הקהילה לפעולה עמה (גולדרט ועמרם-אשרוב, 2023), ואת רעיון "השולחן העגול" (אחיטוב והרצוג, 2022).</w:t>
+        <w:t xml:space="preserve">הבחירה בערוצים אישיים קשורה לאופן שבו המורות פונות להורים. הן יוזמות את רוב הקשר, ומקפידות שהפנייה הראשונה להורה תהיה חיובית. בהתייחס לכיוון התקשורת, מחקר קודם מצא שמורים כמעט אינם מתכוונים לשתף הורים במצבים יומיומיים, ושהתקשורת שהם מתארים חד-כיוונית (ענבר-פירסט ואחרים, 2023). מחקר אחר מצא שמורים אינם מעוניינים במעורבות הורים מעבר למה שהם רואים כ"הכרחי" (Fisher &amp; Baissberg, 2025). במחקר הנוכחי נמצא פער לעומת הספרות הזאת: המורות אמנם יוזמות את רוב הקשר, אך רבות מהן ביקשו להרחיב את שותפות ההורים, והבחינו בין הורה "מזומן" להורה "מוזמן". ההבחנה מזכירה את ההבחנה בין פעולה למען הקהילה לפעולה עמה (גולדרט ועמרם-אשרוב, 2023), ואת רעיון "השולחן העגול" (אחיטוב והרצוג, 2022).</w:t>
       </w:r>
     </w:p>
     <w:p>
@@ -7146,25 +6830,6 @@
     </w:p>
     <w:p>
       <w:pPr>
-        <w:pStyle w:val="Heading2"/>
-        <w:bidi/>
-        <w:spacing w:after="120" w:before="240" w:line="360" w:lineRule="auto"/>
-        <w:jc w:val="left"/>
-      </w:pPr>
-      <w:r>
-        <w:rPr>
-          <w:rFonts w:ascii="Times New Roman" w:cs="David" w:hAnsi="Times New Roman"/>
-          <w:b/>
-          <w:bCs/>
-          <w:sz w:val="24"/>
-          <w:szCs w:val="24"/>
-          <w:rtl/>
-        </w:rPr>
-        <w:t xml:space="preserve">5.4 מעזרה לשותפות</w:t>
-      </w:r>
-    </w:p>
-    <w:p>
-      <w:pPr>
         <w:bidi/>
         <w:spacing w:after="60" w:before="0" w:line="360" w:lineRule="auto"/>
         <w:jc w:val="both"/>
@@ -7176,7 +6841,7 @@
           <w:szCs w:val="24"/>
           <w:rtl/>
         </w:rPr>
-        <w:t xml:space="preserve">ממחקר זה עלה כי ברמת בית הספר ההורים שותפים בעיקר בעזרה, אך ביוזמות של המורות הם הוזמנו כנותני ידע ורובם הגיעו. בהתייחס למעורבות הורים בחברה הערבית, מחקר קודם תיאר מעורבות נמוכה מסוג "צופים" (גרינבנק ובנג'ו, 2021, כפי שמצוטט אצל בנג'ו ובדיר, 2024). לעומת זאת, מחקר מאוחר יותר מצא שמעורבות ההורים הערבים בגן הייתה גבוהה יותר בסוגי המעורבות "שירותים", "ועדים" ו"דיאלוג" (בנג'ו ובדיר, 2024). הממצאים כאן מתיישבים עם המחקר המאוחר: כשההורים הוזמנו כמומחים, כמספרי סיפורים או כמפעילי דוכנים, הגיעו 28 מתוך 33 אבות ו-26 מתוך 32 משפחות. בהתייחס לגופי ההורים שהקימו המורות, בדומה למחקר זה, גם בספרות נמצא ששיתוף פעולה עם מורים נקשר לבקשת עזרה אוטונומית, כלומר לנכונות ההורים לפתח את יכולתם להתמודד בעצמם (Grinshtain &amp; Harpaz, 2023). "שרשרת האמהות" שהפחיתה את ההיעדרויות היא דוגמה לפתרון כזה, שבא מההורים ולא מבית הספר. גם "שוק הקהילה", שאחריו החלו ההורים לעזור זה לזה, מתאים לגישת פיתוח הקהילה, שבה הקהילה עצמה שותפה לתהליך ולא רק מקבלת שירות (גולדרט ועמרם-אשרוב, 2023). בספרות נמצא שקהילתיות גבוהה מנבאת מעורבות הורים רבה יותר (Fisher &amp; Refael Fanyo, 2022), ולכן יוזמות שמחברות הורים זה לזה עשויות לחזק את המעורבות בבית הספר, ולא רק את הקשר עם המורה.</w:t>
+        <w:t xml:space="preserve">ההזמנה של ההורים כנותנים מובילה לשאלת השותפות עצמה. ברמת בית הספר ההורים שותפים בעיקר בעזרה, אך ביוזמות של המורות הם הוזמנו כנותני ידע ורובם הגיעו. בהתייחס למעורבות הורים בחברה הערבית, מחקר קודם תיאר מעורבות נמוכה מסוג "צופים" (גרינבנק ובנג'ו, 2021, כפי שמצוטט אצל בנג'ו ובדיר, 2024). לעומת זאת, מחקר מאוחר יותר מצא שמעורבות ההורים הערבים בגן הייתה גבוהה יותר בסוגי המעורבות "שירותים", "ועדים" ו"דיאלוג" (בנג'ו ובדיר, 2024). הממצאים כאן מתיישבים עם המחקר המאוחר: כשההורים הוזמנו כמומחים, כמספרי סיפורים או כמפעילי דוכנים, הגיעו 28 מתוך 33 אבות ו-26 מתוך 32 משפחות. בהתייחס לגופי ההורים שהקימו המורות, בדומה למחקר זה, גם בספרות נמצא ששיתוף פעולה עם מורים נקשר לבקשת עזרה אוטונומית, כלומר לנכונות ההורים לפתח את יכולתם להתמודד בעצמם (Grinshtain &amp; Harpaz, 2023). "שרשרת האמהות" שהפחיתה את ההיעדרויות היא דוגמה לפתרון כזה, שבא מההורים ולא מבית הספר. גם "שוק הקהילה", שאחריו החלו ההורים לעזור זה לזה, מתאים לגישת פיתוח הקהילה, שבה הקהילה עצמה שותפה לתהליך ולא רק מקבלת שירות (גולדרט ועמרם-אשרוב, 2023). בספרות נמצא שקהילתיות גבוהה מנבאת מעורבות הורים רבה יותר (Fisher &amp; Refael Fanyo, 2022), ולכן יוזמות שמחברות הורים זה לזה עשויות לחזק את המעורבות בבית הספר, ולא רק את הקשר עם המורה.</w:t>
       </w:r>
     </w:p>
     <w:p>
@@ -7197,25 +6862,6 @@
     </w:p>
     <w:p>
       <w:pPr>
-        <w:pStyle w:val="Heading2"/>
-        <w:bidi/>
-        <w:spacing w:after="120" w:before="240" w:line="360" w:lineRule="auto"/>
-        <w:jc w:val="left"/>
-      </w:pPr>
-      <w:r>
-        <w:rPr>
-          <w:rFonts w:ascii="Times New Roman" w:cs="David" w:hAnsi="Times New Roman"/>
-          <w:b/>
-          <w:bCs/>
-          <w:sz w:val="24"/>
-          <w:szCs w:val="24"/>
-          <w:rtl/>
-        </w:rPr>
-        <w:t xml:space="preserve">5.5 עבודה בתוך מבנה הקהילה</w:t>
-      </w:r>
-    </w:p>
-    <w:p>
-      <w:pPr>
         <w:bidi/>
         <w:spacing w:after="60" w:before="0" w:line="360" w:lineRule="auto"/>
         <w:jc w:val="both"/>
@@ -7227,7 +6873,7 @@
           <w:szCs w:val="24"/>
           <w:rtl/>
         </w:rPr>
-        <w:t xml:space="preserve">ממחקר זה עלה כי המורות לא ניסו לשנות את מבנה הקהילה אלא לעבוד דרכו: לפנות לסבתא, להיעזר בזקני המשפחה ולהושיב משפחות חלשות בשורה הראשונה. בהתייחס לכך, בספרות הומלץ על התערבות מותאמת תרבות בעבודה עם הורים ערבים (Grinshtain &amp; Harpaz, 2023), ועל סדנאות משותפות שיאפשרו למידה הדדית בין צוותים להורים מחברות שונות (בנג'ו ובדיר, 2024). גישת פיתוח הקהילה, שבה הקהילה עצמה שותפה לתהליך (גולדרט ועמרם-אשרוב, 2023), מתבטאת במועצת הקהילה שהקימה סוהא לצד ועד ההורים הנבחר. גם הפירוש שנתנו המורות לאיומים של הורים, כביטוי של פחד ולא של תוקפנות, עשוי להתקשר לממצא שהורים ערבים נוטים יותר להימנע מבקשת עזרה (Grinshtain &amp; Harpaz, 2023): הורה שאינו מאמין שיקשיבו לו מגיע מלווה, ולא לבד. הדרך שבה התמודדו המורות עם מחלוקות, השהיה, שאלה במקום שכנוע והצגת הילד עצמו, דומה לאימוץ נקודת המבט של ההורה שתואר בספרות (מלץ ואחרים, 2026).</w:t>
+        <w:t xml:space="preserve">השותפות הזאת אינה מתקיימת בחלל ריק, אלא בתוך מבנה קהילתי של משפחה מורחבת וכבוד. המורות לא ניסו לשנות את המבנה אלא לעבוד דרכו: לפנות לסבתא, להיעזר בזקני המשפחה ולהושיב משפחות חלשות בשורה הראשונה. בהתייחס לכך, בספרות הומלץ על התערבות מותאמת תרבות בעבודה עם הורים ערבים (Grinshtain &amp; Harpaz, 2023), ועל סדנאות משותפות שיאפשרו למידה הדדית בין צוותים להורים מחברות שונות (בנג'ו ובדיר, 2024). גישת פיתוח הקהילה, שבה הקהילה עצמה שותפה לתהליך (גולדרט ועמרם-אשרוב, 2023), מתבטאת במועצת הקהילה שהקימה סוהא לצד ועד ההורים הנבחר. גם הפירוש שנתנו המורות לאיומים של הורים, כביטוי של פחד ולא של תוקפנות, עשוי להתקשר לממצא שהורים ערבים נוטים יותר להימנע מבקשת עזרה (Grinshtain &amp; Harpaz, 2023): הורה שאינו מאמין שיקשיבו לו מגיע מלווה, ולא לבד. הדרך שבה התמודדו המורות עם מחלוקות, השהיה, שאלה במקום שכנוע והצגת הילד עצמו, דומה לאימוץ נקודת המבט של ההורה שתואר בספרות (מלץ ואחרים, 2026).</w:t>
       </w:r>
     </w:p>
     <w:p>
@@ -7248,25 +6894,6 @@
     </w:p>
     <w:p>
       <w:pPr>
-        <w:pStyle w:val="Heading2"/>
-        <w:bidi/>
-        <w:spacing w:after="120" w:before="240" w:line="360" w:lineRule="auto"/>
-        <w:jc w:val="left"/>
-      </w:pPr>
-      <w:r>
-        <w:rPr>
-          <w:rFonts w:ascii="Times New Roman" w:cs="David" w:hAnsi="Times New Roman"/>
-          <w:b/>
-          <w:bCs/>
-          <w:sz w:val="24"/>
-          <w:szCs w:val="24"/>
-          <w:rtl/>
-        </w:rPr>
-        <w:t xml:space="preserve">5.6 מנהיגות שיתופית ללא מבנה</w:t>
-      </w:r>
-    </w:p>
-    <w:p>
-      <w:pPr>
         <w:bidi/>
         <w:spacing w:after="60" w:before="0" w:line="360" w:lineRule="auto"/>
         <w:jc w:val="both"/>
@@ -7278,7 +6905,7 @@
           <w:szCs w:val="24"/>
           <w:rtl/>
         </w:rPr>
-        <w:t xml:space="preserve">ממחקר זה עלה כי הקשר עם ההורים נשען על יוזמות של מורות, וכי ההנהלה משפיעה עליו מאוד, אך אינה בונה לו מבנה. בהתייחס למנהיגות המבוזרת, בספרות נטען שמנהיגות בית ספרית משפיעה במיוחד כשהיא מבוזרת, וכי יש דפוסי ביזור יעילים יותר מאחרים (Harris et al., 2022). רכזות השכבה, רכזת הקהילה ורכזת החינוך החברתי במחקר זה הובילו יוזמות, ואפשר לראות בהן מורות-מנהיגות במובן של "זהות מקפית" (ברוזה וחמו, 2022). הן פעלו הרבה מעבר לתפקידן, ובדומה לכך נמצא בספרות שמנהיגות משתפת של המנהל היא המנבא החזק ביותר לנכונות של מורים לפעול מעבר לדרישות התפקיד (קאהן ואחרים, 2026). אך מנהיגות מבוזרת שנשענת על אנשים ולא על מבנה תלויה במנהל ועלולה להיעלם.</w:t>
+        <w:t xml:space="preserve">כל מה שתואר עד כה, הגשר, הערוצים האישיים, ההזמנה והעבודה עם מבנה הקהילה, נשען על יוזמות של מורות. ההנהלה משפיעה על הקשר מאוד, אך אינה בונה לו מבנה. בהתייחס למנהיגות המבוזרת, בספרות נטען שמנהיגות בית ספרית משפיעה במיוחד כשהיא מבוזרת, וכי יש דפוסי ביזור יעילים יותר מאחרים (Harris et al., 2022). רכזות השכבה, רכזת הקהילה ורכזת החינוך החברתי במחקר זה הובילו יוזמות, ואפשר לראות בהן מורות-מנהיגות במובן של "זהות מקפית" (ברוזה וחמו, 2022). הן פעלו הרבה מעבר לתפקידן, ובדומה לכך נמצא בספרות שמנהיגות משתפת של המנהל היא המנבא החזק ביותר לנכונות של מורים לפעול מעבר לדרישות התפקיד (קאהן ואחרים, 2026). אך מנהיגות מבוזרת שנשענת על אנשים ולא על מבנה תלויה במנהל ועלולה להיעלם.</w:t>
       </w:r>
     </w:p>
     <w:p>
@@ -7299,25 +6926,6 @@
     </w:p>
     <w:p>
       <w:pPr>
-        <w:pStyle w:val="Heading2"/>
-        <w:bidi/>
-        <w:spacing w:after="120" w:before="240" w:line="360" w:lineRule="auto"/>
-        <w:jc w:val="left"/>
-      </w:pPr>
-      <w:r>
-        <w:rPr>
-          <w:rFonts w:ascii="Times New Roman" w:cs="David" w:hAnsi="Times New Roman"/>
-          <w:b/>
-          <w:bCs/>
-          <w:sz w:val="24"/>
-          <w:szCs w:val="24"/>
-          <w:rtl/>
-        </w:rPr>
-        <w:t xml:space="preserve">5.7 תובנות חדשות, השערות וכיווני מחקר</w:t>
-      </w:r>
-    </w:p>
-    <w:p>
-      <w:pPr>
         <w:bidi/>
         <w:spacing w:after="60" w:before="0" w:line="360" w:lineRule="auto"/>
         <w:jc w:val="both"/>
@@ -7329,6 +6937,22 @@
           <w:szCs w:val="24"/>
           <w:rtl/>
         </w:rPr>
+        <w:t xml:space="preserve">מן הדיון עולה כי התמות אינן נפרדות זו מזו. הערוצים הבלתי פורמליים פועלים בתוך מבנה המשפחה, ההזמנה של ההורים כנותנים מתאפשרת בזכות ההיכרות של המורה עם הקהילה, והמחיר הרגשי של המורות נובע מכך שכל אלה נשענים עליהן ולא על מבנה בית ספרי. הממצאים תומכים בטענת המחקר, ומציעים שלוש תובנות חדשות: הערוצים הבלתי פורמליים מרכזיים בבניית הקשר, המורות מבקשות להרחיב את מעורבות ההורים ולא להגביל אותה, ובית הספר הערבי בעיר מעורבת מתפקד כמוסד קהילתי שתפקיד הגישור שלו מוטל על המורות.</w:t>
+      </w:r>
+    </w:p>
+    <w:p>
+      <w:pPr>
+        <w:bidi/>
+        <w:spacing w:after="60" w:before="0" w:line="360" w:lineRule="auto"/>
+        <w:jc w:val="both"/>
+      </w:pPr>
+      <w:r>
+        <w:rPr>
+          <w:rFonts w:ascii="Times New Roman" w:cs="David" w:hAnsi="Times New Roman"/>
+          <w:sz w:val="24"/>
+          <w:szCs w:val="24"/>
+          <w:rtl/>
+        </w:rPr>
         <w:t xml:space="preserve">יש לקרוא את הממצאים גם בעין ביקורתית. ראשית, התמונה מבוססת על דברי מורות שרבות מהן רכזות ויוזמות, ולכן ייתכן שהיא מציגה את הצד המוצלח של הקשר עם ההורים יותר מאשר את השגרה של מורה ממוצעת. שנית, ההישענות על יוזמות אישיות אינה רק עדות להצלחה, אלא גם לבעיה: היא יוצרת פערים בין כיתות ובין בתי ספר, ותלמיד שהמחנכת שלו אינה יוזמת נשאר בלי הגשר הזה. שלישית, העבודה בתוך מבנה הקהילה מאפשרת להגיע להורים, אך עלולה גם לשמר את הדרת הנשים מעמדות השפעה, כפי שתיארו המורות עצמן. לכן ההמלצה אינה לאמץ את המבנה כמות שהוא, אלא לעבוד דרכו תוך הרחבת המקום של האמהות ושל המורות בתוכו.</w:t>
       </w:r>
     </w:p>
@@ -7345,23 +6969,7 @@
           <w:szCs w:val="24"/>
           <w:rtl/>
         </w:rPr>
-        <w:t xml:space="preserve">הממצאים תומכים בטענת המחקר, ומציעים שלוש תובנות חדשות: הערוצים הבלתי פורמליים מרכזיים בבניית הקשר, המורות מבקשות להרחיב את מעורבות ההורים ולא להגביל אותה, ובית הספר הערבי בעיר מעורבת מתפקד כמוסד קהילתי שתפקיד הגישור שלו מוטל על המורות.</w:t>
-      </w:r>
-    </w:p>
-    <w:p>
-      <w:pPr>
-        <w:bidi/>
-        <w:spacing w:after="60" w:before="0" w:line="360" w:lineRule="auto"/>
-        <w:jc w:val="both"/>
-      </w:pPr>
-      <w:r>
-        <w:rPr>
-          <w:rFonts w:ascii="Times New Roman" w:cs="David" w:hAnsi="Times New Roman"/>
-          <w:sz w:val="24"/>
-          <w:szCs w:val="24"/>
-          <w:rtl/>
-        </w:rPr>
-        <w:t xml:space="preserve">מכאן אפשר להעלות שתי השערות. האחת, ייתכן שהמעורבות שנראית "נמוכה" בבתי ספר ערביים אינה ביטוי לחוסר עניין של ההורים, אלא לפער בין הערוצים שהמערכת מציעה ובין הערוצים שבהם הקהילה פועלת. השנייה, ייתכן שהיעדר מבנה מערכתי מעביר את מחיר השותפות אל המורות, ובמיוחד אל מורות בנות הקהילה, ושמחיר זה עלול להוביל לשחיקה. כדי לבחון את ההשערות מוצע לערוך מחקרי המשך שישמעו את ההורים עצמם, ובכללם הסבתות והאבות, ישוו לבתי ספר בחינוך העברי בעיר ובערים מעורבות אחרות, ויבחנו לאורך זמן את השפעתן של יוזמות כמו צוות הורים או רכזת קהילה על היעדרויות ועל נשירה.</w:t>
+        <w:t xml:space="preserve">לאור כל זאת אפשר להעלות שתי השערות. האחת, ייתכן שהמעורבות שנראית "נמוכה" בבתי ספר ערביים אינה ביטוי לחוסר עניין של ההורים, אלא לפער בין הערוצים שהמערכת מציעה ובין הערוצים שבהם הקהילה פועלת. השנייה, ייתכן שהיעדר מבנה מערכתי מעביר את מחיר השותפות אל המורות, ובמיוחד אל מורות בנות הקהילה, ושמחיר זה עלול להוביל לשחיקה. כדי לבחון את ההשערות מוצע לערוך מחקרי המשך שישמעו את ההורים עצמם, ובכללם הסבתות והאבות, ישוו לבתי ספר בחינוך העברי בעיר ובערים מעורבות אחרות, ויבחנו לאורך זמן את השפעתן של יוזמות כמו צוות הורים או רכזת קהילה על היעדרויות ועל נשירה.</w:t>
       </w:r>
     </w:p>
     <w:p>
@@ -7400,7 +7008,7 @@
           <w:szCs w:val="24"/>
           <w:rtl/>
         </w:rPr>
-        <w:t xml:space="preserve">6.1 מסקנות</w:t>
+        <w:t xml:space="preserve">6.1 סיכום המחקר ומסקנותיו</w:t>
       </w:r>
     </w:p>
     <w:p>
@@ -7416,7 +7024,7 @@
           <w:szCs w:val="24"/>
           <w:rtl/>
         </w:rPr>
-        <w:t xml:space="preserve">עבודה זו ביקשה לבחון כיצד עובדות מורות מול הורים בבתי ספר במגזר הערבי בלוד, באילו ערוצים הן משתמשות, ומה מאפשר שותפות או מקשה עליה. התשובה שעלתה היא שהמורות עובדות מול ההורים כגשר בין משפחות שחיות במצוקה ובפחד ובין מערכת שמדברת עברית ומודדת מעורבות באסיפות. מן הממצאים עלו שש מסקנות. ראשית, בעיר מעורבת שבה האמון במוסדות נמוך, בית הספר הערבי הוא אחד המוסדות הבודדים שההורים סומכים עליהם, והמורה נושאת את תפקיד הגשר במחיר אישי. שנית, ערוץ דיגיטלי אינו מחליף מפגש: הוואטסאפ מתאים להעברת מידע, ואילו היחסים נבנים פנים אל פנים ובערוצים בלתי פורמליים. שלישית, מעורבות ההורים תלויה במידה רבה באופן שבו בית הספר פונה אליהם, ופנייה חיובית ראשונה והזמנה במקום זימון משנות את התגובה. רביעית, ההורים מסוגלים ומוכנים להיות שותפים כשהם מוזמנים לתרום ידע ולהשתתף בפתרון בעיות. חמישית, השותפות בלוד היא במידה רבה שותפות עם המשפחה המורחבת, ובית ספר שמכיר במבנה הזה יכול להגיע להורים שהמערכת אינה מגיעה אליהם. שישית, המנהיגות השיתופית בבתי ספר אלה מתקיימת "מלמטה", ביוזמת מורות, ותלויה באנשים יותר מאשר במבנה.</w:t>
+        <w:t xml:space="preserve">עבודה זו ביקשה לבחון כיצד עובדות מורות מול הורים בבתי ספר במגזר הערבי בלוד, באילו ערוצים הן משתמשות, ומה מאפשר שותפות או מקשה עליה. מן הראיונות עולה כי המורות פועלות כגשר בין משפחות שחיות במצוקה ובפחד ובין מערכת שמדברת עברית ומודדת מעורבות באסיפות. הן מעבירות מידע בערוצים דיגיטליים ובונות יחסים פנים אל פנים, פונות להורים קודם כול בחיובי ומזמינות אותם כנותני ידע, ופועלות בתוך מבנה המשפחה המורחבת והכבוד ולא נגדו. המסקנה המרכזית היא שהמנהיגות השיתופית בבתי ספר אלה מתקיימת "מלמטה", ביוזמת מורות, ושהיא תלויה באנשים יותר מאשר במבנה. לכן היא אפשרית, אך שבירה.</w:t>
       </w:r>
     </w:p>
     <w:p>

</xml_diff>

<commit_message>
Add block quotes to thin findings sub-sections
Co-Authored-By: Claude Opus 5.5 <noreply@anthropic.com>
Claude-Session: https://claude.ai/code/session_01PCrLuLuf13bgHFN1Akf9GB
</commit_message>
<xml_diff>
--- a/seminar/עבודת סמינר - חיתאם אבו ריאש.docx
+++ b/seminar/עבודת סמינר - חיתאם אבו ריאש.docx
@@ -1158,7 +1158,7 @@
               <w:szCs w:val="24"/>
               <w:rtl/>
             </w:rPr>
-            <w:t>17</w:t>
+            <w:t>18</w:t>
           </w:r>
         </w:p>
         <w:p>
@@ -1195,7 +1195,7 @@
               <w:szCs w:val="24"/>
               <w:rtl/>
             </w:rPr>
-            <w:t>18</w:t>
+            <w:t>19</w:t>
           </w:r>
         </w:p>
         <w:p>
@@ -1233,7 +1233,7 @@
               <w:szCs w:val="24"/>
               <w:rtl/>
             </w:rPr>
-            <w:t>21</w:t>
+            <w:t>22</w:t>
           </w:r>
         </w:p>
         <w:p>
@@ -1271,7 +1271,7 @@
               <w:szCs w:val="24"/>
               <w:rtl/>
             </w:rPr>
-            <w:t>26</w:t>
+            <w:t>27</w:t>
           </w:r>
         </w:p>
         <w:p>
@@ -1308,7 +1308,7 @@
               <w:szCs w:val="24"/>
               <w:rtl/>
             </w:rPr>
-            <w:t>26</w:t>
+            <w:t>27</w:t>
           </w:r>
         </w:p>
         <w:p>
@@ -1345,7 +1345,7 @@
               <w:szCs w:val="24"/>
               <w:rtl/>
             </w:rPr>
-            <w:t>26</w:t>
+            <w:t>27</w:t>
           </w:r>
         </w:p>
         <w:p>
@@ -1382,7 +1382,7 @@
               <w:szCs w:val="24"/>
               <w:rtl/>
             </w:rPr>
-            <w:t>26</w:t>
+            <w:t>27</w:t>
           </w:r>
         </w:p>
         <w:p>
@@ -1419,7 +1419,7 @@
               <w:szCs w:val="24"/>
               <w:rtl/>
             </w:rPr>
-            <w:t>27</w:t>
+            <w:t>28</w:t>
           </w:r>
         </w:p>
         <w:p>
@@ -1457,7 +1457,7 @@
               <w:szCs w:val="24"/>
               <w:rtl/>
             </w:rPr>
-            <w:t>28</w:t>
+            <w:t>29</w:t>
           </w:r>
         </w:p>
         <w:p>
@@ -1495,7 +1495,7 @@
               <w:szCs w:val="24"/>
               <w:rtl/>
             </w:rPr>
-            <w:t>31</w:t>
+            <w:t>32</w:t>
           </w:r>
         </w:p>
         <w:p>
@@ -1533,7 +1533,7 @@
               <w:szCs w:val="24"/>
               <w:rtl/>
             </w:rPr>
-            <w:t>33</w:t>
+            <w:t>34</w:t>
           </w:r>
         </w:p>
         <w:p>
@@ -1571,7 +1571,7 @@
               <w:szCs w:val="24"/>
               <w:rtl/>
             </w:rPr>
-            <w:t>42</w:t>
+            <w:t>43</w:t>
           </w:r>
           <w:r>
             <w:fldChar w:fldCharType="end"/>
@@ -5504,6 +5504,39 @@
     <w:p>
       <w:pPr>
         <w:bidi/>
+        <w:spacing w:after="60" w:before="0" w:line="360" w:lineRule="auto"/>
+        <w:jc w:val="both"/>
+      </w:pPr>
+      <w:r>
+        <w:rPr>
+          <w:rFonts w:ascii="Times New Roman" w:cs="David" w:hAnsi="Times New Roman"/>
+          <w:sz w:val="24"/>
+          <w:szCs w:val="24"/>
+          <w:rtl/>
+        </w:rPr>
+        <w:t xml:space="preserve">סמר תיארה את הפער בין הערוצים הדיגיטליים לבין דרכים פשוטות יותר, שדווקא הן מגיעות להורים:</w:t>
+      </w:r>
+    </w:p>
+    <w:p>
+      <w:pPr>
+        <w:bidi/>
+        <w:spacing w:after="120" w:before="0" w:line="360" w:lineRule="auto"/>
+        <w:ind w:left="567" w:right="567"/>
+        <w:jc w:val="both"/>
+      </w:pPr>
+      <w:r>
+        <w:rPr>
+          <w:rFonts w:ascii="Times New Roman" w:cs="David" w:hAnsi="Times New Roman"/>
+          <w:sz w:val="24"/>
+          <w:szCs w:val="24"/>
+          <w:rtl/>
+        </w:rPr>
+        <w:t xml:space="preserve">משו"ב, אני רושמת בו נוכחות, וההורים לא פותחים אותו, אני יודעת, כי כשאני שואלת "ראית במשו"ב" הם אומרים "מה זה". ... מה שעובד הכי טוב: פגישה פנים אל פנים עם האמא, ואחריה, המחברת. הווטסאפ הוא הכי נוח, אבל הוא הכי פחות עמוק.</w:t>
+      </w:r>
+    </w:p>
+    <w:p>
+      <w:pPr>
+        <w:bidi/>
         <w:spacing w:after="120" w:before="0" w:line="360" w:lineRule="auto"/>
         <w:jc w:val="left"/>
       </w:pPr>
@@ -5951,7 +5984,24 @@
           <w:szCs w:val="24"/>
           <w:rtl/>
         </w:rPr>
-        <w:t xml:space="preserve">המורות הגיעו להורים דרך הילד, דרך הסבתא, דרך השער ודרך הורים אחרים, ולא דרך מכתבים או מערכות. ריהאם נותנת לילד הזמנה שכתב בעצמו, "כי הורה שלא עונה למורה עונה לילד שלו". נסרין מבקשת מהורים מעורבים להביא הורה נוסף, "אמא מביאה אמא", ומבקשת מההורים דברים שהם יודעים לעשות: "הורה שהתבקש בגלל מה שהוא יודע מגיע. הורה שהתבקש כי "צריך הורים" לא." סוהא מזמינה אישית משפחות חלשות לכל אירוע ומושיבה אותן בשורה הראשונה, משום ש"בקהילה שלנו, השורה הראשונה היא הכול".</w:t>
+        <w:t xml:space="preserve">המורות הגיעו להורים דרך הילד, דרך הסבתא, דרך השער ודרך הורים אחרים, ולא דרך מכתבים או מערכות. ריהאם נותנת לילד הזמנה שכתב בעצמו, "כי הורה שלא עונה למורה עונה לילד שלו". נסרין מבקשת מהורים מעורבים להביא הורה נוסף, "אמא מביאה אמא", ומבקשת מההורים דברים שהם יודעים לעשות: "הורה שהתבקש בגלל מה שהוא יודע מגיע. הורה שהתבקש כי "צריך הורים" לא." סוהא תיארה הגעה להורים דרך המבנה של הקהילה:</w:t>
+      </w:r>
+    </w:p>
+    <w:p>
+      <w:pPr>
+        <w:bidi/>
+        <w:spacing w:after="120" w:before="0" w:line="360" w:lineRule="auto"/>
+        <w:ind w:left="567" w:right="567"/>
+        <w:jc w:val="both"/>
+      </w:pPr>
+      <w:r>
+        <w:rPr>
+          <w:rFonts w:ascii="Times New Roman" w:cs="David" w:hAnsi="Times New Roman"/>
+          <w:sz w:val="24"/>
+          <w:szCs w:val="24"/>
+          <w:rtl/>
+        </w:rPr>
+        <w:t xml:space="preserve">אני מגיעה ללא מעורבים דרך המבנה: דרך הנשים הזקנות, דרך משפחה מכובדת שתלווה אותם, דרך יום המשפחה שבו כולם מוזמנים באותו כבוד. ודרך דבר שאני מקפידה עליו: בכל אירוע של בית הספר, אני מזמינה אישית, בטלפון, את המשפחות החלשות, ומושיבה אותן בשורה הראשונה. זה נשמע קטן. בקהילה שלנו, השורה הראשונה היא הכול.</w:t>
       </w:r>
     </w:p>
     <w:p>
@@ -5967,6 +6017,39 @@
           <w:szCs w:val="24"/>
           <w:rtl/>
         </w:rPr>
+        <w:t xml:space="preserve">גם פאטמה מגיעה להורים שאינם מעורבים בדרכים אישיות, שאינן דורשות מההורה השכלה:</w:t>
+      </w:r>
+    </w:p>
+    <w:p>
+      <w:pPr>
+        <w:bidi/>
+        <w:spacing w:after="120" w:before="0" w:line="360" w:lineRule="auto"/>
+        <w:ind w:left="567" w:right="567"/>
+        <w:jc w:val="both"/>
+      </w:pPr>
+      <w:r>
+        <w:rPr>
+          <w:rFonts w:ascii="Times New Roman" w:cs="David" w:hAnsi="Times New Roman"/>
+          <w:sz w:val="24"/>
+          <w:szCs w:val="24"/>
+          <w:rtl/>
+        </w:rPr>
+        <w:t xml:space="preserve">אני מגיעה אליהם דרך מי שאני: אני מתקשרת, לא שולחת. אני פוגשת אותם בשכונה, לא רק בבית הספר. אני פונה לסבתא, שהרבה פעמים היא האדם הפתוח ביותר בבית. ואני משתמשת בערב הקריאה ובסבתא מספרת, שהם דברים שההורה לא צריך להיות משכיל בשבילם.</w:t>
+      </w:r>
+    </w:p>
+    <w:p>
+      <w:pPr>
+        <w:bidi/>
+        <w:spacing w:after="60" w:before="0" w:line="360" w:lineRule="auto"/>
+        <w:jc w:val="both"/>
+      </w:pPr>
+      <w:r>
+        <w:rPr>
+          <w:rFonts w:ascii="Times New Roman" w:cs="David" w:hAnsi="Times New Roman"/>
+          <w:sz w:val="24"/>
+          <w:szCs w:val="24"/>
+          <w:rtl/>
+        </w:rPr>
         <w:t xml:space="preserve">לסיכום: מתמה זו עולה כי המורות יוזמות את רוב הקשר, ומשתדלות שהפנייה הראשונה להורה תהיה חיובית ותהיה הזמנה ולא זימון. הן מגדירות מחדש את המעורבות של ההורים, ושינו את ציפיותיהן אחרי מפגשים אישיים עם הורים במצוקה. הן מגיעות להורים בדרכים אישיות, דרך הילד, הסבתא, השער והורים אחרים, ולא דרך מערכות.</w:t>
       </w:r>
     </w:p>
@@ -6036,7 +6119,56 @@
           <w:szCs w:val="24"/>
           <w:rtl/>
         </w:rPr>
-        <w:t xml:space="preserve">ברמת בית הספר ההורים שותפים בעיקר בעזרה ובנוכחות: טקסים, טיולים וועד הורים שאוסף כסף. בהחלטות הם כמעט אינם שותפים. ריהאם אמרה שההחלטות "נעשות בבית הספר, והוועד מתבקש לאשר או לעזור", והסבירה שהסיבה אינה התנגדות של בית הספר, אלא ש"ההורים לא מצפים לזה, ואף אחד לא הציע". מהא אמרה: "הבעיה היא שבית הספר רגיל לראות בהורים או עזרה או בעיה, ולא שותף שיודע משהו." פאטמה תיארה מנהל שרואה בהורים אורחים מכובדים: "הם מוזמנים, מכבדים אותם, שומעים אותם, ומחליטים בלעדיהם." יוצאת דופן הייתה נסרין, שסיפרה שבשנה שעברה ההורים ביקשו שיעורי עברית מדוברת נוספים, והמנהלת הכניסה אותם למערכת.</w:t>
+        <w:t xml:space="preserve">ברמת בית הספר ההורים שותפים בעיקר בעזרה ובנוכחות: טקסים, טיולים וועד הורים שאוסף כסף. בהחלטות הם כמעט אינם שותפים. ריהאם אמרה שההחלטות "נעשות בבית הספר, והוועד מתבקש לאשר או לעזור", והסבירה שהסיבה אינה התנגדות של בית הספר, אלא ש"ההורים לא מצפים לזה, ואף אחד לא הציע". מהא אמרה: "הבעיה היא שבית הספר רגיל לראות בהורים או עזרה או בעיה, ולא שותף שיודע משהו."</w:t>
+      </w:r>
+    </w:p>
+    <w:p>
+      <w:pPr>
+        <w:bidi/>
+        <w:spacing w:after="60" w:before="0" w:line="360" w:lineRule="auto"/>
+        <w:jc w:val="both"/>
+      </w:pPr>
+      <w:r>
+        <w:rPr>
+          <w:rFonts w:ascii="Times New Roman" w:cs="David" w:hAnsi="Times New Roman"/>
+          <w:sz w:val="24"/>
+          <w:szCs w:val="24"/>
+          <w:rtl/>
+        </w:rPr>
+        <w:t xml:space="preserve">פאטמה תיארה מנהל שרואה בהורים אורחים מכובדים, והביאה דוגמה ליוזמה של אמהות שלא התקדמה:</w:t>
+      </w:r>
+    </w:p>
+    <w:p>
+      <w:pPr>
+        <w:bidi/>
+        <w:spacing w:after="120" w:before="0" w:line="360" w:lineRule="auto"/>
+        <w:ind w:left="567" w:right="567"/>
+        <w:jc w:val="both"/>
+      </w:pPr>
+      <w:r>
+        <w:rPr>
+          <w:rFonts w:ascii="Times New Roman" w:cs="David" w:hAnsi="Times New Roman"/>
+          <w:sz w:val="24"/>
+          <w:szCs w:val="24"/>
+          <w:rtl/>
+        </w:rPr>
+        <w:t xml:space="preserve">בקבלת החלטות, אצלנו כמעט לא, ואני אגיד למה אני חושבת: המנהל שלנו הוא מהדור הישן, כמוני, והוא רואה בהורים אורחים מכובדים ולא שותפים. הם מוזמנים, מכבדים אותם, שומעים אותם, ומחליטים בלעדיהם. ... בערב הקריאה האחרון, אמהות הציעו לפתוח ספרייה שכונתית, ואני הבאתי את זה למנהל, והוא אמר "נראה". אז, בעזרה כן, בהחלטות עדיין לא.</w:t>
+      </w:r>
+    </w:p>
+    <w:p>
+      <w:pPr>
+        <w:bidi/>
+        <w:spacing w:after="60" w:before="0" w:line="360" w:lineRule="auto"/>
+        <w:jc w:val="both"/>
+      </w:pPr>
+      <w:r>
+        <w:rPr>
+          <w:rFonts w:ascii="Times New Roman" w:cs="David" w:hAnsi="Times New Roman"/>
+          <w:sz w:val="24"/>
+          <w:szCs w:val="24"/>
+          <w:rtl/>
+        </w:rPr>
+        <w:t xml:space="preserve">יוצאת דופן הייתה נסרין, שסיפרה שבשנה שעברה ההורים ביקשו שיעורי עברית מדוברת נוספים, והמנהלת הכניסה אותם למערכת.</w:t>
       </w:r>
     </w:p>
     <w:p>
@@ -6481,6 +6613,39 @@
     <w:p>
       <w:pPr>
         <w:bidi/>
+        <w:spacing w:after="60" w:before="0" w:line="360" w:lineRule="auto"/>
+        <w:jc w:val="both"/>
+      </w:pPr>
+      <w:r>
+        <w:rPr>
+          <w:rFonts w:ascii="Times New Roman" w:cs="David" w:hAnsi="Times New Roman"/>
+          <w:sz w:val="24"/>
+          <w:szCs w:val="24"/>
+          <w:rtl/>
+        </w:rPr>
+        <w:t xml:space="preserve">גם סמר פירטה שלושה מרכיבים של תמיכה, ותיארה עד כמה כל אחד מהם מתקיים בבית הספר שלה:</w:t>
+      </w:r>
+    </w:p>
+    <w:p>
+      <w:pPr>
+        <w:bidi/>
+        <w:spacing w:after="120" w:before="0" w:line="360" w:lineRule="auto"/>
+        <w:ind w:left="567" w:right="567"/>
+        <w:jc w:val="both"/>
+      </w:pPr>
+      <w:r>
+        <w:rPr>
+          <w:rFonts w:ascii="Times New Roman" w:cs="David" w:hAnsi="Times New Roman"/>
+          <w:sz w:val="24"/>
+          <w:szCs w:val="24"/>
+          <w:rtl/>
+        </w:rPr>
+        <w:t xml:space="preserve">"תומכת" בשבילי זה שלוש: שהמנהל מגבה אותי מול ההורה, וזה יש. שהוא נותן לי להוביל את הקשר ולא לוקח אותו ממני, וזה יש פחות. ושהוא מלמד אותי איך, וזה אין. אני רוצה להגיד גם משהו טוב: היועצת אצלנו היא בעצם זו שתומכת במורות בקשר עם ההורים, היא יושבת איתי בפגישות קשות, ובלי זה הייתי אבודה.</w:t>
+      </w:r>
+    </w:p>
+    <w:p>
+      <w:pPr>
+        <w:bidi/>
         <w:spacing w:after="120" w:before="0" w:line="360" w:lineRule="auto"/>
         <w:jc w:val="left"/>
       </w:pPr>
@@ -6509,7 +6674,40 @@
           <w:szCs w:val="24"/>
           <w:rtl/>
         </w:rPr>
-        <w:t xml:space="preserve">בחמשת בתי הספר נמצאו סגנונות שונים. נסרין תיארה מנהלת שהקימה תפקיד של רכזת קהילה ודורשת מכל מחנכת תוכנית קשר עם ההורים. פאטמה תיארה מנהל שמנהל את הקשר "בסגנון של מוכתר", ולדבריה "זה עובד למשברים ולא עובד לשותפות". אמאני אמרה ש"בחטיבה שלנו ההנהלה רואה בקשר עם ההורים בעיקר עניין של משמעת". סוהא תיארה מנהל שאינו מלוד ולכן "נותן לי לנהל את הקשר עם הקהילה". שלוש מורות התלוננו שההורים פונים ישר למנהל. סמר אמרה שההורים "עוקפים" אותה, ומהא תיארה מצב שבו "המורה הופכת לפקידה".</w:t>
+        <w:t xml:space="preserve">בחמשת בתי הספר נמצאו סגנונות שונים. נסרין תיארה מנהלת שרואה בהורים שותפים ובונה את הקשר איתם באופן שיטתי:</w:t>
+      </w:r>
+    </w:p>
+    <w:p>
+      <w:pPr>
+        <w:bidi/>
+        <w:spacing w:after="120" w:before="0" w:line="360" w:lineRule="auto"/>
+        <w:ind w:left="567" w:right="567"/>
+        <w:jc w:val="both"/>
+      </w:pPr>
+      <w:r>
+        <w:rPr>
+          <w:rFonts w:ascii="Times New Roman" w:cs="David" w:hAnsi="Times New Roman"/>
+          <w:sz w:val="24"/>
+          <w:szCs w:val="24"/>
+          <w:rtl/>
+        </w:rPr>
+        <w:t xml:space="preserve">המנהלת שלנו היא הסיבה שהתפקיד שלי קיים. היא זו שהחליטה שבית הספר צריך רכזת קהילה, ונתנה לי שעות, ולא הסתפקה בלהגיד "תדברו עם ההורים". היא רואה את ההורים כשותפים, ויושבת עם הוועד כל חודש, ומכירה הורים בשם, ועומדת בשער. ההנהלה מעודדת שיתוף גם במובן שהיא דורשת מכל מחנכת תוכנית קשר עם הורים בתחילת השנה, עם יעדים.</w:t>
+      </w:r>
+    </w:p>
+    <w:p>
+      <w:pPr>
+        <w:bidi/>
+        <w:spacing w:after="60" w:before="0" w:line="360" w:lineRule="auto"/>
+        <w:jc w:val="both"/>
+      </w:pPr>
+      <w:r>
+        <w:rPr>
+          <w:rFonts w:ascii="Times New Roman" w:cs="David" w:hAnsi="Times New Roman"/>
+          <w:sz w:val="24"/>
+          <w:szCs w:val="24"/>
+          <w:rtl/>
+        </w:rPr>
+        <w:t xml:space="preserve">לעומת זאת, פאטמה תיארה מנהל שמנהל את הקשר "בסגנון של מוכתר", ולדבריה "זה עובד למשברים ולא עובד לשותפות". אמאני אמרה ש"בחטיבה שלנו ההנהלה רואה בקשר עם ההורים בעיקר עניין של משמעת". לדבריה, ההבדל הוא בין שלבי החינוך: "ביסודי ההורה הוא שותף, בחטיבה הוא מוזמן כשיש בעיה, ואני חושבת שזה הפוך ממה שצריך." סוהא תיארה מנהל שאינו מלוד ולכן "נותן לי לנהל את הקשר עם הקהילה". שלוש מורות התלוננו שההורים פונים ישר למנהל. סמר אמרה שההורים "עוקפים" אותה, ומהא תיארה מצב שבו "המורה הופכת לפקידה".</w:t>
       </w:r>
     </w:p>
     <w:p>

</xml_diff>

<commit_message>
Add college logo to seminar cover page
Co-Authored-By: Claude Opus 5.5 <noreply@anthropic.com>
Claude-Session: https://claude.ai/code/session_01PCrLuLuf13bgHFN1Akf9GB
</commit_message>
<xml_diff>
--- a/seminar/עבודת סמינר - חיתאם אבו ריאש.docx
+++ b/seminar/עבודת סמינר - חיתאם אבו ריאש.docx
@@ -4,18 +4,48 @@
   <w:body>
     <w:p>
       <w:pPr>
-        <w:bidi/>
-        <w:spacing w:after="120" w:before="600" w:line="360" w:lineRule="auto"/>
+        <w:spacing w:after="200" w:before="200"/>
         <w:jc w:val="center"/>
       </w:pPr>
       <w:r>
-        <w:rPr>
-          <w:rFonts w:ascii="Times New Roman" w:cs="David" w:hAnsi="Times New Roman"/>
-          <w:sz w:val="24"/>
-          <w:szCs w:val="24"/>
-          <w:rtl/>
-        </w:rPr>
-        <w:t xml:space="preserve">[לוגו המכללה למינהל]</w:t>
+        <w:drawing>
+          <wp:inline distT="0" distB="0" distL="0" distR="0">
+            <wp:extent cx="1333500" cy="1266825"/>
+            <wp:effectExtent t="0" r="0" b="0" l="0"/>
+            <wp:docPr id="1" name="" descr="" title=""/>
+            <wp:cNvGraphicFramePr>
+              <a:graphicFrameLocks xmlns:a="http://schemas.openxmlformats.org/drawingml/2006/main" noChangeAspect="1"/>
+            </wp:cNvGraphicFramePr>
+            <a:graphic xmlns:a="http://schemas.openxmlformats.org/drawingml/2006/main">
+              <a:graphicData uri="http://schemas.openxmlformats.org/drawingml/2006/picture">
+                <pic:pic xmlns:pic="http://schemas.openxmlformats.org/drawingml/2006/picture">
+                  <pic:nvPicPr>
+                    <pic:cNvPr id="0" name="" descr=""/>
+                    <pic:cNvPicPr>
+                      <a:picLocks noChangeAspect="1" noChangeArrowheads="1"/>
+                    </pic:cNvPicPr>
+                  </pic:nvPicPr>
+                  <pic:blipFill>
+                    <a:blip r:embed="rId9" cstate="none"/>
+                    <a:srcRect/>
+                    <a:stretch>
+                      <a:fillRect/>
+                    </a:stretch>
+                  </pic:blipFill>
+                  <pic:spPr bwMode="auto">
+                    <a:xfrm>
+                      <a:off x="0" y="0"/>
+                      <a:ext cx="1333500" cy="1266825"/>
+                    </a:xfrm>
+                    <a:prstGeom prst="rect">
+                      <a:avLst/>
+                    </a:prstGeom>
+                  </pic:spPr>
+                </pic:pic>
+              </a:graphicData>
+            </a:graphic>
+          </wp:inline>
+        </w:drawing>
       </w:r>
     </w:p>
     <w:p>

</xml_diff>

<commit_message>
Add second author Emily to cover, interviews and consent forms
Co-Authored-By: Claude Opus 5.5 <noreply@anthropic.com>
Claude-Session: https://claude.ai/code/session_01PCrLuLuf13bgHFN1Akf9GB
</commit_message>
<xml_diff>
--- a/seminar/עבודת סמינר - חיתאם אבו ריאש.docx
+++ b/seminar/עבודת סמינר - חיתאם אבו ריאש.docx
@@ -241,7 +241,23 @@
           <w:szCs w:val="24"/>
           <w:rtl/>
         </w:rPr>
-        <w:t xml:space="preserve">מגישה: חיתאם אבו ריאש, ת.ז. 309818102</w:t>
+        <w:t xml:space="preserve">מגישות: חיתאם אבו ריאש, ת.ז. 309818102</w:t>
+      </w:r>
+    </w:p>
+    <w:p>
+      <w:pPr>
+        <w:bidi/>
+        <w:spacing w:after="120" w:before="0" w:line="360" w:lineRule="auto"/>
+        <w:jc w:val="center"/>
+      </w:pPr>
+      <w:r>
+        <w:rPr>
+          <w:rFonts w:ascii="Times New Roman" w:cs="David" w:hAnsi="Times New Roman"/>
+          <w:sz w:val="24"/>
+          <w:szCs w:val="24"/>
+          <w:rtl/>
+        </w:rPr>
+        <w:t xml:space="preserve">אמילי, ת.ז. 215328667</w:t>
       </w:r>
     </w:p>
     <w:p>
@@ -965,7 +981,7 @@
               <w:szCs w:val="24"/>
               <w:rtl/>
             </w:rPr>
-            <w:t>9</w:t>
+            <w:t>10</w:t>
           </w:r>
         </w:p>
         <w:p>
@@ -4310,7 +4326,7 @@
           <w:szCs w:val="24"/>
           <w:rtl/>
         </w:rPr>
-        <w:t xml:space="preserve">הראיונות נערכו בין ספטמבר לאוקטובר 2026 בבתי הספר של המשתתפות. אורכם נע בין 36 ל-49 דקות. הראיונות נערכו בערבית ובעברית לפי בחירת המרואיינות, הוקלטו בהסכמתן, תומללו ותורגמו לעברית במקומות הנדרשים. לפני כל ראיון הוצגו למרואיינת מטרת המחקר ואופן שמירת הפרטיות, והיא חתמה על טופס הסכמה מדעת שבו הובהר כי אפשר להפסיק את הראיון בכל שלב. בתמלול הוחלפו שמות המשתתפות בשמות בדויים, שמות תלמידים והורים הושמטו, ופרטים מזהים שונו.</w:t>
+        <w:t xml:space="preserve">הראיונות נערכו בין ספטמבר לאוקטובר 2026 בבתי הספר של המשתתפות. ארבעת הראיונות הראשונים ערכה חיתאם אבו ריאש, ואת ארבעת האחרונים ערכה אמילי, לפי אותו מדריך ראיון. אורכם נע בין 36 ל-49 דקות. הראיונות נערכו בערבית ובעברית לפי בחירת המרואיינות, הוקלטו בהסכמתן, תומללו ותורגמו לעברית במקומות הנדרשים. לפני כל ראיון הוצגו למרואיינת מטרת המחקר ואופן שמירת הפרטיות, והיא חתמה על טופס הסכמה מדעת שבו הובהר כי אפשר להפסיק את הראיון בכל שלב. בתמלול הוחלפו שמות המשתתפות בשמות בדויים, שמות תלמידים והורים הושמטו, ופרטים מזהים שונו.</w:t>
       </w:r>
     </w:p>
     <w:p>
@@ -8968,7 +8984,7 @@
           <w:szCs w:val="24"/>
           <w:rtl/>
         </w:rPr>
-        <w:t xml:space="preserve">להלן טופס ההסכמה שעליו חתמה כל אחת מהמרואיינות לפני הראיון. בהתאם להתחייבות לשמירה על פרטיות המשתתפות, בעבודה מופיעים השמות הבדויים בלבד, והטפסים החתומים בשמות המלאים שמורים אצל החוקרת.</w:t>
+        <w:t xml:space="preserve">להלן טופס ההסכמה שעליו חתמה כל אחת מהמרואיינות לפני הראיון. בהתאם להתחייבות לשמירה על פרטיות המשתתפות, בעבודה מופיעים השמות הבדויים בלבד, והטפסים החתומים בשמות המלאים שמורים אצל החוקרות.</w:t>
       </w:r>
     </w:p>
     <w:p>
@@ -9829,7 +9845,7 @@
           <w:szCs w:val="24"/>
           <w:rtl/>
         </w:rPr>
-        <w:t xml:space="preserve">תודה על השתתפותך, חיתאם אבו ריאש</w:t>
+        <w:t xml:space="preserve">תודה על השתתפותך, אמילי</w:t>
       </w:r>
     </w:p>
     <w:p>
@@ -10014,7 +10030,7 @@
           <w:szCs w:val="24"/>
           <w:rtl/>
         </w:rPr>
-        <w:t xml:space="preserve">תודה על השתתפותך, חיתאם אבו ריאש</w:t>
+        <w:t xml:space="preserve">תודה על השתתפותך, אמילי</w:t>
       </w:r>
     </w:p>
     <w:p>
@@ -10199,7 +10215,7 @@
           <w:szCs w:val="24"/>
           <w:rtl/>
         </w:rPr>
-        <w:t xml:space="preserve">תודה על השתתפותך, חיתאם אבו ריאש</w:t>
+        <w:t xml:space="preserve">תודה על השתתפותך, אמילי</w:t>
       </w:r>
     </w:p>
     <w:p>
@@ -10384,7 +10400,7 @@
           <w:szCs w:val="24"/>
           <w:rtl/>
         </w:rPr>
-        <w:t xml:space="preserve">תודה על השתתפותך, חיתאם אבו ריאש</w:t>
+        <w:t xml:space="preserve">תודה על השתתפותך, אמילי</w:t>
       </w:r>
     </w:p>
     <w:p>
@@ -13922,7 +13938,7 @@
           <w:szCs w:val="24"/>
           <w:rtl/>
         </w:rPr>
-        <w:t xml:space="preserve">מראיינת: מראיינת (שם יושלם) תאריך הראיון: 5.10.2026 משך: 44 דקות מקום: חדר המורים, בשעת חלון</w:t>
+        <w:t xml:space="preserve">מראיינת: אמילי תאריך הראיון: 5.10.2026 משך: 44 דקות מקום: חדר המורים, בשעת חלון</w:t>
       </w:r>
     </w:p>
     <w:p>
@@ -14773,7 +14789,7 @@
           <w:szCs w:val="24"/>
           <w:rtl/>
         </w:rPr>
-        <w:t xml:space="preserve">מראיינת: מראיינת (שם יושלם) תאריך הראיון: 7.10.2026 משך: 36 דקות מקום: חצר בית הספר, אחרי שעות הלימודים</w:t>
+        <w:t xml:space="preserve">מראיינת: אמילי תאריך הראיון: 7.10.2026 משך: 36 דקות מקום: חצר בית הספר, אחרי שעות הלימודים</w:t>
       </w:r>
     </w:p>
     <w:p>
@@ -15624,7 +15640,7 @@
           <w:szCs w:val="24"/>
           <w:rtl/>
         </w:rPr>
-        <w:t xml:space="preserve">מראיינת: מראיינת (שם יושלם) תאריך הראיון: 11.10.2026 משך: 45 דקות מקום: חדר המורים של החטיבה, אחרי שעות הלימודים</w:t>
+        <w:t xml:space="preserve">מראיינת: אמילי תאריך הראיון: 11.10.2026 משך: 45 דקות מקום: חדר המורים של החטיבה, אחרי שעות הלימודים</w:t>
       </w:r>
     </w:p>
     <w:p>
@@ -16475,7 +16491,7 @@
           <w:szCs w:val="24"/>
           <w:rtl/>
         </w:rPr>
-        <w:t xml:space="preserve">מראיינת: מראיינת (שם יושלם) תאריך הראיון: 12.10.2026 משך: 47 דקות מקום: חדר רכזת החינוך החברתי, בשעת חלון</w:t>
+        <w:t xml:space="preserve">מראיינת: אמילי תאריך הראיון: 12.10.2026 משך: 47 דקות מקום: חדר רכזת החינוך החברתי, בשעת חלון</w:t>
       </w:r>
     </w:p>
     <w:p>

</xml_diff>

<commit_message>
Cite interview number after each findings quote
Co-Authored-By: Claude Opus 5.5 <noreply@anthropic.com>
Claude-Session: https://claude.ai/code/session_01PCrLuLuf13bgHFN1Akf9GB
</commit_message>
<xml_diff>
--- a/seminar/עבודת סמינר - חיתאם אבו ריאש.docx
+++ b/seminar/עבודת סמינר - חיתאם אבו ריאש.docx
@@ -1130,7 +1130,7 @@
               <w:szCs w:val="24"/>
               <w:rtl/>
             </w:rPr>
-            <w:t>14</w:t>
+            <w:t>15</w:t>
           </w:r>
         </w:p>
         <w:p>
@@ -5292,7 +5292,7 @@
           <w:szCs w:val="24"/>
           <w:rtl/>
         </w:rPr>
-        <w:t xml:space="preserve">כל המרואיינות תיארו את הקשר עם ההורים כחלק מהותי מעבודתן ולא כתוספת לה. ריהאם אמרה: "בשבילי הקשר עם ההורים הוא לא תוספת לעבודה, הוא חצי מהעבודה." היא הוסיפה:</w:t>
+        <w:t xml:space="preserve">כל המרואיינות תיארו את הקשר עם ההורים כחלק מהותי מעבודתן ולא כתוספת לה. ריהאם אמרה: "בשבילי הקשר עם ההורים הוא לא תוספת לעבודה, הוא חצי מהעבודה" (ראיון 1). היא הוסיפה:</w:t>
       </w:r>
     </w:p>
     <w:p>
@@ -5309,7 +5309,7 @@
           <w:szCs w:val="24"/>
           <w:rtl/>
         </w:rPr>
-        <w:t xml:space="preserve">ואני אגיד משהו שאולי נשמע לא פדגוגי: בשכונה שלנו ההורים הם לא "לקוחות" של בית הספר, הם שכנים, קרובים, אנשים שאני פוגשת בחתונות ובהלוויות. הקשר איתם הוא קשר קהילתי, ובלעדיו בית הספר הוא בניין בתוך שכונה, ולא חלק ממנה.</w:t>
+        <w:t xml:space="preserve">ואני אגיד משהו שאולי נשמע לא פדגוגי: בשכונה שלנו ההורים הם לא "לקוחות" של בית הספר, הם שכנים, קרובים, אנשים שאני פוגשת בחתונות ובהלוויות. הקשר איתם הוא קשר קהילתי, ובלעדיו בית הספר הוא בניין בתוך שכונה, ולא חלק ממנה. (ראיון 1)</w:t>
       </w:r>
     </w:p>
     <w:p>
@@ -5325,7 +5325,7 @@
           <w:szCs w:val="24"/>
           <w:rtl/>
         </w:rPr>
-        <w:t xml:space="preserve">שלוש מורות תיארו את בית הספר כמוסד היחיד בעיר שההורים סומכים עליו. מהא אמרה: "בית הספר הוא לפעמים המוסד היחיד שההורים סומכים עליו. לא על המשטרה, לא על העירייה. אם הקשר איתנו נשבר, אין להם למי ללכת." סוהא ניסחה זאת כך: "בית הספר צריך להיות מוסד של הקהילה, לא מוסד בתוך הקהילה."</w:t>
+        <w:t xml:space="preserve">שלוש מורות תיארו את בית הספר כמוסד היחיד בעיר שההורים סומכים עליו. מהא אמרה: "בית הספר הוא לפעמים המוסד היחיד שההורים סומכים עליו. לא על המשטרה, לא על העירייה. אם הקשר איתנו נשבר, אין להם למי ללכת" (ראיון 2). סוהא ניסחה זאת כך: "בית הספר צריך להיות מוסד של הקהילה, לא מוסד בתוך הקהילה" (ראיון 8).</w:t>
       </w:r>
     </w:p>
     <w:p>
@@ -5359,7 +5359,7 @@
           <w:szCs w:val="24"/>
           <w:rtl/>
         </w:rPr>
-        <w:t xml:space="preserve">שש מהמורות הן בנות העיר, והן תיארו את השייכות לקהילה כיתרון. ריהאם ביקשה מהמחקר לכתוב "שמורה מהקהילה היא לא רק מורה, היא גשר". לצד זה תיארו המורות טשטוש של הגבולות. ריהאם אמרה:</w:t>
+        <w:t xml:space="preserve">שש מהמורות הן בנות העיר, והן תיארו את השייכות לקהילה כיתרון. ריהאם ביקשה מהמחקר לכתוב "שמורה מהקהילה היא לא רק מורה, היא גשר" (ראיון 1). לצד זה תיארו המורות טשטוש של הגבולות. ריהאם אמרה:</w:t>
       </w:r>
     </w:p>
     <w:p>
@@ -5376,7 +5376,7 @@
           <w:szCs w:val="24"/>
           <w:rtl/>
         </w:rPr>
-        <w:t xml:space="preserve">וקשה לי הגבול: כשאני מורה מהשכונה, ההורים מתקשרים אליי בשבת, פוגשים אותי בסופר, מבקשים ממני דברים שלא קשורים לבית הספר, ואני לא יודעת תמיד איפה אני מורה ואיפה אני שכנה.</w:t>
+        <w:t xml:space="preserve">וקשה לי הגבול: כשאני מורה מהשכונה, ההורים מתקשרים אליי בשבת, פוגשים אותי בסופר, מבקשים ממני דברים שלא קשורים לבית הספר, ואני לא יודעת תמיד איפה אני מורה ואיפה אני שכנה. (ראיון 1)</w:t>
       </w:r>
     </w:p>
     <w:p>
@@ -5392,7 +5392,7 @@
           <w:szCs w:val="24"/>
           <w:rtl/>
         </w:rPr>
-        <w:t xml:space="preserve">פאטמה סיפרה על אמא, שהייתה תלמידה שלה, שבאה לביתה בערב וביקשה לשנות ציון "בשביל הכבוד". מאז קבעה לעצמה כלל: "מורה מהשכונה צריכה גבולות ברורים, ושהגבול הראשון הוא הבית." ריהאם הואשמה בקבוצת הוואטסאפ של הכיתה שהיא "מעדיפה את הקרובים שלה". המורות שאינן מלוד חוו את הצד השני. נסרין סיפרה על אב שהאשים אותה שהיא "זרה" שבאה מרמלה, ולמדה מכך ש"האשמה "את זרה" היא לא על המוצא שלי, היא על הפחד שלו שבית הספר נגד הילד שלו", ואמאני שמעה מאב כי "בכפר שלי אולי ככה מתנהגים, אבל בלוד לא". שתיהן תיארו את הזרות גם כיתרון. נסרין אמרה: "אני לא מעורבת בסכסוכים בין המשפחות, ואני לא "של" אף אחד, ואחרי שהאמון נבנה, זה יתרון." אמאני סיפרה ש"הורים מספרים לי דברים שלא יספרו למורה מהשכונה שלהם".</w:t>
+        <w:t xml:space="preserve">פאטמה סיפרה על אמא, שהייתה תלמידה שלה, שבאה לביתה בערב וביקשה לשנות ציון "בשביל הכבוד". מאז קבעה לעצמה כלל: "מורה מהשכונה צריכה גבולות ברורים, ושהגבול הראשון הוא הבית" (ראיון 5). ריהאם הואשמה בקבוצת הוואטסאפ של הכיתה שהיא "מעדיפה את הקרובים שלה" (ראיון 1). המורות שאינן מלוד חוו את הצד השני. נסרין סיפרה על אב שהאשים אותה שהיא "זרה" שבאה מרמלה, ולמדה מכך ש"האשמה "את זרה" היא לא על המוצא שלי, היא על הפחד שלו שבית הספר נגד הילד שלו" (ראיון 4), ואמאני שמעה מאב כי "בכפר שלי אולי ככה מתנהגים, אבל בלוד לא" (ראיון 7). שתיהן תיארו את הזרות גם כיתרון. נסרין אמרה: "אני לא מעורבת בסכסוכים בין המשפחות, ואני לא "של" אף אחד, ואחרי שהאמון נבנה, זה יתרון" (ראיון 4). אמאני סיפרה ש"הורים מספרים לי דברים שלא יספרו למורה מהשכונה שלהם" (ראיון 7).</w:t>
       </w:r>
     </w:p>
     <w:p>
@@ -5443,7 +5443,7 @@
           <w:szCs w:val="24"/>
           <w:rtl/>
         </w:rPr>
-        <w:t xml:space="preserve">ישבנו, והיא סיפרה: הם המשפחה הערבית היחידה בבניין, ואחרי מאי 2021 השכנים הפסיקו לדבר איתם, ומישהו כתב על הדלת שלהם. הילד מפחד לרדת לבד למטה, ולכן לא בא לבית הספר כשהיא בעבודה.</w:t>
+        <w:t xml:space="preserve">ישבנו, והיא סיפרה: הם המשפחה הערבית היחידה בבניין, ואחרי מאי 2021 השכנים הפסיקו לדבר איתם, ומישהו כתב על הדלת שלהם. הילד מפחד לרדת לבד למטה, ולכן לא בא לבית הספר כשהיא בעבודה. (ראיון 4)</w:t>
       </w:r>
     </w:p>
     <w:p>
@@ -5459,7 +5459,7 @@
           <w:szCs w:val="24"/>
           <w:rtl/>
         </w:rPr>
-        <w:t xml:space="preserve">כמעט כל המורות תיארו את עצמן כמתרגמות, משום שהתקשורת העירונית והממשלתית מגיעה בעברית. מהא סיפרה על מכתב של העירייה על חיסונים שההורים לא הבינו, ומאז היא "לא מעבירה הלאה שום מסמך בעברית בלי הודעה בערבית לצידו". סוהא תיארה את הפחד של ההורים מהמוסדות, ולמדה "שהורים בלוד מפחדים מהרווחה יותר מהמשטרה, ושבית הספר צריך להיות הגשר, לא השער". מהא סיכמה: "אי אפשר לדבר על שותפות עם הורים בלי לדבר על מה שקורה ברחוב שלהם."</w:t>
+        <w:t xml:space="preserve">כמעט כל המורות תיארו את עצמן כמתרגמות, משום שהתקשורת העירונית והממשלתית מגיעה בעברית. מהא סיפרה על מכתב של העירייה על חיסונים שההורים לא הבינו, ומאז היא "לא מעבירה הלאה שום מסמך בעברית בלי הודעה בערבית לצידו" (ראיון 2). סוהא תיארה את הפחד של ההורים מהמוסדות, ולמדה "שהורים בלוד מפחדים מהרווחה יותר מהמשטרה, ושבית הספר צריך להיות הגשר, לא השער" (ראיון 8). מהא סיכמה: "אי אפשר לדבר על שותפות עם הורים בלי לדבר על מה שקורה ברחוב שלהם" (ראיון 2).</w:t>
       </w:r>
     </w:p>
     <w:p>
@@ -5544,7 +5544,7 @@
           <w:szCs w:val="24"/>
           <w:rtl/>
         </w:rPr>
-        <w:t xml:space="preserve">הוואטסאפ הוא הערוץ העיקרי בכל בתי הספר. סמר תיארה את הציפייה של הורים בכיתה ב': "בכיתה ב' ההורים מצפים להודעה כל יום, מה למדנו, מה שיעורי הבית, מה להביא. בלי ההודעה היומית אני מקבלת עשרים טלפונים." מערכת משו"ב כמעט אינה בשימוש בקרב ההורים. ריהאם אמרה ש"רוב ההורים אצלנו לא נכנסים אליה, חלקם לא יודעים איך וחלקם בלי מחשב", ומהא העריכה ש"אולי עשרים אחוז מההורים" פותחים אותה. בבית הספר של נסרין פועל גם עמוד פייסבוק, ולדבריה "ההורים רואים את בית הספר, את הטקסים, את הילדים, והם גאים, ומגיבים, ומשתפים, וזה בנה תחושה של קהילה שלא הייתה קודם".</w:t>
+        <w:t xml:space="preserve">הוואטסאפ הוא הערוץ העיקרי בכל בתי הספר. סמר תיארה את הציפייה של הורים בכיתה ב': "בכיתה ב' ההורים מצפים להודעה כל יום, מה למדנו, מה שיעורי הבית, מה להביא. בלי ההודעה היומית אני מקבלת עשרים טלפונים" (ראיון 3). מערכת משו"ב כמעט אינה בשימוש בקרב ההורים. ריהאם אמרה ש"רוב ההורים אצלנו לא נכנסים אליה, חלקם לא יודעים איך וחלקם בלי מחשב" (ראיון 1), ומהא העריכה ש"אולי עשרים אחוז מההורים" (ראיון 2) פותחים אותה. בבית הספר של נסרין פועל גם עמוד פייסבוק, ולדבריה "ההורים רואים את בית הספר, את הטקסים, את הילדים, והם גאים, ומגיבים, ומשתפים, וזה בנה תחושה של קהילה שלא הייתה קודם" (ראיון 4).</w:t>
       </w:r>
     </w:p>
     <w:p>
@@ -5577,7 +5577,7 @@
           <w:szCs w:val="24"/>
           <w:rtl/>
         </w:rPr>
-        <w:t xml:space="preserve">משו"ב, אני רושמת בו נוכחות, וההורים לא פותחים אותו, אני יודעת, כי כשאני שואלת "ראית במשו"ב" הם אומרים "מה זה". ... מה שעובד הכי טוב: פגישה פנים אל פנים עם האמא, ואחריה, המחברת. הווטסאפ הוא הכי נוח, אבל הוא הכי פחות עמוק.</w:t>
+        <w:t xml:space="preserve">משו"ב, אני רושמת בו נוכחות, וההורים לא פותחים אותו, אני יודעת, כי כשאני שואלת "ראית במשו"ב" הם אומרים "מה זה". ... מה שעובד הכי טוב: פגישה פנים אל פנים עם האמא, ואחריה, המחברת. הווטסאפ הוא הכי נוח, אבל הוא הכי פחות עמוק. (ראיון 3)</w:t>
       </w:r>
     </w:p>
     <w:p>
@@ -5611,7 +5611,7 @@
           <w:szCs w:val="24"/>
           <w:rtl/>
         </w:rPr>
-        <w:t xml:space="preserve">היחס של המורות לכלים הדיגיטליים היה כפול. ריהאם אמרה שהם "שינו את הקשר לגמרי, לטובה ולרעה", ונסרין אמרה שהכלים "עזרו לנו להגיע לכולם ופגעו ביכולת שלנו להגיע למישהו". את הסתירה הזאת יישבו המורות בהבחנה בין העברת מידע ובין בניית יחסים. ריהאם הסבירה:</w:t>
+        <w:t xml:space="preserve">היחס של המורות לכלים הדיגיטליים היה כפול. ריהאם אמרה שהם "שינו את הקשר לגמרי, לטובה ולרעה" (ראיון 1), ונסרין אמרה שהכלים "עזרו לנו להגיע לכולם ופגעו ביכולת שלנו להגיע למישהו" (ראיון 4). את הסתירה הזאת יישבו המורות בהבחנה בין העברת מידע ובין בניית יחסים. ריהאם הסבירה:</w:t>
       </w:r>
     </w:p>
     <w:p>
@@ -5628,7 +5628,7 @@
           <w:szCs w:val="24"/>
           <w:rtl/>
         </w:rPr>
-        <w:t xml:space="preserve">ההבדל בין פנים אל פנים לבין הודעות הוא ההבדל בין קשר לבין מידע. בפגישה אני רואה את ההורה, הוא רואה אותי, ואנחנו שני אנשים שאכפת להם מאותו ילד. בהודעה אני "בית הספר" והוא "ההורה", ושני צדדים.</w:t>
+        <w:t xml:space="preserve">ההבדל בין פנים אל פנים לבין הודעות הוא ההבדל בין קשר לבין מידע. בפגישה אני רואה את ההורה, הוא רואה אותי, ואנחנו שני אנשים שאכפת להם מאותו ילד. בהודעה אני "בית הספר" והוא "ההורה", ושני צדדים. (ראיון 1)</w:t>
       </w:r>
     </w:p>
     <w:p>
@@ -5644,7 +5644,7 @@
           <w:szCs w:val="24"/>
           <w:rtl/>
         </w:rPr>
-        <w:t xml:space="preserve">פאטמה ניסחה זאת כך: "פנים אל פנים זה שיחה, טלפון זה חצי שיחה, הודעה זה פתק." רנא אמרה: "בפנים אני יכולה להגיד לאמא דבר קשה והיא תקבל, כי היא רואה שאכפת לי. בהודעה אותו דבר הוא עלבון." מכאן גזרו כמה מורות כלל עבודה. מהא אמרה: "כל דבר שיש בו רגש, לא בווטסאפ."</w:t>
+        <w:t xml:space="preserve">פאטמה ניסחה זאת כך: "פנים אל פנים זה שיחה, טלפון זה חצי שיחה, הודעה זה פתק" (ראיון 5). רנא אמרה: "בפנים אני יכולה להגיד לאמא דבר קשה והיא תקבל, כי היא רואה שאכפת לי. בהודעה אותו דבר הוא עלבון" (ראיון 6). מכאן גזרו כמה מורות כלל עבודה. מהא אמרה: "כל דבר שיש בו רגש, לא בווטסאפ" (ראיון 2).</w:t>
       </w:r>
     </w:p>
     <w:p>
@@ -5678,7 +5678,7 @@
           <w:szCs w:val="24"/>
           <w:rtl/>
         </w:rPr>
-        <w:t xml:space="preserve">המורות תיארו שלושה מחירים. הראשון הוא זמינות מתמדת. מהא אמרה: "אני מקבלת הודעות בחצות, ואם לא עניתי, זה "למורה לא אכפת"." השני הוא הפיכת הקבוצה לזירה. לדברי מהא, "מספיק הורה אחד שכותב משהו נגד מורה, וכל הכיתה בלהבות, ובשכונה שלנו זה יוצא מהקבוצה לרחוב". סוהא סיפרה על סכסוך בין שתי משפחות שהתחיל בהודעה של מורה, והסבירה שהודעה כתובה "נשמרת, מועברת, נקראת לא נכון, ומגיעה למג'לס". השלישי הוא הדרה. סמר אמרה:</w:t>
+        <w:t xml:space="preserve">המורות תיארו שלושה מחירים. הראשון הוא זמינות מתמדת. מהא אמרה: "אני מקבלת הודעות בחצות, ואם לא עניתי, זה "למורה לא אכפת"" (ראיון 2). השני הוא הפיכת הקבוצה לזירה. לדברי מהא, "מספיק הורה אחד שכותב משהו נגד מורה, וכל הכיתה בלהבות, ובשכונה שלנו זה יוצא מהקבוצה לרחוב" (ראיון 2). סוהא סיפרה על סכסוך בין שתי משפחות שהתחיל בהודעה של מורה, והסבירה שהודעה כתובה "נשמרת, מועברת, נקראת לא נכון, ומגיעה למג'לס" (ראיון 8). השלישי הוא הדרה. סמר אמרה:</w:t>
       </w:r>
     </w:p>
     <w:p>
@@ -5695,7 +5695,7 @@
           <w:szCs w:val="24"/>
           <w:rtl/>
         </w:rPr>
-        <w:t xml:space="preserve">והכלים האלה מפלים: אמהות שיודעות לכתוב כותבות, שואלות, מבקשות, והילדים שלהן מקבלים יותר תשומת לב, ואמהות שלא כותבות שותקות. ואני צריכה לזכור כל הזמן את מי אני לא שומעת.</w:t>
+        <w:t xml:space="preserve">והכלים האלה מפלים: אמהות שיודעות לכתוב כותבות, שואלות, מבקשות, והילדים שלהן מקבלים יותר תשומת לב, ואמהות שלא כותבות שותקות. ואני צריכה לזכור כל הזמן את מי אני לא שומעת. (ראיון 3)</w:t>
       </w:r>
     </w:p>
     <w:p>
@@ -5711,7 +5711,7 @@
           <w:szCs w:val="24"/>
           <w:rtl/>
         </w:rPr>
-        <w:t xml:space="preserve">רנא אמרה שהכלים הדיגיטליים הם "כלי לאמהות ולא לאבות", ופאטמה גילתה במקרה שסבתא שמגדלת נכד לא קיבלה אף הודעה במשך שנה שלמה. בחטיבת הביניים תיארה אמאני מחיר נוסף: ההורים רואים כל ציון במערכת "לפני שהילד הספיק לספר, ואז בבית יש מלחמה, והילד מאשים אותי שאני "מלשינה"".</w:t>
+        <w:t xml:space="preserve">רנא אמרה שהכלים הדיגיטליים הם "כלי לאמהות ולא לאבות" (ראיון 6), ופאטמה גילתה במקרה שסבתא שמגדלת נכד לא קיבלה אף הודעה במשך שנה שלמה. בחטיבת הביניים תיארה אמאני מחיר נוסף: ההורים רואים כל ציון במערכת "לפני שהילד הספיק לספר, ואז בבית יש מלחמה, והילד מאשים אותי שאני "מלשינה"".</w:t>
       </w:r>
     </w:p>
     <w:p>
@@ -5745,7 +5745,7 @@
           <w:szCs w:val="24"/>
           <w:rtl/>
         </w:rPr>
-        <w:t xml:space="preserve">לצד הערוצים הרשמיים פיתחו המורות ערוצים בלתי פורמליים, שאותם תיארו כיעילים ביותר. מהא אמרה: "ויש משהו שלא רשום בשום מקום: השער. אני עומדת בשער בבוקר, וחצי מהתקשורת שלי עם הורים קורית שם, בשתי דקות." רנא מדברת עם אבות ליד גדר המגרש, ולדבריה "הורה לא יבוא לפגישה, אבל ידבר איתי ליד הגדר על הילד שלו עשרים דקות". נסרין עורכת כעשרים ביקורי בית בשנה ו"בוקר קפה" חודשי לאמהות, והסבירה:</w:t>
+        <w:t xml:space="preserve">לצד הערוצים הרשמיים פיתחו המורות ערוצים בלתי פורמליים, שאותם תיארו כיעילים ביותר. מהא אמרה: "ויש משהו שלא רשום בשום מקום: השער. אני עומדת בשער בבוקר, וחצי מהתקשורת שלי עם הורים קורית שם, בשתי דקות" (ראיון 2). רנא מדברת עם אבות ליד גדר המגרש, ולדבריה "הורה לא יבוא לפגישה, אבל ידבר איתי ליד הגדר על הילד שלו עשרים דקות" (ראיון 6). נסרין עורכת כעשרים ביקורי בית בשנה ו"בוקר קפה" חודשי לאמהות, והסבירה:</w:t>
       </w:r>
     </w:p>
     <w:p>
@@ -5762,7 +5762,7 @@
           <w:szCs w:val="24"/>
           <w:rtl/>
         </w:rPr>
-        <w:t xml:space="preserve">הדברים שעובדים הם אלה שבהם ההורה לא מרגיש "מזומן" אלא "מוזמן". בבוקר קפה אמא שלא באה לאסיפת הורים אף פעם יושבת שעה ומספרת לי על הבית שלה.</w:t>
+        <w:t xml:space="preserve">הדברים שעובדים הם אלה שבהם ההורה לא מרגיש "מזומן" אלא "מוזמן". בבוקר קפה אמא שלא באה לאסיפת הורים אף פעם יושבת שעה ומספרת לי על הבית שלה. (ראיון 4)</w:t>
       </w:r>
     </w:p>
     <w:p>
@@ -5778,7 +5778,7 @@
           <w:szCs w:val="24"/>
           <w:rtl/>
         </w:rPr>
-        <w:t xml:space="preserve">פאטמה מקיימת "שעת הורים" שבועית בלי תיאום מראש, וסמר משתמשת ב"מחברת קשר", שלדבריה "עובד דווקא עם ההורים שלא בווטסאפ". בחטיבת הביניים תיארה אמאני את "הפגישה המשולשת" של המורה, ההורה והתלמיד: "כשהילד בחדר, הוא שומע שההורה ואני אומרים אותו דבר, וזה הדבר שהכי משפיע עליו."</w:t>
+        <w:t xml:space="preserve">פאטמה מקיימת "שעת הורים" שבועית בלי תיאום מראש, וסמר משתמשת ב"מחברת קשר", שלדבריה "עובד דווקא עם ההורים שלא בווטסאפ" (ראיון 3). בחטיבת הביניים תיארה אמאני את "הפגישה המשולשת" של המורה, ההורה והתלמיד: "כשהילד בחדר, הוא שומע שההורה ואני אומרים אותו דבר, וזה הדבר שהכי משפיע עליו" (ראיון 7).</w:t>
       </w:r>
     </w:p>
     <w:p>
@@ -5863,7 +5863,7 @@
           <w:szCs w:val="24"/>
           <w:rtl/>
         </w:rPr>
-        <w:t xml:space="preserve">כמעט כל המורות דיווחו שהן יוזמות את רוב הקשר, וכי ההורים פונים בעיקר כשיש בעיה. מהא אמרה: "בשכבה שלי אני יוזמת את רוב הקשר, וזה בעיה, כי זה אומר שההורים שומעים ממני בעיקר כשיש בעיה." מכאן צמחה אסטרטגיה משותפת לרובן: הפנייה הראשונה להורה תהיה חיובית. ריהאם סיפרה ש"הורה שקיבל ממני טלפון חיובי אחד בתחילת השנה עונה לי אחרת כשאני מתקשרת על בעיה". נסרין הסבירה:</w:t>
+        <w:t xml:space="preserve">כמעט כל המורות דיווחו שהן יוזמות את רוב הקשר, וכי ההורים פונים בעיקר כשיש בעיה. מהא אמרה: "בשכבה שלי אני יוזמת את רוב הקשר, וזה בעיה, כי זה אומר שההורים שומעים ממני בעיקר כשיש בעיה" (ראיון 2). מכאן צמחה אסטרטגיה משותפת לרובן: הפנייה הראשונה להורה תהיה חיובית. ריהאם סיפרה ש"הורה שקיבל ממני טלפון חיובי אחד בתחילת השנה עונה לי אחרת כשאני מתקשרת על בעיה" (ראיון 1). נסרין הסבירה:</w:t>
       </w:r>
     </w:p>
     <w:p>
@@ -5880,7 +5880,7 @@
           <w:szCs w:val="24"/>
           <w:rtl/>
         </w:rPr>
-        <w:t xml:space="preserve">למדתי שהפנייה הראשונה בשנה קובעת את כל השנה: אם הפנייה הראשונה היא על בעיה, ההורה "נרשם" כבעייתי בעיני עצמו, ולא יבוא. אם הפנייה הראשונה היא הזמנה, הוא בא.</w:t>
+        <w:t xml:space="preserve">למדתי שהפנייה הראשונה בשנה קובעת את כל השנה: אם הפנייה הראשונה היא על בעיה, ההורה "נרשם" כבעייתי בעיני עצמו, ולא יבוא. אם הפנייה הראשונה היא הזמנה, הוא בא. (ראיון 4)</w:t>
       </w:r>
     </w:p>
     <w:p>
@@ -5896,7 +5896,7 @@
           <w:szCs w:val="24"/>
           <w:rtl/>
         </w:rPr>
-        <w:t xml:space="preserve">פאטמה מתקשרת להורה שאינו מעורב רק על דברים טובים במשך השנה הראשונה, ולדבריה "ההורים פונים למי שפנה אליהם קודם". רנא מגיעה לאבות דרך הכדורגל: "אבא שקיבל ממני שלושה טלפונים על כדורגל עונה לטלפון הרביעי על בעיה." בחטיבת הביניים מתקשרת אמאני להגיד "משהו שהילד אמר או עשה שהפתיע אותי לטובה".</w:t>
+        <w:t xml:space="preserve">פאטמה מתקשרת להורה שאינו מעורב רק על דברים טובים במשך השנה הראשונה, ולדבריה "ההורים פונים למי שפנה אליהם קודם" (ראיון 5). רנא מגיעה לאבות דרך הכדורגל: "אבא שקיבל ממני שלושה טלפונים על כדורגל עונה לטלפון הרביעי על בעיה" (ראיון 6). בחטיבת הביניים מתקשרת אמאני להגיד "משהו שהילד אמר או עשה שהפתיע אותי לטובה" (ראיון 7).</w:t>
       </w:r>
     </w:p>
     <w:p>
@@ -5947,7 +5947,7 @@
           <w:szCs w:val="24"/>
           <w:rtl/>
         </w:rPr>
-        <w:t xml:space="preserve">המסר שלי הוא שההורים בלוד לא "לא מעורבים". הם מעורבים בחיים של הילדים שלהם יותר מרוב ההורים שאני מכירה, רק לא בדרך שבית הספר מצפה לה. אבא שעובד שתים עשרה שעות כדי שהילד יהיה בסדר הוא מעורב. אמא שלא יודעת לקרוא ושולחת את הילד נקי ומסורק כל בוקר היא מעורבת.</w:t>
+        <w:t xml:space="preserve">המסר שלי הוא שההורים בלוד לא "לא מעורבים". הם מעורבים בחיים של הילדים שלהם יותר מרוב ההורים שאני מכירה, רק לא בדרך שבית הספר מצפה לה. אבא שעובד שתים עשרה שעות כדי שהילד יהיה בסדר הוא מעורב. אמא שלא יודעת לקרוא ושולחת את הילד נקי ומסורק כל בוקר היא מעורבת. (ראיון 1)</w:t>
       </w:r>
     </w:p>
     <w:p>
@@ -5963,7 +5963,7 @@
           <w:szCs w:val="24"/>
           <w:rtl/>
         </w:rPr>
-        <w:t xml:space="preserve">מהא תיארה אותם כ"לא הורים אדישים", אלא "הורים שקועים" בעבודה, בעוני, בבעיות משפטיות ובבריאות. סמר סיפרה על אם שהוזמנה לשיחה על אבחון בנה:</w:t>
+        <w:t xml:space="preserve">מהא תיארה אותם כ"לא הורים אדישים" (ראיון 2), אלא "הורים שקועים" בעבודה, בעוני, בבעיות משפטיות ובבריאות. סמר סיפרה על אם שהוזמנה לשיחה על אבחון בנה:</w:t>
       </w:r>
     </w:p>
     <w:p>
@@ -5980,7 +5980,7 @@
           <w:szCs w:val="24"/>
           <w:rtl/>
         </w:rPr>
-        <w:t xml:space="preserve">היא באה, ישבה, ולפני שאמרתי מילה, היא אמרה: "אני יודעת שהוא לא קורא. אני לא קוראת. אני לא יכולה לעזור לו." ואז היא בכתה. ואני, שהכנתי נאום על אבחון, הבנתי שהנאום לא רלוונטי.</w:t>
+        <w:t xml:space="preserve">היא באה, ישבה, ולפני שאמרתי מילה, היא אמרה: "אני יודעת שהוא לא קורא. אני לא קוראת. אני לא יכולה לעזור לו." ואז היא בכתה. ואני, שהכנתי נאום על אבחון, הבנתי שהנאום לא רלוונטי. (ראיון 3)</w:t>
       </w:r>
     </w:p>
     <w:p>
@@ -5996,7 +5996,7 @@
           <w:szCs w:val="24"/>
           <w:rtl/>
         </w:rPr>
-        <w:t xml:space="preserve">מאז שינתה סמר את ציפיותיה: "מאמא שלא יודעת לקרוא אני לא מצפה שתבדוק שיעורי בית, אני מבקשת שתשב ליד הילד כשהוא עושה אותם." גם מהא תיארה שינוי דומה. אחרי ביקור בית אצל אב שגידל לבד חמישה ילדים, ושבנו נשאר בבית לשמור על הקטנים, אמרה: "אחרי השיחה הרגשתי בושה על הכעס. למדתי שלפני שאני שופטת הורה, אני צריכה לראות את הבית." אמאני הוסיפה שבחטיבת הביניים חלק מההורים ויתרו, ולדבריה הם ויתרו "אחרי שבית הספר ויתר על הילדים הגדולים שלהם". היא הזמינה אם שבעלה בכלא לשבת פעם בשבוע בחדר המורים, והסיקה "שלפעמים נוכחות של אמא בבית הספר, בלי שום תפקיד, היא התערבות חינוכית".</w:t>
+        <w:t xml:space="preserve">מאז שינתה סמר את ציפיותיה: "מאמא שלא יודעת לקרוא אני לא מצפה שתבדוק שיעורי בית, אני מבקשת שתשב ליד הילד כשהוא עושה אותם" (ראיון 3). גם מהא תיארה שינוי דומה. אחרי ביקור בית אצל אב שגידל לבד חמישה ילדים, ושבנו נשאר בבית לשמור על הקטנים, אמרה: "אחרי השיחה הרגשתי בושה על הכעס. למדתי שלפני שאני שופטת הורה, אני צריכה לראות את הבית" (ראיון 2). אמאני הוסיפה שבחטיבת הביניים חלק מההורים ויתרו, ולדבריה הם ויתרו "אחרי שבית הספר ויתר על הילדים הגדולים שלהם" (ראיון 7). היא הזמינה אם שבעלה בכלא לשבת פעם בשבוע בחדר המורים, והסיקה "שלפעמים נוכחות של אמא בבית הספר, בלי שום תפקיד, היא התערבות חינוכית" (ראיון 7).</w:t>
       </w:r>
     </w:p>
     <w:p>
@@ -6030,7 +6030,7 @@
           <w:szCs w:val="24"/>
           <w:rtl/>
         </w:rPr>
-        <w:t xml:space="preserve">המורות הגיעו להורים דרך הילד, דרך הסבתא, דרך השער ודרך הורים אחרים, ולא דרך מכתבים או מערכות. ריהאם נותנת לילד הזמנה שכתב בעצמו, "כי הורה שלא עונה למורה עונה לילד שלו". נסרין מבקשת מהורים מעורבים להביא הורה נוסף, "אמא מביאה אמא", ומבקשת מההורים דברים שהם יודעים לעשות: "הורה שהתבקש בגלל מה שהוא יודע מגיע. הורה שהתבקש כי "צריך הורים" לא." סוהא תיארה הגעה להורים דרך המבנה של הקהילה:</w:t>
+        <w:t xml:space="preserve">המורות הגיעו להורים דרך הילד, דרך הסבתא, דרך השער ודרך הורים אחרים, ולא דרך מכתבים או מערכות. ריהאם נותנת לילד הזמנה שכתב בעצמו, "כי הורה שלא עונה למורה עונה לילד שלו" (ראיון 1). נסרין מבקשת מהורים מעורבים להביא הורה נוסף, "אמא מביאה אמא" (ראיון 4), ומבקשת מההורים דברים שהם יודעים לעשות: "הורה שהתבקש בגלל מה שהוא יודע מגיע. הורה שהתבקש כי "צריך הורים" לא" (ראיון 4). סוהא תיארה הגעה להורים דרך המבנה של הקהילה:</w:t>
       </w:r>
     </w:p>
     <w:p>
@@ -6047,7 +6047,7 @@
           <w:szCs w:val="24"/>
           <w:rtl/>
         </w:rPr>
-        <w:t xml:space="preserve">אני מגיעה ללא מעורבים דרך המבנה: דרך הנשים הזקנות, דרך משפחה מכובדת שתלווה אותם, דרך יום המשפחה שבו כולם מוזמנים באותו כבוד. ודרך דבר שאני מקפידה עליו: בכל אירוע של בית הספר, אני מזמינה אישית, בטלפון, את המשפחות החלשות, ומושיבה אותן בשורה הראשונה. זה נשמע קטן. בקהילה שלנו, השורה הראשונה היא הכול.</w:t>
+        <w:t xml:space="preserve">אני מגיעה ללא מעורבים דרך המבנה: דרך הנשים הזקנות, דרך משפחה מכובדת שתלווה אותם, דרך יום המשפחה שבו כולם מוזמנים באותו כבוד. ודרך דבר שאני מקפידה עליו: בכל אירוע של בית הספר, אני מזמינה אישית, בטלפון, את המשפחות החלשות, ומושיבה אותן בשורה הראשונה. זה נשמע קטן. בקהילה שלנו, השורה הראשונה היא הכול. (ראיון 8)</w:t>
       </w:r>
     </w:p>
     <w:p>
@@ -6080,7 +6080,7 @@
           <w:szCs w:val="24"/>
           <w:rtl/>
         </w:rPr>
-        <w:t xml:space="preserve">אני מגיעה אליהם דרך מי שאני: אני מתקשרת, לא שולחת. אני פוגשת אותם בשכונה, לא רק בבית הספר. אני פונה לסבתא, שהרבה פעמים היא האדם הפתוח ביותר בבית. ואני משתמשת בערב הקריאה ובסבתא מספרת, שהם דברים שההורה לא צריך להיות משכיל בשבילם.</w:t>
+        <w:t xml:space="preserve">אני מגיעה אליהם דרך מי שאני: אני מתקשרת, לא שולחת. אני פוגשת אותם בשכונה, לא רק בבית הספר. אני פונה לסבתא, שהרבה פעמים היא האדם הפתוח ביותר בבית. ואני משתמשת בערב הקריאה ובסבתא מספרת, שהם דברים שההורה לא צריך להיות משכיל בשבילם. (ראיון 5)</w:t>
       </w:r>
     </w:p>
     <w:p>
@@ -6165,7 +6165,7 @@
           <w:szCs w:val="24"/>
           <w:rtl/>
         </w:rPr>
-        <w:t xml:space="preserve">ברמת בית הספר ההורים שותפים בעיקר בעזרה ובנוכחות: טקסים, טיולים וועד הורים שאוסף כסף. בהחלטות הם כמעט אינם שותפים. ריהאם אמרה שההחלטות "נעשות בבית הספר, והוועד מתבקש לאשר או לעזור", והסבירה שהסיבה אינה התנגדות של בית הספר, אלא ש"ההורים לא מצפים לזה, ואף אחד לא הציע". מהא אמרה: "הבעיה היא שבית הספר רגיל לראות בהורים או עזרה או בעיה, ולא שותף שיודע משהו."</w:t>
+        <w:t xml:space="preserve">ברמת בית הספר ההורים שותפים בעיקר בעזרה ובנוכחות: טקסים, טיולים וועד הורים שאוסף כסף. בהחלטות הם כמעט אינם שותפים. ריהאם אמרה שההחלטות "נעשות בבית הספר, והוועד מתבקש לאשר או לעזור" (ראיון 1), והסבירה שהסיבה אינה התנגדות של בית הספר, אלא ש"ההורים לא מצפים לזה, ואף אחד לא הציע" (ראיון 1). מהא אמרה: "הבעיה היא שבית הספר רגיל לראות בהורים או עזרה או בעיה, ולא שותף שיודע משהו" (ראיון 2).</w:t>
       </w:r>
     </w:p>
     <w:p>
@@ -6198,7 +6198,7 @@
           <w:szCs w:val="24"/>
           <w:rtl/>
         </w:rPr>
-        <w:t xml:space="preserve">בקבלת החלטות, אצלנו כמעט לא, ואני אגיד למה אני חושבת: המנהל שלנו הוא מהדור הישן, כמוני, והוא רואה בהורים אורחים מכובדים ולא שותפים. הם מוזמנים, מכבדים אותם, שומעים אותם, ומחליטים בלעדיהם. ... בערב הקריאה האחרון, אמהות הציעו לפתוח ספרייה שכונתית, ואני הבאתי את זה למנהל, והוא אמר "נראה". אז, בעזרה כן, בהחלטות עדיין לא.</w:t>
+        <w:t xml:space="preserve">בקבלת החלטות, אצלנו כמעט לא, ואני אגיד למה אני חושבת: המנהל שלנו הוא מהדור הישן, כמוני, והוא רואה בהורים אורחים מכובדים ולא שותפים. הם מוזמנים, מכבדים אותם, שומעים אותם, ומחליטים בלעדיהם. ... בערב הקריאה האחרון, אמהות הציעו לפתוח ספרייה שכונתית, ואני הבאתי את זה למנהל, והוא אמר "נראה". אז, בעזרה כן, בהחלטות עדיין לא. (ראיון 5)</w:t>
       </w:r>
     </w:p>
     <w:p>
@@ -6265,7 +6265,7 @@
           <w:szCs w:val="24"/>
           <w:rtl/>
         </w:rPr>
-        <w:t xml:space="preserve">מה שגרם להצלחה, לדעתי: שלא ביקשתי מהם לבוא "להורים", ביקשתי מהם לבוא כמומחים. שהשעה הייתה שלהם ולא שלי. ושהילד היה הסיבה, לא בית הספר.</w:t>
+        <w:t xml:space="preserve">מה שגרם להצלחה, לדעתי: שלא ביקשתי מהם לבוא "להורים", ביקשתי מהם לבוא כמומחים. שהשעה הייתה שלהם ולא שלי. ושהילד היה הסיבה, לא בית הספר. (ראיון 1)</w:t>
       </w:r>
     </w:p>
     <w:p>
@@ -6281,7 +6281,7 @@
           <w:szCs w:val="24"/>
           <w:rtl/>
         </w:rPr>
-        <w:t xml:space="preserve">בפרויקט הקריאה של סמר הגיעו 26 מתוך 32 משפחות לספר סיפור בכיתה, ונאמר להן שמי שאינו יודע לקרוא יכול לספר בעל פה. בפרויקט "סבתא מספרת" של פאטמה הגיעו 14 סבתות לספר על לוד של פעם. ב"שוק הקהילה" שארגנה נסרין הפעילו יותר ממאה הורים דוכנים של מה שהם יודעים לעשות, ולדבריה "ההורים שהכירו זה את זה בשוק התחילו לעזור זה לזה". פאטמה הסבירה את הצלחת "סבתא מספרת" בכך "שהילדים ראו את המשפחה שלהם בתוך בית הספר כמקור של ידע, לא כמקור של בעיות". רנא הקימה קבוצת כדורסל לבנות, ולדבריה "לאימונים יש "ספסל אמהות" קבוע, שהפך למקום שבו אני עושה את רוב העבודה שלי כמחנכת".</w:t>
+        <w:t xml:space="preserve">בפרויקט הקריאה של סמר הגיעו 26 מתוך 32 משפחות לספר סיפור בכיתה, ונאמר להן שמי שאינו יודע לקרוא יכול לספר בעל פה. בפרויקט "סבתא מספרת" של פאטמה הגיעו 14 סבתות לספר על לוד של פעם. ב"שוק הקהילה" שארגנה נסרין הפעילו יותר ממאה הורים דוכנים של מה שהם יודעים לעשות, ולדבריה "ההורים שהכירו זה את זה בשוק התחילו לעזור זה לזה" (ראיון 4). פאטמה הסבירה את הצלחת "סבתא מספרת" בכך "שהילדים ראו את המשפחה שלהם בתוך בית הספר כמקור של ידע, לא כמקור של בעיות" (ראיון 5). רנא הקימה קבוצת כדורסל לבנות, ולדבריה "לאימונים יש "ספסל אמהות" קבוע, שהפך למקום שבו אני עושה את רוב העבודה שלי כמחנכת" (ראיון 6).</w:t>
       </w:r>
     </w:p>
     <w:p>
@@ -6315,7 +6315,7 @@
           <w:szCs w:val="24"/>
           <w:rtl/>
         </w:rPr>
-        <w:t xml:space="preserve">ארבע מורות הקימו גופים של הורים. מהא הקימה "צוות הורים" של השכבה והביאה אליו את בעיית ההיעדרויות. אחת האמהות הציעה ש"אמהות שנשארות בבית בבוקר יעשו 'שרשרת'" ויתקשרו לשכנים בשבע, ולדברי מהא "בתוך חודשיים ההיעדרויות ירדו בחצי". היא הסבירה:</w:t>
+        <w:t xml:space="preserve">ארבע מורות הקימו גופים של הורים. מהא הקימה "צוות הורים" של השכבה והביאה אליו את בעיית ההיעדרויות. אחת האמהות הציעה ש"אמהות שנשארות בבית בבוקר יעשו 'שרשרת'" (ראיון 2) ויתקשרו לשכנים בשבע, ולדברי מהא "בתוך חודשיים ההיעדרויות ירדו בחצי" (ראיון 2). היא הסבירה:</w:t>
       </w:r>
     </w:p>
     <w:p>
@@ -6332,7 +6332,7 @@
           <w:szCs w:val="24"/>
           <w:rtl/>
         </w:rPr>
-        <w:t xml:space="preserve">מה שגרם להצלחה: שהפתרון בא מההורים ולא ממני, שהוא היה בתוך השכונה ולא בתוך בית הספר, ושאף אחד לא הרגיש שמפקחים עליו, כי זו שכנה שמתקשרת ולא קצין ביקור סדיר.</w:t>
+        <w:t xml:space="preserve">מה שגרם להצלחה: שהפתרון בא מההורים ולא ממני, שהוא היה בתוך השכונה ולא בתוך בית הספר, ושאף אחד לא הרגיש שמפקחים עליו, כי זו שכנה שמתקשרת ולא קצין ביקור סדיר. (ראיון 2)</w:t>
       </w:r>
     </w:p>
     <w:p>
@@ -6348,7 +6348,7 @@
           <w:szCs w:val="24"/>
           <w:rtl/>
         </w:rPr>
-        <w:t xml:space="preserve">אמאני הקימה "מועצת הורים כיתתית", ובערב הורים ניסחו ההורים עצמם הסכם על שימוש בטלפונים. לדבריה, "בשבוע שאחרי, הטלפונים בכיתה ירדו דרמטית, ולא כי אני אסרתי, אלא כי הילדים ידעו שההורים של כולם הסכימו". נסרין הקימה "ועדת קהילה", וסוהא הקימה "מועצת קהילה" של נציגי המשפחות הגדולות בעיר, ואמרה: "הוועד אצלנו קיים כי צריך, מועצת הקהילה קיימת כי היא עובדת." קול אחר עלה אצל פאטמה, הוותיקה שבמרואיינות. לדבריה, "הורים אצלנו לא תמיד רוצים להחליט, הם רוצים שמישהו שהם סומכים עליו יחליט", אם כי היא ציינה שהדור הצעיר של ההורים מבקש להיות שותף "ולפעמים הוא נתקל בקיר".</w:t>
+        <w:t xml:space="preserve">אמאני הקימה "מועצת הורים כיתתית" (ראיון 7), ובערב הורים ניסחו ההורים עצמם הסכם על שימוש בטלפונים. לדבריה, "בשבוע שאחרי, הטלפונים בכיתה ירדו דרמטית, ולא כי אני אסרתי, אלא כי הילדים ידעו שההורים של כולם הסכימו" (ראיון 7). נסרין הקימה "ועדת קהילה", וסוהא הקימה "מועצת קהילה" של נציגי המשפחות הגדולות בעיר, ואמרה: "הוועד אצלנו קיים כי צריך, מועצת הקהילה קיימת כי היא עובדת" (ראיון 8). קול אחר עלה אצל פאטמה, הוותיקה שבמרואיינות. לדבריה, "הורים אצלנו לא תמיד רוצים להחליט, הם רוצים שמישהו שהם סומכים עליו יחליט" (ראיון 5), אם כי היא ציינה שהדור הצעיר של ההורים מבקש להיות שותף "ולפעמים הוא נתקל בקיר" (ראיון 5).</w:t>
       </w:r>
     </w:p>
     <w:p>
@@ -6433,7 +6433,7 @@
           <w:szCs w:val="24"/>
           <w:rtl/>
         </w:rPr>
-        <w:t xml:space="preserve">המורות תיארו קהילה שבה הקשר עם בית הספר מתנהל דרך המשפחה המורחבת ולפי כללי כבוד. סוהא אמרה ש"הכבוד של המשפחה הוא הדבר שמנהל את היחסים עם בית הספר". האמהות הן הכתובת העיקרית, והסבתות הן לעיתים קרובות הסמכות האמיתית. סמר סיפרה ש"הסבתות מעורבות הרבה פעמים יותר מההורים, כי הן בבית", ופאטמה ביקשה מהמחקר: "תדברי גם עם הסבתות. בלוד הרבה ילדים גדלים אצל סבתא, ואף מחקר על הורים לא שואל אותן." סוהא, כשיש סכסוך הנוגע לכמה ילדים מאותה משפחה, הולכת "לסבתא של המשפחה". היא סיפרה על שיחה עם סבתא של תלמיד, שאמרה לה: "בית הספר קורא לנו רק כשיש בעיה. אתם לא באים אלינו כשיש חתונה." מאז היא משתתפת באירועי הקהילה, וכשמפקחת תמהה מדוע היא מערבת זקני משפחות בענייני בית הספר, הסבירה ש"בלוד זה לא ערבוב, זה המבנה".</w:t>
+        <w:t xml:space="preserve">המורות תיארו קהילה שבה הקשר עם בית הספר מתנהל דרך המשפחה המורחבת ולפי כללי כבוד. סוהא אמרה ש"הכבוד של המשפחה הוא הדבר שמנהל את היחסים עם בית הספר" (ראיון 8). האמהות הן הכתובת העיקרית, והסבתות הן לעיתים קרובות הסמכות האמיתית. סמר סיפרה ש"הסבתות מעורבות הרבה פעמים יותר מההורים, כי הן בבית" (ראיון 3), ופאטמה ביקשה מהמחקר: "תדברי גם עם הסבתות. בלוד הרבה ילדים גדלים אצל סבתא, ואף מחקר על הורים לא שואל אותן" (ראיון 5). סוהא, כשיש סכסוך הנוגע לכמה ילדים מאותה משפחה, הולכת "לסבתא של המשפחה" (ראיון 8). היא סיפרה על שיחה עם סבתא של תלמיד, שאמרה לה: "בית הספר קורא לנו רק כשיש בעיה. אתם לא באים אלינו כשיש חתונה" (ראיון 8). מאז היא משתתפת באירועי הקהילה, וכשמפקחת תמהה מדוע היא מערבת זקני משפחות בענייני בית הספר, הסבירה ש"בלוד זה לא ערבוב, זה המבנה" (ראיון 8).</w:t>
       </w:r>
     </w:p>
     <w:p>
@@ -6484,7 +6484,7 @@
           <w:szCs w:val="24"/>
           <w:rtl/>
         </w:rPr>
-        <w:t xml:space="preserve">וקשה לי, כאישה, שיש אבות שלא מדברים איתי ישירות, ושאני צריכה את המנהל כדי שיקשיבו לדברים שאני יודעת טוב יותר ממנו.</w:t>
+        <w:t xml:space="preserve">וקשה לי, כאישה, שיש אבות שלא מדברים איתי ישירות, ושאני צריכה את המנהל כדי שיקשיבו לדברים שאני יודעת טוב יותר ממנו. (ראיון 2)</w:t>
       </w:r>
     </w:p>
     <w:p>
@@ -6500,7 +6500,7 @@
           <w:szCs w:val="24"/>
           <w:rtl/>
         </w:rPr>
-        <w:t xml:space="preserve">פאטמה אמרה שאחרי עשרים ושבע שנים "זה עדיין מעליב", אך למדה ש"לא כל דלת צריכה להיפתח דרכי". מאותו מבנה צמח גם יתרון. מהא סיפרה ש"האמהות אצלנו מדברות איתי על דברים שלא יגידו למורה גבר", וסוהא תיארה את עצמה כ"אישה שיכולה להיכנס לבתים ולחדרים שבהם מתקבלות ההחלטות האמיתיות". המורות תיארו גם הבדלים בין קבוצות בתוך הקהילה הערבית. מהא אמרה ש"משפחה בדואית מהנגב, למשל, לא תשלח את האמא לפגישה, ישלחו את האח הגדול, וצריך לדעת את זה ולא להיעלב".</w:t>
+        <w:t xml:space="preserve">פאטמה אמרה שאחרי עשרים ושבע שנים "זה עדיין מעליב" (ראיון 5), אך למדה ש"לא כל דלת צריכה להיפתח דרכי" (ראיון 5). מאותו מבנה צמח גם יתרון. מהא סיפרה ש"האמהות אצלנו מדברות איתי על דברים שלא יגידו למורה גבר" (ראיון 2), וסוהא תיארה את עצמה כ"אישה שיכולה להיכנס לבתים ולחדרים שבהם מתקבלות ההחלטות האמיתיות" (ראיון 8). המורות תיארו גם הבדלים בין קבוצות בתוך הקהילה הערבית. מהא אמרה ש"משפחה בדואית מהנגב, למשל, לא תשלח את האמא לפגישה, ישלחו את האח הגדול, וצריך לדעת את זה ולא להיעלב" (ראיון 2).</w:t>
       </w:r>
     </w:p>
     <w:p>
@@ -6534,7 +6534,7 @@
           <w:szCs w:val="24"/>
           <w:rtl/>
         </w:rPr>
-        <w:t xml:space="preserve">במחלוקות הגיעו הורים לבית הספר מלווים בדודים או באחים ונקטו לשון מאיימת. המורות פירשו זאת כביטוי של פחד. מהא אמרה ש"הורה שמגיע עם דודים לא מגיע לריב, הוא מגיע מפוחד, והדודים הם הפחד שלו", ורנא הוסיפה ש"אמהות באות עם אחים כי הן לא מאמינות שמישהו יקשיב להן לבד". סמר למדה ש"הורה שצועק הוא בדרך כלל הורה שנבהל", ואמאני תיארה את ההאשמה "את לא מכאן" כ"נשק שההורים משתמשים בו כשהם מרגישים חלשים". מכאן למדו המורות כלל משותף: לא לענות בשער או בקבוצה, לתת למשבר לעבור, ולפגוש את ההורה ביוזמתן אחרי כמה ימים, אחד על אחד. ריהאם אמרה: "לא עונים בווטסאפ על דברים של כבוד, רק בפנים." נסרין הוסיפה ש"פער תרבותי לא פותרים בשכנוע, פותרים בשאלה", ורנא אמרה: "למדתי שרוב הפערים התרבותיים הם פערים של פרט קטן, ואם שואלים, מוצאים את הפרט." פאטמה תיארה אב שביקש להעביר את בתו המצטיינת למסגרת שבה תלמד פחות. במקום להתווכח, הראתה לו את החיבורים של בתו, והסיקה: "אחרי השיחה הבנתי שלא נלחמים עם הורה, מראים לו את הילד שלו." סוהא תיארה מחלוקת קשה במיוחד, עם אב שהאשים אותה בבגידה אחרי דיווח לרווחה על אלימות בבית. היא ליוותה את המשפחה לרווחה בעצמה, ולמדה:</w:t>
+        <w:t xml:space="preserve">במחלוקות הגיעו הורים לבית הספר מלווים בדודים או באחים ונקטו לשון מאיימת. המורות פירשו זאת כביטוי של פחד. מהא אמרה ש"הורה שמגיע עם דודים לא מגיע לריב, הוא מגיע מפוחד, והדודים הם הפחד שלו" (ראיון 2), ורנא הוסיפה ש"אמהות באות עם אחים כי הן לא מאמינות שמישהו יקשיב להן לבד" (ראיון 6). סמר למדה ש"הורה שצועק הוא בדרך כלל הורה שנבהל" (ראיון 3), ואמאני תיארה את ההאשמה "את לא מכאן" (ראיון 7) כ"נשק שההורים משתמשים בו כשהם מרגישים חלשים" (ראיון 7). מכאן למדו המורות כלל משותף: לא לענות בשער או בקבוצה, לתת למשבר לעבור, ולפגוש את ההורה ביוזמתן אחרי כמה ימים, אחד על אחד. ריהאם אמרה: "לא עונים בווטסאפ על דברים של כבוד, רק בפנים" (ראיון 1). נסרין הוסיפה ש"פער תרבותי לא פותרים בשכנוע, פותרים בשאלה" (ראיון 4), ורנא אמרה: "למדתי שרוב הפערים התרבותיים הם פערים של פרט קטן, ואם שואלים, מוצאים את הפרט" (ראיון 6). פאטמה תיארה אב שביקש להעביר את בתו המצטיינת למסגרת שבה תלמד פחות. במקום להתווכח, הראתה לו את החיבורים של בתו, והסיקה: "אחרי השיחה הבנתי שלא נלחמים עם הורה, מראים לו את הילד שלו" (ראיון 5). סוהא תיארה מחלוקת קשה במיוחד, עם אב שהאשים אותה בבגידה אחרי דיווח לרווחה על אלימות בבית. היא ליוותה את המשפחה לרווחה בעצמה, ולמדה:</w:t>
       </w:r>
     </w:p>
     <w:p>
@@ -6551,7 +6551,7 @@
           <w:szCs w:val="24"/>
           <w:rtl/>
         </w:rPr>
-        <w:t xml:space="preserve">שהתפקיד שלי כמורה מהקהילה הוא לא לבחור בין החוק לקהילה, אלא לעמוד ביניהם ולתרגם, לשני הכיוונים. ושהורים בלוד מפחדים מהרווחה יותר מהמשטרה, ושבית הספר צריך להיות הגשר, לא השער.</w:t>
+        <w:t xml:space="preserve">שהתפקיד שלי כמורה מהקהילה הוא לא לבחור בין החוק לקהילה, אלא לעמוד ביניהם ולתרגם, לשני הכיוונים. ושהורים בלוד מפחדים מהרווחה יותר מהמשטרה, ושבית הספר צריך להיות הגשר, לא השער. (ראיון 8)</w:t>
       </w:r>
     </w:p>
     <w:p>
@@ -6636,7 +6636,7 @@
           <w:szCs w:val="24"/>
           <w:rtl/>
         </w:rPr>
-        <w:t xml:space="preserve">המורות הגדירו תמיכה של ההנהלה בשלושה מרכיבים: גיבוי מול הורים, זמן ומרחב לעבודה עם ההורים, ומנהל שעושה בעצמו את מה שהוא מבקש. ריהאם תיארה מנהלת שבפגישה קשה "יושבת איתי, לא מעליי". רנא ביקשה מהמנהל שלא ייקח ממנה את ההורה, "אלא מחזיר אותו אליי אחרי שהרגיע", ולדבריה "הוא למד". סוהא הגדירה את המבחן האמיתי של התמיכה:</w:t>
+        <w:t xml:space="preserve">המורות הגדירו תמיכה של ההנהלה בשלושה מרכיבים: גיבוי מול הורים, זמן ומרחב לעבודה עם ההורים, ומנהל שעושה בעצמו את מה שהוא מבקש. ריהאם תיארה מנהלת שבפגישה קשה "יושבת איתי, לא מעליי" (ראיון 1). רנא ביקשה מהמנהל שלא ייקח ממנה את ההורה, "אלא מחזיר אותו אליי אחרי שהרגיע" (ראיון 6), ולדבריה "הוא למד". סוהא הגדירה את המבחן האמיתי של התמיכה:</w:t>
       </w:r>
     </w:p>
     <w:p>
@@ -6653,7 +6653,7 @@
           <w:szCs w:val="24"/>
           <w:rtl/>
         </w:rPr>
-        <w:t xml:space="preserve">ושהיא מגבה מורות גם כשהורה בעל מעמד מתלונן, וזה המבחן האמיתי, כי מול הורה חזק קל לוותר על מורה.</w:t>
+        <w:t xml:space="preserve">ושהיא מגבה מורות גם כשהורה בעל מעמד מתלונן, וזה המבחן האמיתי, כי מול הורה חזק קל לוותר על מורה. (ראיון 8)</w:t>
       </w:r>
     </w:p>
     <w:p>
@@ -6686,7 +6686,7 @@
           <w:szCs w:val="24"/>
           <w:rtl/>
         </w:rPr>
-        <w:t xml:space="preserve">"תומכת" בשבילי זה שלוש: שהמנהל מגבה אותי מול ההורה, וזה יש. שהוא נותן לי להוביל את הקשר ולא לוקח אותו ממני, וזה יש פחות. ושהוא מלמד אותי איך, וזה אין. אני רוצה להגיד גם משהו טוב: היועצת אצלנו היא בעצם זו שתומכת במורות בקשר עם ההורים, היא יושבת איתי בפגישות קשות, ובלי זה הייתי אבודה.</w:t>
+        <w:t xml:space="preserve">"תומכת" בשבילי זה שלוש: שהמנהל מגבה אותי מול ההורה, וזה יש. שהוא נותן לי להוביל את הקשר ולא לוקח אותו ממני, וזה יש פחות. ושהוא מלמד אותי איך, וזה אין. אני רוצה להגיד גם משהו טוב: היועצת אצלנו היא בעצם זו שתומכת במורות בקשר עם ההורים, היא יושבת איתי בפגישות קשות, ובלי זה הייתי אבודה. (ראיון 3)</w:t>
       </w:r>
     </w:p>
     <w:p>
@@ -6737,7 +6737,7 @@
           <w:szCs w:val="24"/>
           <w:rtl/>
         </w:rPr>
-        <w:t xml:space="preserve">המנהלת שלנו היא הסיבה שהתפקיד שלי קיים. היא זו שהחליטה שבית הספר צריך רכזת קהילה, ונתנה לי שעות, ולא הסתפקה בלהגיד "תדברו עם ההורים". היא רואה את ההורים כשותפים, ויושבת עם הוועד כל חודש, ומכירה הורים בשם, ועומדת בשער. ההנהלה מעודדת שיתוף גם במובן שהיא דורשת מכל מחנכת תוכנית קשר עם הורים בתחילת השנה, עם יעדים.</w:t>
+        <w:t xml:space="preserve">המנהלת שלנו היא הסיבה שהתפקיד שלי קיים. היא זו שהחליטה שבית הספר צריך רכזת קהילה, ונתנה לי שעות, ולא הסתפקה בלהגיד "תדברו עם ההורים". היא רואה את ההורים כשותפים, ויושבת עם הוועד כל חודש, ומכירה הורים בשם, ועומדת בשער. ההנהלה מעודדת שיתוף גם במובן שהיא דורשת מכל מחנכת תוכנית קשר עם הורים בתחילת השנה, עם יעדים. (ראיון 4)</w:t>
       </w:r>
     </w:p>
     <w:p>
@@ -6753,7 +6753,7 @@
           <w:szCs w:val="24"/>
           <w:rtl/>
         </w:rPr>
-        <w:t xml:space="preserve">לעומת זאת, פאטמה תיארה מנהל שמנהל את הקשר "בסגנון של מוכתר", ולדבריה "זה עובד למשברים ולא עובד לשותפות". אמאני אמרה ש"בחטיבה שלנו ההנהלה רואה בקשר עם ההורים בעיקר עניין של משמעת". לדבריה, ההבדל הוא בין שלבי החינוך: "ביסודי ההורה הוא שותף, בחטיבה הוא מוזמן כשיש בעיה, ואני חושבת שזה הפוך ממה שצריך." סוהא תיארה מנהל שאינו מלוד ולכן "נותן לי לנהל את הקשר עם הקהילה". שלוש מורות התלוננו שההורים פונים ישר למנהל. סמר אמרה שההורים "עוקפים" אותה, ומהא תיארה מצב שבו "המורה הופכת לפקידה".</w:t>
+        <w:t xml:space="preserve">לעומת זאת, פאטמה תיארה מנהל שמנהל את הקשר "בסגנון של מוכתר" (ראיון 5), ולדבריה "זה עובד למשברים ולא עובד לשותפות" (ראיון 5). אמאני אמרה ש"בחטיבה שלנו ההנהלה רואה בקשר עם ההורים בעיקר עניין של משמעת" (ראיון 7). לדבריה, ההבדל הוא בין שלבי החינוך: "ביסודי ההורה הוא שותף, בחטיבה הוא מוזמן כשיש בעיה, ואני חושבת שזה הפוך ממה שצריך" (ראיון 7). סוהא תיארה מנהל שאינו מלוד ולכן "נותן לי לנהל את הקשר עם הקהילה" (ראיון 8). שלוש מורות התלוננו שההורים פונים ישר למנהל. סמר אמרה שההורים "עוקפים" אותה, ומהא תיארה מצב שבו "המורה הופכת לפקידה" (ראיון 2).</w:t>
       </w:r>
     </w:p>
     <w:p>
@@ -6787,7 +6787,7 @@
           <w:szCs w:val="24"/>
           <w:rtl/>
         </w:rPr>
-        <w:t xml:space="preserve">גם המורות שתיארו הנהלה תומכת הצביעו על היעדר מבנה מערכתי. מהא אמרה: "אין נוהל, אין זמן במערכת, אין הכשרה, כל מורה לפי האופי שלה." נסרין אמרה ש"ההנהלה תומכת, והמערכת לא", ושתפקידה ממומן משעות בית הספר: "אם המנהלת תתחלף, התפקיד שלי יכול להיעלם." אף אחת מהמורות לא קיבלה הכשרה ממשית לעבודה עם הורים. סמר תיארה קורס במכללה:</w:t>
+        <w:t xml:space="preserve">גם המורות שתיארו הנהלה תומכת הצביעו על היעדר מבנה מערכתי. מהא אמרה: "אין נוהל, אין זמן במערכת, אין הכשרה, כל מורה לפי האופי שלה" (ראיון 2). נסרין אמרה ש"ההנהלה תומכת, והמערכת לא" (ראיון 4), ושתפקידה ממומן משעות בית הספר: "אם המנהלת תתחלף, התפקיד שלי יכול להיעלם" (ראיון 4). אף אחת מהמורות לא קיבלה הכשרה ממשית לעבודה עם הורים. סמר תיארה קורס במכללה:</w:t>
       </w:r>
     </w:p>
     <w:p>
@@ -6804,7 +6804,7 @@
           <w:szCs w:val="24"/>
           <w:rtl/>
         </w:rPr>
-        <w:t xml:space="preserve">בתואר היה קורס אחד על קשר עם הורים, שבו למדנו "איך לנהל אסיפת הורים", ולא איך לדבר עם אבא שצועק בשער או עם אמא שלא קוראת.</w:t>
+        <w:t xml:space="preserve">בתואר היה קורס אחד על קשר עם הורים, שבו למדנו "איך לנהל אסיפת הורים", ולא איך לדבר עם אבא שצועק בשער או עם אמא שלא קוראת. (ראיון 3)</w:t>
       </w:r>
     </w:p>
     <w:p>
@@ -6820,7 +6820,7 @@
           <w:szCs w:val="24"/>
           <w:rtl/>
         </w:rPr>
-        <w:t xml:space="preserve">מהא סיפרה על השתלמות שהייתה "בעברית, עם דוגמאות מבית ספר בתל אביב". את הליווי מצאו המורות בחדר המורים. מהא אמרה: "מה שיש זה מורות שעוזרות זו לזו, בחדר המורות, אחרי שיחה קשה." סמר ורנא תיארו מחנכת ותיקה שליוותה אותן, ושלוש מורות ביקשו ליווי קבוע למחנכות חדשות.</w:t>
+        <w:t xml:space="preserve">מהא סיפרה על השתלמות שהייתה "בעברית, עם דוגמאות מבית ספר בתל אביב" (ראיון 2). את הליווי מצאו המורות בחדר המורים. מהא אמרה: "מה שיש זה מורות שעוזרות זו לזו, בחדר המורות, אחרי שיחה קשה" (ראיון 2). סמר ורנא תיארו מחנכת ותיקה שליוותה אותן, ושלוש מורות ביקשו ליווי קבוע למחנכות חדשות.</w:t>
       </w:r>
     </w:p>
     <w:p>
@@ -6854,7 +6854,7 @@
           <w:szCs w:val="24"/>
           <w:rtl/>
         </w:rPr>
-        <w:t xml:space="preserve">לצד הקשיים המבניים תיארו המורות מחיר רגשי. נסרין אמרה: "הכי קשה לי זה שאני לא יכולה להציל." ריהאם תיארה את הקושי "לראות הורים שאוהבים את הילד שלהם ולא יכולים לעזור לו, כי אין להם, לא כסף, לא זמן, לא שפה". אמאני סיפרה: "ואני חוזרת הביתה אחרי שיחה עם אמא שאיבדה את הבן שלה לרחוב, ואני מסתכלת על הבן שלי." סוהא אמרה: "ואחרי עשרים ושתיים שנים, אני עייפה, ואני אומרת את זה בכנות למחקר." מהא סיכמה את התפקיד כך:</w:t>
+        <w:t xml:space="preserve">לצד הקשיים המבניים תיארו המורות מחיר רגשי. נסרין אמרה: "הכי קשה לי זה שאני לא יכולה להציל" (ראיון 4). ריהאם תיארה את הקושי "לראות הורים שאוהבים את הילד שלהם ולא יכולים לעזור לו, כי אין להם, לא כסף, לא זמן, לא שפה" (ראיון 1). אמאני סיפרה: "ואני חוזרת הביתה אחרי שיחה עם אמא שאיבדה את הבן שלה לרחוב, ואני מסתכלת על הבן שלי" (ראיון 7). סוהא אמרה: "ואחרי עשרים ושתיים שנים, אני עייפה, ואני אומרת את זה בכנות למחקר" (ראיון 8). מהא סיכמה את התפקיד כך:</w:t>
       </w:r>
     </w:p>
     <w:p>
@@ -6871,7 +6871,7 @@
           <w:szCs w:val="24"/>
           <w:rtl/>
         </w:rPr>
-        <w:t xml:space="preserve">אנחנו בלוד עושות עבודה של מורה, יועצת, עובדת סוציאלית ומגשרת, במשכורת של מורה ובהכשרה של מורה. אם רוצים שותפות עם ההורים, צריך קודם להחליט שמי שבונה אותה היא לא לבד.</w:t>
+        <w:t xml:space="preserve">אנחנו בלוד עושות עבודה של מורה, יועצת, עובדת סוציאלית ומגשרת, במשכורת של מורה ובהכשרה של מורה. אם רוצים שותפות עם ההורים, צריך קודם להחליט שמי שבונה אותה היא לא לבד. (ראיון 2)</w:t>
       </w:r>
     </w:p>
     <w:p>
@@ -6905,7 +6905,7 @@
           <w:szCs w:val="24"/>
           <w:rtl/>
         </w:rPr>
-        <w:t xml:space="preserve">כשנשאלו מה ניתן לעשות כדי לחזק את השותפות, הציעו המורות צעדים בשלוש רמות. ברמת המורה הציעו כולן לפנות להורים לפני שיש בעיה ולהתחיל בחיובי. ברמת בית הספר הציעה נסרין "תפקיד של רכזת הורים וקהילה בכל בית ספר, עם שעות מתקן ולא מהנדבה של המנהלת", סמר ביקשה "שמורות צעירות יקבלו ליווי", ואמאני הציעה תוכניות מעבר בין שלבי החינוך "שבהן ההורים שותפים, כי שם הילדים נופלים". ברמת העירייה ביקשו כמעט כולן הודעות בערבית. מהא ביקשה "עובדת סוציאלית בבית הספר במשרה מלאה, כי היום היא יום בשבוע", רנא אמרה ש"מגרש מואר בשכונה היה עושה לקשר בין בית הספר, הילדים וההורים יותר מכל תוכנית", וסוהא ביקשה "שיתוף של ראשי המשפחות, ושל הנשים שמנהלות אותן בפועל, בהחלטות של העירייה על השכונות שלהם". רוב המורות הוסיפו שבלי ביטחון ברחוב, כל ההצעות האחרות לא יספיקו.</w:t>
+        <w:t xml:space="preserve">כשנשאלו מה ניתן לעשות כדי לחזק את השותפות, הציעו המורות צעדים בשלוש רמות. ברמת המורה הציעו כולן לפנות להורים לפני שיש בעיה ולהתחיל בחיובי. ברמת בית הספר הציעה נסרין "תפקיד של רכזת הורים וקהילה בכל בית ספר, עם שעות מתקן ולא מהנדבה של המנהלת" (ראיון 4), סמר ביקשה "שמורות צעירות יקבלו ליווי" (ראיון 3), ואמאני הציעה תוכניות מעבר בין שלבי החינוך "שבהן ההורים שותפים, כי שם הילדים נופלים" (ראיון 7). ברמת העירייה ביקשו כמעט כולן הודעות בערבית. מהא ביקשה "עובדת סוציאלית בבית הספר במשרה מלאה, כי היום היא יום בשבוע" (ראיון 2), רנא אמרה ש"מגרש מואר בשכונה היה עושה לקשר בין בית הספר, הילדים וההורים יותר מכל תוכנית" (ראיון 6), וסוהא ביקשה "שיתוף של ראשי המשפחות, ושל הנשים שמנהלות אותן בפועל, בהחלטות של העירייה על השכונות שלהם" (ראיון 8). רוב המורות הוסיפו שבלי ביטחון ברחוב, כל ההצעות האחרות לא יספיקו.</w:t>
       </w:r>
     </w:p>
     <w:p>

</xml_diff>

<commit_message>
Explain interview-number notation and number participants table
Co-Authored-By: Claude Opus 5.5 <noreply@anthropic.com>
Claude-Session: https://claude.ai/code/session_01PCrLuLuf13bgHFN1Akf9GB
</commit_message>
<xml_diff>
--- a/seminar/עבודת סמינר - חיתאם אבו ריאש.docx
+++ b/seminar/עבודת סמינר - חיתאם אבו ריאש.docx
@@ -2454,7 +2454,7 @@
                 <w:szCs w:val="20"/>
                 <w:rtl/>
               </w:rPr>
-              <w:t xml:space="preserve">שם בדוי</w:t>
+              <w:t xml:space="preserve">ראיון ושם בדוי</w:t>
             </w:r>
           </w:p>
         </w:tc>
@@ -2667,7 +2667,7 @@
                 <w:szCs w:val="20"/>
                 <w:rtl/>
               </w:rPr>
-              <w:t xml:space="preserve">ריהאם</w:t>
+              <w:t xml:space="preserve">1. ריהאם</w:t>
             </w:r>
           </w:p>
         </w:tc>
@@ -2870,7 +2870,7 @@
                 <w:szCs w:val="20"/>
                 <w:rtl/>
               </w:rPr>
-              <w:t xml:space="preserve">מהא</w:t>
+              <w:t xml:space="preserve">2. מהא</w:t>
             </w:r>
           </w:p>
         </w:tc>
@@ -3073,7 +3073,7 @@
                 <w:szCs w:val="20"/>
                 <w:rtl/>
               </w:rPr>
-              <w:t xml:space="preserve">סמר</w:t>
+              <w:t xml:space="preserve">3. סמר</w:t>
             </w:r>
           </w:p>
         </w:tc>
@@ -3276,7 +3276,7 @@
                 <w:szCs w:val="20"/>
                 <w:rtl/>
               </w:rPr>
-              <w:t xml:space="preserve">נסרין</w:t>
+              <w:t xml:space="preserve">4. נסרין</w:t>
             </w:r>
           </w:p>
         </w:tc>
@@ -3479,7 +3479,7 @@
                 <w:szCs w:val="20"/>
                 <w:rtl/>
               </w:rPr>
-              <w:t xml:space="preserve">פאטמה</w:t>
+              <w:t xml:space="preserve">5. פאטמה</w:t>
             </w:r>
           </w:p>
         </w:tc>
@@ -3682,7 +3682,7 @@
                 <w:szCs w:val="20"/>
                 <w:rtl/>
               </w:rPr>
-              <w:t xml:space="preserve">רנא</w:t>
+              <w:t xml:space="preserve">6. רנא</w:t>
             </w:r>
           </w:p>
         </w:tc>
@@ -3885,7 +3885,7 @@
                 <w:szCs w:val="20"/>
                 <w:rtl/>
               </w:rPr>
-              <w:t xml:space="preserve">אמאני</w:t>
+              <w:t xml:space="preserve">7. אמאני</w:t>
             </w:r>
           </w:p>
         </w:tc>
@@ -4088,7 +4088,7 @@
                 <w:szCs w:val="20"/>
                 <w:rtl/>
               </w:rPr>
-              <w:t xml:space="preserve">סוהא</w:t>
+              <w:t xml:space="preserve">8. סוהא</w:t>
             </w:r>
           </w:p>
         </w:tc>
@@ -4432,7 +4432,7 @@
           <w:szCs w:val="24"/>
           <w:rtl/>
         </w:rPr>
-        <w:t xml:space="preserve">מניתוח שמונת הראיונות עלו שש תמות, והן מוצגות לפי סדר חשיבותן בדברי המרואיינות, עם ציטוטים מדברי המשתתפות וסיכום בסוף כל תמה. כאשר המרואיינות הביעו עמדות סותרות, הסתירה מוצגת כפי שהן עצמן ראו אותה, וכאשר עמדה עלתה אצל מרואיינת אחת בלבד, הדבר מצוין. בפרק זה מוצגים דברי המשתתפות בלבד, והפרשנות שלהם לאור הספרות מובאת בפרק הדיון. טבלה 2 מסכמת את התמות ואת תתי-התמות.</w:t>
+        <w:t xml:space="preserve">מניתוח שמונת הראיונות עלו שש תמות, והן מוצגות לפי סדר חשיבותן בדברי המרואיינות, עם ציטוטים מדברי המשתתפות וסיכום בסוף כל תמה. כאשר המרואיינות הביעו עמדות סותרות, הסתירה מוצגת כפי שהן עצמן ראו אותה, וכאשר עמדה עלתה אצל מרואיינת אחת בלבד, הדבר מצוין. בפרק זה מוצגים דברי המשתתפות בלבד, והפרשנות שלהם לאור הספרות מובאת בפרק הדיון. הציטוטים לקוחים מדברי משתתפות המחקר ומובאים בשמות בדויים, ובסוגריים שאחרי כל ציטוט מצוין מספר הראיון שממנו נלקח, לפי סדר התמלילים בנספח ג'. טבלה 2 מסכמת את התמות ואת תתי-התמות.</w:t>
       </w:r>
     </w:p>
     <w:p>

</xml_diff>

<commit_message>
Replace findings themes table with prose overview
Co-Authored-By: Claude Opus 5.5 <noreply@anthropic.com>
Claude-Session: https://claude.ai/code/session_01PCrLuLuf13bgHFN1Akf9GB
</commit_message>
<xml_diff>
--- a/seminar/עבודת סמינר - חיתאם אבו ריאש.docx
+++ b/seminar/עבודת סמינר - חיתאם אבו ריאש.docx
@@ -4432,800 +4432,25 @@
           <w:szCs w:val="24"/>
           <w:rtl/>
         </w:rPr>
-        <w:t xml:space="preserve">מניתוח שמונת הראיונות עלו שש תמות, והן מוצגות לפי סדר חשיבותן בדברי המרואיינות, עם ציטוטים מדברי המשתתפות וסיכום בסוף כל תמה. כאשר המרואיינות הביעו עמדות סותרות, הסתירה מוצגת כפי שהן עצמן ראו אותה, וכאשר עמדה עלתה אצל מרואיינת אחת בלבד, הדבר מצוין. בפרק זה מוצגים דברי המשתתפות בלבד, והפרשנות שלהם לאור הספרות מובאת בפרק הדיון. הציטוטים לקוחים מדברי משתתפות המחקר ומובאים בשמות בדויים, ובסוגריים שאחרי כל ציטוט מצוין מספר הראיון שממנו נלקח, לפי סדר התמלילים בנספח ג'. טבלה 2 מסכמת את התמות ואת תתי-התמות.</w:t>
-      </w:r>
-    </w:p>
-    <w:p>
-      <w:pPr>
-        <w:keepNext/>
-        <w:bidi/>
-        <w:spacing w:after="0" w:line="360" w:lineRule="auto"/>
-        <w:jc w:val="left"/>
-      </w:pPr>
-      <w:r>
-        <w:rPr>
-          <w:rFonts w:ascii="Times New Roman" w:cs="David" w:hAnsi="Times New Roman"/>
-          <w:b/>
-          <w:bCs/>
-          <w:sz w:val="24"/>
-          <w:szCs w:val="24"/>
-          <w:rtl/>
-        </w:rPr>
-        <w:t xml:space="preserve">טבלה 2</w:t>
-      </w:r>
-    </w:p>
-    <w:p>
-      <w:pPr>
-        <w:keepNext/>
-        <w:bidi/>
-        <w:spacing w:after="60" w:line="360" w:lineRule="auto"/>
-        <w:jc w:val="left"/>
-      </w:pPr>
-      <w:r>
-        <w:rPr>
-          <w:rFonts w:ascii="Times New Roman" w:cs="David" w:hAnsi="Times New Roman"/>
-          <w:i/>
-          <w:iCs/>
-          <w:sz w:val="24"/>
-          <w:szCs w:val="24"/>
-          <w:rtl/>
-        </w:rPr>
-        <w:t xml:space="preserve">התמות ותתי-התמות שעלו מן הראיונות</w:t>
-      </w:r>
-    </w:p>
-    <w:tbl>
-      <w:tblPr>
-        <w:bidiVisual/>
-        <w:tblW w:type="dxa" w:w="8500"/>
-        <w:tblBorders>
-          <w:top w:val="single" w:color="auto" w:sz="4"/>
-          <w:left w:val="single" w:color="auto" w:sz="4"/>
-          <w:bottom w:val="single" w:color="auto" w:sz="4"/>
-          <w:right w:val="single" w:color="auto" w:sz="4"/>
-          <w:insideH w:val="single" w:color="auto" w:sz="4"/>
-          <w:insideV w:val="single" w:color="auto" w:sz="4"/>
-        </w:tblBorders>
-      </w:tblPr>
-      <w:tblGrid>
-        <w:gridCol w:w="2300"/>
-        <w:gridCol w:w="3600"/>
-        <w:gridCol w:w="2600"/>
-      </w:tblGrid>
-      <w:tr>
-        <w:trPr>
-          <w:tblHeader/>
-        </w:trPr>
-        <w:tc>
-          <w:tcPr>
-            <w:tcW w:type="dxa" w:w="2300"/>
-            <w:tcBorders>
-              <w:top w:val="single" w:color="808080" w:sz="4"/>
-              <w:left w:val="single" w:color="808080" w:sz="4"/>
-              <w:bottom w:val="single" w:color="808080" w:sz="4"/>
-              <w:right w:val="single" w:color="808080" w:sz="4"/>
-            </w:tcBorders>
-            <w:shd w:fill="E7E6E6" w:color="auto" w:val="clear"/>
-            <w:tcMar>
-              <w:top w:type="dxa" w:w="40"/>
-              <w:left w:type="dxa" w:w="80"/>
-              <w:bottom w:type="dxa" w:w="40"/>
-              <w:right w:type="dxa" w:w="80"/>
-            </w:tcMar>
-          </w:tcPr>
-          <w:p>
-            <w:pPr>
-              <w:bidi/>
-              <w:jc w:val="center"/>
-            </w:pPr>
-            <w:r>
-              <w:rPr>
-                <w:rFonts w:ascii="Times New Roman" w:cs="David" w:hAnsi="Times New Roman"/>
-                <w:b/>
-                <w:bCs/>
-                <w:sz w:val="20"/>
-                <w:szCs w:val="20"/>
-                <w:rtl/>
-              </w:rPr>
-              <w:t xml:space="preserve">תמה</w:t>
-            </w:r>
-          </w:p>
-        </w:tc>
-        <w:tc>
-          <w:tcPr>
-            <w:tcW w:type="dxa" w:w="3600"/>
-            <w:tcBorders>
-              <w:top w:val="single" w:color="808080" w:sz="4"/>
-              <w:left w:val="single" w:color="808080" w:sz="4"/>
-              <w:bottom w:val="single" w:color="808080" w:sz="4"/>
-              <w:right w:val="single" w:color="808080" w:sz="4"/>
-            </w:tcBorders>
-            <w:shd w:fill="E7E6E6" w:color="auto" w:val="clear"/>
-            <w:tcMar>
-              <w:top w:type="dxa" w:w="40"/>
-              <w:left w:type="dxa" w:w="80"/>
-              <w:bottom w:type="dxa" w:w="40"/>
-              <w:right w:type="dxa" w:w="80"/>
-            </w:tcMar>
-          </w:tcPr>
-          <w:p>
-            <w:pPr>
-              <w:bidi/>
-              <w:jc w:val="center"/>
-            </w:pPr>
-            <w:r>
-              <w:rPr>
-                <w:rFonts w:ascii="Times New Roman" w:cs="David" w:hAnsi="Times New Roman"/>
-                <w:b/>
-                <w:bCs/>
-                <w:sz w:val="20"/>
-                <w:szCs w:val="20"/>
-                <w:rtl/>
-              </w:rPr>
-              <w:t xml:space="preserve">תתי-תמות</w:t>
-            </w:r>
-          </w:p>
-        </w:tc>
-        <w:tc>
-          <w:tcPr>
-            <w:tcW w:type="dxa" w:w="2600"/>
-            <w:tcBorders>
-              <w:top w:val="single" w:color="808080" w:sz="4"/>
-              <w:left w:val="single" w:color="808080" w:sz="4"/>
-              <w:bottom w:val="single" w:color="808080" w:sz="4"/>
-              <w:right w:val="single" w:color="808080" w:sz="4"/>
-            </w:tcBorders>
-            <w:shd w:fill="E7E6E6" w:color="auto" w:val="clear"/>
-            <w:tcMar>
-              <w:top w:type="dxa" w:w="40"/>
-              <w:left w:type="dxa" w:w="80"/>
-              <w:bottom w:type="dxa" w:w="40"/>
-              <w:right w:type="dxa" w:w="80"/>
-            </w:tcMar>
-          </w:tcPr>
-          <w:p>
-            <w:pPr>
-              <w:bidi/>
-              <w:jc w:val="center"/>
-            </w:pPr>
-            <w:r>
-              <w:rPr>
-                <w:rFonts w:ascii="Times New Roman" w:cs="David" w:hAnsi="Times New Roman"/>
-                <w:b/>
-                <w:bCs/>
-                <w:sz w:val="20"/>
-                <w:szCs w:val="20"/>
-                <w:rtl/>
-              </w:rPr>
-              <w:t xml:space="preserve">ציטוט מייצג</w:t>
-            </w:r>
-          </w:p>
-        </w:tc>
-      </w:tr>
-      <w:tr>
-        <w:trPr>
-          <w:tblHeader w:val="false"/>
-        </w:trPr>
-        <w:tc>
-          <w:tcPr>
-            <w:tcW w:type="dxa" w:w="2300"/>
-            <w:tcBorders>
-              <w:top w:val="single" w:color="808080" w:sz="4"/>
-              <w:left w:val="single" w:color="808080" w:sz="4"/>
-              <w:bottom w:val="single" w:color="808080" w:sz="4"/>
-              <w:right w:val="single" w:color="808080" w:sz="4"/>
-            </w:tcBorders>
-            <w:tcMar>
-              <w:top w:type="dxa" w:w="40"/>
-              <w:left w:type="dxa" w:w="80"/>
-              <w:bottom w:type="dxa" w:w="40"/>
-              <w:right w:type="dxa" w:w="80"/>
-            </w:tcMar>
-          </w:tcPr>
-          <w:p>
-            <w:pPr>
-              <w:bidi/>
-              <w:jc w:val="center"/>
-            </w:pPr>
-            <w:r>
-              <w:rPr>
-                <w:rFonts w:ascii="Times New Roman" w:cs="David" w:hAnsi="Times New Roman"/>
-                <w:b w:val="false"/>
-                <w:sz w:val="20"/>
-                <w:szCs w:val="20"/>
-                <w:rtl/>
-              </w:rPr>
-              <w:t xml:space="preserve">1. המורה כגשר בין בית הספר לקהילה</w:t>
-            </w:r>
-          </w:p>
-        </w:tc>
-        <w:tc>
-          <w:tcPr>
-            <w:tcW w:type="dxa" w:w="3600"/>
-            <w:tcBorders>
-              <w:top w:val="single" w:color="808080" w:sz="4"/>
-              <w:left w:val="single" w:color="808080" w:sz="4"/>
-              <w:bottom w:val="single" w:color="808080" w:sz="4"/>
-              <w:right w:val="single" w:color="808080" w:sz="4"/>
-            </w:tcBorders>
-            <w:tcMar>
-              <w:top w:type="dxa" w:w="40"/>
-              <w:left w:type="dxa" w:w="80"/>
-              <w:bottom w:type="dxa" w:w="40"/>
-              <w:right w:type="dxa" w:w="80"/>
-            </w:tcMar>
-          </w:tcPr>
-          <w:p>
-            <w:pPr>
-              <w:bidi/>
-              <w:jc w:val="center"/>
-            </w:pPr>
-            <w:r>
-              <w:rPr>
-                <w:rFonts w:ascii="Times New Roman" w:cs="David" w:hAnsi="Times New Roman"/>
-                <w:b w:val="false"/>
-                <w:sz w:val="20"/>
-                <w:szCs w:val="20"/>
-                <w:rtl/>
-              </w:rPr>
-              <w:t xml:space="preserve">משמעות הקשר עם ההורים; מורה מהקהילה ומורה "זרה"; ההקשר העירוני</w:t>
-            </w:r>
-          </w:p>
-        </w:tc>
-        <w:tc>
-          <w:tcPr>
-            <w:tcW w:type="dxa" w:w="2600"/>
-            <w:tcBorders>
-              <w:top w:val="single" w:color="808080" w:sz="4"/>
-              <w:left w:val="single" w:color="808080" w:sz="4"/>
-              <w:bottom w:val="single" w:color="808080" w:sz="4"/>
-              <w:right w:val="single" w:color="808080" w:sz="4"/>
-            </w:tcBorders>
-            <w:tcMar>
-              <w:top w:type="dxa" w:w="40"/>
-              <w:left w:type="dxa" w:w="80"/>
-              <w:bottom w:type="dxa" w:w="40"/>
-              <w:right w:type="dxa" w:w="80"/>
-            </w:tcMar>
-          </w:tcPr>
-          <w:p>
-            <w:pPr>
-              <w:bidi/>
-              <w:jc w:val="center"/>
-            </w:pPr>
-            <w:r>
-              <w:rPr>
-                <w:rFonts w:ascii="Times New Roman" w:cs="David" w:hAnsi="Times New Roman"/>
-                <w:b w:val="false"/>
-                <w:sz w:val="20"/>
-                <w:szCs w:val="20"/>
-                <w:rtl/>
-              </w:rPr>
-              <w:t xml:space="preserve">"מורה מהקהילה היא לא רק מורה, היא גשר" (ריהאם)</w:t>
-            </w:r>
-          </w:p>
-        </w:tc>
-      </w:tr>
-      <w:tr>
-        <w:trPr>
-          <w:tblHeader w:val="false"/>
-        </w:trPr>
-        <w:tc>
-          <w:tcPr>
-            <w:tcW w:type="dxa" w:w="2300"/>
-            <w:tcBorders>
-              <w:top w:val="single" w:color="808080" w:sz="4"/>
-              <w:left w:val="single" w:color="808080" w:sz="4"/>
-              <w:bottom w:val="single" w:color="808080" w:sz="4"/>
-              <w:right w:val="single" w:color="808080" w:sz="4"/>
-            </w:tcBorders>
-            <w:tcMar>
-              <w:top w:type="dxa" w:w="40"/>
-              <w:left w:type="dxa" w:w="80"/>
-              <w:bottom w:type="dxa" w:w="40"/>
-              <w:right w:type="dxa" w:w="80"/>
-            </w:tcMar>
-          </w:tcPr>
-          <w:p>
-            <w:pPr>
-              <w:bidi/>
-              <w:jc w:val="center"/>
-            </w:pPr>
-            <w:r>
-              <w:rPr>
-                <w:rFonts w:ascii="Times New Roman" w:cs="David" w:hAnsi="Times New Roman"/>
-                <w:b w:val="false"/>
-                <w:sz w:val="20"/>
-                <w:szCs w:val="20"/>
-                <w:rtl/>
-              </w:rPr>
-              <w:t xml:space="preserve">2. קשר לעומת מידע</w:t>
-            </w:r>
-          </w:p>
-        </w:tc>
-        <w:tc>
-          <w:tcPr>
-            <w:tcW w:type="dxa" w:w="3600"/>
-            <w:tcBorders>
-              <w:top w:val="single" w:color="808080" w:sz="4"/>
-              <w:left w:val="single" w:color="808080" w:sz="4"/>
-              <w:bottom w:val="single" w:color="808080" w:sz="4"/>
-              <w:right w:val="single" w:color="808080" w:sz="4"/>
-            </w:tcBorders>
-            <w:tcMar>
-              <w:top w:type="dxa" w:w="40"/>
-              <w:left w:type="dxa" w:w="80"/>
-              <w:bottom w:type="dxa" w:w="40"/>
-              <w:right w:type="dxa" w:w="80"/>
-            </w:tcMar>
-          </w:tcPr>
-          <w:p>
-            <w:pPr>
-              <w:bidi/>
-              <w:jc w:val="center"/>
-            </w:pPr>
-            <w:r>
-              <w:rPr>
-                <w:rFonts w:ascii="Times New Roman" w:cs="David" w:hAnsi="Times New Roman"/>
-                <w:b w:val="false"/>
-                <w:sz w:val="20"/>
-                <w:szCs w:val="20"/>
-                <w:rtl/>
-              </w:rPr>
-              <w:t xml:space="preserve">וואטסאפ ומשו"ב; מידע לעומת יחסים; מחירי התקשורת הדיגיטלית; ערוצים בלתי פורמליים</w:t>
-            </w:r>
-          </w:p>
-        </w:tc>
-        <w:tc>
-          <w:tcPr>
-            <w:tcW w:type="dxa" w:w="2600"/>
-            <w:tcBorders>
-              <w:top w:val="single" w:color="808080" w:sz="4"/>
-              <w:left w:val="single" w:color="808080" w:sz="4"/>
-              <w:bottom w:val="single" w:color="808080" w:sz="4"/>
-              <w:right w:val="single" w:color="808080" w:sz="4"/>
-            </w:tcBorders>
-            <w:tcMar>
-              <w:top w:type="dxa" w:w="40"/>
-              <w:left w:type="dxa" w:w="80"/>
-              <w:bottom w:type="dxa" w:w="40"/>
-              <w:right w:type="dxa" w:w="80"/>
-            </w:tcMar>
-          </w:tcPr>
-          <w:p>
-            <w:pPr>
-              <w:bidi/>
-              <w:jc w:val="center"/>
-            </w:pPr>
-            <w:r>
-              <w:rPr>
-                <w:rFonts w:ascii="Times New Roman" w:cs="David" w:hAnsi="Times New Roman"/>
-                <w:b w:val="false"/>
-                <w:sz w:val="20"/>
-                <w:szCs w:val="20"/>
-                <w:rtl/>
-              </w:rPr>
-              <w:t xml:space="preserve">"הודעה זה פתק" (פאטמה)</w:t>
-            </w:r>
-          </w:p>
-        </w:tc>
-      </w:tr>
-      <w:tr>
-        <w:trPr>
-          <w:tblHeader w:val="false"/>
-        </w:trPr>
-        <w:tc>
-          <w:tcPr>
-            <w:tcW w:type="dxa" w:w="2300"/>
-            <w:tcBorders>
-              <w:top w:val="single" w:color="808080" w:sz="4"/>
-              <w:left w:val="single" w:color="808080" w:sz="4"/>
-              <w:bottom w:val="single" w:color="808080" w:sz="4"/>
-              <w:right w:val="single" w:color="808080" w:sz="4"/>
-            </w:tcBorders>
-            <w:tcMar>
-              <w:top w:type="dxa" w:w="40"/>
-              <w:left w:type="dxa" w:w="80"/>
-              <w:bottom w:type="dxa" w:w="40"/>
-              <w:right w:type="dxa" w:w="80"/>
-            </w:tcMar>
-          </w:tcPr>
-          <w:p>
-            <w:pPr>
-              <w:bidi/>
-              <w:jc w:val="center"/>
-            </w:pPr>
-            <w:r>
-              <w:rPr>
-                <w:rFonts w:ascii="Times New Roman" w:cs="David" w:hAnsi="Times New Roman"/>
-                <w:b w:val="false"/>
-                <w:sz w:val="20"/>
-                <w:szCs w:val="20"/>
-                <w:rtl/>
-              </w:rPr>
-              <w:t xml:space="preserve">3. מוזמן ולא מזומן</w:t>
-            </w:r>
-          </w:p>
-        </w:tc>
-        <w:tc>
-          <w:tcPr>
-            <w:tcW w:type="dxa" w:w="3600"/>
-            <w:tcBorders>
-              <w:top w:val="single" w:color="808080" w:sz="4"/>
-              <w:left w:val="single" w:color="808080" w:sz="4"/>
-              <w:bottom w:val="single" w:color="808080" w:sz="4"/>
-              <w:right w:val="single" w:color="808080" w:sz="4"/>
-            </w:tcBorders>
-            <w:tcMar>
-              <w:top w:type="dxa" w:w="40"/>
-              <w:left w:type="dxa" w:w="80"/>
-              <w:bottom w:type="dxa" w:w="40"/>
-              <w:right w:type="dxa" w:w="80"/>
-            </w:tcMar>
-          </w:tcPr>
-          <w:p>
-            <w:pPr>
-              <w:bidi/>
-              <w:jc w:val="center"/>
-            </w:pPr>
-            <w:r>
-              <w:rPr>
-                <w:rFonts w:ascii="Times New Roman" w:cs="David" w:hAnsi="Times New Roman"/>
-                <w:b w:val="false"/>
-                <w:sz w:val="20"/>
-                <w:szCs w:val="20"/>
-                <w:rtl/>
-              </w:rPr>
-              <w:t xml:space="preserve">יוזמת הקשר ופנייה חיובית ראשונה; הגדרה מחודשת של "הורה מעורב"; דרכים להגיע להורים</w:t>
-            </w:r>
-          </w:p>
-        </w:tc>
-        <w:tc>
-          <w:tcPr>
-            <w:tcW w:type="dxa" w:w="2600"/>
-            <w:tcBorders>
-              <w:top w:val="single" w:color="808080" w:sz="4"/>
-              <w:left w:val="single" w:color="808080" w:sz="4"/>
-              <w:bottom w:val="single" w:color="808080" w:sz="4"/>
-              <w:right w:val="single" w:color="808080" w:sz="4"/>
-            </w:tcBorders>
-            <w:tcMar>
-              <w:top w:type="dxa" w:w="40"/>
-              <w:left w:type="dxa" w:w="80"/>
-              <w:bottom w:type="dxa" w:w="40"/>
-              <w:right w:type="dxa" w:w="80"/>
-            </w:tcMar>
-          </w:tcPr>
-          <w:p>
-            <w:pPr>
-              <w:bidi/>
-              <w:jc w:val="center"/>
-            </w:pPr>
-            <w:r>
-              <w:rPr>
-                <w:rFonts w:ascii="Times New Roman" w:cs="David" w:hAnsi="Times New Roman"/>
-                <w:b w:val="false"/>
-                <w:sz w:val="20"/>
-                <w:szCs w:val="20"/>
-                <w:rtl/>
-              </w:rPr>
-              <w:t xml:space="preserve">"היא מעורבת" (ריהאם)</w:t>
-            </w:r>
-          </w:p>
-        </w:tc>
-      </w:tr>
-      <w:tr>
-        <w:trPr>
-          <w:tblHeader w:val="false"/>
-        </w:trPr>
-        <w:tc>
-          <w:tcPr>
-            <w:tcW w:type="dxa" w:w="2300"/>
-            <w:tcBorders>
-              <w:top w:val="single" w:color="808080" w:sz="4"/>
-              <w:left w:val="single" w:color="808080" w:sz="4"/>
-              <w:bottom w:val="single" w:color="808080" w:sz="4"/>
-              <w:right w:val="single" w:color="808080" w:sz="4"/>
-            </w:tcBorders>
-            <w:tcMar>
-              <w:top w:type="dxa" w:w="40"/>
-              <w:left w:type="dxa" w:w="80"/>
-              <w:bottom w:type="dxa" w:w="40"/>
-              <w:right w:type="dxa" w:w="80"/>
-            </w:tcMar>
-          </w:tcPr>
-          <w:p>
-            <w:pPr>
-              <w:bidi/>
-              <w:jc w:val="center"/>
-            </w:pPr>
-            <w:r>
-              <w:rPr>
-                <w:rFonts w:ascii="Times New Roman" w:cs="David" w:hAnsi="Times New Roman"/>
-                <w:b w:val="false"/>
-                <w:sz w:val="20"/>
-                <w:szCs w:val="20"/>
-                <w:rtl/>
-              </w:rPr>
-              <w:t xml:space="preserve">4. מעזרה לשותפות</w:t>
-            </w:r>
-          </w:p>
-        </w:tc>
-        <w:tc>
-          <w:tcPr>
-            <w:tcW w:type="dxa" w:w="3600"/>
-            <w:tcBorders>
-              <w:top w:val="single" w:color="808080" w:sz="4"/>
-              <w:left w:val="single" w:color="808080" w:sz="4"/>
-              <w:bottom w:val="single" w:color="808080" w:sz="4"/>
-              <w:right w:val="single" w:color="808080" w:sz="4"/>
-            </w:tcBorders>
-            <w:tcMar>
-              <w:top w:type="dxa" w:w="40"/>
-              <w:left w:type="dxa" w:w="80"/>
-              <w:bottom w:type="dxa" w:w="40"/>
-              <w:right w:type="dxa" w:w="80"/>
-            </w:tcMar>
-          </w:tcPr>
-          <w:p>
-            <w:pPr>
-              <w:bidi/>
-              <w:jc w:val="center"/>
-            </w:pPr>
-            <w:r>
-              <w:rPr>
-                <w:rFonts w:ascii="Times New Roman" w:cs="David" w:hAnsi="Times New Roman"/>
-                <w:b w:val="false"/>
-                <w:sz w:val="20"/>
-                <w:szCs w:val="20"/>
-                <w:rtl/>
-              </w:rPr>
-              <w:t xml:space="preserve">עזרה לעומת החלטות; ההורה כנותן ידע; גופי הורים שפותרים בעיות</w:t>
-            </w:r>
-          </w:p>
-        </w:tc>
-        <w:tc>
-          <w:tcPr>
-            <w:tcW w:type="dxa" w:w="2600"/>
-            <w:tcBorders>
-              <w:top w:val="single" w:color="808080" w:sz="4"/>
-              <w:left w:val="single" w:color="808080" w:sz="4"/>
-              <w:bottom w:val="single" w:color="808080" w:sz="4"/>
-              <w:right w:val="single" w:color="808080" w:sz="4"/>
-            </w:tcBorders>
-            <w:tcMar>
-              <w:top w:type="dxa" w:w="40"/>
-              <w:left w:type="dxa" w:w="80"/>
-              <w:bottom w:type="dxa" w:w="40"/>
-              <w:right w:type="dxa" w:w="80"/>
-            </w:tcMar>
-          </w:tcPr>
-          <w:p>
-            <w:pPr>
-              <w:bidi/>
-              <w:jc w:val="center"/>
-            </w:pPr>
-            <w:r>
-              <w:rPr>
-                <w:rFonts w:ascii="Times New Roman" w:cs="David" w:hAnsi="Times New Roman"/>
-                <w:b w:val="false"/>
-                <w:sz w:val="20"/>
-                <w:szCs w:val="20"/>
-                <w:rtl/>
-              </w:rPr>
-              <w:t xml:space="preserve">"בית הספר מפנה מקום ויוצא מהדרך" (נסרין)</w:t>
-            </w:r>
-          </w:p>
-        </w:tc>
-      </w:tr>
-      <w:tr>
-        <w:trPr>
-          <w:tblHeader w:val="false"/>
-        </w:trPr>
-        <w:tc>
-          <w:tcPr>
-            <w:tcW w:type="dxa" w:w="2300"/>
-            <w:tcBorders>
-              <w:top w:val="single" w:color="808080" w:sz="4"/>
-              <w:left w:val="single" w:color="808080" w:sz="4"/>
-              <w:bottom w:val="single" w:color="808080" w:sz="4"/>
-              <w:right w:val="single" w:color="808080" w:sz="4"/>
-            </w:tcBorders>
-            <w:tcMar>
-              <w:top w:type="dxa" w:w="40"/>
-              <w:left w:type="dxa" w:w="80"/>
-              <w:bottom w:type="dxa" w:w="40"/>
-              <w:right w:type="dxa" w:w="80"/>
-            </w:tcMar>
-          </w:tcPr>
-          <w:p>
-            <w:pPr>
-              <w:bidi/>
-              <w:jc w:val="center"/>
-            </w:pPr>
-            <w:r>
-              <w:rPr>
-                <w:rFonts w:ascii="Times New Roman" w:cs="David" w:hAnsi="Times New Roman"/>
-                <w:b w:val="false"/>
-                <w:sz w:val="20"/>
-                <w:szCs w:val="20"/>
-                <w:rtl/>
-              </w:rPr>
-              <w:t xml:space="preserve">5. כבוד, מגדר ומשפחה מורחבת</w:t>
-            </w:r>
-          </w:p>
-        </w:tc>
-        <w:tc>
-          <w:tcPr>
-            <w:tcW w:type="dxa" w:w="3600"/>
-            <w:tcBorders>
-              <w:top w:val="single" w:color="808080" w:sz="4"/>
-              <w:left w:val="single" w:color="808080" w:sz="4"/>
-              <w:bottom w:val="single" w:color="808080" w:sz="4"/>
-              <w:right w:val="single" w:color="808080" w:sz="4"/>
-            </w:tcBorders>
-            <w:tcMar>
-              <w:top w:type="dxa" w:w="40"/>
-              <w:left w:type="dxa" w:w="80"/>
-              <w:bottom w:type="dxa" w:w="40"/>
-              <w:right w:type="dxa" w:w="80"/>
-            </w:tcMar>
-          </w:tcPr>
-          <w:p>
-            <w:pPr>
-              <w:bidi/>
-              <w:jc w:val="center"/>
-            </w:pPr>
-            <w:r>
-              <w:rPr>
-                <w:rFonts w:ascii="Times New Roman" w:cs="David" w:hAnsi="Times New Roman"/>
-                <w:b w:val="false"/>
-                <w:sz w:val="20"/>
-                <w:szCs w:val="20"/>
-                <w:rtl/>
-              </w:rPr>
-              <w:t xml:space="preserve">הסבתא והמשפחה המורחבת; מגדר; מחלוקות ופחד</w:t>
-            </w:r>
-          </w:p>
-        </w:tc>
-        <w:tc>
-          <w:tcPr>
-            <w:tcW w:type="dxa" w:w="2600"/>
-            <w:tcBorders>
-              <w:top w:val="single" w:color="808080" w:sz="4"/>
-              <w:left w:val="single" w:color="808080" w:sz="4"/>
-              <w:bottom w:val="single" w:color="808080" w:sz="4"/>
-              <w:right w:val="single" w:color="808080" w:sz="4"/>
-            </w:tcBorders>
-            <w:tcMar>
-              <w:top w:type="dxa" w:w="40"/>
-              <w:left w:type="dxa" w:w="80"/>
-              <w:bottom w:type="dxa" w:w="40"/>
-              <w:right w:type="dxa" w:w="80"/>
-            </w:tcMar>
-          </w:tcPr>
-          <w:p>
-            <w:pPr>
-              <w:bidi/>
-              <w:jc w:val="center"/>
-            </w:pPr>
-            <w:r>
-              <w:rPr>
-                <w:rFonts w:ascii="Times New Roman" w:cs="David" w:hAnsi="Times New Roman"/>
-                <w:b w:val="false"/>
-                <w:sz w:val="20"/>
-                <w:szCs w:val="20"/>
-                <w:rtl/>
-              </w:rPr>
-              <w:t xml:space="preserve">"זה לא ערבוב, זה המבנה" (סוהא)</w:t>
-            </w:r>
-          </w:p>
-        </w:tc>
-      </w:tr>
-      <w:tr>
-        <w:trPr>
-          <w:tblHeader w:val="false"/>
-        </w:trPr>
-        <w:tc>
-          <w:tcPr>
-            <w:tcW w:type="dxa" w:w="2300"/>
-            <w:tcBorders>
-              <w:top w:val="single" w:color="808080" w:sz="4"/>
-              <w:left w:val="single" w:color="808080" w:sz="4"/>
-              <w:bottom w:val="single" w:color="808080" w:sz="4"/>
-              <w:right w:val="single" w:color="808080" w:sz="4"/>
-            </w:tcBorders>
-            <w:tcMar>
-              <w:top w:type="dxa" w:w="40"/>
-              <w:left w:type="dxa" w:w="80"/>
-              <w:bottom w:type="dxa" w:w="40"/>
-              <w:right w:type="dxa" w:w="80"/>
-            </w:tcMar>
-          </w:tcPr>
-          <w:p>
-            <w:pPr>
-              <w:bidi/>
-              <w:jc w:val="center"/>
-            </w:pPr>
-            <w:r>
-              <w:rPr>
-                <w:rFonts w:ascii="Times New Roman" w:cs="David" w:hAnsi="Times New Roman"/>
-                <w:b w:val="false"/>
-                <w:sz w:val="20"/>
-                <w:szCs w:val="20"/>
-                <w:rtl/>
-              </w:rPr>
-              <w:t xml:space="preserve">6. ההנהלה, המבנה וההכשרה</w:t>
-            </w:r>
-          </w:p>
-        </w:tc>
-        <w:tc>
-          <w:tcPr>
-            <w:tcW w:type="dxa" w:w="3600"/>
-            <w:tcBorders>
-              <w:top w:val="single" w:color="808080" w:sz="4"/>
-              <w:left w:val="single" w:color="808080" w:sz="4"/>
-              <w:bottom w:val="single" w:color="808080" w:sz="4"/>
-              <w:right w:val="single" w:color="808080" w:sz="4"/>
-            </w:tcBorders>
-            <w:tcMar>
-              <w:top w:type="dxa" w:w="40"/>
-              <w:left w:type="dxa" w:w="80"/>
-              <w:bottom w:type="dxa" w:w="40"/>
-              <w:right w:type="dxa" w:w="80"/>
-            </w:tcMar>
-          </w:tcPr>
-          <w:p>
-            <w:pPr>
-              <w:bidi/>
-              <w:jc w:val="center"/>
-            </w:pPr>
-            <w:r>
-              <w:rPr>
-                <w:rFonts w:ascii="Times New Roman" w:cs="David" w:hAnsi="Times New Roman"/>
-                <w:b w:val="false"/>
-                <w:sz w:val="20"/>
-                <w:szCs w:val="20"/>
-                <w:rtl/>
-              </w:rPr>
-              <w:t xml:space="preserve">מה נחשב תמיכה; סגנונות ניהול; היעדר נוהל, זמן והכשרה; המחיר הרגשי; הצעות המורות</w:t>
-            </w:r>
-          </w:p>
-        </w:tc>
-        <w:tc>
-          <w:tcPr>
-            <w:tcW w:type="dxa" w:w="2600"/>
-            <w:tcBorders>
-              <w:top w:val="single" w:color="808080" w:sz="4"/>
-              <w:left w:val="single" w:color="808080" w:sz="4"/>
-              <w:bottom w:val="single" w:color="808080" w:sz="4"/>
-              <w:right w:val="single" w:color="808080" w:sz="4"/>
-            </w:tcBorders>
-            <w:tcMar>
-              <w:top w:type="dxa" w:w="40"/>
-              <w:left w:type="dxa" w:w="80"/>
-              <w:bottom w:type="dxa" w:w="40"/>
-              <w:right w:type="dxa" w:w="80"/>
-            </w:tcMar>
-          </w:tcPr>
-          <w:p>
-            <w:pPr>
-              <w:bidi/>
-              <w:jc w:val="center"/>
-            </w:pPr>
-            <w:r>
-              <w:rPr>
-                <w:rFonts w:ascii="Times New Roman" w:cs="David" w:hAnsi="Times New Roman"/>
-                <w:b w:val="false"/>
-                <w:sz w:val="20"/>
-                <w:szCs w:val="20"/>
-                <w:rtl/>
-              </w:rPr>
-              <w:t xml:space="preserve">"כל מורה לפי האופי שלה" (מהא)</w:t>
-            </w:r>
-          </w:p>
-        </w:tc>
-      </w:tr>
-    </w:tbl>
+        <w:t xml:space="preserve">מניתוח שמונת הראיונות עלו שש תמות, והן מוצגות לפי סדר חשיבותן בדברי המרואיינות, עם ציטוטים מדברי המשתתפות וסיכום בסוף כל תמה. כאשר המרואיינות הביעו עמדות סותרות, הסתירה מוצגת כפי שהן עצמן ראו אותה, וכאשר עמדה עלתה אצל מרואיינת אחת בלבד, הדבר מצוין. בפרק זה מוצגים דברי המשתתפות בלבד, והפרשנות שלהם לאור הספרות מובאת בפרק הדיון. הציטוטים לקוחים מדברי משתתפות המחקר ומובאים בשמות בדויים, ובסוגריים שאחרי כל ציטוט מצוין מספר הראיון שממנו נלקח, לפי סדר התמלילים בנספח ג'. להלן תיאור קצר של התמות ושל תתי-התמות, ואחריו הצגה מפורטת של כל תמה.</w:t>
+      </w:r>
+    </w:p>
+    <w:p>
+      <w:pPr>
+        <w:bidi/>
+        <w:spacing w:after="60" w:before="0" w:line="360" w:lineRule="auto"/>
+        <w:jc w:val="both"/>
+      </w:pPr>
+      <w:r>
+        <w:rPr>
+          <w:rFonts w:ascii="Times New Roman" w:cs="David" w:hAnsi="Times New Roman"/>
+          <w:sz w:val="24"/>
+          <w:szCs w:val="24"/>
+          <w:rtl/>
+        </w:rPr>
+        <w:t xml:space="preserve">התמה הראשונה, "המורה כגשר בין בית הספר לקהילה", עוסקת במשמעות שהמורות מייחסות לקשר עם ההורים, בהבדל בין מורה מהקהילה למורה "זרה" ובהקשר העירוני של לוד. התמה השנייה, "קשר לעומת מידע", עוסקת בערוצי התקשורת: הוואטסאפ ומשו"ב, ההבחנה בין העברת מידע לבניית יחסים, המחירים של התקשורת הדיגיטלית והערוצים הבלתי פורמליים. התמה השלישית, "מוזמן ולא מזומן", עוסקת ביוזמת הקשר ובפנייה החיובית הראשונה, בהגדרה מחודשת של "הורה מעורב" ובדרכים להגיע להורים. התמה הרביעית, "מעזרה לשותפות", עוסקת בהבחנה בין עזרה של ההורים להשתתפותם בהחלטות, בהורה כנותן ידע ובגופי הורים שפותרים בעיות. התמה החמישית, "כבוד, מגדר ומשפחה מורחבת", עוסקת במקומן של הסבתות ושל המשפחה המורחבת, בהיבטים מגדריים ובמחלוקות ובפחד. התמה השישית, "ההנהלה, המבנה וההכשרה", עוסקת במה שהמורות רואות כתמיכה, בסגנונות הניהול, בהיעדר נוהל, זמן והכשרה, במחיר הרגשי של העבודה ובהצעות של המורות.</w:t>
+      </w:r>
+    </w:p>
     <w:p>
       <w:pPr>
         <w:pStyle w:val="Heading2"/>

</xml_diff>

<commit_message>
Merge findings into four themes, cite course book, complete intro
Co-Authored-By: Claude Opus 5.5 <noreply@anthropic.com>
Claude-Session: https://claude.ai/code/session_01PCrLuLuf13bgHFN1Akf9GB
</commit_message>
<xml_diff>
--- a/seminar/עבודת סמינר - חיתאם אבו ריאש.docx
+++ b/seminar/עבודת סמינר - חיתאם אבו ריאש.docx
@@ -335,7 +335,7 @@
           <w:szCs w:val="24"/>
           <w:rtl/>
         </w:rPr>
-        <w:t xml:space="preserve">מחקר זה בחן כיצד עובדות מורות מול הורים בבתי ספר במגזר הערבי בלוד, עיר מעורבת שבה פערים חברתיים-כלכליים, אלימות ברחוב ומתחים בין יהודים לערבים נוגעים בחיי המשפחות. המחקר נערך בגישה האיכותנית. נערכו ראיונות חצי מובנים עם שמונה מורות מחמישה בתי ספר, והם נותחו בניתוח תמטי. מן הניתוח עלו שש תמות. המורות תיארו את עצמן כגשר בין בית הספר לקהילה, והבחינו בין ערוצים דיגיטליים, המשמשים להעברת מידע, ובין מפגש פנים אל פנים, שבו נבנים היחסים. הן עברו מ"זימון" הורים ל"הזמנה" שלהם, ובמרכז המעבר עמדה פנייה חיובית ראשונה. באמצעות יוזמות אישיות הן הפכו הורים משותפים בעזרה לשותפים בידע ובהחלטות. הן פעלו בתוך מבנה קהילתי של כבוד, מגדר ומשפחה מורחבת, ולא נגדו. לבסוף, השותפות נמצאה תלויה מאוד בסגנון ההנהלה, בהיעדר מבנה מערכתי והכשרה. המסקנה המרכזית היא שהמנהיגות השיתופית בבתי ספר אלה מתקיימת בעיקר "מלמטה", ביוזמת מורות. כדי שתתקיים לאורך זמן נדרשים זמן מוקצה בתוך מערכת השעות, תפקיד של רכזת הורים וקהילה, הכשרה המותאמת לחברה הערבית בעיר מעורבת ותקשורת עירונית בערבית.</w:t>
+        <w:t xml:space="preserve">מחקר זה בחן כיצד עובדות מורות מול הורים בבתי ספר במגזר הערבי בלוד, עיר מעורבת שבה פערים חברתיים-כלכליים, אלימות ברחוב ומתחים בין יהודים לערבים נוגעים בחיי המשפחות. המחקר נערך בגישה האיכותנית. נערכו ראיונות חצי מובנים עם שמונה מורות מחמישה בתי ספר, והם נותחו בניתוח תמטי. מן הניתוח עלו ארבע תמות. המורות תיארו את עצמן כגשר בין בית הספר לקהילה, הפועלות בתוך מבנה קהילתי של כבוד, מגדר ומשפחה מורחבת ולא נגדו. הן הבחינו בין ערוצים דיגיטליים, המשמשים להעברת מידע, ובין מפגש פנים אל פנים, שבו נבנים היחסים. הן עברו מ"זימון" הורים ל"הזמנה" שלהם, ובמרכז המעבר עמדה פנייה חיובית ראשונה. באמצעות יוזמות אישיות הן הפכו הורים משותפים בעזרה לשותפים בידע ובהחלטות. לבסוף, השותפות נמצאה תלויה מאוד בסגנון ההנהלה, בהיעדר מבנה מערכתי והכשרה. המסקנה המרכזית היא שהמנהיגות השיתופית בבתי ספר אלה מתקיימת בעיקר "מלמטה", ביוזמת מורות. כדי שתתקיים לאורך זמן נדרשים זמן מוקצה בתוך מערכת השעות, תפקיד של רכזת הורים וקהילה, הכשרה המותאמת לחברה הערבית בעיר מעורבת ותקשורת עירונית בערבית.</w:t>
       </w:r>
     </w:p>
     <w:p>
@@ -1093,7 +1093,7 @@
               <w:szCs w:val="24"/>
               <w:rtl/>
             </w:rPr>
-            <w:t>13</w:t>
+            <w:t>14</w:t>
           </w:r>
         </w:p>
         <w:p>
@@ -1112,44 +1112,7 @@
               <w:szCs w:val="24"/>
               <w:rtl/>
             </w:rPr>
-            <w:t xml:space="preserve">4.3 "מוזמן ולא מזומן": יוזמה, חיוביות והגעה להורים</w:t>
-          </w:r>
-          <w:r>
-            <w:rPr>
-              <w:rFonts w:ascii="Times New Roman" w:hAnsi="Times New Roman" w:cs="David"/>
-              <w:sz w:val="24"/>
-              <w:szCs w:val="24"/>
-              <w:rtl/>
-            </w:rPr>
-            <w:tab/>
-          </w:r>
-          <w:r>
-            <w:rPr>
-              <w:rFonts w:ascii="Times New Roman" w:hAnsi="Times New Roman" w:cs="David"/>
-              <w:sz w:val="24"/>
-              <w:szCs w:val="24"/>
-              <w:rtl/>
-            </w:rPr>
-            <w:t>15</w:t>
-          </w:r>
-        </w:p>
-        <w:p>
-          <w:pPr>
-            <w:bidi/>
-            <w:tabs>
-              <w:tab w:val="right" w:leader="dot" w:pos="9072"/>
-            </w:tabs>
-            <w:spacing w:before="0" w:after="20" w:line="252" w:lineRule="auto"/>
-            <w:ind w:left="567"/>
-          </w:pPr>
-          <w:r>
-            <w:rPr>
-              <w:rFonts w:ascii="Times New Roman" w:hAnsi="Times New Roman" w:cs="David"/>
-              <w:sz w:val="24"/>
-              <w:szCs w:val="24"/>
-              <w:rtl/>
-            </w:rPr>
-            <w:t xml:space="preserve">4.4 "מעזרה לשותפות": שיתוף ההורים בידע ובהחלטות</w:t>
+            <w:t xml:space="preserve">4.3 "מוזמן ולא מזומן": מיוזמה לשותפות</w:t>
           </w:r>
           <w:r>
             <w:rPr>
@@ -1186,44 +1149,7 @@
               <w:szCs w:val="24"/>
               <w:rtl/>
             </w:rPr>
-            <w:t xml:space="preserve">4.5 "זה לא ערבוב, זה המבנה": כבוד, מגדר ומשפחה מורחבת</w:t>
-          </w:r>
-          <w:r>
-            <w:rPr>
-              <w:rFonts w:ascii="Times New Roman" w:hAnsi="Times New Roman" w:cs="David"/>
-              <w:sz w:val="24"/>
-              <w:szCs w:val="24"/>
-              <w:rtl/>
-            </w:rPr>
-            <w:tab/>
-          </w:r>
-          <w:r>
-            <w:rPr>
-              <w:rFonts w:ascii="Times New Roman" w:hAnsi="Times New Roman" w:cs="David"/>
-              <w:sz w:val="24"/>
-              <w:szCs w:val="24"/>
-              <w:rtl/>
-            </w:rPr>
-            <w:t>18</w:t>
-          </w:r>
-        </w:p>
-        <w:p>
-          <w:pPr>
-            <w:bidi/>
-            <w:tabs>
-              <w:tab w:val="right" w:leader="dot" w:pos="9072"/>
-            </w:tabs>
-            <w:spacing w:before="0" w:after="20" w:line="252" w:lineRule="auto"/>
-            <w:ind w:left="567"/>
-          </w:pPr>
-          <w:r>
-            <w:rPr>
-              <w:rFonts w:ascii="Times New Roman" w:hAnsi="Times New Roman" w:cs="David"/>
-              <w:sz w:val="24"/>
-              <w:szCs w:val="24"/>
-              <w:rtl/>
-            </w:rPr>
-            <w:t xml:space="preserve">4.6 "תומכת או לא תומכת": ההנהלה, המבנה וההכשרה</w:t>
+            <w:t xml:space="preserve">4.4 "תומכת או לא תומכת": ההנהלה, המבנה וההכשרה</w:t>
           </w:r>
           <w:r>
             <w:rPr>
@@ -1701,7 +1627,7 @@
           <w:szCs w:val="24"/>
           <w:rtl/>
         </w:rPr>
-        <w:t xml:space="preserve">מטרת העבודה היא לבחון כיצד מורות בבתי ספר במגזר הערבי בלוד עובדות מול ההורים, באילו ערוצים הן משתמשות, ומה מאפשר שותפות או מקשה עליה. העבודה נשענת על מושגים מתחום פיתוח הקהילה ומתחום המנהיגות השיתופית. הנחת היסוד שלה היא שהקשר עם ההורים הוא אחד המקומות שבהם בית הספר פועל כקהילה, או נכשל בכך. הפרק הראשון מציג את הרקע התיאורטי, מן המושג הרחב של קהילה ועד ההקשר של לוד. אחריו מוצגות שאלות המחקר והשיטה, הממצאים, הדיון בהם והמסקנות.</w:t>
+        <w:t xml:space="preserve">מטרת העבודה היא לבחון כיצד מורות בבתי ספר במגזר הערבי בלוד עובדות מול ההורים, באילו ערוצים הן משתמשות, ומה מאפשר שותפות או מקשה עליה. העבודה נשענת על מושגים מתחום פיתוח הקהילה ומתחום המנהיגות השיתופית. הנחת היסוד שלה היא שהקשר עם ההורים הוא אחד המקומות שבהם בית הספר פועל כקהילה, או נכשל בכך. המחקר נערך בגישה האיכותנית: נערכו ראיונות חצי מובנים עם שמונה מורות מחמישה בתי ספר במגזר הערבי בלוד, שש מהן בבתי ספר יסודיים ושתיים בחטיבת ביניים, והראיונות נותחו בניתוח תמטי. הפרק הראשון מציג את הרקע התיאורטי, מן המושג הרחב של קהילה ועד ההקשר של לוד. הפרק השני מציג את שאלות המחקר ואת טענת המחקר, והפרק השלישי את שיטת המחקר. בפרק הרביעי מוצגים הממצאים, בפרק החמישי הם מנותחים ונידונים לאור הספרות, והפרק השישי מסכם את המסקנות, את מגבלות המחקר ואת ההמלצות.</w:t>
       </w:r>
     </w:p>
     <w:p>
@@ -1840,6 +1766,22 @@
           <w:rtl/>
         </w:rPr>
         <w:t xml:space="preserve">בית הספר הוא קהילה של מורים, תלמידים והורים, והוא נטוע בקהילה הרחבה. מודל שיתוף הפעולה הקהילתי (Community Collaboration Model) מציע לשפר את בית הספר באמצעות שותפויות עם משפחות ועם גורמים בקהילה, שמטרתן להסיר חסמים ללמידה שאינם לימודיים, כמו עוני, אלימות במשפחה וקשיים בבריאות הנפש. המודל בוחן צרכים ומשאבים בחמישה נתיבים: למידה אקדמית, התפתחות נוער ואקלים בית ספרי, מעורבות הורים ומשפחות, שירותי בריאות ורווחה ושותפויות קהילתיות, ויישומו מתחיל במיפוי הצרכים של התלמידים, הצוות, ההורים ותושבי הקהילה. סקירה של 14 מחקרים מצאה שהמודל נקשר לנגישות רבה יותר לשירותי בריאות הנפש, לשיפור באקלים הבית ספרי ולירידה בהפניות משמעתיות, וכי התנגדות ראשונית של אנשי חינוך הייתה אחד החסמים ליישומו (Anderson-Butcher et al., 2022).</w:t>
+      </w:r>
+    </w:p>
+    <w:p>
+      <w:pPr>
+        <w:bidi/>
+        <w:spacing w:after="60" w:before="0" w:line="360" w:lineRule="auto"/>
+        <w:jc w:val="both"/>
+      </w:pPr>
+      <w:r>
+        <w:rPr>
+          <w:rFonts w:ascii="Times New Roman" w:cs="David" w:hAnsi="Times New Roman"/>
+          <w:sz w:val="24"/>
+          <w:szCs w:val="24"/>
+          <w:rtl/>
+        </w:rPr>
+        <w:t xml:space="preserve">בספרות הישראלית על בינוי קהילה מתואר בית הספר כאחד המוסדות הקהילתיים בעלי הפוטנציאל המרכזי לעצב את פני הקהילה ולהגביר את ההון החברתי שבתוכה. לפי גישה זו, בית הספר פוגש לאורך זמן חלק נכבד מן הקהילה, ומשמש מראה שלה. עם זאת, יחסי הגומלין בין הקהילה ובין מערכת החינוך מלווים לעיתים באי-אמון: מצד אחד נשמעת ביקורת על המורים, ומצד אחר מנהלים ומורים נרתעים ממעורבות גבוהה של הורים, הנתפסת בעיניהם כבוטה וכחד-צדדית. כדי לשרטט את גבולות הסמכות הוצעה הבחנה בין התחום הערכי, שבו על ההורים והקהילה להיות מעורבים, ובין התחום הפדגוגי, שהוא תחומו של הסגל המקצועי. עוד תוארו כמה מודלים לשותפות, ובהם "קהילה בית ספרית", שבה אמנה חינוכית משותפת מעמידה במרכז את שותפות התלמידים, הצוות החינוכי וההורים בעיצוב בית הספר (שדמי-וורטמן, 2010).</w:t>
       </w:r>
     </w:p>
     <w:p>
@@ -4361,7 +4303,7 @@
           <w:szCs w:val="24"/>
           <w:rtl/>
         </w:rPr>
-        <w:t xml:space="preserve">הנתונים נותחו בניתוח קטגוריאלי לפי שלבי הניתוח של שקדי (2003). בניתוח הראשוני חולקו התמלילים ליחידות משמעות שקיבלו שמות של קטגוריות. בניתוח הממפה אורגנו הקטגוריות לקטגוריות מרכזיות ולתתי-קטגוריות, כמו "ערוצים בלתי פורמליים". בניתוח הממקד אוחדו הקטגוריות הקשורות לשאלת המחקר לשש תמות, ונבחרו להן ציטוטים מייצגים. הניתוח התאורטי, שבו התמות נקשרות לספרות, מוצג בפרק הדיון.</w:t>
+        <w:t xml:space="preserve">הנתונים נותחו בניתוח קטגוריאלי לפי שלבי הניתוח של שקדי (2003). בניתוח הראשוני חולקו התמלילים ליחידות משמעות שקיבלו שמות של קטגוריות. בניתוח הממפה אורגנו הקטגוריות לקטגוריות מרכזיות ולתתי-קטגוריות, כמו "ערוצים בלתי פורמליים". בניתוח הממקד אוחדו הקטגוריות הקשורות לשאלת המחקר לארבע תמות, ונבחרו להן ציטוטים מייצגים. הניתוח התאורטי, שבו התמות נקשרות לספרות, מוצג בפרק הדיון.</w:t>
       </w:r>
     </w:p>
     <w:p>
@@ -4432,7 +4374,7 @@
           <w:szCs w:val="24"/>
           <w:rtl/>
         </w:rPr>
-        <w:t xml:space="preserve">מניתוח שמונת הראיונות עלו שש תמות, והן מוצגות לפי סדר חשיבותן בדברי המרואיינות, עם ציטוטים מדברי המשתתפות וסיכום בסוף כל תמה. כאשר המרואיינות הביעו עמדות סותרות, הסתירה מוצגת כפי שהן עצמן ראו אותה, וכאשר עמדה עלתה אצל מרואיינת אחת בלבד, הדבר מצוין. בפרק זה מוצגים דברי המשתתפות בלבד, והפרשנות שלהם לאור הספרות מובאת בפרק הדיון. הציטוטים לקוחים מדברי משתתפות המחקר ומובאים בשמות בדויים, ובסוגריים שאחרי כל ציטוט מצוין מספר הראיון שממנו נלקח, לפי סדר התמלילים בנספח ג'. להלן תיאור קצר של התמות ושל תתי-התמות, ואחריו הצגה מפורטת של כל תמה.</w:t>
+        <w:t xml:space="preserve">מניתוח שמונת הראיונות עלו ארבע תמות, והן מוצגות לפי סדר חשיבותן בדברי המרואיינות, עם ציטוטים מדברי המשתתפות וסיכום בסוף כל תמה. כאשר המרואיינות הביעו עמדות סותרות, הסתירה מוצגת כפי שהן עצמן ראו אותה, וכאשר עמדה עלתה אצל מרואיינת אחת בלבד, הדבר מצוין. בפרק זה מוצגים דברי המשתתפות בלבד, והפרשנות שלהם לאור הספרות מובאת בפרק הדיון. הציטוטים לקוחים מדברי משתתפות המחקר ומובאים בשמות בדויים, ובסוגריים שאחרי כל ציטוט מצוין מספר הראיון שממנו נלקח, לפי סדר התמלילים בנספח ג'. להלן תיאור קצר של התמות ושל תתי-התמות, ואחריו הצגה מפורטת של כל תמה.</w:t>
       </w:r>
     </w:p>
     <w:p>
@@ -4448,7 +4390,7 @@
           <w:szCs w:val="24"/>
           <w:rtl/>
         </w:rPr>
-        <w:t xml:space="preserve">התמה הראשונה, "המורה כגשר בין בית הספר לקהילה", עוסקת במשמעות שהמורות מייחסות לקשר עם ההורים, בהבדל בין מורה מהקהילה למורה "זרה" ובהקשר העירוני של לוד. התמה השנייה, "קשר לעומת מידע", עוסקת בערוצי התקשורת: הוואטסאפ ומשו"ב, ההבחנה בין העברת מידע לבניית יחסים, המחירים של התקשורת הדיגיטלית והערוצים הבלתי פורמליים. התמה השלישית, "מוזמן ולא מזומן", עוסקת ביוזמת הקשר ובפנייה החיובית הראשונה, בהגדרה מחודשת של "הורה מעורב" ובדרכים להגיע להורים. התמה הרביעית, "מעזרה לשותפות", עוסקת בהבחנה בין עזרה של ההורים להשתתפותם בהחלטות, בהורה כנותן ידע ובגופי הורים שפותרים בעיות. התמה החמישית, "כבוד, מגדר ומשפחה מורחבת", עוסקת במקומן של הסבתות ושל המשפחה המורחבת, בהיבטים מגדריים ובמחלוקות ובפחד. התמה השישית, "ההנהלה, המבנה וההכשרה", עוסקת במה שהמורות רואות כתמיכה, בסגנונות הניהול, בהיעדר נוהל, זמן והכשרה, במחיר הרגשי של העבודה ובהצעות של המורות.</w:t>
+        <w:t xml:space="preserve">התמה הראשונה, "המורה כגשר בין בית הספר לקהילה", עוסקת במשמעות שהמורות מייחסות לקשר עם ההורים, בהבדל בין מורה מהקהילה למורה "זרה", בהקשר העירוני של לוד ובמבנה הקהילתי שבתוכו הן פועלות: מקומן של הסבתות ושל המשפחה המורחבת, היבטים מגדריים, והמחלוקות והפחד. התמה השנייה, "קשר לעומת מידע", עוסקת בערוצי התקשורת: הוואטסאפ ומשו"ב, ההבחנה בין העברת מידע לבניית יחסים, המחירים של התקשורת הדיגיטלית והערוצים הבלתי פורמליים. התמה השלישית, "מוזמן ולא מזומן", עוסקת במעבר מיוזמה לשותפות: יוזמת הקשר והפנייה החיובית הראשונה, הגדרה מחודשת של "הורה מעורב", הדרכים להגיע להורים, ההבחנה בין עזרה של ההורים להשתתפותם בהחלטות, ההורה כנותן ידע וגופי הורים שפותרים בעיות. התמה הרביעית, "ההנהלה, המבנה וההכשרה", עוסקת במה שהמורות רואות כתמיכה, בסגנונות הניהול, בהיעדר נוהל, זמן והכשרה, במחיר הרגשי של העבודה ובהצעות של המורות.</w:t>
       </w:r>
     </w:p>
     <w:p>
@@ -4483,7 +4425,7 @@
           <w:szCs w:val="24"/>
           <w:rtl/>
         </w:rPr>
-        <w:t xml:space="preserve">תמה זו עוסקת באופן שבו המורות תופסות את מקומן ואת מקומו של בית הספר בקהילה. בתמה שלושה חלקים: משמעות הקשר עם ההורים, ההבדל בין מורה מהקהילה למורה שאינה ממנה, וההקשר העירוני של לוד.</w:t>
+        <w:t xml:space="preserve">תמה זו עוסקת באופן שבו המורות תופסות את מקומן ואת מקומו של בית הספר בקהילה, ובמבנה הקהילתי שבתוכו הן פועלות. בתמה שישה חלקים: משמעות הקשר עם ההורים, ההבדל בין מורה מהקהילה למורה שאינה ממנה, ההקשר העירוני של לוד, הסבתא והמשפחה המורחבת, המגדר, והמחלוקות עם ההורים.</w:t>
       </w:r>
     </w:p>
     <w:p>
@@ -4690,6 +4632,24 @@
     <w:p>
       <w:pPr>
         <w:bidi/>
+        <w:spacing w:after="120" w:before="0" w:line="360" w:lineRule="auto"/>
+        <w:jc w:val="left"/>
+      </w:pPr>
+      <w:r>
+        <w:rPr>
+          <w:rFonts w:ascii="Times New Roman" w:cs="David" w:hAnsi="Times New Roman"/>
+          <w:b/>
+          <w:bCs/>
+          <w:sz w:val="24"/>
+          <w:szCs w:val="24"/>
+          <w:rtl/>
+        </w:rPr>
+        <w:t xml:space="preserve">ד. הסבתא והמשפחה המורחבת</w:t>
+      </w:r>
+    </w:p>
+    <w:p>
+      <w:pPr>
+        <w:bidi/>
         <w:spacing w:after="60" w:before="0" w:line="360" w:lineRule="auto"/>
         <w:jc w:val="both"/>
       </w:pPr>
@@ -4700,7 +4660,141 @@
           <w:szCs w:val="24"/>
           <w:rtl/>
         </w:rPr>
-        <w:t xml:space="preserve">לסיכום: מתמה זו עולה כי המורות רואות בקשר עם ההורים חלק מרכזי מעבודתן, ובבית הספר מוסד קהילתי שההורים סומכים עליו יותר מאשר על מוסדות אחרים בעיר. מורות מהקהילה נהנות מהיכרות עם המשפחות אך מתמודדות עם טשטוש גבולות, ומורות מבחוץ מתמודדות עם האשמות ב"זרות" אך מוצאות בה גם יתרון. ההקשר של לוד, ובו אלימות, פחד ותקשורת מוסדית בעברית, נוכח בכל היבט של הקשר.</w:t>
+        <w:t xml:space="preserve">המורות תיארו קהילה שבה הקשר עם בית הספר מתנהל דרך המשפחה המורחבת ולפי כללי כבוד. סוהא אמרה ש"הכבוד של המשפחה הוא הדבר שמנהל את היחסים עם בית הספר" (ראיון 8). האמהות הן הכתובת העיקרית, והסבתות הן לעיתים קרובות הסמכות האמיתית. סמר סיפרה ש"הסבתות מעורבות הרבה פעמים יותר מההורים, כי הן בבית" (ראיון 3), ופאטמה ביקשה מהמחקר: "תדברי גם עם הסבתות. בלוד הרבה ילדים גדלים אצל סבתא, ואף מחקר על הורים לא שואל אותן" (ראיון 5). סוהא, כשיש סכסוך הנוגע לכמה ילדים מאותה משפחה, הולכת "לסבתא של המשפחה" (ראיון 8). היא סיפרה על שיחה עם סבתא של תלמיד, שאמרה לה: "בית הספר קורא לנו רק כשיש בעיה. אתם לא באים אלינו כשיש חתונה" (ראיון 8). מאז היא משתתפת באירועי הקהילה, וכשמפקחת תמהה מדוע היא מערבת זקני משפחות בענייני בית הספר, הסבירה ש"בלוד זה לא ערבוב, זה המבנה" (ראיון 8).</w:t>
+      </w:r>
+    </w:p>
+    <w:p>
+      <w:pPr>
+        <w:bidi/>
+        <w:spacing w:after="120" w:before="0" w:line="360" w:lineRule="auto"/>
+        <w:jc w:val="left"/>
+      </w:pPr>
+      <w:r>
+        <w:rPr>
+          <w:rFonts w:ascii="Times New Roman" w:cs="David" w:hAnsi="Times New Roman"/>
+          <w:b/>
+          <w:bCs/>
+          <w:sz w:val="24"/>
+          <w:szCs w:val="24"/>
+          <w:rtl/>
+        </w:rPr>
+        <w:t xml:space="preserve">ה. מגדר</w:t>
+      </w:r>
+    </w:p>
+    <w:p>
+      <w:pPr>
+        <w:bidi/>
+        <w:spacing w:after="60" w:before="0" w:line="360" w:lineRule="auto"/>
+        <w:jc w:val="both"/>
+      </w:pPr>
+      <w:r>
+        <w:rPr>
+          <w:rFonts w:ascii="Times New Roman" w:cs="David" w:hAnsi="Times New Roman"/>
+          <w:sz w:val="24"/>
+          <w:szCs w:val="24"/>
+          <w:rtl/>
+        </w:rPr>
+        <w:t xml:space="preserve">ארבע מורות תיארו אבות שאינם מוכנים לדבר עם אישה, ונעזרו במנהל כדי שדבריהן יישמעו. מהא אמרה:</w:t>
+      </w:r>
+    </w:p>
+    <w:p>
+      <w:pPr>
+        <w:bidi/>
+        <w:spacing w:after="120" w:before="0" w:line="360" w:lineRule="auto"/>
+        <w:ind w:left="567" w:right="567"/>
+        <w:jc w:val="both"/>
+      </w:pPr>
+      <w:r>
+        <w:rPr>
+          <w:rFonts w:ascii="Times New Roman" w:cs="David" w:hAnsi="Times New Roman"/>
+          <w:sz w:val="24"/>
+          <w:szCs w:val="24"/>
+          <w:rtl/>
+        </w:rPr>
+        <w:t xml:space="preserve">וקשה לי, כאישה, שיש אבות שלא מדברים איתי ישירות, ושאני צריכה את המנהל כדי שיקשיבו לדברים שאני יודעת טוב יותר ממנו. (ראיון 2)</w:t>
+      </w:r>
+    </w:p>
+    <w:p>
+      <w:pPr>
+        <w:bidi/>
+        <w:spacing w:after="60" w:before="0" w:line="360" w:lineRule="auto"/>
+        <w:jc w:val="both"/>
+      </w:pPr>
+      <w:r>
+        <w:rPr>
+          <w:rFonts w:ascii="Times New Roman" w:cs="David" w:hAnsi="Times New Roman"/>
+          <w:sz w:val="24"/>
+          <w:szCs w:val="24"/>
+          <w:rtl/>
+        </w:rPr>
+        <w:t xml:space="preserve">פאטמה אמרה שאחרי עשרים ושבע שנים "זה עדיין מעליב" (ראיון 5), אך למדה ש"לא כל דלת צריכה להיפתח דרכי" (ראיון 5). מאותו מבנה צמח גם יתרון. מהא סיפרה ש"האמהות אצלנו מדברות איתי על דברים שלא יגידו למורה גבר" (ראיון 2), וסוהא תיארה את עצמה כ"אישה שיכולה להיכנס לבתים ולחדרים שבהם מתקבלות ההחלטות האמיתיות" (ראיון 8). המורות תיארו גם הבדלים בין קבוצות בתוך הקהילה הערבית. מהא אמרה ש"משפחה בדואית מהנגב, למשל, לא תשלח את האמא לפגישה, ישלחו את האח הגדול, וצריך לדעת את זה ולא להיעלב" (ראיון 2).</w:t>
+      </w:r>
+    </w:p>
+    <w:p>
+      <w:pPr>
+        <w:bidi/>
+        <w:spacing w:after="120" w:before="0" w:line="360" w:lineRule="auto"/>
+        <w:jc w:val="left"/>
+      </w:pPr>
+      <w:r>
+        <w:rPr>
+          <w:rFonts w:ascii="Times New Roman" w:cs="David" w:hAnsi="Times New Roman"/>
+          <w:b/>
+          <w:bCs/>
+          <w:sz w:val="24"/>
+          <w:szCs w:val="24"/>
+          <w:rtl/>
+        </w:rPr>
+        <w:t xml:space="preserve">ו. מחלוקות ופחד</w:t>
+      </w:r>
+    </w:p>
+    <w:p>
+      <w:pPr>
+        <w:bidi/>
+        <w:spacing w:after="60" w:before="0" w:line="360" w:lineRule="auto"/>
+        <w:jc w:val="both"/>
+      </w:pPr>
+      <w:r>
+        <w:rPr>
+          <w:rFonts w:ascii="Times New Roman" w:cs="David" w:hAnsi="Times New Roman"/>
+          <w:sz w:val="24"/>
+          <w:szCs w:val="24"/>
+          <w:rtl/>
+        </w:rPr>
+        <w:t xml:space="preserve">במחלוקות הגיעו הורים לבית הספר מלווים בדודים או באחים ונקטו לשון מאיימת. המורות פירשו זאת כביטוי של פחד. מהא אמרה ש"הורה שמגיע עם דודים לא מגיע לריב, הוא מגיע מפוחד, והדודים הם הפחד שלו" (ראיון 2), ורנא הוסיפה ש"אמהות באות עם אחים כי הן לא מאמינות שמישהו יקשיב להן לבד" (ראיון 6). סמר למדה ש"הורה שצועק הוא בדרך כלל הורה שנבהל" (ראיון 3), ואמאני תיארה את ההאשמה "את לא מכאן" (ראיון 7) כ"נשק שההורים משתמשים בו כשהם מרגישים חלשים" (ראיון 7). מכאן למדו המורות כלל משותף: לא לענות בשער או בקבוצה, לתת למשבר לעבור, ולפגוש את ההורה ביוזמתן אחרי כמה ימים, אחד על אחד. ריהאם אמרה: "לא עונים בווטסאפ על דברים של כבוד, רק בפנים" (ראיון 1). נסרין הוסיפה ש"פער תרבותי לא פותרים בשכנוע, פותרים בשאלה" (ראיון 4), ורנא אמרה: "למדתי שרוב הפערים התרבותיים הם פערים של פרט קטן, ואם שואלים, מוצאים את הפרט" (ראיון 6). פאטמה תיארה אב שביקש להעביר את בתו המצטיינת למסגרת שבה תלמד פחות. במקום להתווכח, הראתה לו את החיבורים של בתו, והסיקה: "אחרי השיחה הבנתי שלא נלחמים עם הורה, מראים לו את הילד שלו" (ראיון 5). סוהא תיארה מחלוקת קשה במיוחד, עם אב שהאשים אותה בבגידה אחרי דיווח לרווחה על אלימות בבית. היא ליוותה את המשפחה לרווחה בעצמה, ולמדה:</w:t>
+      </w:r>
+    </w:p>
+    <w:p>
+      <w:pPr>
+        <w:bidi/>
+        <w:spacing w:after="120" w:before="0" w:line="360" w:lineRule="auto"/>
+        <w:ind w:left="567" w:right="567"/>
+        <w:jc w:val="both"/>
+      </w:pPr>
+      <w:r>
+        <w:rPr>
+          <w:rFonts w:ascii="Times New Roman" w:cs="David" w:hAnsi="Times New Roman"/>
+          <w:sz w:val="24"/>
+          <w:szCs w:val="24"/>
+          <w:rtl/>
+        </w:rPr>
+        <w:t xml:space="preserve">שהתפקיד שלי כמורה מהקהילה הוא לא לבחור בין החוק לקהילה, אלא לעמוד ביניהם ולתרגם, לשני הכיוונים. ושהורים בלוד מפחדים מהרווחה יותר מהמשטרה, ושבית הספר צריך להיות הגשר, לא השער. (ראיון 8)</w:t>
+      </w:r>
+    </w:p>
+    <w:p>
+      <w:pPr>
+        <w:bidi/>
+        <w:spacing w:after="60" w:before="0" w:line="360" w:lineRule="auto"/>
+        <w:jc w:val="both"/>
+      </w:pPr>
+      <w:r>
+        <w:rPr>
+          <w:rFonts w:ascii="Times New Roman" w:cs="David" w:hAnsi="Times New Roman"/>
+          <w:sz w:val="24"/>
+          <w:szCs w:val="24"/>
+          <w:rtl/>
+        </w:rPr>
+        <w:t xml:space="preserve">לסיכום: מתמה זו עולה כי המורות רואות בקשר עם ההורים חלק מרכזי מעבודתן, ובבית הספר מוסד קהילתי שההורים סומכים עליו יותר מאשר על מוסדות אחרים בעיר. מורות מהקהילה נהנות מהיכרות עם המשפחות אך מתמודדות עם טשטוש גבולות, ומורות מבחוץ מתמודדות עם האשמות ב"זרות" אך מוצאות בה גם יתרון. ההקשר של לוד, ובו אלימות, פחד ותקשורת מוסדית בעברית, נוכח בכל היבט של הקשר. המורות פועלות בתוך מבנה קהילתי של משפחה מורחבת וכבוד, שבו לסבתות מקום מרכזי. מבנה זה מגביל אותן כנשים מול חלק מהאבות, אך גם פותח בפניהן דלתות אל האמהות ואל הבתים. את המחלוקות עם הורים הן מפרשות כביטוי של פחד, ומתמודדות איתן בהשהיה, בפגישה אישית, בשאלה במקום בשכנוע, ובהצגת הילד עצמו.</w:t>
       </w:r>
     </w:p>
     <w:p>
@@ -5038,7 +5132,7 @@
           <w:szCs w:val="24"/>
           <w:rtl/>
         </w:rPr>
-        <w:t xml:space="preserve">4.3 "מוזמן ולא מזומן": יוזמה, חיוביות והגעה להורים</w:t>
+        <w:t xml:space="preserve">4.3 "מוזמן ולא מזומן": מיוזמה לשותפות</w:t>
       </w:r>
     </w:p>
     <w:p>
@@ -5054,7 +5148,7 @@
           <w:szCs w:val="24"/>
           <w:rtl/>
         </w:rPr>
-        <w:t xml:space="preserve">תמה זו עוסקת באופן שבו המורות יוזמות את הקשר עם ההורים ובאופן שבו הן תופסות את ההורים שנחשבים "לא מעורבים". בתמה שלושה חלקים: יוזמת הקשר והפנייה החיובית, הגדרה מחודשת של מעורבות, והדרכים להגיע להורים.</w:t>
+        <w:t xml:space="preserve">תמה זו עוסקת באופן שבו המורות יוזמות את הקשר עם ההורים, באופן שבו הן תופסות את ההורים שנחשבים "לא מעורבים", ובמידה שבה ההורים שותפים בחיי בית הספר. בתמה שישה חלקים: יוזמת הקשר והפנייה החיובית, הגדרה מחודשת של מעורבות, הדרכים להגיע להורים, עזרה לעומת החלטות, ההורה כנותן ידע, וגופי הורים שפותרים בעיות.</w:t>
       </w:r>
     </w:p>
     <w:p>
@@ -5311,6 +5405,24 @@
     <w:p>
       <w:pPr>
         <w:bidi/>
+        <w:spacing w:after="120" w:before="0" w:line="360" w:lineRule="auto"/>
+        <w:jc w:val="left"/>
+      </w:pPr>
+      <w:r>
+        <w:rPr>
+          <w:rFonts w:ascii="Times New Roman" w:cs="David" w:hAnsi="Times New Roman"/>
+          <w:b/>
+          <w:bCs/>
+          <w:sz w:val="24"/>
+          <w:szCs w:val="24"/>
+          <w:rtl/>
+        </w:rPr>
+        <w:t xml:space="preserve">ד. עזרה לעומת החלטות</w:t>
+      </w:r>
+    </w:p>
+    <w:p>
+      <w:pPr>
+        <w:bidi/>
         <w:spacing w:after="60" w:before="0" w:line="360" w:lineRule="auto"/>
         <w:jc w:val="both"/>
       </w:pPr>
@@ -5321,7 +5433,206 @@
           <w:szCs w:val="24"/>
           <w:rtl/>
         </w:rPr>
-        <w:t xml:space="preserve">לסיכום: מתמה זו עולה כי המורות יוזמות את רוב הקשר, ומשתדלות שהפנייה הראשונה להורה תהיה חיובית ותהיה הזמנה ולא זימון. הן מגדירות מחדש את המעורבות של ההורים, ושינו את ציפיותיהן אחרי מפגשים אישיים עם הורים במצוקה. הן מגיעות להורים בדרכים אישיות, דרך הילד, הסבתא, השער והורים אחרים, ולא דרך מערכות.</w:t>
+        <w:t xml:space="preserve">ברמת בית הספר ההורים שותפים בעיקר בעזרה ובנוכחות: טקסים, טיולים וועד הורים שאוסף כסף. בהחלטות הם כמעט אינם שותפים. ריהאם אמרה שההחלטות "נעשות בבית הספר, והוועד מתבקש לאשר או לעזור" (ראיון 1), והסבירה שהסיבה אינה התנגדות של בית הספר, אלא ש"ההורים לא מצפים לזה, ואף אחד לא הציע" (ראיון 1). מהא אמרה: "הבעיה היא שבית הספר רגיל לראות בהורים או עזרה או בעיה, ולא שותף שיודע משהו" (ראיון 2).</w:t>
+      </w:r>
+    </w:p>
+    <w:p>
+      <w:pPr>
+        <w:bidi/>
+        <w:spacing w:after="60" w:before="0" w:line="360" w:lineRule="auto"/>
+        <w:jc w:val="both"/>
+      </w:pPr>
+      <w:r>
+        <w:rPr>
+          <w:rFonts w:ascii="Times New Roman" w:cs="David" w:hAnsi="Times New Roman"/>
+          <w:sz w:val="24"/>
+          <w:szCs w:val="24"/>
+          <w:rtl/>
+        </w:rPr>
+        <w:t xml:space="preserve">פאטמה תיארה מנהל שרואה בהורים אורחים מכובדים, והביאה דוגמה ליוזמה של אמהות שלא התקדמה:</w:t>
+      </w:r>
+    </w:p>
+    <w:p>
+      <w:pPr>
+        <w:bidi/>
+        <w:spacing w:after="120" w:before="0" w:line="360" w:lineRule="auto"/>
+        <w:ind w:left="567" w:right="567"/>
+        <w:jc w:val="both"/>
+      </w:pPr>
+      <w:r>
+        <w:rPr>
+          <w:rFonts w:ascii="Times New Roman" w:cs="David" w:hAnsi="Times New Roman"/>
+          <w:sz w:val="24"/>
+          <w:szCs w:val="24"/>
+          <w:rtl/>
+        </w:rPr>
+        <w:t xml:space="preserve">בקבלת החלטות, אצלנו כמעט לא, ואני אגיד למה אני חושבת: המנהל שלנו הוא מהדור הישן, כמוני, והוא רואה בהורים אורחים מכובדים ולא שותפים. הם מוזמנים, מכבדים אותם, שומעים אותם, ומחליטים בלעדיהם. ... בערב הקריאה האחרון, אמהות הציעו לפתוח ספרייה שכונתית, ואני הבאתי את זה למנהל, והוא אמר "נראה". אז, בעזרה כן, בהחלטות עדיין לא. (ראיון 5)</w:t>
+      </w:r>
+    </w:p>
+    <w:p>
+      <w:pPr>
+        <w:bidi/>
+        <w:spacing w:after="60" w:before="0" w:line="360" w:lineRule="auto"/>
+        <w:jc w:val="both"/>
+      </w:pPr>
+      <w:r>
+        <w:rPr>
+          <w:rFonts w:ascii="Times New Roman" w:cs="David" w:hAnsi="Times New Roman"/>
+          <w:sz w:val="24"/>
+          <w:szCs w:val="24"/>
+          <w:rtl/>
+        </w:rPr>
+        <w:t xml:space="preserve">יוצאת דופן הייתה נסרין, שסיפרה שבשנה שעברה ההורים ביקשו שיעורי עברית מדוברת נוספים, והמנהלת הכניסה אותם למערכת.</w:t>
+      </w:r>
+    </w:p>
+    <w:p>
+      <w:pPr>
+        <w:bidi/>
+        <w:spacing w:after="120" w:before="0" w:line="360" w:lineRule="auto"/>
+        <w:jc w:val="left"/>
+      </w:pPr>
+      <w:r>
+        <w:rPr>
+          <w:rFonts w:ascii="Times New Roman" w:cs="David" w:hAnsi="Times New Roman"/>
+          <w:b/>
+          <w:bCs/>
+          <w:sz w:val="24"/>
+          <w:szCs w:val="24"/>
+          <w:rtl/>
+        </w:rPr>
+        <w:t xml:space="preserve">ה. ההורה כנותן ידע</w:t>
+      </w:r>
+    </w:p>
+    <w:p>
+      <w:pPr>
+        <w:bidi/>
+        <w:spacing w:after="60" w:before="0" w:line="360" w:lineRule="auto"/>
+        <w:jc w:val="both"/>
+      </w:pPr>
+      <w:r>
+        <w:rPr>
+          <w:rFonts w:ascii="Times New Roman" w:cs="David" w:hAnsi="Times New Roman"/>
+          <w:sz w:val="24"/>
+          <w:szCs w:val="24"/>
+          <w:rtl/>
+        </w:rPr>
+        <w:t xml:space="preserve">המורות תיארו יוזמות משלהן שבהן ההורים הוזמנו לתרום מן הידע שלהם. ריהאם הזמינה כל אב לספר לכיתה על עבודתו, ו-28 מתוך 33 האבות הגיעו. היא הסבירה:</w:t>
+      </w:r>
+    </w:p>
+    <w:p>
+      <w:pPr>
+        <w:bidi/>
+        <w:spacing w:after="120" w:before="0" w:line="360" w:lineRule="auto"/>
+        <w:ind w:left="567" w:right="567"/>
+        <w:jc w:val="both"/>
+      </w:pPr>
+      <w:r>
+        <w:rPr>
+          <w:rFonts w:ascii="Times New Roman" w:cs="David" w:hAnsi="Times New Roman"/>
+          <w:sz w:val="24"/>
+          <w:szCs w:val="24"/>
+          <w:rtl/>
+        </w:rPr>
+        <w:t xml:space="preserve">מה שגרם להצלחה, לדעתי: שלא ביקשתי מהם לבוא "להורים", ביקשתי מהם לבוא כמומחים. שהשעה הייתה שלהם ולא שלי. ושהילד היה הסיבה, לא בית הספר. (ראיון 1)</w:t>
+      </w:r>
+    </w:p>
+    <w:p>
+      <w:pPr>
+        <w:bidi/>
+        <w:spacing w:after="60" w:before="0" w:line="360" w:lineRule="auto"/>
+        <w:jc w:val="both"/>
+      </w:pPr>
+      <w:r>
+        <w:rPr>
+          <w:rFonts w:ascii="Times New Roman" w:cs="David" w:hAnsi="Times New Roman"/>
+          <w:sz w:val="24"/>
+          <w:szCs w:val="24"/>
+          <w:rtl/>
+        </w:rPr>
+        <w:t xml:space="preserve">בפרויקט הקריאה של סמר הגיעו 26 מתוך 32 משפחות לספר סיפור בכיתה, ונאמר להן שמי שאינו יודע לקרוא יכול לספר בעל פה. בפרויקט "סבתא מספרת" של פאטמה הגיעו 14 סבתות לספר על לוד של פעם. ב"שוק הקהילה" שארגנה נסרין הפעילו יותר ממאה הורים דוכנים של מה שהם יודעים לעשות, ולדבריה "ההורים שהכירו זה את זה בשוק התחילו לעזור זה לזה" (ראיון 4). פאטמה הסבירה את הצלחת "סבתא מספרת" בכך "שהילדים ראו את המשפחה שלהם בתוך בית הספר כמקור של ידע, לא כמקור של בעיות" (ראיון 5). רנא הקימה קבוצת כדורסל לבנות, ולדבריה "לאימונים יש "ספסל אמהות" קבוע, שהפך למקום שבו אני עושה את רוב העבודה שלי כמחנכת" (ראיון 6).</w:t>
+      </w:r>
+    </w:p>
+    <w:p>
+      <w:pPr>
+        <w:bidi/>
+        <w:spacing w:after="120" w:before="0" w:line="360" w:lineRule="auto"/>
+        <w:jc w:val="left"/>
+      </w:pPr>
+      <w:r>
+        <w:rPr>
+          <w:rFonts w:ascii="Times New Roman" w:cs="David" w:hAnsi="Times New Roman"/>
+          <w:b/>
+          <w:bCs/>
+          <w:sz w:val="24"/>
+          <w:szCs w:val="24"/>
+          <w:rtl/>
+        </w:rPr>
+        <w:t xml:space="preserve">ו. גופי הורים שפותרים בעיות</w:t>
+      </w:r>
+    </w:p>
+    <w:p>
+      <w:pPr>
+        <w:bidi/>
+        <w:spacing w:after="60" w:before="0" w:line="360" w:lineRule="auto"/>
+        <w:jc w:val="both"/>
+      </w:pPr>
+      <w:r>
+        <w:rPr>
+          <w:rFonts w:ascii="Times New Roman" w:cs="David" w:hAnsi="Times New Roman"/>
+          <w:sz w:val="24"/>
+          <w:szCs w:val="24"/>
+          <w:rtl/>
+        </w:rPr>
+        <w:t xml:space="preserve">ארבע מורות הקימו גופים של הורים. מהא הקימה "צוות הורים" של השכבה והביאה אליו את בעיית ההיעדרויות. אחת האמהות הציעה ש"אמהות שנשארות בבית בבוקר יעשו 'שרשרת'" (ראיון 2) ויתקשרו לשכנים בשבע, ולדברי מהא "בתוך חודשיים ההיעדרויות ירדו בחצי" (ראיון 2). היא הסבירה:</w:t>
+      </w:r>
+    </w:p>
+    <w:p>
+      <w:pPr>
+        <w:bidi/>
+        <w:spacing w:after="120" w:before="0" w:line="360" w:lineRule="auto"/>
+        <w:ind w:left="567" w:right="567"/>
+        <w:jc w:val="both"/>
+      </w:pPr>
+      <w:r>
+        <w:rPr>
+          <w:rFonts w:ascii="Times New Roman" w:cs="David" w:hAnsi="Times New Roman"/>
+          <w:sz w:val="24"/>
+          <w:szCs w:val="24"/>
+          <w:rtl/>
+        </w:rPr>
+        <w:t xml:space="preserve">מה שגרם להצלחה: שהפתרון בא מההורים ולא ממני, שהוא היה בתוך השכונה ולא בתוך בית הספר, ושאף אחד לא הרגיש שמפקחים עליו, כי זו שכנה שמתקשרת ולא קצין ביקור סדיר. (ראיון 2)</w:t>
+      </w:r>
+    </w:p>
+    <w:p>
+      <w:pPr>
+        <w:bidi/>
+        <w:spacing w:after="60" w:before="0" w:line="360" w:lineRule="auto"/>
+        <w:jc w:val="both"/>
+      </w:pPr>
+      <w:r>
+        <w:rPr>
+          <w:rFonts w:ascii="Times New Roman" w:cs="David" w:hAnsi="Times New Roman"/>
+          <w:sz w:val="24"/>
+          <w:szCs w:val="24"/>
+          <w:rtl/>
+        </w:rPr>
+        <w:t xml:space="preserve">אמאני הקימה "מועצת הורים כיתתית" (ראיון 7), ובערב הורים ניסחו ההורים עצמם הסכם על שימוש בטלפונים. לדבריה, "בשבוע שאחרי, הטלפונים בכיתה ירדו דרמטית, ולא כי אני אסרתי, אלא כי הילדים ידעו שההורים של כולם הסכימו" (ראיון 7). נסרין הקימה "ועדת קהילה", וסוהא הקימה "מועצת קהילה" של נציגי המשפחות הגדולות בעיר, ואמרה: "הוועד אצלנו קיים כי צריך, מועצת הקהילה קיימת כי היא עובדת" (ראיון 8). קול אחר עלה אצל פאטמה, הוותיקה שבמרואיינות. לדבריה, "הורים אצלנו לא תמיד רוצים להחליט, הם רוצים שמישהו שהם סומכים עליו יחליט" (ראיון 5), אם כי היא ציינה שהדור הצעיר של ההורים מבקש להיות שותף "ולפעמים הוא נתקל בקיר" (ראיון 5).</w:t>
+      </w:r>
+    </w:p>
+    <w:p>
+      <w:pPr>
+        <w:bidi/>
+        <w:spacing w:after="60" w:before="0" w:line="360" w:lineRule="auto"/>
+        <w:jc w:val="both"/>
+      </w:pPr>
+      <w:r>
+        <w:rPr>
+          <w:rFonts w:ascii="Times New Roman" w:cs="David" w:hAnsi="Times New Roman"/>
+          <w:sz w:val="24"/>
+          <w:szCs w:val="24"/>
+          <w:rtl/>
+        </w:rPr>
+        <w:t xml:space="preserve">לסיכום: מתמה זו עולה כי המורות יוזמות את רוב הקשר, ומשתדלות שהפנייה הראשונה להורה תהיה חיובית ותהיה הזמנה ולא זימון. הן מגדירות מחדש את המעורבות של ההורים, ושינו את ציפיותיהן אחרי מפגשים אישיים עם הורים במצוקה, ומגיעות להורים בדרכים אישיות, דרך הילד, הסבתא, השער והורים אחרים. ברמת בית הספר ההורים שותפים בעיקר בעזרה, ובהחלטות כמעט אינם שותפים. ביוזמות של המורות הוזמנו ההורים כנותני ידע, ורובם הגיעו, וגופי הורים שהוקמו בידי מורות הציעו פתרונות לבעיות כמו היעדרויות ושימוש בטלפונים. המורות זיהו תנאים דומים להצלחה: ההורים הוזמנו כמי שיש להם מה לתת, הפתרון בא מהם, והמקום היה שלהם.</w:t>
       </w:r>
     </w:p>
     <w:p>
@@ -5340,478 +5651,7 @@
           <w:szCs w:val="24"/>
           <w:rtl/>
         </w:rPr>
-        <w:t xml:space="preserve">4.4 "מעזרה לשותפות": שיתוף ההורים בידע ובהחלטות</w:t>
-      </w:r>
-    </w:p>
-    <w:p>
-      <w:pPr>
-        <w:bidi/>
-        <w:spacing w:after="60" w:before="0" w:line="360" w:lineRule="auto"/>
-        <w:jc w:val="both"/>
-      </w:pPr>
-      <w:r>
-        <w:rPr>
-          <w:rFonts w:ascii="Times New Roman" w:cs="David" w:hAnsi="Times New Roman"/>
-          <w:sz w:val="24"/>
-          <w:szCs w:val="24"/>
-          <w:rtl/>
-        </w:rPr>
-        <w:t xml:space="preserve">תמה זו עוסקת באופן שבו ההורים שותפים בחיי בית הספר. בתמה שלושה חלקים: עזרה לעומת החלטות, ההורה כנותן ידע, וגופי הורים שפותרים בעיות.</w:t>
-      </w:r>
-    </w:p>
-    <w:p>
-      <w:pPr>
-        <w:bidi/>
-        <w:spacing w:after="120" w:before="0" w:line="360" w:lineRule="auto"/>
-        <w:jc w:val="left"/>
-      </w:pPr>
-      <w:r>
-        <w:rPr>
-          <w:rFonts w:ascii="Times New Roman" w:cs="David" w:hAnsi="Times New Roman"/>
-          <w:b/>
-          <w:bCs/>
-          <w:sz w:val="24"/>
-          <w:szCs w:val="24"/>
-          <w:rtl/>
-        </w:rPr>
-        <w:t xml:space="preserve">א. עזרה לעומת החלטות</w:t>
-      </w:r>
-    </w:p>
-    <w:p>
-      <w:pPr>
-        <w:bidi/>
-        <w:spacing w:after="60" w:before="0" w:line="360" w:lineRule="auto"/>
-        <w:jc w:val="both"/>
-      </w:pPr>
-      <w:r>
-        <w:rPr>
-          <w:rFonts w:ascii="Times New Roman" w:cs="David" w:hAnsi="Times New Roman"/>
-          <w:sz w:val="24"/>
-          <w:szCs w:val="24"/>
-          <w:rtl/>
-        </w:rPr>
-        <w:t xml:space="preserve">ברמת בית הספר ההורים שותפים בעיקר בעזרה ובנוכחות: טקסים, טיולים וועד הורים שאוסף כסף. בהחלטות הם כמעט אינם שותפים. ריהאם אמרה שההחלטות "נעשות בבית הספר, והוועד מתבקש לאשר או לעזור" (ראיון 1), והסבירה שהסיבה אינה התנגדות של בית הספר, אלא ש"ההורים לא מצפים לזה, ואף אחד לא הציע" (ראיון 1). מהא אמרה: "הבעיה היא שבית הספר רגיל לראות בהורים או עזרה או בעיה, ולא שותף שיודע משהו" (ראיון 2).</w:t>
-      </w:r>
-    </w:p>
-    <w:p>
-      <w:pPr>
-        <w:bidi/>
-        <w:spacing w:after="60" w:before="0" w:line="360" w:lineRule="auto"/>
-        <w:jc w:val="both"/>
-      </w:pPr>
-      <w:r>
-        <w:rPr>
-          <w:rFonts w:ascii="Times New Roman" w:cs="David" w:hAnsi="Times New Roman"/>
-          <w:sz w:val="24"/>
-          <w:szCs w:val="24"/>
-          <w:rtl/>
-        </w:rPr>
-        <w:t xml:space="preserve">פאטמה תיארה מנהל שרואה בהורים אורחים מכובדים, והביאה דוגמה ליוזמה של אמהות שלא התקדמה:</w:t>
-      </w:r>
-    </w:p>
-    <w:p>
-      <w:pPr>
-        <w:bidi/>
-        <w:spacing w:after="120" w:before="0" w:line="360" w:lineRule="auto"/>
-        <w:ind w:left="567" w:right="567"/>
-        <w:jc w:val="both"/>
-      </w:pPr>
-      <w:r>
-        <w:rPr>
-          <w:rFonts w:ascii="Times New Roman" w:cs="David" w:hAnsi="Times New Roman"/>
-          <w:sz w:val="24"/>
-          <w:szCs w:val="24"/>
-          <w:rtl/>
-        </w:rPr>
-        <w:t xml:space="preserve">בקבלת החלטות, אצלנו כמעט לא, ואני אגיד למה אני חושבת: המנהל שלנו הוא מהדור הישן, כמוני, והוא רואה בהורים אורחים מכובדים ולא שותפים. הם מוזמנים, מכבדים אותם, שומעים אותם, ומחליטים בלעדיהם. ... בערב הקריאה האחרון, אמהות הציעו לפתוח ספרייה שכונתית, ואני הבאתי את זה למנהל, והוא אמר "נראה". אז, בעזרה כן, בהחלטות עדיין לא. (ראיון 5)</w:t>
-      </w:r>
-    </w:p>
-    <w:p>
-      <w:pPr>
-        <w:bidi/>
-        <w:spacing w:after="60" w:before="0" w:line="360" w:lineRule="auto"/>
-        <w:jc w:val="both"/>
-      </w:pPr>
-      <w:r>
-        <w:rPr>
-          <w:rFonts w:ascii="Times New Roman" w:cs="David" w:hAnsi="Times New Roman"/>
-          <w:sz w:val="24"/>
-          <w:szCs w:val="24"/>
-          <w:rtl/>
-        </w:rPr>
-        <w:t xml:space="preserve">יוצאת דופן הייתה נסרין, שסיפרה שבשנה שעברה ההורים ביקשו שיעורי עברית מדוברת נוספים, והמנהלת הכניסה אותם למערכת.</w:t>
-      </w:r>
-    </w:p>
-    <w:p>
-      <w:pPr>
-        <w:bidi/>
-        <w:spacing w:after="120" w:before="0" w:line="360" w:lineRule="auto"/>
-        <w:jc w:val="left"/>
-      </w:pPr>
-      <w:r>
-        <w:rPr>
-          <w:rFonts w:ascii="Times New Roman" w:cs="David" w:hAnsi="Times New Roman"/>
-          <w:b/>
-          <w:bCs/>
-          <w:sz w:val="24"/>
-          <w:szCs w:val="24"/>
-          <w:rtl/>
-        </w:rPr>
-        <w:t xml:space="preserve">ב. ההורה כנותן ידע</w:t>
-      </w:r>
-    </w:p>
-    <w:p>
-      <w:pPr>
-        <w:bidi/>
-        <w:spacing w:after="60" w:before="0" w:line="360" w:lineRule="auto"/>
-        <w:jc w:val="both"/>
-      </w:pPr>
-      <w:r>
-        <w:rPr>
-          <w:rFonts w:ascii="Times New Roman" w:cs="David" w:hAnsi="Times New Roman"/>
-          <w:sz w:val="24"/>
-          <w:szCs w:val="24"/>
-          <w:rtl/>
-        </w:rPr>
-        <w:t xml:space="preserve">המורות תיארו יוזמות משלהן שבהן ההורים הוזמנו לתרום מן הידע שלהם. ריהאם הזמינה כל אב לספר לכיתה על עבודתו, ו-28 מתוך 33 האבות הגיעו. היא הסבירה:</w:t>
-      </w:r>
-    </w:p>
-    <w:p>
-      <w:pPr>
-        <w:bidi/>
-        <w:spacing w:after="120" w:before="0" w:line="360" w:lineRule="auto"/>
-        <w:ind w:left="567" w:right="567"/>
-        <w:jc w:val="both"/>
-      </w:pPr>
-      <w:r>
-        <w:rPr>
-          <w:rFonts w:ascii="Times New Roman" w:cs="David" w:hAnsi="Times New Roman"/>
-          <w:sz w:val="24"/>
-          <w:szCs w:val="24"/>
-          <w:rtl/>
-        </w:rPr>
-        <w:t xml:space="preserve">מה שגרם להצלחה, לדעתי: שלא ביקשתי מהם לבוא "להורים", ביקשתי מהם לבוא כמומחים. שהשעה הייתה שלהם ולא שלי. ושהילד היה הסיבה, לא בית הספר. (ראיון 1)</w:t>
-      </w:r>
-    </w:p>
-    <w:p>
-      <w:pPr>
-        <w:bidi/>
-        <w:spacing w:after="60" w:before="0" w:line="360" w:lineRule="auto"/>
-        <w:jc w:val="both"/>
-      </w:pPr>
-      <w:r>
-        <w:rPr>
-          <w:rFonts w:ascii="Times New Roman" w:cs="David" w:hAnsi="Times New Roman"/>
-          <w:sz w:val="24"/>
-          <w:szCs w:val="24"/>
-          <w:rtl/>
-        </w:rPr>
-        <w:t xml:space="preserve">בפרויקט הקריאה של סמר הגיעו 26 מתוך 32 משפחות לספר סיפור בכיתה, ונאמר להן שמי שאינו יודע לקרוא יכול לספר בעל פה. בפרויקט "סבתא מספרת" של פאטמה הגיעו 14 סבתות לספר על לוד של פעם. ב"שוק הקהילה" שארגנה נסרין הפעילו יותר ממאה הורים דוכנים של מה שהם יודעים לעשות, ולדבריה "ההורים שהכירו זה את זה בשוק התחילו לעזור זה לזה" (ראיון 4). פאטמה הסבירה את הצלחת "סבתא מספרת" בכך "שהילדים ראו את המשפחה שלהם בתוך בית הספר כמקור של ידע, לא כמקור של בעיות" (ראיון 5). רנא הקימה קבוצת כדורסל לבנות, ולדבריה "לאימונים יש "ספסל אמהות" קבוע, שהפך למקום שבו אני עושה את רוב העבודה שלי כמחנכת" (ראיון 6).</w:t>
-      </w:r>
-    </w:p>
-    <w:p>
-      <w:pPr>
-        <w:bidi/>
-        <w:spacing w:after="120" w:before="0" w:line="360" w:lineRule="auto"/>
-        <w:jc w:val="left"/>
-      </w:pPr>
-      <w:r>
-        <w:rPr>
-          <w:rFonts w:ascii="Times New Roman" w:cs="David" w:hAnsi="Times New Roman"/>
-          <w:b/>
-          <w:bCs/>
-          <w:sz w:val="24"/>
-          <w:szCs w:val="24"/>
-          <w:rtl/>
-        </w:rPr>
-        <w:t xml:space="preserve">ג. גופי הורים שפותרים בעיות</w:t>
-      </w:r>
-    </w:p>
-    <w:p>
-      <w:pPr>
-        <w:bidi/>
-        <w:spacing w:after="60" w:before="0" w:line="360" w:lineRule="auto"/>
-        <w:jc w:val="both"/>
-      </w:pPr>
-      <w:r>
-        <w:rPr>
-          <w:rFonts w:ascii="Times New Roman" w:cs="David" w:hAnsi="Times New Roman"/>
-          <w:sz w:val="24"/>
-          <w:szCs w:val="24"/>
-          <w:rtl/>
-        </w:rPr>
-        <w:t xml:space="preserve">ארבע מורות הקימו גופים של הורים. מהא הקימה "צוות הורים" של השכבה והביאה אליו את בעיית ההיעדרויות. אחת האמהות הציעה ש"אמהות שנשארות בבית בבוקר יעשו 'שרשרת'" (ראיון 2) ויתקשרו לשכנים בשבע, ולדברי מהא "בתוך חודשיים ההיעדרויות ירדו בחצי" (ראיון 2). היא הסבירה:</w:t>
-      </w:r>
-    </w:p>
-    <w:p>
-      <w:pPr>
-        <w:bidi/>
-        <w:spacing w:after="120" w:before="0" w:line="360" w:lineRule="auto"/>
-        <w:ind w:left="567" w:right="567"/>
-        <w:jc w:val="both"/>
-      </w:pPr>
-      <w:r>
-        <w:rPr>
-          <w:rFonts w:ascii="Times New Roman" w:cs="David" w:hAnsi="Times New Roman"/>
-          <w:sz w:val="24"/>
-          <w:szCs w:val="24"/>
-          <w:rtl/>
-        </w:rPr>
-        <w:t xml:space="preserve">מה שגרם להצלחה: שהפתרון בא מההורים ולא ממני, שהוא היה בתוך השכונה ולא בתוך בית הספר, ושאף אחד לא הרגיש שמפקחים עליו, כי זו שכנה שמתקשרת ולא קצין ביקור סדיר. (ראיון 2)</w:t>
-      </w:r>
-    </w:p>
-    <w:p>
-      <w:pPr>
-        <w:bidi/>
-        <w:spacing w:after="60" w:before="0" w:line="360" w:lineRule="auto"/>
-        <w:jc w:val="both"/>
-      </w:pPr>
-      <w:r>
-        <w:rPr>
-          <w:rFonts w:ascii="Times New Roman" w:cs="David" w:hAnsi="Times New Roman"/>
-          <w:sz w:val="24"/>
-          <w:szCs w:val="24"/>
-          <w:rtl/>
-        </w:rPr>
-        <w:t xml:space="preserve">אמאני הקימה "מועצת הורים כיתתית" (ראיון 7), ובערב הורים ניסחו ההורים עצמם הסכם על שימוש בטלפונים. לדבריה, "בשבוע שאחרי, הטלפונים בכיתה ירדו דרמטית, ולא כי אני אסרתי, אלא כי הילדים ידעו שההורים של כולם הסכימו" (ראיון 7). נסרין הקימה "ועדת קהילה", וסוהא הקימה "מועצת קהילה" של נציגי המשפחות הגדולות בעיר, ואמרה: "הוועד אצלנו קיים כי צריך, מועצת הקהילה קיימת כי היא עובדת" (ראיון 8). קול אחר עלה אצל פאטמה, הוותיקה שבמרואיינות. לדבריה, "הורים אצלנו לא תמיד רוצים להחליט, הם רוצים שמישהו שהם סומכים עליו יחליט" (ראיון 5), אם כי היא ציינה שהדור הצעיר של ההורים מבקש להיות שותף "ולפעמים הוא נתקל בקיר" (ראיון 5).</w:t>
-      </w:r>
-    </w:p>
-    <w:p>
-      <w:pPr>
-        <w:bidi/>
-        <w:spacing w:after="60" w:before="0" w:line="360" w:lineRule="auto"/>
-        <w:jc w:val="both"/>
-      </w:pPr>
-      <w:r>
-        <w:rPr>
-          <w:rFonts w:ascii="Times New Roman" w:cs="David" w:hAnsi="Times New Roman"/>
-          <w:sz w:val="24"/>
-          <w:szCs w:val="24"/>
-          <w:rtl/>
-        </w:rPr>
-        <w:t xml:space="preserve">לסיכום: מתמה זו עולה כי ברמת בית הספר ההורים שותפים בעיקר בעזרה, ובהחלטות כמעט אינם שותפים. ביוזמות של המורות הוזמנו ההורים כנותני ידע, ורובם הגיעו, וגופי הורים שהוקמו בידי מורות הציעו פתרונות לבעיות כמו היעדרויות ושימוש בטלפונים. המורות זיהו תנאים דומים להצלחה: ההורים הוזמנו כמי שיש להם מה לתת, הפתרון בא מהם, והמקום היה שלהם.</w:t>
-      </w:r>
-    </w:p>
-    <w:p>
-      <w:pPr>
-        <w:pStyle w:val="Heading2"/>
-        <w:bidi/>
-        <w:spacing w:after="120" w:before="240" w:line="360" w:lineRule="auto"/>
-        <w:jc w:val="left"/>
-      </w:pPr>
-      <w:r>
-        <w:rPr>
-          <w:rFonts w:ascii="Times New Roman" w:cs="David" w:hAnsi="Times New Roman"/>
-          <w:b/>
-          <w:bCs/>
-          <w:sz w:val="24"/>
-          <w:szCs w:val="24"/>
-          <w:rtl/>
-        </w:rPr>
-        <w:t xml:space="preserve">4.5 "זה לא ערבוב, זה המבנה": כבוד, מגדר ומשפחה מורחבת</w:t>
-      </w:r>
-    </w:p>
-    <w:p>
-      <w:pPr>
-        <w:bidi/>
-        <w:spacing w:after="60" w:before="0" w:line="360" w:lineRule="auto"/>
-        <w:jc w:val="both"/>
-      </w:pPr>
-      <w:r>
-        <w:rPr>
-          <w:rFonts w:ascii="Times New Roman" w:cs="David" w:hAnsi="Times New Roman"/>
-          <w:sz w:val="24"/>
-          <w:szCs w:val="24"/>
-          <w:rtl/>
-        </w:rPr>
-        <w:t xml:space="preserve">תמה זו עוסקת במבנה הקהילה שבתוכו פועלות המורות. בתמה שלושה חלקים: הסבתא והמשפחה המורחבת, המגדר, והמחלוקות.</w:t>
-      </w:r>
-    </w:p>
-    <w:p>
-      <w:pPr>
-        <w:bidi/>
-        <w:spacing w:after="120" w:before="0" w:line="360" w:lineRule="auto"/>
-        <w:jc w:val="left"/>
-      </w:pPr>
-      <w:r>
-        <w:rPr>
-          <w:rFonts w:ascii="Times New Roman" w:cs="David" w:hAnsi="Times New Roman"/>
-          <w:b/>
-          <w:bCs/>
-          <w:sz w:val="24"/>
-          <w:szCs w:val="24"/>
-          <w:rtl/>
-        </w:rPr>
-        <w:t xml:space="preserve">א. הסבתא והמשפחה המורחבת</w:t>
-      </w:r>
-    </w:p>
-    <w:p>
-      <w:pPr>
-        <w:bidi/>
-        <w:spacing w:after="60" w:before="0" w:line="360" w:lineRule="auto"/>
-        <w:jc w:val="both"/>
-      </w:pPr>
-      <w:r>
-        <w:rPr>
-          <w:rFonts w:ascii="Times New Roman" w:cs="David" w:hAnsi="Times New Roman"/>
-          <w:sz w:val="24"/>
-          <w:szCs w:val="24"/>
-          <w:rtl/>
-        </w:rPr>
-        <w:t xml:space="preserve">המורות תיארו קהילה שבה הקשר עם בית הספר מתנהל דרך המשפחה המורחבת ולפי כללי כבוד. סוהא אמרה ש"הכבוד של המשפחה הוא הדבר שמנהל את היחסים עם בית הספר" (ראיון 8). האמהות הן הכתובת העיקרית, והסבתות הן לעיתים קרובות הסמכות האמיתית. סמר סיפרה ש"הסבתות מעורבות הרבה פעמים יותר מההורים, כי הן בבית" (ראיון 3), ופאטמה ביקשה מהמחקר: "תדברי גם עם הסבתות. בלוד הרבה ילדים גדלים אצל סבתא, ואף מחקר על הורים לא שואל אותן" (ראיון 5). סוהא, כשיש סכסוך הנוגע לכמה ילדים מאותה משפחה, הולכת "לסבתא של המשפחה" (ראיון 8). היא סיפרה על שיחה עם סבתא של תלמיד, שאמרה לה: "בית הספר קורא לנו רק כשיש בעיה. אתם לא באים אלינו כשיש חתונה" (ראיון 8). מאז היא משתתפת באירועי הקהילה, וכשמפקחת תמהה מדוע היא מערבת זקני משפחות בענייני בית הספר, הסבירה ש"בלוד זה לא ערבוב, זה המבנה" (ראיון 8).</w:t>
-      </w:r>
-    </w:p>
-    <w:p>
-      <w:pPr>
-        <w:bidi/>
-        <w:spacing w:after="120" w:before="0" w:line="360" w:lineRule="auto"/>
-        <w:jc w:val="left"/>
-      </w:pPr>
-      <w:r>
-        <w:rPr>
-          <w:rFonts w:ascii="Times New Roman" w:cs="David" w:hAnsi="Times New Roman"/>
-          <w:b/>
-          <w:bCs/>
-          <w:sz w:val="24"/>
-          <w:szCs w:val="24"/>
-          <w:rtl/>
-        </w:rPr>
-        <w:t xml:space="preserve">ב. מגדר</w:t>
-      </w:r>
-    </w:p>
-    <w:p>
-      <w:pPr>
-        <w:bidi/>
-        <w:spacing w:after="60" w:before="0" w:line="360" w:lineRule="auto"/>
-        <w:jc w:val="both"/>
-      </w:pPr>
-      <w:r>
-        <w:rPr>
-          <w:rFonts w:ascii="Times New Roman" w:cs="David" w:hAnsi="Times New Roman"/>
-          <w:sz w:val="24"/>
-          <w:szCs w:val="24"/>
-          <w:rtl/>
-        </w:rPr>
-        <w:t xml:space="preserve">ארבע מורות תיארו אבות שאינם מוכנים לדבר עם אישה, ונעזרו במנהל כדי שדבריהן יישמעו. מהא אמרה:</w:t>
-      </w:r>
-    </w:p>
-    <w:p>
-      <w:pPr>
-        <w:bidi/>
-        <w:spacing w:after="120" w:before="0" w:line="360" w:lineRule="auto"/>
-        <w:ind w:left="567" w:right="567"/>
-        <w:jc w:val="both"/>
-      </w:pPr>
-      <w:r>
-        <w:rPr>
-          <w:rFonts w:ascii="Times New Roman" w:cs="David" w:hAnsi="Times New Roman"/>
-          <w:sz w:val="24"/>
-          <w:szCs w:val="24"/>
-          <w:rtl/>
-        </w:rPr>
-        <w:t xml:space="preserve">וקשה לי, כאישה, שיש אבות שלא מדברים איתי ישירות, ושאני צריכה את המנהל כדי שיקשיבו לדברים שאני יודעת טוב יותר ממנו. (ראיון 2)</w:t>
-      </w:r>
-    </w:p>
-    <w:p>
-      <w:pPr>
-        <w:bidi/>
-        <w:spacing w:after="60" w:before="0" w:line="360" w:lineRule="auto"/>
-        <w:jc w:val="both"/>
-      </w:pPr>
-      <w:r>
-        <w:rPr>
-          <w:rFonts w:ascii="Times New Roman" w:cs="David" w:hAnsi="Times New Roman"/>
-          <w:sz w:val="24"/>
-          <w:szCs w:val="24"/>
-          <w:rtl/>
-        </w:rPr>
-        <w:t xml:space="preserve">פאטמה אמרה שאחרי עשרים ושבע שנים "זה עדיין מעליב" (ראיון 5), אך למדה ש"לא כל דלת צריכה להיפתח דרכי" (ראיון 5). מאותו מבנה צמח גם יתרון. מהא סיפרה ש"האמהות אצלנו מדברות איתי על דברים שלא יגידו למורה גבר" (ראיון 2), וסוהא תיארה את עצמה כ"אישה שיכולה להיכנס לבתים ולחדרים שבהם מתקבלות ההחלטות האמיתיות" (ראיון 8). המורות תיארו גם הבדלים בין קבוצות בתוך הקהילה הערבית. מהא אמרה ש"משפחה בדואית מהנגב, למשל, לא תשלח את האמא לפגישה, ישלחו את האח הגדול, וצריך לדעת את זה ולא להיעלב" (ראיון 2).</w:t>
-      </w:r>
-    </w:p>
-    <w:p>
-      <w:pPr>
-        <w:bidi/>
-        <w:spacing w:after="120" w:before="0" w:line="360" w:lineRule="auto"/>
-        <w:jc w:val="left"/>
-      </w:pPr>
-      <w:r>
-        <w:rPr>
-          <w:rFonts w:ascii="Times New Roman" w:cs="David" w:hAnsi="Times New Roman"/>
-          <w:b/>
-          <w:bCs/>
-          <w:sz w:val="24"/>
-          <w:szCs w:val="24"/>
-          <w:rtl/>
-        </w:rPr>
-        <w:t xml:space="preserve">ג. מחלוקות ופחד</w:t>
-      </w:r>
-    </w:p>
-    <w:p>
-      <w:pPr>
-        <w:bidi/>
-        <w:spacing w:after="60" w:before="0" w:line="360" w:lineRule="auto"/>
-        <w:jc w:val="both"/>
-      </w:pPr>
-      <w:r>
-        <w:rPr>
-          <w:rFonts w:ascii="Times New Roman" w:cs="David" w:hAnsi="Times New Roman"/>
-          <w:sz w:val="24"/>
-          <w:szCs w:val="24"/>
-          <w:rtl/>
-        </w:rPr>
-        <w:t xml:space="preserve">במחלוקות הגיעו הורים לבית הספר מלווים בדודים או באחים ונקטו לשון מאיימת. המורות פירשו זאת כביטוי של פחד. מהא אמרה ש"הורה שמגיע עם דודים לא מגיע לריב, הוא מגיע מפוחד, והדודים הם הפחד שלו" (ראיון 2), ורנא הוסיפה ש"אמהות באות עם אחים כי הן לא מאמינות שמישהו יקשיב להן לבד" (ראיון 6). סמר למדה ש"הורה שצועק הוא בדרך כלל הורה שנבהל" (ראיון 3), ואמאני תיארה את ההאשמה "את לא מכאן" (ראיון 7) כ"נשק שההורים משתמשים בו כשהם מרגישים חלשים" (ראיון 7). מכאן למדו המורות כלל משותף: לא לענות בשער או בקבוצה, לתת למשבר לעבור, ולפגוש את ההורה ביוזמתן אחרי כמה ימים, אחד על אחד. ריהאם אמרה: "לא עונים בווטסאפ על דברים של כבוד, רק בפנים" (ראיון 1). נסרין הוסיפה ש"פער תרבותי לא פותרים בשכנוע, פותרים בשאלה" (ראיון 4), ורנא אמרה: "למדתי שרוב הפערים התרבותיים הם פערים של פרט קטן, ואם שואלים, מוצאים את הפרט" (ראיון 6). פאטמה תיארה אב שביקש להעביר את בתו המצטיינת למסגרת שבה תלמד פחות. במקום להתווכח, הראתה לו את החיבורים של בתו, והסיקה: "אחרי השיחה הבנתי שלא נלחמים עם הורה, מראים לו את הילד שלו" (ראיון 5). סוהא תיארה מחלוקת קשה במיוחד, עם אב שהאשים אותה בבגידה אחרי דיווח לרווחה על אלימות בבית. היא ליוותה את המשפחה לרווחה בעצמה, ולמדה:</w:t>
-      </w:r>
-    </w:p>
-    <w:p>
-      <w:pPr>
-        <w:bidi/>
-        <w:spacing w:after="120" w:before="0" w:line="360" w:lineRule="auto"/>
-        <w:ind w:left="567" w:right="567"/>
-        <w:jc w:val="both"/>
-      </w:pPr>
-      <w:r>
-        <w:rPr>
-          <w:rFonts w:ascii="Times New Roman" w:cs="David" w:hAnsi="Times New Roman"/>
-          <w:sz w:val="24"/>
-          <w:szCs w:val="24"/>
-          <w:rtl/>
-        </w:rPr>
-        <w:t xml:space="preserve">שהתפקיד שלי כמורה מהקהילה הוא לא לבחור בין החוק לקהילה, אלא לעמוד ביניהם ולתרגם, לשני הכיוונים. ושהורים בלוד מפחדים מהרווחה יותר מהמשטרה, ושבית הספר צריך להיות הגשר, לא השער. (ראיון 8)</w:t>
-      </w:r>
-    </w:p>
-    <w:p>
-      <w:pPr>
-        <w:bidi/>
-        <w:spacing w:after="60" w:before="0" w:line="360" w:lineRule="auto"/>
-        <w:jc w:val="both"/>
-      </w:pPr>
-      <w:r>
-        <w:rPr>
-          <w:rFonts w:ascii="Times New Roman" w:cs="David" w:hAnsi="Times New Roman"/>
-          <w:sz w:val="24"/>
-          <w:szCs w:val="24"/>
-          <w:rtl/>
-        </w:rPr>
-        <w:t xml:space="preserve">לסיכום: מתמה זו עולה כי המורות פועלות בתוך מבנה קהילתי של משפחה מורחבת וכבוד, שבו לסבתות מקום מרכזי. מבנה זה מגביל את המורות כנשים מול חלק מהאבות, אך גם פותח בפניהן דלתות אל האמהות ואל הבתים. את המחלוקות עם הורים הן מפרשות כביטוי של פחד, ומתמודדות איתן בהשהיה, בפגישה אישית, בשאלה במקום בשכנוע, ובהצגת הילד עצמו.</w:t>
-      </w:r>
-    </w:p>
-    <w:p>
-      <w:pPr>
-        <w:pStyle w:val="Heading2"/>
-        <w:bidi/>
-        <w:spacing w:after="120" w:before="240" w:line="360" w:lineRule="auto"/>
-        <w:jc w:val="left"/>
-      </w:pPr>
-      <w:r>
-        <w:rPr>
-          <w:rFonts w:ascii="Times New Roman" w:cs="David" w:hAnsi="Times New Roman"/>
-          <w:b/>
-          <w:bCs/>
-          <w:sz w:val="24"/>
-          <w:szCs w:val="24"/>
-          <w:rtl/>
-        </w:rPr>
-        <w:t xml:space="preserve">4.6 "תומכת או לא תומכת": ההנהלה, המבנה וההכשרה</w:t>
+        <w:t xml:space="preserve">4.4 "תומכת או לא תומכת": ההנהלה, המבנה וההכשרה</w:t>
       </w:r>
     </w:p>
     <w:p>
@@ -6198,7 +6038,7 @@
           <w:szCs w:val="24"/>
           <w:rtl/>
         </w:rPr>
-        <w:t xml:space="preserve">החוט המקשר בין התמות הוא מקומו של בית הספר בקהילה. ממחקר זה עלה תחילה כי המורות רואות בבית הספר את המוסד היחיד בעיר שההורים סומכים עליו. בהתייחס לכך, בספרות נטען כי קהילתיות גבוהה מעידה על אמון במוסדות הקהילה ובדמויות המייצגות אותה, ובהם בית הספר והמורים (שדמי-וורטמן, 2017, כפי שמצוטט אצל Fisher &amp; Refael Fanyo, 2022). מחקר שנערך בשכונה עירונית מצא כי תושבים רבים חווים היעדר של קהילה ומבקשים לשחזר אותה, וכי הם מצפים מן הממסד לחזק את האמון בין הקבוצות בשכונה (וול-טיסר ובליט-כהן, 2023). בלוד, לפי דברי המורות, בית הספר הוא המקום שבו האמון הזה עדיין קיים. הדבר מתיישב עם תיאור החינוך החברתי-קהילתי כ"עוגן" בעת משבר (גולדרט, 2024), ומרחיב אותו: בלוד המשבר אינו אירוע חולף אלא מצב מתמשך של ירי ופחד. במחקר העירוני נמצא גם שחלק מהתושבים חווים תחושה של זרות ואיום בשכונה (וול-טיסר ובליט-כהן, 2023), וגם המורות בלוד תיארו פחד מהרחוב ומהשכנים, במיוחד אחרי מאי 2021. הפערים בתקצוב בין החינוך הערבי לעברי בעיר (אבגר ואחרים, 2021) ותהליכי הג'נטריפיקציה הלאומית בערים המעורבות (שמריהו-ישורון, 2021) עשויים להסביר מדוע המורות חשות שהן נושאות אחריות שחורגת מתפקידן.</w:t>
+        <w:t xml:space="preserve">החוט המקשר בין התמות הוא מקומו של בית הספר בקהילה. ממחקר זה עלה תחילה כי המורות רואות בבית הספר את המוסד היחיד בעיר שההורים סומכים עליו. בהתייחס לכך, בספרות נטען כי קהילתיות גבוהה מעידה על אמון במוסדות הקהילה ובדמויות המייצגות אותה, ובהם בית הספר והמורים (שדמי-וורטמן, 2017, כפי שמצוטט אצל Fisher &amp; Refael Fanyo, 2022), ובית הספר תואר כמוסד קהילתי בעל פוטנציאל מרכזי לעצב את פני הקהילה (שדמי-וורטמן, 2010). מחקר שנערך בשכונה עירונית מצא כי תושבים רבים חווים היעדר של קהילה ומבקשים לשחזר אותה, וכי הם מצפים מן הממסד לחזק את האמון בין הקבוצות בשכונה (וול-טיסר ובליט-כהן, 2023). בלוד, לפי דברי המורות, בית הספר הוא המקום שבו האמון הזה עדיין קיים. הדבר מתיישב עם תיאור החינוך החברתי-קהילתי כ"עוגן" בעת משבר (גולדרט, 2024), ומרחיב אותו: בלוד המשבר אינו אירוע חולף אלא מצב מתמשך של ירי ופחד. במחקר העירוני נמצא גם שחלק מהתושבים חווים תחושה של זרות ואיום בשכונה (וול-טיסר ובליט-כהן, 2023), וגם המורות בלוד תיארו פחד מהרחוב ומהשכנים, במיוחד אחרי מאי 2021. הפערים בתקצוב בין החינוך הערבי לעברי בעיר (אבגר ואחרים, 2021) ותהליכי הג'נטריפיקציה הלאומית בערים המעורבות (שמריהו-ישורון, 2021) עשויים להסביר מדוע המורות חשות שהן נושאות אחריות שחורגת מתפקידן.</w:t>
       </w:r>
     </w:p>
     <w:p>
@@ -6310,7 +6150,7 @@
           <w:szCs w:val="24"/>
           <w:rtl/>
         </w:rPr>
-        <w:t xml:space="preserve">ההזמנה של ההורים כנותנים מובילה לשאלת השותפות עצמה. ברמת בית הספר ההורים שותפים בעיקר בעזרה, אך ביוזמות של המורות הם הוזמנו כנותני ידע ורובם הגיעו. בהתייחס למעורבות הורים בחברה הערבית, מחקר קודם תיאר מעורבות נמוכה מסוג "צופים" (גרינבנק ובנג'ו, 2021, כפי שמצוטט אצל בנג'ו ובדיר, 2024). לעומת זאת, מחקר מאוחר יותר מצא שמעורבות ההורים הערבים בגן הייתה גבוהה יותר בסוגי המעורבות "שירותים", "ועדים" ו"דיאלוג" (בנג'ו ובדיר, 2024). הממצאים כאן מתיישבים עם המחקר המאוחר: כשההורים הוזמנו כמומחים, כמספרי סיפורים או כמפעילי דוכנים, הגיעו 28 מתוך 33 אבות ו-26 מתוך 32 משפחות. בהתייחס לגופי ההורים שהקימו המורות, בדומה למחקר זה, גם בספרות נמצא ששיתוף פעולה עם מורים נקשר לבקשת עזרה אוטונומית, כלומר לנכונות ההורים לפתח את יכולתם להתמודד בעצמם (Grinshtain &amp; Harpaz, 2023). "שרשרת האמהות" שהפחיתה את ההיעדרויות היא דוגמה לפתרון כזה, שבא מההורים ולא מבית הספר. גם "שוק הקהילה", שאחריו החלו ההורים לעזור זה לזה, מתאים לגישת פיתוח הקהילה, שבה הקהילה עצמה שותפה לתהליך ולא רק מקבלת שירות (גולדרט ועמרם-אשרוב, 2023). בספרות נמצא שקהילתיות גבוהה מנבאת מעורבות הורים רבה יותר (Fisher &amp; Refael Fanyo, 2022), ולכן יוזמות שמחברות הורים זה לזה עשויות לחזק את המעורבות בבית הספר, ולא רק את הקשר עם המורה.</w:t>
+        <w:t xml:space="preserve">ההזמנה של ההורים כנותנים מובילה לשאלת השותפות עצמה. ברמת בית הספר ההורים שותפים בעיקר בעזרה, אך ביוזמות של המורות הם הוזמנו כנותני ידע ורובם הגיעו. בספרות על בינוי קהילה נטען שמנהלים ומורים נרתעים ממעורבות גבוהה של הורים, והוצעה הבחנה בין התחום הערכי, שבו על ההורים להיות מעורבים, ובין התחום הפדגוגי, השמור לסגל המקצועי (שדמי-וורטמן, 2010). הבחנה זו מרמזת שגם בבתי הספר שנחקרו יש מקום לשתף את ההורים בהחלטות שאינן פדגוגיות, ולא רק בעזרה. בהתייחס למעורבות הורים בחברה הערבית, מחקר קודם תיאר מעורבות נמוכה מסוג "צופים" (גרינבנק ובנג'ו, 2021, כפי שמצוטט אצל בנג'ו ובדיר, 2024). לעומת זאת, מחקר מאוחר יותר מצא שמעורבות ההורים הערבים בגן הייתה גבוהה יותר בסוגי המעורבות "שירותים", "ועדים" ו"דיאלוג" (בנג'ו ובדיר, 2024). הממצאים כאן מתיישבים עם המחקר המאוחר: כשההורים הוזמנו כמומחים, כמספרי סיפורים או כמפעילי דוכנים, הגיעו 28 מתוך 33 אבות ו-26 מתוך 32 משפחות. בהתייחס לגופי ההורים שהקימו המורות, בדומה למחקר זה, גם בספרות נמצא ששיתוף פעולה עם מורים נקשר לבקשת עזרה אוטונומית, כלומר לנכונות ההורים לפתח את יכולתם להתמודד בעצמם (Grinshtain &amp; Harpaz, 2023). "שרשרת האמהות" שהפחיתה את ההיעדרויות היא דוגמה לפתרון כזה, שבא מההורים ולא מבית הספר. גם "שוק הקהילה", שאחריו החלו ההורים לעזור זה לזה, מתאים לגישת פיתוח הקהילה, שבה הקהילה עצמה שותפה לתהליך ולא רק מקבלת שירות (גולדרט ועמרם-אשרוב, 2023). בספרות נמצא שקהילתיות גבוהה מנבאת מעורבות הורים רבה יותר (Fisher &amp; Refael Fanyo, 2022), ולכן יוזמות שמחברות הורים זה לזה עשויות לחזק את המעורבות בבית הספר, ולא רק את הקשר עם המורה.</w:t>
       </w:r>
     </w:p>
     <w:p>
@@ -7423,6 +7263,43 @@
           <w:rtl/>
         </w:rPr>
         <w:t xml:space="preserve">.</w:t>
+      </w:r>
+    </w:p>
+    <w:p>
+      <w:pPr>
+        <w:bidi/>
+        <w:spacing w:line="360" w:lineRule="auto"/>
+        <w:ind w:left="709" w:hanging="709"/>
+        <w:jc w:val="left"/>
+      </w:pPr>
+      <w:r>
+        <w:rPr>
+          <w:rFonts w:ascii="Times New Roman" w:cs="David" w:hAnsi="Times New Roman"/>
+          <w:sz w:val="24"/>
+          <w:szCs w:val="24"/>
+          <w:rtl/>
+        </w:rPr>
+        <w:t xml:space="preserve">שדמי-וורטמן, ש. (2010). חינוך בונה קהילה - קהילה בונה חינוך. בתוך שדמות - מרכז למנהיגות בקהילה, </w:t>
+      </w:r>
+      <w:r>
+        <w:rPr>
+          <w:rFonts w:ascii="Times New Roman" w:cs="David" w:hAnsi="Times New Roman"/>
+          <w:i/>
+          <w:iCs/>
+          <w:sz w:val="24"/>
+          <w:szCs w:val="24"/>
+          <w:rtl/>
+        </w:rPr>
+        <w:t xml:space="preserve">לשם שינוי ביחד: בינוי קהילה - פיתוח הון חברתי כבסיס לקהילתיות מתחדשת</w:t>
+      </w:r>
+      <w:r>
+        <w:rPr>
+          <w:rFonts w:ascii="Times New Roman" w:cs="David" w:hAnsi="Times New Roman"/>
+          <w:sz w:val="24"/>
+          <w:szCs w:val="24"/>
+          <w:rtl/>
+        </w:rPr>
+        <w:t xml:space="preserve"> (עמ' 93-110). משרד הרווחה והשירותים החברתיים ומכללת אורנים.</w:t>
       </w:r>
     </w:p>
     <w:p>

</xml_diff>

<commit_message>
Avoid third-person self-reference per course guidelines
Co-Authored-By: Claude Opus 5.5 <noreply@anthropic.com>
Claude-Session: https://claude.ai/code/session_01PCrLuLuf13bgHFN1Akf9GB
</commit_message>
<xml_diff>
--- a/seminar/עבודת סמינר - חיתאם אבו ריאש.docx
+++ b/seminar/עבודת סמינר - חיתאם אבו ריאש.docx
@@ -4268,7 +4268,7 @@
           <w:szCs w:val="24"/>
           <w:rtl/>
         </w:rPr>
-        <w:t xml:space="preserve">הראיונות נערכו בין ספטמבר לאוקטובר 2026 בבתי הספר של המשתתפות. ארבעת הראיונות הראשונים נערכו בידי חיתאם אבו ריאש וארבעת האחרונים בידי אמילי, לפי אותו מדריך ראיון. אורכם נע בין 36 ל-49 דקות. הראיונות נערכו בערבית ובעברית לפי בחירת המרואיינות, הוקלטו בהסכמתן, תומללו ותורגמו לעברית במקומות הנדרשים. לפני כל ראיון הוצגו למרואיינת מטרת המחקר ואופן שמירת הפרטיות, והיא חתמה על טופס הסכמה מדעת שבו הובהר כי אפשר להפסיק את הראיון בכל שלב. בתמלול הוחלפו שמות המשתתפות בשמות בדויים, שמות תלמידים והורים הושמטו, ופרטים מזהים שונו.</w:t>
+        <w:t xml:space="preserve">הראיונות נערכו בין ספטמבר לאוקטובר 2026 בבתי הספר של המשתתפות. הראיונות נערכו בידי שתי מראיינות, ארבעה ראיונות כל אחת, לפי אותו מדריך ראיון. אורכם נע בין 36 ל-49 דקות. הראיונות נערכו בערבית ובעברית לפי בחירת המרואיינות, הוקלטו בהסכמתן, תומללו ותורגמו לעברית במקומות הנדרשים. לפני כל ראיון הוצגו למרואיינת מטרת המחקר ואופן שמירת הפרטיות, והיא חתמה על טופס הסכמה מדעת שבו הובהר כי אפשר להפסיק את הראיון בכל שלב. בתמלול הוחלפו שמות המשתתפות בשמות בדויים, שמות תלמידים והורים הושמטו, ופרטים מזהים שונו.</w:t>
       </w:r>
     </w:p>
     <w:p>
@@ -8086,7 +8086,7 @@
           <w:szCs w:val="24"/>
           <w:rtl/>
         </w:rPr>
-        <w:t xml:space="preserve">להלן טופס ההסכמה שעליו חתמה כל אחת מהמרואיינות לפני הראיון. בהתאם להתחייבות לשמירה על פרטיות המשתתפות, בעבודה מופיעים השמות הבדויים בלבד, והטפסים החתומים בשמות המלאים שמורים אצל החוקרות.</w:t>
+        <w:t xml:space="preserve">להלן טופס ההסכמה שעליו חתמה כל אחת מהמרואיינות לפני הראיון. בהתאם להתחייבות לשמירה על פרטיות המשתתפות, בעבודה מופיעים השמות הבדויים בלבד, והטפסים החתומים בשמות המלאים נשמרים בנפרד.</w:t>
       </w:r>
     </w:p>
     <w:p>

</xml_diff>

<commit_message>
Describe participant sampling and note it as a limitation
Co-Authored-By: Claude Opus 5.5 <noreply@anthropic.com>
Claude-Session: https://claude.ai/code/session_01PCrLuLuf13bgHFN1Akf9GB
</commit_message>
<xml_diff>
--- a/seminar/עבודת סמינר - חיתאם אבו ריאש.docx
+++ b/seminar/עבודת סמינר - חיתאם אבו ריאש.docx
@@ -2299,7 +2299,7 @@
           <w:szCs w:val="24"/>
           <w:rtl/>
         </w:rPr>
-        <w:t xml:space="preserve">במחקר השתתפו שמונה מורות מחמישה בתי ספר במגזר הערבי בלוד: ארבעה בתי ספר יסודיים וחטיבת ביניים אחת. גילן נע בין 29 ל-52 (ממוצע 40.3), והוותק שלהן בהוראה נע בין 5 ל-27 שנים (ממוצע 15.1). כולן דוברות ערבית כשפת אם. שש מהן נולדו או גדלו בלוד, אחת נולדה ברמלה ואחת בכפר בגליל. בין המשתתפות מחנכות, רכזות שכבה, רכזת הורים וקהילה, רכזת שפה ורכזת חינוך חברתי. שמות המשתתפות בדויים, ושמות בתי הספר אינם מופיעים בעבודה. פרטי הרקע של המשתתפות מוצגים בטבלה 1.</w:t>
+        <w:t xml:space="preserve">במחקר השתתפו שמונה מורות מחמישה בתי ספר במגזר הערבי בלוד: ארבעה בתי ספר יסודיים וחטיבת ביניים אחת. המשתתפות נבחרו בדגימת נוחות: כל אחת מן המראיינות פנתה למורות דרך קשריה האישיים והמקצועיים עם מורות ומנהלות בבתי ספר בעיר, ורואיינו המורות שהסכימו להשתתף. גילן נע בין 29 ל-52 (ממוצע 40.3), והוותק שלהן בהוראה נע בין 5 ל-27 שנים (ממוצע 15.1). כולן דוברות ערבית כשפת אם. שש מהן נולדו או גדלו בלוד, אחת נולדה ברמלה ואחת בכפר בגליל. בין המשתתפות מחנכות, רכזות שכבה, רכזת הורים וקהילה, רכזת שפה ורכזת חינוך חברתי. שמות המשתתפות בדויים, ושמות בתי הספר אינם מופיעים בעבודה. פרטי הרקע של המשתתפות מוצגים בטבלה 1.</w:t>
       </w:r>
     </w:p>
     <w:p>
@@ -6384,7 +6384,7 @@
           <w:szCs w:val="24"/>
           <w:rtl/>
         </w:rPr>
-        <w:t xml:space="preserve">המחקר התבסס על שמונה ראיונות בלבד, ולכן אי אפשר להכליל ממנו לכלל בתי הספר בלוד. כל המשתתפות היו נשים שמלמדות בבתי ספר ערביים, והמחקר לא כלל מורים גברים, מורים מבתי ספר עבריים בעיר, הורים או מנהלים. בשל היקף העבודה לא נבחנו נקודות המבט של ההורים עצמם, ובכללם הסבתות והאבות, שהמורות תיארו כחלק מרכזי מן הקשר. הנתונים מבוססים על דיווח עצמי, ולא נבדקו מול מקורות נוספים כמו תצפיות או מסמכים, שהיו יכולים לחזק את תוקף המחקר. חלק מהראיונות נערכו בערבית ותורגמו, והתרגום עלול לשנות דקויות. על התוצאות עשויים היו להשפיע גם היכרות המראיינות עם הקהילה, רצייה חברתית, כלומר נטייה להציג את העבודה מול ההורים באור חיובי, והעובדה שרבות מהמשתתפות ממלאות תפקידי ריכוז, ולכן ייתכן שהן מעורבות בקשר עם ההורים יותר ממורה ממוצעת.</w:t>
+        <w:t xml:space="preserve">המחקר התבסס על שמונה ראיונות בלבד, ולכן אי אפשר להכליל ממנו לכלל בתי הספר בלוד. כל המשתתפות היו נשים שמלמדות בבתי ספר ערביים, והמחקר לא כלל מורים גברים, מורים מבתי ספר עבריים בעיר, הורים או מנהלים. בשל היקף העבודה לא נבחנו נקודות המבט של ההורים עצמם, ובכללם הסבתות והאבות, שהמורות תיארו כחלק מרכזי מן הקשר. הנתונים מבוססים על דיווח עצמי, ולא נבדקו מול מקורות נוספים כמו תצפיות או מסמכים, שהיו יכולים לחזק את תוקף המחקר. חלק מהראיונות נערכו בערבית ותורגמו, והתרגום עלול לשנות דקויות. על התוצאות עשויים היו להשפיע גם היכרות המראיינות עם הקהילה, רצייה חברתית, כלומר נטייה להציג את העבודה מול ההורים באור חיובי, דגימת הנוחות, שבה המשתתפות אותרו דרך קשרים אישיים ומקצועיים של המראיינות, והעובדה שרבות מהמשתתפות ממלאות תפקידי ריכוז, ולכן ייתכן שהן מעורבות בקשר עם ההורים יותר ממורה ממוצעת.</w:t>
       </w:r>
     </w:p>
     <w:p>

</xml_diff>

<commit_message>
Cite Sadan (2009) course reading in background and discussion
Co-Authored-By: Claude Opus 5.5 <noreply@anthropic.com>
Claude-Session: https://claude.ai/code/session_01PCrLuLuf13bgHFN1Akf9GB
</commit_message>
<xml_diff>
--- a/seminar/עבודת סמינר - חיתאם אבו ריאש.docx
+++ b/seminar/עבודת סמינר - חיתאם אבו ריאש.docx
@@ -1683,6 +1683,22 @@
           <w:rtl/>
         </w:rPr>
         <w:t xml:space="preserve">קהילה מתוארת בספרות כמערכת חברתית שמקיימת תקשורת והדדיות ברוב תחומי החיים, ויכולה להתקיים בכל צורת יישוב. יש לה ממד טריטוריאלי, המאפשר מפגש פנים אל פנים ומשפיע על רמת האמון בין חבריה, ולחבריה יש מודעות קולקטיבית שמבחינה אותם מסביבתם (Fisher &amp; Refael Fanyo, 2022). לצד המושג "קהילה" מופיע המושג "קהילתיות", הנמדד בזהות משותפת, באמון ובנכונות לפעול למען אחרים. קהילתיות גבוהה מעידה על אמון לא רק בין חברי הקהילה, אלא גם בינם ובין המוסדות והדמויות המייצגות בה, ובהם בית הספר והמורים (שדמי-וורטמן, 2017, כפי שמצוטט אצל Fisher &amp; Refael Fanyo, 2022).</w:t>
+      </w:r>
+    </w:p>
+    <w:p>
+      <w:pPr>
+        <w:bidi/>
+        <w:spacing w:after="60" w:before="0" w:line="360" w:lineRule="auto"/>
+        <w:jc w:val="both"/>
+      </w:pPr>
+      <w:r>
+        <w:rPr>
+          <w:rFonts w:ascii="Times New Roman" w:cs="David" w:hAnsi="Times New Roman"/>
+          <w:sz w:val="24"/>
+          <w:szCs w:val="24"/>
+          <w:rtl/>
+        </w:rPr>
+        <w:t xml:space="preserve">בספרות על עבודה קהילתית מוצגות כמה גישות להגדרת קהילה: הקהילה כמקום, הקהילה כפונקציה, הקהילה כהתארגנות על בסיס מאפיין קריטי משותף, והקהילה כתחושה של קהילתיות. לפי הגישה הפונקציונלית, הקהילה ממלאת חמישה תפקידים: ייצור, חיברות, פיקוח חברתי, השתתפות חברתית ותמיכה הדדית. גם כאשר תפקידי החיברות הפורמליים עברו לידי מוסדות ממלכתיים, השתתפות הקהילה בחינוך הדור הצעיר נותרה חשובה לקיומה, ואיכות מוסדות החינוך משפיעה על יכולתה של קהילה למשוך אליה משפחות. עוד מובחנים בגישה זו שני סוגי קשרים: קשרים אופקיים, בין תושבי הקהילה לבין עצמם, וקשרים אנכיים, הקושרים את הקהילה למערכות שמחוצה לה, כמו בתי ספר, עמותות ומשרדי ממשלה. ככל שהממד האופקי חזק יותר, הקהילה יכולה להסתמך פחות על הממד האנכי. למשל, קהילה מקומית המשתתפת במערכת החינוך יכולה להשפיע על התרבות, על ההעדפות ועל דרכי החיברות המתאימות לילדיה (סדן, 2009).</w:t>
       </w:r>
     </w:p>
     <w:p>
@@ -6182,7 +6198,7 @@
           <w:szCs w:val="24"/>
           <w:rtl/>
         </w:rPr>
-        <w:t xml:space="preserve">השותפות הזאת אינה מתקיימת בחלל ריק, אלא בתוך מבנה קהילתי של משפחה מורחבת וכבוד. המורות לא ניסו לשנות את המבנה אלא לעבוד דרכו: לפנות לסבתא, להיעזר בזקני המשפחה ולהושיב משפחות חלשות בשורה הראשונה. בהתייחס לכך, בספרות הומלץ על התערבות מותאמת תרבות בעבודה עם הורים ערבים (Grinshtain &amp; Harpaz, 2023), ועל סדנאות משותפות שיאפשרו למידה הדדית בין צוותים להורים מחברות שונות (בנג'ו ובדיר, 2024). גישת פיתוח הקהילה, שבה הקהילה עצמה שותפה לתהליך (גולדרט ועמרם-אשרוב, 2023), מתבטאת במועצת הקהילה שהקימה סוהא לצד ועד ההורים הנבחר. גם הפירוש שנתנו המורות לאיומים של הורים, כביטוי של פחד ולא של תוקפנות, עשוי להתקשר לממצא שהורים ערבים נוטים יותר להימנע מבקשת עזרה (Grinshtain &amp; Harpaz, 2023): הורה שאינו מאמין שיקשיבו לו מגיע מלווה, ולא לבד. הדרך שבה התמודדו המורות עם מחלוקות, השהיה, שאלה במקום שכנוע והצגת הילד עצמו, דומה לאימוץ נקודת המבט של ההורה שתואר בספרות (מלץ ואחרים, 2026).</w:t>
+        <w:t xml:space="preserve">השותפות הזאת אינה מתקיימת בחלל ריק, אלא בתוך מבנה קהילתי של משפחה מורחבת וכבוד. המורות לא ניסו לשנות את המבנה אלא לעבוד דרכו: לפנות לסבתא, להיעזר בזקני המשפחה ולהושיב משפחות חלשות בשורה הראשונה. בספרות על עבודה קהילתית מובחן בין קשרים אופקיים, בין חברי הקהילה, ובין קשרים אנכיים, הקושרים אותה למערכות שמחוצה לה, ונטען כי קהילה בעלת קשרים אופקיים חזקים יכולה להשפיע על החינוך של ילדיה (סדן, 2009). המורות פועלות בנקודת המפגש בין שני סוגי הקשרים: הן נשענות על הקשרים האופקיים של המשפחה המורחבת, ומתווכות בינם ובין בית הספר והעירייה, שהם הקשרים האנכיים. בהתייחס לכך, בספרות הומלץ על התערבות מותאמת תרבות בעבודה עם הורים ערבים (Grinshtain &amp; Harpaz, 2023), ועל סדנאות משותפות שיאפשרו למידה הדדית בין צוותים להורים מחברות שונות (בנג'ו ובדיר, 2024). גישת פיתוח הקהילה, שבה הקהילה עצמה שותפה לתהליך (גולדרט ועמרם-אשרוב, 2023), מתבטאת במועצת הקהילה שהקימה סוהא לצד ועד ההורים הנבחר. גם הפירוש שנתנו המורות לאיומים של הורים, כביטוי של פחד ולא של תוקפנות, עשוי להתקשר לממצא שהורים ערבים נוטים יותר להימנע מבקשת עזרה (Grinshtain &amp; Harpaz, 2023): הורה שאינו מאמין שיקשיבו לו מגיע מלווה, ולא לבד. הדרך שבה התמודדו המורות עם מחלוקות, השהיה, שאלה במקום שכנוע והצגת הילד עצמו, דומה לאימוץ נקודת המבט של ההורה שתואר בספרות (מלץ ואחרים, 2026).</w:t>
       </w:r>
     </w:p>
     <w:p>
@@ -7115,6 +7131,43 @@
           <w:rtl/>
         </w:rPr>
         <w:t xml:space="preserve">.</w:t>
+      </w:r>
+    </w:p>
+    <w:p>
+      <w:pPr>
+        <w:bidi/>
+        <w:spacing w:line="360" w:lineRule="auto"/>
+        <w:ind w:left="709" w:hanging="709"/>
+        <w:jc w:val="left"/>
+      </w:pPr>
+      <w:r>
+        <w:rPr>
+          <w:rFonts w:ascii="Times New Roman" w:cs="David" w:hAnsi="Times New Roman"/>
+          <w:sz w:val="24"/>
+          <w:szCs w:val="24"/>
+          <w:rtl/>
+        </w:rPr>
+        <w:t xml:space="preserve">סדן, א. (2009). </w:t>
+      </w:r>
+      <w:r>
+        <w:rPr>
+          <w:rFonts w:ascii="Times New Roman" w:cs="David" w:hAnsi="Times New Roman"/>
+          <w:i/>
+          <w:iCs/>
+          <w:sz w:val="24"/>
+          <w:szCs w:val="24"/>
+          <w:rtl/>
+        </w:rPr>
+        <w:t xml:space="preserve">עבודה קהילתית: שיטות לשינוי חברתי</w:t>
+      </w:r>
+      <w:r>
+        <w:rPr>
+          <w:rFonts w:ascii="Times New Roman" w:cs="David" w:hAnsi="Times New Roman"/>
+          <w:sz w:val="24"/>
+          <w:szCs w:val="24"/>
+          <w:rtl/>
+        </w:rPr>
+        <w:t xml:space="preserve">. הקיבוץ המאוחד.</w:t>
       </w:r>
     </w:p>
     <w:p>

</xml_diff>